<commit_message>
nmv 15 09 2026
</commit_message>
<xml_diff>
--- a/TS Jatai Ghanam Project/TS 4.1/TS 4.1 Ghanam Malayalam Corrections.docx
+++ b/TS Jatai Ghanam Project/TS 4.1/TS 4.1 Ghanam Malayalam Corrections.docx
@@ -1,7 +1,3198 @@
 
 <file path=word/document.xml><?xml version="1.0" encoding="utf-8"?>
-<w:document xmlns:wpc="http://schemas.microsoft.com/office/word/2010/wordprocessingCanvas" xmlns:cx="http://schemas.microsoft.com/office/drawing/2014/chartex" xmlns:cx1="http://schemas.microsoft.com/office/drawing/2015/9/8/chartex" xmlns:cx2="http://schemas.microsoft.com/office/drawing/2015/10/21/chartex" xmlns:cx3="http://schemas.microsoft.com/office/drawing/2016/5/9/chartex" xmlns:cx4="http://schemas.microsoft.com/office/drawing/2016/5/10/chartex" xmlns:cx5="http://schemas.microsoft.com/office/drawing/2016/5/11/chartex" xmlns:cx6="http://schemas.microsoft.com/office/drawing/2016/5/12/chartex" xmlns:cx7="http://schemas.microsoft.com/office/drawing/2016/5/13/chartex" xmlns:cx8="http://schemas.microsoft.com/office/drawing/2016/5/14/chartex" xmlns:mc="http://schemas.openxmlformats.org/markup-compatibility/2006" xmlns:aink="http://schemas.microsoft.com/office/drawing/2016/ink" xmlns:am3d="http://schemas.microsoft.com/office/drawing/2017/model3d" xmlns:o="urn:schemas-microsoft-com:office:office" xmlns:oel="http://schemas.microsoft.com/office/2019/extlst" xmlns:r="http://schemas.openxmlformats.org/officeDocument/2006/relationships" xmlns:m="http://schemas.openxmlformats.org/officeDocument/2006/math" xmlns:v="urn:schemas-microsoft-com:vml" xmlns:wp14="http://schemas.microsoft.com/office/word/2010/wordprocessingDrawing" xmlns:wp="http://schemas.openxmlformats.org/drawingml/2006/wordprocessingDrawing" xmlns:w10="urn:schemas-microsoft-com:office:word" xmlns:w="http://schemas.openxmlformats.org/wordprocessingml/2006/main" xmlns:w14="http://schemas.microsoft.com/office/word/2010/wordml" xmlns:w15="http://schemas.microsoft.com/office/word/2012/wordml" xmlns:w16cex="http://schemas.microsoft.com/office/word/2018/wordml/cex" xmlns:w16cid="http://schemas.microsoft.com/office/word/2016/wordml/cid" xmlns:w16="http://schemas.microsoft.com/office/word/2018/wordml" xmlns:w16sdtdh="http://schemas.microsoft.com/office/word/2020/wordml/sdtdatahash" xmlns:w16se="http://schemas.microsoft.com/office/word/2015/wordml/symex" xmlns:wpg="http://schemas.microsoft.com/office/word/2010/wordprocessingGroup" xmlns:wpi="http://schemas.microsoft.com/office/word/2010/wordprocessingInk" xmlns:wne="http://schemas.microsoft.com/office/word/2006/wordml" xmlns:wps="http://schemas.microsoft.com/office/word/2010/wordprocessingShape" mc:Ignorable="w14 w15 w16se w16cid w16 w16cex w16sdtdh wp14">
+<w:document xmlns:wpc="http://schemas.microsoft.com/office/word/2010/wordprocessingCanvas" xmlns:cx="http://schemas.microsoft.com/office/drawing/2014/chartex" xmlns:cx1="http://schemas.microsoft.com/office/drawing/2015/9/8/chartex" xmlns:cx2="http://schemas.microsoft.com/office/drawing/2015/10/21/chartex" xmlns:cx3="http://schemas.microsoft.com/office/drawing/2016/5/9/chartex" xmlns:cx4="http://schemas.microsoft.com/office/drawing/2016/5/10/chartex" xmlns:cx5="http://schemas.microsoft.com/office/drawing/2016/5/11/chartex" xmlns:cx6="http://schemas.microsoft.com/office/drawing/2016/5/12/chartex" xmlns:cx7="http://schemas.microsoft.com/office/drawing/2016/5/13/chartex" xmlns:cx8="http://schemas.microsoft.com/office/drawing/2016/5/14/chartex" xmlns:mc="http://schemas.openxmlformats.org/markup-compatibility/2006" xmlns:aink="http://schemas.microsoft.com/office/drawing/2016/ink" xmlns:am3d="http://schemas.microsoft.com/office/drawing/2017/model3d" xmlns:o="urn:schemas-microsoft-com:office:office" xmlns:oel="http://schemas.microsoft.com/office/2019/extlst" xmlns:r="http://schemas.openxmlformats.org/officeDocument/2006/relationships" xmlns:m="http://schemas.openxmlformats.org/officeDocument/2006/math" xmlns:v="urn:schemas-microsoft-com:vml" xmlns:wp14="http://schemas.microsoft.com/office/word/2010/wordprocessingDrawing" xmlns:wp="http://schemas.openxmlformats.org/drawingml/2006/wordprocessingDrawing" xmlns:w10="urn:schemas-microsoft-com:office:word" xmlns:w="http://schemas.openxmlformats.org/wordprocessingml/2006/main" xmlns:w14="http://schemas.microsoft.com/office/word/2010/wordml" xmlns:w15="http://schemas.microsoft.com/office/word/2012/wordml" xmlns:w16cex="http://schemas.microsoft.com/office/word/2018/wordml/cex" xmlns:w16cid="http://schemas.microsoft.com/office/word/2016/wordml/cid" xmlns:w16="http://schemas.microsoft.com/office/word/2018/wordml" xmlns:w16du="http://schemas.microsoft.com/office/word/2023/wordml/word16du" xmlns:w16sdtdh="http://schemas.microsoft.com/office/word/2020/wordml/sdtdatahash" xmlns:w16sdtfl="http://schemas.microsoft.com/office/word/2024/wordml/sdtformatlock" xmlns:w16se="http://schemas.microsoft.com/office/word/2015/wordml/symex" xmlns:wpg="http://schemas.microsoft.com/office/word/2010/wordprocessingGroup" xmlns:wpi="http://schemas.microsoft.com/office/word/2010/wordprocessingInk" xmlns:wne="http://schemas.microsoft.com/office/word/2006/wordml" xmlns:wps="http://schemas.microsoft.com/office/word/2010/wordprocessingShape" mc:Ignorable="w14 w15 w16se w16cid w16 w16cex w16sdtdh w16sdtfl w16du wp14">
   <w:body>
+    <w:p>
+      <w:pPr>
+        <w:spacing w:before="0" w:line="240" w:lineRule="auto"/>
+        <w:jc w:val="center"/>
+        <w:rPr>
+          <w:b/>
+          <w:bCs/>
+          <w:sz w:val="32"/>
+          <w:szCs w:val="32"/>
+          <w:u w:val="single"/>
+        </w:rPr>
+      </w:pPr>
+      <w:r>
+        <w:rPr>
+          <w:b/>
+          <w:bCs/>
+          <w:sz w:val="32"/>
+          <w:szCs w:val="32"/>
+          <w:u w:val="single"/>
+        </w:rPr>
+        <w:t xml:space="preserve">TS </w:t>
+      </w:r>
+      <w:proofErr w:type="gramStart"/>
+      <w:r>
+        <w:rPr>
+          <w:b/>
+          <w:bCs/>
+          <w:sz w:val="32"/>
+          <w:szCs w:val="32"/>
+          <w:u w:val="single"/>
+        </w:rPr>
+        <w:t xml:space="preserve">Ghanam </w:t>
+      </w:r>
+      <w:r>
+        <w:rPr>
+          <w:b/>
+          <w:bCs/>
+          <w:sz w:val="32"/>
+          <w:szCs w:val="32"/>
+          <w:u w:val="single"/>
+        </w:rPr>
+        <w:t xml:space="preserve"> </w:t>
+      </w:r>
+      <w:r>
+        <w:rPr>
+          <w:b/>
+          <w:bCs/>
+          <w:sz w:val="32"/>
+          <w:szCs w:val="32"/>
+          <w:u w:val="single"/>
+        </w:rPr>
+        <w:t>–</w:t>
+      </w:r>
+      <w:proofErr w:type="gramEnd"/>
+      <w:r>
+        <w:rPr>
+          <w:b/>
+          <w:bCs/>
+          <w:sz w:val="32"/>
+          <w:szCs w:val="32"/>
+          <w:u w:val="single"/>
+        </w:rPr>
+        <w:t xml:space="preserve"> TS </w:t>
+      </w:r>
+      <w:r>
+        <w:rPr>
+          <w:b/>
+          <w:bCs/>
+          <w:sz w:val="32"/>
+          <w:szCs w:val="32"/>
+          <w:u w:val="single"/>
+        </w:rPr>
+        <w:t>4.1</w:t>
+      </w:r>
+      <w:r>
+        <w:rPr>
+          <w:b/>
+          <w:bCs/>
+          <w:sz w:val="32"/>
+          <w:szCs w:val="32"/>
+          <w:u w:val="single"/>
+        </w:rPr>
+        <w:t xml:space="preserve"> </w:t>
+      </w:r>
+      <w:r>
+        <w:rPr>
+          <w:b/>
+          <w:bCs/>
+          <w:sz w:val="32"/>
+          <w:szCs w:val="32"/>
+          <w:u w:val="single"/>
+        </w:rPr>
+        <w:t>Malayalam</w:t>
+      </w:r>
+      <w:r>
+        <w:rPr>
+          <w:b/>
+          <w:bCs/>
+          <w:sz w:val="32"/>
+          <w:szCs w:val="32"/>
+          <w:u w:val="single"/>
+        </w:rPr>
+        <w:t xml:space="preserve"> Corrections –</w:t>
+      </w:r>
+      <w:r>
+        <w:rPr>
+          <w:b/>
+          <w:bCs/>
+          <w:sz w:val="32"/>
+          <w:szCs w:val="32"/>
+          <w:u w:val="single"/>
+        </w:rPr>
+        <w:t xml:space="preserve"> </w:t>
+      </w:r>
+      <w:r>
+        <w:rPr>
+          <w:b/>
+          <w:bCs/>
+          <w:sz w:val="32"/>
+          <w:szCs w:val="32"/>
+          <w:u w:val="single"/>
+        </w:rPr>
+        <w:t xml:space="preserve">Observed </w:t>
+      </w:r>
+      <w:proofErr w:type="gramStart"/>
+      <w:r>
+        <w:rPr>
+          <w:b/>
+          <w:bCs/>
+          <w:sz w:val="32"/>
+          <w:szCs w:val="32"/>
+          <w:u w:val="single"/>
+        </w:rPr>
+        <w:t xml:space="preserve">till </w:t>
+      </w:r>
+      <w:r>
+        <w:rPr>
+          <w:b/>
+          <w:bCs/>
+          <w:sz w:val="32"/>
+          <w:szCs w:val="32"/>
+          <w:highlight w:val="red"/>
+          <w:u w:val="single"/>
+        </w:rPr>
+        <w:t>?????</w:t>
+      </w:r>
+      <w:proofErr w:type="gramEnd"/>
+    </w:p>
+    <w:p>
+      <w:pPr>
+        <w:spacing w:before="0" w:line="240" w:lineRule="auto"/>
+        <w:jc w:val="center"/>
+        <w:rPr>
+          <w:b/>
+          <w:bCs/>
+          <w:sz w:val="28"/>
+          <w:szCs w:val="32"/>
+        </w:rPr>
+      </w:pPr>
+      <w:r>
+        <w:rPr>
+          <w:b/>
+          <w:bCs/>
+          <w:sz w:val="28"/>
+          <w:szCs w:val="32"/>
+        </w:rPr>
+        <w:t>(ignore those which are already incorporated in your book’s version and date)</w:t>
+      </w:r>
+    </w:p>
+    <w:tbl>
+      <w:tblPr>
+        <w:tblW w:w="14537" w:type="dxa"/>
+        <w:tblInd w:w="-792" w:type="dxa"/>
+        <w:tblBorders>
+          <w:top w:val="single" w:sz="4" w:space="0" w:color="000000"/>
+          <w:left w:val="single" w:sz="4" w:space="0" w:color="000000"/>
+          <w:bottom w:val="single" w:sz="4" w:space="0" w:color="000000"/>
+          <w:right w:val="single" w:sz="4" w:space="0" w:color="000000"/>
+          <w:insideH w:val="single" w:sz="4" w:space="0" w:color="000000"/>
+          <w:insideV w:val="single" w:sz="4" w:space="0" w:color="000000"/>
+        </w:tblBorders>
+        <w:tblLook w:val="04A0" w:firstRow="1" w:lastRow="0" w:firstColumn="1" w:lastColumn="0" w:noHBand="0" w:noVBand="1"/>
+      </w:tblPr>
+      <w:tblGrid>
+        <w:gridCol w:w="7166"/>
+        <w:gridCol w:w="7371"/>
+      </w:tblGrid>
+      <w:tr>
+        <w:tc>
+          <w:tcPr>
+            <w:tcW w:w="7166" w:type="dxa"/>
+          </w:tcPr>
+          <w:p>
+            <w:pPr>
+              <w:spacing w:before="0" w:line="240" w:lineRule="auto"/>
+              <w:jc w:val="center"/>
+              <w:rPr>
+                <w:b/>
+                <w:sz w:val="32"/>
+                <w:szCs w:val="32"/>
+              </w:rPr>
+            </w:pPr>
+            <w:r>
+              <w:rPr>
+                <w:b/>
+                <w:sz w:val="32"/>
+                <w:szCs w:val="32"/>
+              </w:rPr>
+              <w:t>As Printed</w:t>
+            </w:r>
+          </w:p>
+        </w:tc>
+        <w:tc>
+          <w:tcPr>
+            <w:tcW w:w="7371" w:type="dxa"/>
+          </w:tcPr>
+          <w:p>
+            <w:pPr>
+              <w:spacing w:before="0" w:line="240" w:lineRule="auto"/>
+              <w:ind w:right="-18"/>
+              <w:jc w:val="center"/>
+              <w:rPr>
+                <w:b/>
+                <w:sz w:val="32"/>
+                <w:szCs w:val="32"/>
+              </w:rPr>
+            </w:pPr>
+            <w:r>
+              <w:rPr>
+                <w:b/>
+                <w:sz w:val="32"/>
+                <w:szCs w:val="32"/>
+              </w:rPr>
+              <w:t>To be read as or corrected as</w:t>
+            </w:r>
+            <w:r>
+              <w:rPr>
+                <w:b/>
+                <w:sz w:val="32"/>
+                <w:szCs w:val="32"/>
+              </w:rPr>
+              <w:t xml:space="preserve"> </w:t>
+            </w:r>
+          </w:p>
+        </w:tc>
+      </w:tr>
+      <w:tr>
+        <w:trPr>
+          <w:trHeight w:val="2175"/>
+        </w:trPr>
+        <w:tc>
+          <w:tcPr>
+            <w:tcW w:w="7166" w:type="dxa"/>
+            <w:tcBorders>
+              <w:top w:val="single" w:sz="4" w:space="0" w:color="000000"/>
+              <w:left w:val="single" w:sz="4" w:space="0" w:color="000000"/>
+              <w:bottom w:val="single" w:sz="4" w:space="0" w:color="000000"/>
+              <w:right w:val="single" w:sz="4" w:space="0" w:color="000000"/>
+            </w:tcBorders>
+          </w:tcPr>
+          <w:p>
+            <w:pPr>
+              <w:widowControl w:val="0"/>
+              <w:autoSpaceDE w:val="0"/>
+              <w:autoSpaceDN w:val="0"/>
+              <w:adjustRightInd w:val="0"/>
+              <w:spacing w:before="0" w:line="240" w:lineRule="auto"/>
+              <w:rPr>
+                <w:rFonts w:ascii="BRH Malayalam Extra" w:hAnsi="BRH Malayalam Extra" w:cs="BRH Malayalam Extra"/>
+                <w:color w:val="000000"/>
+                <w:sz w:val="32"/>
+                <w:szCs w:val="32"/>
+              </w:rPr>
+            </w:pPr>
+            <w:r>
+              <w:rPr>
+                <w:rFonts w:cs="BRH Malayalam Extra"/>
+                <w:color w:val="000000"/>
+                <w:szCs w:val="32"/>
+              </w:rPr>
+              <w:t>38</w:t>
+            </w:r>
+            <w:r>
+              <w:rPr>
+                <w:rFonts w:ascii="BRH Malayalam Extra" w:hAnsi="BRH Malayalam Extra" w:cs="BRH Malayalam Extra"/>
+                <w:color w:val="000000"/>
+                <w:sz w:val="32"/>
+                <w:szCs w:val="32"/>
+              </w:rPr>
+              <w:t>)</w:t>
+            </w:r>
+            <w:r>
+              <w:rPr>
+                <w:rFonts w:ascii="BRH Malayalam Extra" w:hAnsi="BRH Malayalam Extra" w:cs="BRH Malayalam Extra"/>
+                <w:color w:val="000000"/>
+                <w:sz w:val="32"/>
+                <w:szCs w:val="32"/>
+              </w:rPr>
+              <w:tab/>
+            </w:r>
+            <w:r>
+              <w:rPr>
+                <w:rFonts w:cs="BRH Malayalam Extra"/>
+                <w:color w:val="000000"/>
+                <w:szCs w:val="32"/>
+              </w:rPr>
+              <w:t>4</w:t>
+            </w:r>
+            <w:r>
+              <w:rPr>
+                <w:rFonts w:ascii="BRH Malayalam Extra" w:hAnsi="BRH Malayalam Extra" w:cs="BRH Malayalam Extra"/>
+                <w:color w:val="000000"/>
+                <w:sz w:val="32"/>
+                <w:szCs w:val="32"/>
+              </w:rPr>
+              <w:t>.</w:t>
+            </w:r>
+            <w:r>
+              <w:rPr>
+                <w:rFonts w:cs="BRH Malayalam Extra"/>
+                <w:color w:val="000000"/>
+                <w:szCs w:val="32"/>
+              </w:rPr>
+              <w:t>1</w:t>
+            </w:r>
+            <w:r>
+              <w:rPr>
+                <w:rFonts w:ascii="BRH Malayalam Extra" w:hAnsi="BRH Malayalam Extra" w:cs="BRH Malayalam Extra"/>
+                <w:color w:val="000000"/>
+                <w:sz w:val="32"/>
+                <w:szCs w:val="32"/>
+              </w:rPr>
+              <w:t>.</w:t>
+            </w:r>
+            <w:r>
+              <w:rPr>
+                <w:rFonts w:cs="BRH Malayalam Extra"/>
+                <w:color w:val="000000"/>
+                <w:szCs w:val="32"/>
+              </w:rPr>
+              <w:t>2</w:t>
+            </w:r>
+            <w:r>
+              <w:rPr>
+                <w:rFonts w:ascii="BRH Malayalam Extra" w:hAnsi="BRH Malayalam Extra" w:cs="BRH Malayalam Extra"/>
+                <w:color w:val="000000"/>
+                <w:sz w:val="32"/>
+                <w:szCs w:val="32"/>
+              </w:rPr>
+              <w:t>.</w:t>
+            </w:r>
+            <w:r>
+              <w:rPr>
+                <w:rFonts w:cs="BRH Malayalam Extra"/>
+                <w:color w:val="000000"/>
+                <w:szCs w:val="32"/>
+              </w:rPr>
+              <w:t>1</w:t>
+            </w:r>
+            <w:r>
+              <w:rPr>
+                <w:rFonts w:ascii="BRH Malayalam Extra" w:hAnsi="BRH Malayalam Extra" w:cs="BRH Malayalam Extra"/>
+                <w:color w:val="000000"/>
+                <w:sz w:val="32"/>
+                <w:szCs w:val="32"/>
+              </w:rPr>
+              <w:t>(</w:t>
+            </w:r>
+            <w:r>
+              <w:rPr>
+                <w:rFonts w:cs="BRH Malayalam Extra"/>
+                <w:color w:val="000000"/>
+                <w:szCs w:val="32"/>
+              </w:rPr>
+              <w:t>37</w:t>
+            </w:r>
+            <w:r>
+              <w:rPr>
+                <w:rFonts w:ascii="BRH Malayalam Extra" w:hAnsi="BRH Malayalam Extra" w:cs="BRH Malayalam Extra"/>
+                <w:color w:val="000000"/>
+                <w:sz w:val="32"/>
+                <w:szCs w:val="32"/>
+              </w:rPr>
+              <w:t>)- A</w:t>
+            </w:r>
+            <w:r>
+              <w:rPr>
+                <w:rFonts w:ascii="BRH Malayalam Extra" w:hAnsi="BRH Malayalam Extra" w:cs="BRH Malayalam Extra"/>
+                <w:color w:val="000000"/>
+                <w:sz w:val="26"/>
+                <w:szCs w:val="32"/>
+              </w:rPr>
+              <w:t>–</w:t>
+            </w:r>
+            <w:r>
+              <w:rPr>
+                <w:rFonts w:ascii="BRH Malayalam Extra" w:hAnsi="BRH Malayalam Extra" w:cs="BRH Malayalam Extra"/>
+                <w:color w:val="000000"/>
+                <w:sz w:val="32"/>
+                <w:szCs w:val="32"/>
+              </w:rPr>
+              <w:t>sôyË§ | jx¥i˜ | p£</w:t>
+            </w:r>
+            <w:r>
+              <w:rPr>
+                <w:rFonts w:ascii="BRH Malayalam Extra" w:hAnsi="BRH Malayalam Extra" w:cs="BRH Malayalam Extra"/>
+                <w:color w:val="000000"/>
+                <w:sz w:val="26"/>
+                <w:szCs w:val="32"/>
+              </w:rPr>
+              <w:t>–</w:t>
+            </w:r>
+            <w:r>
+              <w:rPr>
+                <w:rFonts w:ascii="BRH Malayalam Extra" w:hAnsi="BRH Malayalam Extra" w:cs="BRH Malayalam Extra"/>
+                <w:color w:val="000000"/>
+                <w:sz w:val="32"/>
+                <w:szCs w:val="32"/>
+              </w:rPr>
+              <w:t>r</w:t>
+            </w:r>
+            <w:r>
+              <w:rPr>
+                <w:rFonts w:ascii="BRH Malayalam Extra" w:hAnsi="BRH Malayalam Extra" w:cs="BRH Malayalam Extra"/>
+                <w:color w:val="000000"/>
+                <w:sz w:val="26"/>
+                <w:szCs w:val="32"/>
+              </w:rPr>
+              <w:t>–</w:t>
+            </w:r>
+            <w:r>
+              <w:rPr>
+                <w:rFonts w:ascii="BRH Malayalam Extra" w:hAnsi="BRH Malayalam Extra" w:cs="BRH Malayalam Extra"/>
+                <w:color w:val="000000"/>
+                <w:sz w:val="32"/>
+                <w:szCs w:val="32"/>
+              </w:rPr>
+              <w:t>Yû</w:t>
+            </w:r>
+            <w:r>
+              <w:rPr>
+                <w:rFonts w:ascii="BRH Malayalam Extra" w:hAnsi="BRH Malayalam Extra" w:cs="BRH Malayalam Extra"/>
+                <w:color w:val="000000"/>
+                <w:sz w:val="26"/>
+                <w:szCs w:val="32"/>
+              </w:rPr>
+              <w:t>–</w:t>
+            </w:r>
+            <w:r>
+              <w:rPr>
+                <w:rFonts w:ascii="BRH Malayalam Extra" w:hAnsi="BRH Malayalam Extra" w:cs="BRH Malayalam Extra"/>
+                <w:color w:val="000000"/>
+                <w:sz w:val="32"/>
+                <w:szCs w:val="32"/>
+                <w:highlight w:val="yellow"/>
+              </w:rPr>
+              <w:t>s¢</w:t>
+            </w:r>
+            <w:r>
+              <w:rPr>
+                <w:rFonts w:ascii="BRH Malayalam Extra" w:hAnsi="BRH Malayalam Extra" w:cs="BRH Malayalam Extra"/>
+                <w:color w:val="000000"/>
+                <w:sz w:val="32"/>
+                <w:szCs w:val="32"/>
+              </w:rPr>
+              <w:t xml:space="preserve"> ||</w:t>
+            </w:r>
+          </w:p>
+          <w:p>
+            <w:pPr>
+              <w:widowControl w:val="0"/>
+              <w:autoSpaceDE w:val="0"/>
+              <w:autoSpaceDN w:val="0"/>
+              <w:adjustRightInd w:val="0"/>
+              <w:spacing w:before="0" w:line="240" w:lineRule="auto"/>
+              <w:rPr>
+                <w:rFonts w:ascii="BRH Malayalam Extra" w:hAnsi="BRH Malayalam Extra" w:cs="BRH Malayalam Extra"/>
+                <w:color w:val="000000"/>
+                <w:sz w:val="32"/>
+                <w:szCs w:val="32"/>
+              </w:rPr>
+            </w:pPr>
+            <w:r>
+              <w:rPr>
+                <w:rFonts w:ascii="BRH Malayalam Extra" w:hAnsi="BRH Malayalam Extra" w:cs="BRH Malayalam Extra"/>
+                <w:color w:val="000000"/>
+                <w:sz w:val="32"/>
+                <w:szCs w:val="32"/>
+              </w:rPr>
+              <w:t>A</w:t>
+            </w:r>
+            <w:r>
+              <w:rPr>
+                <w:rFonts w:ascii="BRH Malayalam Extra" w:hAnsi="BRH Malayalam Extra" w:cs="BRH Malayalam Extra"/>
+                <w:color w:val="000000"/>
+                <w:sz w:val="26"/>
+                <w:szCs w:val="32"/>
+              </w:rPr>
+              <w:t>–</w:t>
+            </w:r>
+            <w:r>
+              <w:rPr>
+                <w:rFonts w:ascii="BRH Malayalam Extra" w:hAnsi="BRH Malayalam Extra" w:cs="BRH Malayalam Extra"/>
+                <w:color w:val="000000"/>
+                <w:sz w:val="32"/>
+                <w:szCs w:val="32"/>
+              </w:rPr>
+              <w:t>sôy©. jx¥i</w:t>
+            </w:r>
+            <w:r>
+              <w:rPr>
+                <w:rFonts w:ascii="BRH Malayalam Extra" w:hAnsi="BRH Malayalam Extra" w:cs="BRH Malayalam Extra"/>
+                <w:color w:val="000000"/>
+                <w:sz w:val="26"/>
+                <w:szCs w:val="32"/>
+              </w:rPr>
+              <w:t>–</w:t>
+            </w:r>
+            <w:r>
+              <w:rPr>
+                <w:rFonts w:ascii="BRH Malayalam Extra" w:hAnsi="BRH Malayalam Extra" w:cs="BRH Malayalam Extra"/>
+                <w:color w:val="000000"/>
+                <w:sz w:val="32"/>
+                <w:szCs w:val="32"/>
+              </w:rPr>
+              <w:t xml:space="preserve"> jx¥i— A</w:t>
+            </w:r>
+            <w:r>
+              <w:rPr>
+                <w:rFonts w:ascii="BRH Malayalam Extra" w:hAnsi="BRH Malayalam Extra" w:cs="BRH Malayalam Extra"/>
+                <w:color w:val="000000"/>
+                <w:sz w:val="26"/>
+                <w:szCs w:val="32"/>
+              </w:rPr>
+              <w:t>–</w:t>
+            </w:r>
+            <w:r>
+              <w:rPr>
+                <w:rFonts w:ascii="BRH Malayalam Extra" w:hAnsi="BRH Malayalam Extra" w:cs="BRH Malayalam Extra"/>
+                <w:color w:val="000000"/>
+                <w:sz w:val="32"/>
+                <w:szCs w:val="32"/>
+              </w:rPr>
+              <w:t>sôy© d</w:t>
+            </w:r>
+            <w:r>
+              <w:rPr>
+                <w:rFonts w:ascii="BRH Malayalam Extra" w:hAnsi="BRH Malayalam Extra" w:cs="BRH Malayalam Extra"/>
+                <w:color w:val="000000"/>
+                <w:sz w:val="26"/>
+                <w:szCs w:val="32"/>
+              </w:rPr>
+              <w:t>–</w:t>
+            </w:r>
+            <w:r>
+              <w:rPr>
+                <w:rFonts w:ascii="BRH Malayalam Extra" w:hAnsi="BRH Malayalam Extra" w:cs="BRH Malayalam Extra"/>
+                <w:color w:val="000000"/>
+                <w:sz w:val="32"/>
+                <w:szCs w:val="32"/>
+              </w:rPr>
+              <w:t>sôy©. jx¥i— p£r</w:t>
+            </w:r>
+            <w:r>
+              <w:rPr>
+                <w:rFonts w:ascii="BRH Malayalam Extra" w:hAnsi="BRH Malayalam Extra" w:cs="BRH Malayalam Extra"/>
+                <w:color w:val="000000"/>
+                <w:sz w:val="32"/>
+                <w:szCs w:val="32"/>
+                <w:highlight w:val="yellow"/>
+              </w:rPr>
+              <w:t>Yû</w:t>
+            </w:r>
+            <w:r>
+              <w:rPr>
+                <w:rFonts w:ascii="BRH Malayalam Extra" w:hAnsi="BRH Malayalam Extra" w:cs="BRH Malayalam Extra"/>
+                <w:color w:val="000000"/>
+                <w:sz w:val="26"/>
+                <w:szCs w:val="32"/>
+                <w:highlight w:val="yellow"/>
+              </w:rPr>
+              <w:t>–</w:t>
+            </w:r>
+            <w:r>
+              <w:rPr>
+                <w:rFonts w:ascii="BRH Malayalam Extra" w:hAnsi="BRH Malayalam Extra" w:cs="BRH Malayalam Extra"/>
+                <w:color w:val="000000"/>
+                <w:sz w:val="32"/>
+                <w:szCs w:val="32"/>
+                <w:highlight w:val="yellow"/>
+              </w:rPr>
+              <w:t>s¢</w:t>
+            </w:r>
+            <w:r>
+              <w:rPr>
+                <w:rFonts w:ascii="BRH Malayalam Extra" w:hAnsi="BRH Malayalam Extra" w:cs="BRH Malayalam Extra"/>
+                <w:color w:val="000000"/>
+                <w:sz w:val="32"/>
+                <w:szCs w:val="32"/>
+              </w:rPr>
+              <w:t xml:space="preserve"> </w:t>
+            </w:r>
+            <w:r>
+              <w:rPr>
+                <w:rFonts w:ascii="BRH Malayalam Extra" w:hAnsi="BRH Malayalam Extra" w:cs="BRH Malayalam Extra"/>
+                <w:color w:val="000000"/>
+                <w:sz w:val="32"/>
+                <w:szCs w:val="32"/>
+                <w:highlight w:val="yellow"/>
+              </w:rPr>
+              <w:t>p£</w:t>
+            </w:r>
+            <w:r>
+              <w:rPr>
+                <w:rFonts w:ascii="BRH Malayalam Extra" w:hAnsi="BRH Malayalam Extra" w:cs="BRH Malayalam Extra"/>
+                <w:color w:val="000000"/>
+                <w:sz w:val="32"/>
+                <w:szCs w:val="32"/>
+              </w:rPr>
+              <w:t>—r</w:t>
+            </w:r>
+            <w:r>
+              <w:rPr>
+                <w:rFonts w:ascii="BRH Malayalam Extra" w:hAnsi="BRH Malayalam Extra" w:cs="BRH Malayalam Extra"/>
+                <w:color w:val="000000"/>
+                <w:sz w:val="32"/>
+                <w:szCs w:val="32"/>
+                <w:highlight w:val="yellow"/>
+              </w:rPr>
+              <w:t>Yû</w:t>
+            </w:r>
+            <w:r>
+              <w:rPr>
+                <w:rFonts w:ascii="BRH Malayalam Extra" w:hAnsi="BRH Malayalam Extra" w:cs="BRH Malayalam Extra"/>
+                <w:color w:val="000000"/>
+                <w:sz w:val="26"/>
+                <w:szCs w:val="32"/>
+                <w:highlight w:val="yellow"/>
+              </w:rPr>
+              <w:t>–</w:t>
+            </w:r>
+            <w:r>
+              <w:rPr>
+                <w:rFonts w:ascii="BRH Malayalam Extra" w:hAnsi="BRH Malayalam Extra" w:cs="BRH Malayalam Extra"/>
+                <w:color w:val="000000"/>
+                <w:sz w:val="32"/>
+                <w:szCs w:val="32"/>
+                <w:highlight w:val="yellow"/>
+              </w:rPr>
+              <w:t>s¢</w:t>
+            </w:r>
+            <w:r>
+              <w:rPr>
+                <w:rFonts w:ascii="BRH Malayalam Extra" w:hAnsi="BRH Malayalam Extra" w:cs="BRH Malayalam Extra"/>
+                <w:color w:val="000000"/>
+                <w:sz w:val="32"/>
+                <w:szCs w:val="32"/>
+              </w:rPr>
+              <w:t xml:space="preserve"> jx¥i— A</w:t>
+            </w:r>
+            <w:r>
+              <w:rPr>
+                <w:rFonts w:ascii="BRH Malayalam Extra" w:hAnsi="BRH Malayalam Extra" w:cs="BRH Malayalam Extra"/>
+                <w:color w:val="000000"/>
+                <w:sz w:val="26"/>
+                <w:szCs w:val="32"/>
+              </w:rPr>
+              <w:t>–</w:t>
+            </w:r>
+            <w:r>
+              <w:rPr>
+                <w:rFonts w:ascii="BRH Malayalam Extra" w:hAnsi="BRH Malayalam Extra" w:cs="BRH Malayalam Extra"/>
+                <w:color w:val="000000"/>
+                <w:sz w:val="32"/>
+                <w:szCs w:val="32"/>
+              </w:rPr>
+              <w:t>sôy© d</w:t>
+            </w:r>
+            <w:r>
+              <w:rPr>
+                <w:rFonts w:ascii="BRH Malayalam Extra" w:hAnsi="BRH Malayalam Extra" w:cs="BRH Malayalam Extra"/>
+                <w:color w:val="000000"/>
+                <w:sz w:val="26"/>
+                <w:szCs w:val="32"/>
+              </w:rPr>
+              <w:t>–</w:t>
+            </w:r>
+            <w:r>
+              <w:rPr>
+                <w:rFonts w:ascii="BRH Malayalam Extra" w:hAnsi="BRH Malayalam Extra" w:cs="BRH Malayalam Extra"/>
+                <w:color w:val="000000"/>
+                <w:sz w:val="32"/>
+                <w:szCs w:val="32"/>
+              </w:rPr>
+              <w:t>sôy©. jx¥i— p£r</w:t>
+            </w:r>
+            <w:r>
+              <w:rPr>
+                <w:rFonts w:ascii="BRH Malayalam Extra" w:hAnsi="BRH Malayalam Extra" w:cs="BRH Malayalam Extra"/>
+                <w:color w:val="000000"/>
+                <w:sz w:val="32"/>
+                <w:szCs w:val="32"/>
+                <w:highlight w:val="yellow"/>
+              </w:rPr>
+              <w:t>Yû</w:t>
+            </w:r>
+            <w:r>
+              <w:rPr>
+                <w:rFonts w:ascii="BRH Malayalam Extra" w:hAnsi="BRH Malayalam Extra" w:cs="BRH Malayalam Extra"/>
+                <w:color w:val="000000"/>
+                <w:sz w:val="26"/>
+                <w:szCs w:val="32"/>
+              </w:rPr>
+              <w:t>–</w:t>
+            </w:r>
+            <w:r>
+              <w:rPr>
+                <w:rFonts w:ascii="BRH Malayalam Extra" w:hAnsi="BRH Malayalam Extra" w:cs="BRH Malayalam Extra"/>
+                <w:color w:val="000000"/>
+                <w:sz w:val="32"/>
+                <w:szCs w:val="32"/>
+              </w:rPr>
+              <w:t>s¢</w:t>
+            </w:r>
+            <w:r>
+              <w:rPr>
+                <w:rFonts w:ascii="BRH Malayalam Extra" w:hAnsi="BRH Malayalam Extra" w:cs="BRH Malayalam Extra"/>
+                <w:color w:val="000000"/>
+                <w:sz w:val="32"/>
+                <w:szCs w:val="32"/>
+              </w:rPr>
+              <w:t xml:space="preserve"> | </w:t>
+            </w:r>
+          </w:p>
+          <w:p>
+            <w:pPr>
+              <w:widowControl w:val="0"/>
+              <w:autoSpaceDE w:val="0"/>
+              <w:autoSpaceDN w:val="0"/>
+              <w:adjustRightInd w:val="0"/>
+              <w:spacing w:before="0" w:line="240" w:lineRule="auto"/>
+              <w:rPr>
+                <w:rFonts w:ascii="BRH Malayalam Extra" w:hAnsi="BRH Malayalam Extra" w:cs="BRH Malayalam Extra"/>
+                <w:color w:val="000000"/>
+                <w:sz w:val="32"/>
+                <w:szCs w:val="32"/>
+              </w:rPr>
+            </w:pPr>
+            <w:r>
+              <w:rPr>
+                <w:rFonts w:cs="BRH Malayalam Extra"/>
+                <w:color w:val="000000"/>
+                <w:szCs w:val="32"/>
+              </w:rPr>
+              <w:t>39</w:t>
+            </w:r>
+            <w:r>
+              <w:rPr>
+                <w:rFonts w:ascii="BRH Malayalam Extra" w:hAnsi="BRH Malayalam Extra" w:cs="BRH Malayalam Extra"/>
+                <w:color w:val="000000"/>
+                <w:sz w:val="32"/>
+                <w:szCs w:val="32"/>
+              </w:rPr>
+              <w:t>)</w:t>
+            </w:r>
+            <w:r>
+              <w:rPr>
+                <w:rFonts w:ascii="BRH Malayalam Extra" w:hAnsi="BRH Malayalam Extra" w:cs="BRH Malayalam Extra"/>
+                <w:color w:val="000000"/>
+                <w:sz w:val="32"/>
+                <w:szCs w:val="32"/>
+              </w:rPr>
+              <w:tab/>
+            </w:r>
+            <w:r>
+              <w:rPr>
+                <w:rFonts w:cs="BRH Malayalam Extra"/>
+                <w:color w:val="000000"/>
+                <w:szCs w:val="32"/>
+              </w:rPr>
+              <w:t>4</w:t>
+            </w:r>
+            <w:r>
+              <w:rPr>
+                <w:rFonts w:ascii="BRH Malayalam Extra" w:hAnsi="BRH Malayalam Extra" w:cs="BRH Malayalam Extra"/>
+                <w:color w:val="000000"/>
+                <w:sz w:val="32"/>
+                <w:szCs w:val="32"/>
+              </w:rPr>
+              <w:t>.</w:t>
+            </w:r>
+            <w:r>
+              <w:rPr>
+                <w:rFonts w:cs="BRH Malayalam Extra"/>
+                <w:color w:val="000000"/>
+                <w:szCs w:val="32"/>
+              </w:rPr>
+              <w:t>1</w:t>
+            </w:r>
+            <w:r>
+              <w:rPr>
+                <w:rFonts w:ascii="BRH Malayalam Extra" w:hAnsi="BRH Malayalam Extra" w:cs="BRH Malayalam Extra"/>
+                <w:color w:val="000000"/>
+                <w:sz w:val="32"/>
+                <w:szCs w:val="32"/>
+              </w:rPr>
+              <w:t>.</w:t>
+            </w:r>
+            <w:r>
+              <w:rPr>
+                <w:rFonts w:cs="BRH Malayalam Extra"/>
+                <w:color w:val="000000"/>
+                <w:szCs w:val="32"/>
+              </w:rPr>
+              <w:t>2</w:t>
+            </w:r>
+            <w:r>
+              <w:rPr>
+                <w:rFonts w:ascii="BRH Malayalam Extra" w:hAnsi="BRH Malayalam Extra" w:cs="BRH Malayalam Extra"/>
+                <w:color w:val="000000"/>
+                <w:sz w:val="32"/>
+                <w:szCs w:val="32"/>
+              </w:rPr>
+              <w:t>.</w:t>
+            </w:r>
+            <w:r>
+              <w:rPr>
+                <w:rFonts w:cs="BRH Malayalam Extra"/>
+                <w:color w:val="000000"/>
+                <w:szCs w:val="32"/>
+              </w:rPr>
+              <w:t>1</w:t>
+            </w:r>
+            <w:r>
+              <w:rPr>
+                <w:rFonts w:ascii="BRH Malayalam Extra" w:hAnsi="BRH Malayalam Extra" w:cs="BRH Malayalam Extra"/>
+                <w:color w:val="000000"/>
+                <w:sz w:val="32"/>
+                <w:szCs w:val="32"/>
+              </w:rPr>
+              <w:t>(</w:t>
+            </w:r>
+            <w:r>
+              <w:rPr>
+                <w:rFonts w:cs="BRH Malayalam Extra"/>
+                <w:color w:val="000000"/>
+                <w:szCs w:val="32"/>
+              </w:rPr>
+              <w:t>38</w:t>
+            </w:r>
+            <w:r>
+              <w:rPr>
+                <w:rFonts w:ascii="BRH Malayalam Extra" w:hAnsi="BRH Malayalam Extra" w:cs="BRH Malayalam Extra"/>
+                <w:color w:val="000000"/>
+                <w:sz w:val="32"/>
+                <w:szCs w:val="32"/>
+              </w:rPr>
+              <w:t>)- jx¥i˜ | p£</w:t>
+            </w:r>
+            <w:r>
+              <w:rPr>
+                <w:rFonts w:ascii="BRH Malayalam Extra" w:hAnsi="BRH Malayalam Extra" w:cs="BRH Malayalam Extra"/>
+                <w:color w:val="000000"/>
+                <w:sz w:val="26"/>
+                <w:szCs w:val="32"/>
+              </w:rPr>
+              <w:t>–</w:t>
+            </w:r>
+            <w:r>
+              <w:rPr>
+                <w:rFonts w:ascii="BRH Malayalam Extra" w:hAnsi="BRH Malayalam Extra" w:cs="BRH Malayalam Extra"/>
+                <w:color w:val="000000"/>
+                <w:sz w:val="32"/>
+                <w:szCs w:val="32"/>
+              </w:rPr>
+              <w:t>r</w:t>
+            </w:r>
+            <w:r>
+              <w:rPr>
+                <w:rFonts w:ascii="BRH Malayalam Extra" w:hAnsi="BRH Malayalam Extra" w:cs="BRH Malayalam Extra"/>
+                <w:color w:val="000000"/>
+                <w:sz w:val="26"/>
+                <w:szCs w:val="32"/>
+              </w:rPr>
+              <w:t>–</w:t>
+            </w:r>
+            <w:r>
+              <w:rPr>
+                <w:rFonts w:ascii="BRH Malayalam Extra" w:hAnsi="BRH Malayalam Extra" w:cs="BRH Malayalam Extra"/>
+                <w:color w:val="000000"/>
+                <w:sz w:val="32"/>
+                <w:szCs w:val="32"/>
+              </w:rPr>
+              <w:t>Yû</w:t>
+            </w:r>
+            <w:r>
+              <w:rPr>
+                <w:rFonts w:ascii="BRH Malayalam Extra" w:hAnsi="BRH Malayalam Extra" w:cs="BRH Malayalam Extra"/>
+                <w:color w:val="000000"/>
+                <w:sz w:val="26"/>
+                <w:szCs w:val="32"/>
+              </w:rPr>
+              <w:t>–</w:t>
+            </w:r>
+            <w:r>
+              <w:rPr>
+                <w:rFonts w:ascii="BRH Malayalam Extra" w:hAnsi="BRH Malayalam Extra" w:cs="BRH Malayalam Extra"/>
+                <w:color w:val="000000"/>
+                <w:sz w:val="32"/>
+                <w:szCs w:val="32"/>
+                <w:highlight w:val="yellow"/>
+              </w:rPr>
+              <w:t>s¢</w:t>
+            </w:r>
+            <w:r>
+              <w:rPr>
+                <w:rFonts w:ascii="BRH Malayalam Extra" w:hAnsi="BRH Malayalam Extra" w:cs="BRH Malayalam Extra"/>
+                <w:color w:val="000000"/>
+                <w:sz w:val="32"/>
+                <w:szCs w:val="32"/>
+              </w:rPr>
+              <w:t xml:space="preserve"> ||</w:t>
+            </w:r>
+          </w:p>
+          <w:p>
+            <w:pPr>
+              <w:widowControl w:val="0"/>
+              <w:autoSpaceDE w:val="0"/>
+              <w:autoSpaceDN w:val="0"/>
+              <w:adjustRightInd w:val="0"/>
+              <w:spacing w:before="0" w:line="240" w:lineRule="auto"/>
+              <w:rPr>
+                <w:rFonts w:ascii="BRH Malayalam Extra" w:hAnsi="BRH Malayalam Extra" w:cs="BRH Malayalam Extra"/>
+                <w:color w:val="000000"/>
+                <w:sz w:val="32"/>
+                <w:szCs w:val="32"/>
+              </w:rPr>
+            </w:pPr>
+            <w:r>
+              <w:rPr>
+                <w:rFonts w:ascii="BRH Malayalam Extra" w:hAnsi="BRH Malayalam Extra" w:cs="BRH Malayalam Extra"/>
+                <w:color w:val="000000"/>
+                <w:sz w:val="32"/>
+                <w:szCs w:val="32"/>
+              </w:rPr>
+              <w:t>jx¥i— p£r</w:t>
+            </w:r>
+            <w:r>
+              <w:rPr>
+                <w:rFonts w:ascii="BRH Malayalam Extra" w:hAnsi="BRH Malayalam Extra" w:cs="BRH Malayalam Extra"/>
+                <w:color w:val="000000"/>
+                <w:sz w:val="32"/>
+                <w:szCs w:val="32"/>
+                <w:highlight w:val="yellow"/>
+              </w:rPr>
+              <w:t>Yû</w:t>
+            </w:r>
+            <w:r>
+              <w:rPr>
+                <w:rFonts w:ascii="BRH Malayalam Extra" w:hAnsi="BRH Malayalam Extra" w:cs="BRH Malayalam Extra"/>
+                <w:color w:val="000000"/>
+                <w:sz w:val="26"/>
+                <w:szCs w:val="32"/>
+                <w:highlight w:val="yellow"/>
+              </w:rPr>
+              <w:t>–</w:t>
+            </w:r>
+            <w:r>
+              <w:rPr>
+                <w:rFonts w:ascii="BRH Malayalam Extra" w:hAnsi="BRH Malayalam Extra" w:cs="BRH Malayalam Extra"/>
+                <w:color w:val="000000"/>
+                <w:sz w:val="32"/>
+                <w:szCs w:val="32"/>
+                <w:highlight w:val="yellow"/>
+              </w:rPr>
+              <w:t>s¢</w:t>
+            </w:r>
+            <w:r>
+              <w:rPr>
+                <w:rFonts w:ascii="BRH Malayalam Extra" w:hAnsi="BRH Malayalam Extra" w:cs="BRH Malayalam Extra"/>
+                <w:color w:val="000000"/>
+                <w:sz w:val="32"/>
+                <w:szCs w:val="32"/>
+              </w:rPr>
+              <w:t xml:space="preserve"> </w:t>
+            </w:r>
+            <w:r>
+              <w:rPr>
+                <w:rFonts w:ascii="BRH Malayalam Extra" w:hAnsi="BRH Malayalam Extra" w:cs="BRH Malayalam Extra"/>
+                <w:color w:val="000000"/>
+                <w:sz w:val="32"/>
+                <w:szCs w:val="32"/>
+                <w:highlight w:val="yellow"/>
+              </w:rPr>
+              <w:t>p£</w:t>
+            </w:r>
+            <w:r>
+              <w:rPr>
+                <w:rFonts w:ascii="BRH Malayalam Extra" w:hAnsi="BRH Malayalam Extra" w:cs="BRH Malayalam Extra"/>
+                <w:color w:val="000000"/>
+                <w:sz w:val="32"/>
+                <w:szCs w:val="32"/>
+              </w:rPr>
+              <w:t>—r</w:t>
+            </w:r>
+            <w:r>
+              <w:rPr>
+                <w:rFonts w:ascii="BRH Malayalam Extra" w:hAnsi="BRH Malayalam Extra" w:cs="BRH Malayalam Extra"/>
+                <w:color w:val="000000"/>
+                <w:sz w:val="32"/>
+                <w:szCs w:val="32"/>
+                <w:highlight w:val="yellow"/>
+              </w:rPr>
+              <w:t>Yû</w:t>
+            </w:r>
+            <w:r>
+              <w:rPr>
+                <w:rFonts w:ascii="BRH Malayalam Extra" w:hAnsi="BRH Malayalam Extra" w:cs="BRH Malayalam Extra"/>
+                <w:color w:val="000000"/>
+                <w:sz w:val="26"/>
+                <w:szCs w:val="32"/>
+                <w:highlight w:val="yellow"/>
+              </w:rPr>
+              <w:t>–</w:t>
+            </w:r>
+            <w:r>
+              <w:rPr>
+                <w:rFonts w:ascii="BRH Malayalam Extra" w:hAnsi="BRH Malayalam Extra" w:cs="BRH Malayalam Extra"/>
+                <w:color w:val="000000"/>
+                <w:sz w:val="32"/>
+                <w:szCs w:val="32"/>
+                <w:highlight w:val="yellow"/>
+              </w:rPr>
+              <w:t>s¢</w:t>
+            </w:r>
+            <w:r>
+              <w:rPr>
+                <w:rFonts w:ascii="BRH Malayalam Extra" w:hAnsi="BRH Malayalam Extra" w:cs="BRH Malayalam Extra"/>
+                <w:color w:val="000000"/>
+                <w:sz w:val="32"/>
+                <w:szCs w:val="32"/>
+              </w:rPr>
+              <w:t xml:space="preserve"> jx¥i</w:t>
+            </w:r>
+            <w:r>
+              <w:rPr>
+                <w:rFonts w:ascii="BRH Malayalam Extra" w:hAnsi="BRH Malayalam Extra" w:cs="BRH Malayalam Extra"/>
+                <w:color w:val="000000"/>
+                <w:sz w:val="26"/>
+                <w:szCs w:val="32"/>
+              </w:rPr>
+              <w:t>–</w:t>
+            </w:r>
+            <w:r>
+              <w:rPr>
+                <w:rFonts w:ascii="BRH Malayalam Extra" w:hAnsi="BRH Malayalam Extra" w:cs="BRH Malayalam Extra"/>
+                <w:color w:val="000000"/>
+                <w:sz w:val="32"/>
+                <w:szCs w:val="32"/>
+              </w:rPr>
+              <w:t xml:space="preserve"> jx¥i— p£r</w:t>
+            </w:r>
+            <w:r>
+              <w:rPr>
+                <w:rFonts w:ascii="BRH Malayalam Extra" w:hAnsi="BRH Malayalam Extra" w:cs="BRH Malayalam Extra"/>
+                <w:color w:val="000000"/>
+                <w:sz w:val="32"/>
+                <w:szCs w:val="32"/>
+                <w:highlight w:val="yellow"/>
+              </w:rPr>
+              <w:t>Yû</w:t>
+            </w:r>
+            <w:r>
+              <w:rPr>
+                <w:rFonts w:ascii="BRH Malayalam Extra" w:hAnsi="BRH Malayalam Extra" w:cs="BRH Malayalam Extra"/>
+                <w:color w:val="000000"/>
+                <w:sz w:val="26"/>
+                <w:szCs w:val="32"/>
+                <w:highlight w:val="yellow"/>
+              </w:rPr>
+              <w:t>–</w:t>
+            </w:r>
+            <w:r>
+              <w:rPr>
+                <w:rFonts w:ascii="BRH Malayalam Extra" w:hAnsi="BRH Malayalam Extra" w:cs="BRH Malayalam Extra"/>
+                <w:color w:val="000000"/>
+                <w:sz w:val="32"/>
+                <w:szCs w:val="32"/>
+                <w:highlight w:val="yellow"/>
+              </w:rPr>
+              <w:t>s¢</w:t>
+            </w:r>
+            <w:r>
+              <w:rPr>
+                <w:rFonts w:ascii="BRH Malayalam Extra" w:hAnsi="BRH Malayalam Extra" w:cs="BRH Malayalam Extra"/>
+                <w:color w:val="000000"/>
+                <w:sz w:val="32"/>
+                <w:szCs w:val="32"/>
+              </w:rPr>
+              <w:t xml:space="preserve"> | </w:t>
+            </w:r>
+          </w:p>
+          <w:p>
+            <w:pPr>
+              <w:widowControl w:val="0"/>
+              <w:autoSpaceDE w:val="0"/>
+              <w:autoSpaceDN w:val="0"/>
+              <w:adjustRightInd w:val="0"/>
+              <w:spacing w:before="0" w:line="240" w:lineRule="auto"/>
+              <w:rPr>
+                <w:rFonts w:ascii="BRH Malayalam Extra" w:hAnsi="BRH Malayalam Extra" w:cs="BRH Malayalam Extra"/>
+                <w:color w:val="000000"/>
+                <w:sz w:val="32"/>
+                <w:szCs w:val="32"/>
+              </w:rPr>
+            </w:pPr>
+            <w:r>
+              <w:rPr>
+                <w:rFonts w:cs="BRH Malayalam Extra"/>
+                <w:color w:val="000000"/>
+                <w:szCs w:val="32"/>
+              </w:rPr>
+              <w:t>40</w:t>
+            </w:r>
+            <w:r>
+              <w:rPr>
+                <w:rFonts w:ascii="BRH Malayalam Extra" w:hAnsi="BRH Malayalam Extra" w:cs="BRH Malayalam Extra"/>
+                <w:color w:val="000000"/>
+                <w:sz w:val="32"/>
+                <w:szCs w:val="32"/>
+              </w:rPr>
+              <w:t>)</w:t>
+            </w:r>
+            <w:r>
+              <w:rPr>
+                <w:rFonts w:ascii="BRH Malayalam Extra" w:hAnsi="BRH Malayalam Extra" w:cs="BRH Malayalam Extra"/>
+                <w:color w:val="000000"/>
+                <w:sz w:val="32"/>
+                <w:szCs w:val="32"/>
+              </w:rPr>
+              <w:tab/>
+            </w:r>
+            <w:r>
+              <w:rPr>
+                <w:rFonts w:cs="BRH Malayalam Extra"/>
+                <w:color w:val="000000"/>
+                <w:szCs w:val="32"/>
+              </w:rPr>
+              <w:t>4</w:t>
+            </w:r>
+            <w:r>
+              <w:rPr>
+                <w:rFonts w:ascii="BRH Malayalam Extra" w:hAnsi="BRH Malayalam Extra" w:cs="BRH Malayalam Extra"/>
+                <w:color w:val="000000"/>
+                <w:sz w:val="32"/>
+                <w:szCs w:val="32"/>
+              </w:rPr>
+              <w:t>.</w:t>
+            </w:r>
+            <w:r>
+              <w:rPr>
+                <w:rFonts w:cs="BRH Malayalam Extra"/>
+                <w:color w:val="000000"/>
+                <w:szCs w:val="32"/>
+              </w:rPr>
+              <w:t>1</w:t>
+            </w:r>
+            <w:r>
+              <w:rPr>
+                <w:rFonts w:ascii="BRH Malayalam Extra" w:hAnsi="BRH Malayalam Extra" w:cs="BRH Malayalam Extra"/>
+                <w:color w:val="000000"/>
+                <w:sz w:val="32"/>
+                <w:szCs w:val="32"/>
+              </w:rPr>
+              <w:t>.</w:t>
+            </w:r>
+            <w:r>
+              <w:rPr>
+                <w:rFonts w:cs="BRH Malayalam Extra"/>
+                <w:color w:val="000000"/>
+                <w:szCs w:val="32"/>
+              </w:rPr>
+              <w:t>2</w:t>
+            </w:r>
+            <w:r>
+              <w:rPr>
+                <w:rFonts w:ascii="BRH Malayalam Extra" w:hAnsi="BRH Malayalam Extra" w:cs="BRH Malayalam Extra"/>
+                <w:color w:val="000000"/>
+                <w:sz w:val="32"/>
+                <w:szCs w:val="32"/>
+              </w:rPr>
+              <w:t>.</w:t>
+            </w:r>
+            <w:r>
+              <w:rPr>
+                <w:rFonts w:cs="BRH Malayalam Extra"/>
+                <w:color w:val="000000"/>
+                <w:szCs w:val="32"/>
+              </w:rPr>
+              <w:t>1</w:t>
+            </w:r>
+            <w:r>
+              <w:rPr>
+                <w:rFonts w:ascii="BRH Malayalam Extra" w:hAnsi="BRH Malayalam Extra" w:cs="BRH Malayalam Extra"/>
+                <w:color w:val="000000"/>
+                <w:sz w:val="32"/>
+                <w:szCs w:val="32"/>
+              </w:rPr>
+              <w:t>(</w:t>
+            </w:r>
+            <w:r>
+              <w:rPr>
+                <w:rFonts w:cs="BRH Malayalam Extra"/>
+                <w:color w:val="000000"/>
+                <w:szCs w:val="32"/>
+              </w:rPr>
+              <w:t>39</w:t>
+            </w:r>
+            <w:r>
+              <w:rPr>
+                <w:rFonts w:ascii="BRH Malayalam Extra" w:hAnsi="BRH Malayalam Extra" w:cs="BRH Malayalam Extra"/>
+                <w:color w:val="000000"/>
+                <w:sz w:val="32"/>
+                <w:szCs w:val="32"/>
+              </w:rPr>
+              <w:t>)- p£</w:t>
+            </w:r>
+            <w:r>
+              <w:rPr>
+                <w:rFonts w:ascii="BRH Malayalam Extra" w:hAnsi="BRH Malayalam Extra" w:cs="BRH Malayalam Extra"/>
+                <w:color w:val="000000"/>
+                <w:sz w:val="26"/>
+                <w:szCs w:val="32"/>
+              </w:rPr>
+              <w:t>–</w:t>
+            </w:r>
+            <w:r>
+              <w:rPr>
+                <w:rFonts w:ascii="BRH Malayalam Extra" w:hAnsi="BRH Malayalam Extra" w:cs="BRH Malayalam Extra"/>
+                <w:color w:val="000000"/>
+                <w:sz w:val="32"/>
+                <w:szCs w:val="32"/>
+              </w:rPr>
+              <w:t>r</w:t>
+            </w:r>
+            <w:r>
+              <w:rPr>
+                <w:rFonts w:ascii="BRH Malayalam Extra" w:hAnsi="BRH Malayalam Extra" w:cs="BRH Malayalam Extra"/>
+                <w:color w:val="000000"/>
+                <w:sz w:val="26"/>
+                <w:szCs w:val="32"/>
+              </w:rPr>
+              <w:t>–</w:t>
+            </w:r>
+            <w:r>
+              <w:rPr>
+                <w:rFonts w:ascii="BRH Malayalam Extra" w:hAnsi="BRH Malayalam Extra" w:cs="BRH Malayalam Extra"/>
+                <w:color w:val="000000"/>
+                <w:sz w:val="32"/>
+                <w:szCs w:val="32"/>
+              </w:rPr>
+              <w:t>Yû</w:t>
+            </w:r>
+            <w:r>
+              <w:rPr>
+                <w:rFonts w:ascii="BRH Malayalam Extra" w:hAnsi="BRH Malayalam Extra" w:cs="BRH Malayalam Extra"/>
+                <w:color w:val="000000"/>
+                <w:sz w:val="26"/>
+                <w:szCs w:val="32"/>
+              </w:rPr>
+              <w:t>–</w:t>
+            </w:r>
+            <w:r>
+              <w:rPr>
+                <w:rFonts w:ascii="BRH Malayalam Extra" w:hAnsi="BRH Malayalam Extra" w:cs="BRH Malayalam Extra"/>
+                <w:color w:val="000000"/>
+                <w:sz w:val="32"/>
+                <w:szCs w:val="32"/>
+                <w:highlight w:val="yellow"/>
+              </w:rPr>
+              <w:t>s¢</w:t>
+            </w:r>
+            <w:r>
+              <w:rPr>
+                <w:rFonts w:ascii="BRH Malayalam Extra" w:hAnsi="BRH Malayalam Extra" w:cs="BRH Malayalam Extra"/>
+                <w:color w:val="000000"/>
+                <w:sz w:val="32"/>
+                <w:szCs w:val="32"/>
+              </w:rPr>
+              <w:t xml:space="preserve"> ||</w:t>
+            </w:r>
+          </w:p>
+          <w:p>
+            <w:pPr>
+              <w:widowControl w:val="0"/>
+              <w:autoSpaceDE w:val="0"/>
+              <w:autoSpaceDN w:val="0"/>
+              <w:adjustRightInd w:val="0"/>
+              <w:spacing w:before="0" w:line="240" w:lineRule="auto"/>
+              <w:rPr>
+                <w:rFonts w:ascii="BRH Malayalam Extra" w:hAnsi="BRH Malayalam Extra" w:cs="BRH Malayalam Extra"/>
+                <w:color w:val="000000"/>
+                <w:sz w:val="32"/>
+                <w:szCs w:val="32"/>
+              </w:rPr>
+            </w:pPr>
+            <w:r>
+              <w:rPr>
+                <w:rFonts w:ascii="BRH Malayalam Extra" w:hAnsi="BRH Malayalam Extra" w:cs="BRH Malayalam Extra"/>
+                <w:color w:val="000000"/>
+                <w:sz w:val="32"/>
+                <w:szCs w:val="32"/>
+              </w:rPr>
+              <w:t>p£</w:t>
+            </w:r>
+            <w:r>
+              <w:rPr>
+                <w:rFonts w:ascii="BRH Malayalam Extra" w:hAnsi="BRH Malayalam Extra" w:cs="BRH Malayalam Extra"/>
+                <w:color w:val="000000"/>
+                <w:sz w:val="26"/>
+                <w:szCs w:val="32"/>
+              </w:rPr>
+              <w:t>–</w:t>
+            </w:r>
+            <w:r>
+              <w:rPr>
+                <w:rFonts w:ascii="BRH Malayalam Extra" w:hAnsi="BRH Malayalam Extra" w:cs="BRH Malayalam Extra"/>
+                <w:color w:val="000000"/>
+                <w:sz w:val="32"/>
+                <w:szCs w:val="32"/>
+              </w:rPr>
+              <w:t>r</w:t>
+            </w:r>
+            <w:r>
+              <w:rPr>
+                <w:rFonts w:ascii="BRH Malayalam Extra" w:hAnsi="BRH Malayalam Extra" w:cs="BRH Malayalam Extra"/>
+                <w:color w:val="000000"/>
+                <w:sz w:val="26"/>
+                <w:szCs w:val="32"/>
+              </w:rPr>
+              <w:t>–</w:t>
+            </w:r>
+            <w:r>
+              <w:rPr>
+                <w:rFonts w:ascii="BRH Malayalam Extra" w:hAnsi="BRH Malayalam Extra" w:cs="BRH Malayalam Extra"/>
+                <w:color w:val="000000"/>
+                <w:sz w:val="32"/>
+                <w:szCs w:val="32"/>
+              </w:rPr>
+              <w:t>Yû</w:t>
+            </w:r>
+            <w:r>
+              <w:rPr>
+                <w:rFonts w:ascii="BRH Malayalam Extra" w:hAnsi="BRH Malayalam Extra" w:cs="BRH Malayalam Extra"/>
+                <w:color w:val="000000"/>
+                <w:sz w:val="26"/>
+                <w:szCs w:val="32"/>
+              </w:rPr>
+              <w:t>–</w:t>
+            </w:r>
+            <w:r>
+              <w:rPr>
+                <w:rFonts w:ascii="BRH Malayalam Extra" w:hAnsi="BRH Malayalam Extra" w:cs="BRH Malayalam Extra"/>
+                <w:color w:val="000000"/>
+                <w:sz w:val="32"/>
+                <w:szCs w:val="32"/>
+              </w:rPr>
+              <w:t>s¢</w:t>
+            </w:r>
+            <w:r>
+              <w:rPr>
+                <w:rFonts w:ascii="BRH Malayalam Extra" w:hAnsi="BRH Malayalam Extra" w:cs="BRH Malayalam Extra"/>
+                <w:color w:val="000000"/>
+                <w:sz w:val="26"/>
+                <w:szCs w:val="32"/>
+              </w:rPr>
+              <w:t>–</w:t>
+            </w:r>
+            <w:r>
+              <w:rPr>
+                <w:rFonts w:ascii="BRH Malayalam Extra" w:hAnsi="BRH Malayalam Extra" w:cs="BRH Malayalam Extra"/>
+                <w:color w:val="000000"/>
+                <w:sz w:val="32"/>
+                <w:szCs w:val="32"/>
+              </w:rPr>
+              <w:t xml:space="preserve"> CZy— p£rY§ - p</w:t>
+            </w:r>
+            <w:r>
+              <w:rPr>
+                <w:rFonts w:ascii="BRH Malayalam Extra" w:hAnsi="BRH Malayalam Extra" w:cs="BRH Malayalam Extra"/>
+                <w:color w:val="000000"/>
+                <w:sz w:val="26"/>
+                <w:szCs w:val="32"/>
+              </w:rPr>
+              <w:t>–</w:t>
+            </w:r>
+            <w:r>
+              <w:rPr>
+                <w:rFonts w:ascii="BRH Malayalam Extra" w:hAnsi="BRH Malayalam Extra" w:cs="BRH Malayalam Extra"/>
+                <w:color w:val="000000"/>
+                <w:sz w:val="32"/>
+                <w:szCs w:val="32"/>
+              </w:rPr>
+              <w:t>s¢</w:t>
+            </w:r>
+            <w:r>
+              <w:rPr>
+                <w:rFonts w:ascii="BRH Malayalam Extra" w:hAnsi="BRH Malayalam Extra" w:cs="BRH Malayalam Extra"/>
+                <w:color w:val="000000"/>
+                <w:sz w:val="26"/>
+                <w:szCs w:val="32"/>
+              </w:rPr>
+              <w:t>–</w:t>
+            </w:r>
+            <w:r>
+              <w:rPr>
+                <w:rFonts w:ascii="BRH Malayalam Extra" w:hAnsi="BRH Malayalam Extra" w:cs="BRH Malayalam Extra"/>
+                <w:color w:val="000000"/>
+                <w:sz w:val="32"/>
+                <w:szCs w:val="32"/>
+              </w:rPr>
+              <w:t xml:space="preserve"> | </w:t>
+            </w:r>
+          </w:p>
+          <w:p>
+            <w:pPr>
+              <w:widowControl w:val="0"/>
+              <w:autoSpaceDE w:val="0"/>
+              <w:autoSpaceDN w:val="0"/>
+              <w:adjustRightInd w:val="0"/>
+              <w:spacing w:before="0" w:line="240" w:lineRule="auto"/>
+              <w:rPr>
+                <w:rFonts w:cs="BRH Malayalam Extra"/>
+                <w:color w:val="FF0000"/>
+                <w:szCs w:val="40"/>
+              </w:rPr>
+            </w:pPr>
+          </w:p>
+        </w:tc>
+        <w:tc>
+          <w:tcPr>
+            <w:tcW w:w="7371" w:type="dxa"/>
+            <w:tcBorders>
+              <w:top w:val="single" w:sz="4" w:space="0" w:color="000000"/>
+              <w:left w:val="single" w:sz="4" w:space="0" w:color="000000"/>
+              <w:bottom w:val="single" w:sz="4" w:space="0" w:color="000000"/>
+              <w:right w:val="single" w:sz="4" w:space="0" w:color="000000"/>
+            </w:tcBorders>
+          </w:tcPr>
+          <w:p>
+            <w:pPr>
+              <w:widowControl w:val="0"/>
+              <w:autoSpaceDE w:val="0"/>
+              <w:autoSpaceDN w:val="0"/>
+              <w:adjustRightInd w:val="0"/>
+              <w:spacing w:before="0" w:line="240" w:lineRule="auto"/>
+              <w:rPr>
+                <w:rFonts w:ascii="BRH Malayalam Extra" w:hAnsi="BRH Malayalam Extra" w:cs="BRH Malayalam Extra"/>
+                <w:color w:val="000000"/>
+                <w:sz w:val="32"/>
+                <w:szCs w:val="32"/>
+              </w:rPr>
+            </w:pPr>
+            <w:r>
+              <w:rPr>
+                <w:rFonts w:cs="BRH Malayalam Extra"/>
+                <w:color w:val="000000"/>
+                <w:szCs w:val="32"/>
+              </w:rPr>
+              <w:t>38</w:t>
+            </w:r>
+            <w:r>
+              <w:rPr>
+                <w:rFonts w:ascii="BRH Malayalam Extra" w:hAnsi="BRH Malayalam Extra" w:cs="BRH Malayalam Extra"/>
+                <w:color w:val="000000"/>
+                <w:sz w:val="32"/>
+                <w:szCs w:val="32"/>
+              </w:rPr>
+              <w:t>)</w:t>
+            </w:r>
+            <w:r>
+              <w:rPr>
+                <w:rFonts w:ascii="BRH Malayalam Extra" w:hAnsi="BRH Malayalam Extra" w:cs="BRH Malayalam Extra"/>
+                <w:color w:val="000000"/>
+                <w:sz w:val="32"/>
+                <w:szCs w:val="32"/>
+              </w:rPr>
+              <w:tab/>
+            </w:r>
+            <w:r>
+              <w:rPr>
+                <w:rFonts w:cs="BRH Malayalam Extra"/>
+                <w:color w:val="000000"/>
+                <w:szCs w:val="32"/>
+              </w:rPr>
+              <w:t>4</w:t>
+            </w:r>
+            <w:r>
+              <w:rPr>
+                <w:rFonts w:ascii="BRH Malayalam Extra" w:hAnsi="BRH Malayalam Extra" w:cs="BRH Malayalam Extra"/>
+                <w:color w:val="000000"/>
+                <w:sz w:val="32"/>
+                <w:szCs w:val="32"/>
+              </w:rPr>
+              <w:t>.</w:t>
+            </w:r>
+            <w:r>
+              <w:rPr>
+                <w:rFonts w:cs="BRH Malayalam Extra"/>
+                <w:color w:val="000000"/>
+                <w:szCs w:val="32"/>
+              </w:rPr>
+              <w:t>1</w:t>
+            </w:r>
+            <w:r>
+              <w:rPr>
+                <w:rFonts w:ascii="BRH Malayalam Extra" w:hAnsi="BRH Malayalam Extra" w:cs="BRH Malayalam Extra"/>
+                <w:color w:val="000000"/>
+                <w:sz w:val="32"/>
+                <w:szCs w:val="32"/>
+              </w:rPr>
+              <w:t>.</w:t>
+            </w:r>
+            <w:r>
+              <w:rPr>
+                <w:rFonts w:cs="BRH Malayalam Extra"/>
+                <w:color w:val="000000"/>
+                <w:szCs w:val="32"/>
+              </w:rPr>
+              <w:t>2</w:t>
+            </w:r>
+            <w:r>
+              <w:rPr>
+                <w:rFonts w:ascii="BRH Malayalam Extra" w:hAnsi="BRH Malayalam Extra" w:cs="BRH Malayalam Extra"/>
+                <w:color w:val="000000"/>
+                <w:sz w:val="32"/>
+                <w:szCs w:val="32"/>
+              </w:rPr>
+              <w:t>.</w:t>
+            </w:r>
+            <w:r>
+              <w:rPr>
+                <w:rFonts w:cs="BRH Malayalam Extra"/>
+                <w:color w:val="000000"/>
+                <w:szCs w:val="32"/>
+              </w:rPr>
+              <w:t>1</w:t>
+            </w:r>
+            <w:r>
+              <w:rPr>
+                <w:rFonts w:ascii="BRH Malayalam Extra" w:hAnsi="BRH Malayalam Extra" w:cs="BRH Malayalam Extra"/>
+                <w:color w:val="000000"/>
+                <w:sz w:val="32"/>
+                <w:szCs w:val="32"/>
+              </w:rPr>
+              <w:t>(</w:t>
+            </w:r>
+            <w:r>
+              <w:rPr>
+                <w:rFonts w:cs="BRH Malayalam Extra"/>
+                <w:color w:val="000000"/>
+                <w:szCs w:val="32"/>
+              </w:rPr>
+              <w:t>37</w:t>
+            </w:r>
+            <w:r>
+              <w:rPr>
+                <w:rFonts w:ascii="BRH Malayalam Extra" w:hAnsi="BRH Malayalam Extra" w:cs="BRH Malayalam Extra"/>
+                <w:color w:val="000000"/>
+                <w:sz w:val="32"/>
+                <w:szCs w:val="32"/>
+              </w:rPr>
+              <w:t>)- A</w:t>
+            </w:r>
+            <w:r>
+              <w:rPr>
+                <w:rFonts w:ascii="BRH Malayalam Extra" w:hAnsi="BRH Malayalam Extra" w:cs="BRH Malayalam Extra"/>
+                <w:color w:val="000000"/>
+                <w:sz w:val="26"/>
+                <w:szCs w:val="32"/>
+              </w:rPr>
+              <w:t>–</w:t>
+            </w:r>
+            <w:r>
+              <w:rPr>
+                <w:rFonts w:ascii="BRH Malayalam Extra" w:hAnsi="BRH Malayalam Extra" w:cs="BRH Malayalam Extra"/>
+                <w:color w:val="000000"/>
+                <w:sz w:val="32"/>
+                <w:szCs w:val="32"/>
+              </w:rPr>
+              <w:t>sôyË§ | jx¥i˜ | p£</w:t>
+            </w:r>
+            <w:r>
+              <w:rPr>
+                <w:rFonts w:ascii="BRH Malayalam Extra" w:hAnsi="BRH Malayalam Extra" w:cs="BRH Malayalam Extra"/>
+                <w:color w:val="000000"/>
+                <w:sz w:val="26"/>
+                <w:szCs w:val="32"/>
+              </w:rPr>
+              <w:t>–</w:t>
+            </w:r>
+            <w:r>
+              <w:rPr>
+                <w:rFonts w:ascii="BRH Malayalam Extra" w:hAnsi="BRH Malayalam Extra" w:cs="BRH Malayalam Extra"/>
+                <w:color w:val="000000"/>
+                <w:sz w:val="32"/>
+                <w:szCs w:val="32"/>
+              </w:rPr>
+              <w:t>r</w:t>
+            </w:r>
+            <w:r>
+              <w:rPr>
+                <w:rFonts w:ascii="BRH Malayalam Extra" w:hAnsi="BRH Malayalam Extra" w:cs="BRH Malayalam Extra"/>
+                <w:color w:val="000000"/>
+                <w:sz w:val="26"/>
+                <w:szCs w:val="32"/>
+              </w:rPr>
+              <w:t>–</w:t>
+            </w:r>
+            <w:r>
+              <w:rPr>
+                <w:rFonts w:ascii="BRH Malayalam Extra" w:hAnsi="BRH Malayalam Extra" w:cs="BRH Malayalam Extra"/>
+                <w:color w:val="000000"/>
+                <w:sz w:val="32"/>
+                <w:szCs w:val="32"/>
+              </w:rPr>
+              <w:t>Yû</w:t>
+            </w:r>
+            <w:r>
+              <w:rPr>
+                <w:rFonts w:ascii="BRH Malayalam Extra" w:hAnsi="BRH Malayalam Extra" w:cs="BRH Malayalam Extra"/>
+                <w:color w:val="000000"/>
+                <w:sz w:val="26"/>
+                <w:szCs w:val="32"/>
+              </w:rPr>
+              <w:t>–</w:t>
+            </w:r>
+            <w:r>
+              <w:rPr>
+                <w:rFonts w:ascii="BRH Malayalam Extra" w:hAnsi="BRH Malayalam Extra" w:cs="BRH Malayalam Extra"/>
+                <w:color w:val="000000"/>
+                <w:sz w:val="32"/>
+                <w:szCs w:val="32"/>
+                <w:highlight w:val="green"/>
+              </w:rPr>
+              <w:t>s¢</w:t>
+            </w:r>
+            <w:r>
+              <w:rPr>
+                <w:rFonts w:ascii="BRH Malayalam Extra" w:hAnsi="BRH Malayalam Extra" w:cs="BRH Malayalam Extra"/>
+                <w:color w:val="000000"/>
+                <w:sz w:val="26"/>
+                <w:szCs w:val="32"/>
+                <w:highlight w:val="green"/>
+              </w:rPr>
+              <w:t>–</w:t>
+            </w:r>
+            <w:r>
+              <w:rPr>
+                <w:rFonts w:ascii="BRH Malayalam Extra" w:hAnsi="BRH Malayalam Extra" w:cs="BRH Malayalam Extra"/>
+                <w:color w:val="000000"/>
+                <w:sz w:val="32"/>
+                <w:szCs w:val="32"/>
+              </w:rPr>
+              <w:t xml:space="preserve"> ||</w:t>
+            </w:r>
+          </w:p>
+          <w:p>
+            <w:pPr>
+              <w:widowControl w:val="0"/>
+              <w:autoSpaceDE w:val="0"/>
+              <w:autoSpaceDN w:val="0"/>
+              <w:adjustRightInd w:val="0"/>
+              <w:spacing w:before="0" w:line="240" w:lineRule="auto"/>
+              <w:rPr>
+                <w:rFonts w:ascii="BRH Malayalam Extra" w:hAnsi="BRH Malayalam Extra" w:cs="BRH Malayalam Extra"/>
+                <w:color w:val="000000"/>
+                <w:sz w:val="32"/>
+                <w:szCs w:val="32"/>
+              </w:rPr>
+            </w:pPr>
+            <w:r>
+              <w:rPr>
+                <w:rFonts w:ascii="BRH Malayalam Extra" w:hAnsi="BRH Malayalam Extra" w:cs="BRH Malayalam Extra"/>
+                <w:color w:val="000000"/>
+                <w:sz w:val="32"/>
+                <w:szCs w:val="32"/>
+              </w:rPr>
+              <w:t>A</w:t>
+            </w:r>
+            <w:r>
+              <w:rPr>
+                <w:rFonts w:ascii="BRH Malayalam Extra" w:hAnsi="BRH Malayalam Extra" w:cs="BRH Malayalam Extra"/>
+                <w:color w:val="000000"/>
+                <w:sz w:val="26"/>
+                <w:szCs w:val="32"/>
+              </w:rPr>
+              <w:t>–</w:t>
+            </w:r>
+            <w:r>
+              <w:rPr>
+                <w:rFonts w:ascii="BRH Malayalam Extra" w:hAnsi="BRH Malayalam Extra" w:cs="BRH Malayalam Extra"/>
+                <w:color w:val="000000"/>
+                <w:sz w:val="32"/>
+                <w:szCs w:val="32"/>
+              </w:rPr>
+              <w:t>sôy©. jx¥i</w:t>
+            </w:r>
+            <w:r>
+              <w:rPr>
+                <w:rFonts w:ascii="BRH Malayalam Extra" w:hAnsi="BRH Malayalam Extra" w:cs="BRH Malayalam Extra"/>
+                <w:color w:val="000000"/>
+                <w:sz w:val="26"/>
+                <w:szCs w:val="32"/>
+              </w:rPr>
+              <w:t>–</w:t>
+            </w:r>
+            <w:r>
+              <w:rPr>
+                <w:rFonts w:ascii="BRH Malayalam Extra" w:hAnsi="BRH Malayalam Extra" w:cs="BRH Malayalam Extra"/>
+                <w:color w:val="000000"/>
+                <w:sz w:val="32"/>
+                <w:szCs w:val="32"/>
+              </w:rPr>
+              <w:t xml:space="preserve"> jx¥i— A</w:t>
+            </w:r>
+            <w:r>
+              <w:rPr>
+                <w:rFonts w:ascii="BRH Malayalam Extra" w:hAnsi="BRH Malayalam Extra" w:cs="BRH Malayalam Extra"/>
+                <w:color w:val="000000"/>
+                <w:sz w:val="26"/>
+                <w:szCs w:val="32"/>
+              </w:rPr>
+              <w:t>–</w:t>
+            </w:r>
+            <w:r>
+              <w:rPr>
+                <w:rFonts w:ascii="BRH Malayalam Extra" w:hAnsi="BRH Malayalam Extra" w:cs="BRH Malayalam Extra"/>
+                <w:color w:val="000000"/>
+                <w:sz w:val="32"/>
+                <w:szCs w:val="32"/>
+              </w:rPr>
+              <w:t>sôy© d</w:t>
+            </w:r>
+            <w:r>
+              <w:rPr>
+                <w:rFonts w:ascii="BRH Malayalam Extra" w:hAnsi="BRH Malayalam Extra" w:cs="BRH Malayalam Extra"/>
+                <w:color w:val="000000"/>
+                <w:sz w:val="26"/>
+                <w:szCs w:val="32"/>
+              </w:rPr>
+              <w:t>–</w:t>
+            </w:r>
+            <w:r>
+              <w:rPr>
+                <w:rFonts w:ascii="BRH Malayalam Extra" w:hAnsi="BRH Malayalam Extra" w:cs="BRH Malayalam Extra"/>
+                <w:color w:val="000000"/>
+                <w:sz w:val="32"/>
+                <w:szCs w:val="32"/>
+              </w:rPr>
+              <w:t>sôy©. jx¥i— p£r</w:t>
+            </w:r>
+            <w:r>
+              <w:rPr>
+                <w:rFonts w:ascii="BRH Malayalam Extra" w:hAnsi="BRH Malayalam Extra" w:cs="BRH Malayalam Extra"/>
+                <w:color w:val="000000"/>
+                <w:sz w:val="32"/>
+                <w:szCs w:val="32"/>
+                <w:highlight w:val="green"/>
+              </w:rPr>
+              <w:t>Yûs¢</w:t>
+            </w:r>
+            <w:r>
+              <w:rPr>
+                <w:rFonts w:ascii="BRH Malayalam Extra" w:hAnsi="BRH Malayalam Extra" w:cs="BRH Malayalam Extra"/>
+                <w:color w:val="000000"/>
+                <w:sz w:val="26"/>
+                <w:szCs w:val="32"/>
+                <w:highlight w:val="green"/>
+              </w:rPr>
+              <w:t>–</w:t>
+            </w:r>
+            <w:r>
+              <w:rPr>
+                <w:rFonts w:ascii="BRH Malayalam Extra" w:hAnsi="BRH Malayalam Extra" w:cs="BRH Malayalam Extra"/>
+                <w:color w:val="000000"/>
+                <w:sz w:val="32"/>
+                <w:szCs w:val="32"/>
+              </w:rPr>
+              <w:t xml:space="preserve"> </w:t>
+            </w:r>
+            <w:r>
+              <w:rPr>
+                <w:rFonts w:ascii="BRH Malayalam Extra" w:hAnsi="BRH Malayalam Extra" w:cs="BRH Malayalam Extra"/>
+                <w:color w:val="000000"/>
+                <w:sz w:val="32"/>
+                <w:szCs w:val="32"/>
+                <w:highlight w:val="green"/>
+              </w:rPr>
+              <w:t>p£</w:t>
+            </w:r>
+            <w:r>
+              <w:rPr>
+                <w:rFonts w:ascii="BRH Malayalam Extra" w:hAnsi="BRH Malayalam Extra" w:cs="BRH Malayalam Extra"/>
+                <w:color w:val="000000"/>
+                <w:sz w:val="32"/>
+                <w:szCs w:val="32"/>
+              </w:rPr>
+              <w:t>r</w:t>
+            </w:r>
+            <w:r>
+              <w:rPr>
+                <w:rFonts w:ascii="BRH Malayalam Extra" w:hAnsi="BRH Malayalam Extra" w:cs="BRH Malayalam Extra"/>
+                <w:color w:val="000000"/>
+                <w:sz w:val="32"/>
+                <w:szCs w:val="32"/>
+                <w:highlight w:val="green"/>
+              </w:rPr>
+              <w:t>Yûs¢</w:t>
+            </w:r>
+            <w:r>
+              <w:rPr>
+                <w:rFonts w:ascii="BRH Malayalam Extra" w:hAnsi="BRH Malayalam Extra" w:cs="BRH Malayalam Extra"/>
+                <w:color w:val="000000"/>
+                <w:sz w:val="26"/>
+                <w:szCs w:val="32"/>
+                <w:highlight w:val="yellow"/>
+              </w:rPr>
+              <w:t>–</w:t>
+            </w:r>
+            <w:r>
+              <w:rPr>
+                <w:rFonts w:ascii="BRH Malayalam Extra" w:hAnsi="BRH Malayalam Extra" w:cs="BRH Malayalam Extra"/>
+                <w:color w:val="000000"/>
+                <w:sz w:val="32"/>
+                <w:szCs w:val="32"/>
+              </w:rPr>
+              <w:t xml:space="preserve"> jx¥i— A</w:t>
+            </w:r>
+            <w:r>
+              <w:rPr>
+                <w:rFonts w:ascii="BRH Malayalam Extra" w:hAnsi="BRH Malayalam Extra" w:cs="BRH Malayalam Extra"/>
+                <w:color w:val="000000"/>
+                <w:sz w:val="26"/>
+                <w:szCs w:val="32"/>
+              </w:rPr>
+              <w:t>–</w:t>
+            </w:r>
+            <w:r>
+              <w:rPr>
+                <w:rFonts w:ascii="BRH Malayalam Extra" w:hAnsi="BRH Malayalam Extra" w:cs="BRH Malayalam Extra"/>
+                <w:color w:val="000000"/>
+                <w:sz w:val="32"/>
+                <w:szCs w:val="32"/>
+              </w:rPr>
+              <w:t>sôy© d</w:t>
+            </w:r>
+            <w:r>
+              <w:rPr>
+                <w:rFonts w:ascii="BRH Malayalam Extra" w:hAnsi="BRH Malayalam Extra" w:cs="BRH Malayalam Extra"/>
+                <w:color w:val="000000"/>
+                <w:sz w:val="26"/>
+                <w:szCs w:val="32"/>
+              </w:rPr>
+              <w:t>–</w:t>
+            </w:r>
+            <w:r>
+              <w:rPr>
+                <w:rFonts w:ascii="BRH Malayalam Extra" w:hAnsi="BRH Malayalam Extra" w:cs="BRH Malayalam Extra"/>
+                <w:color w:val="000000"/>
+                <w:sz w:val="32"/>
+                <w:szCs w:val="32"/>
+              </w:rPr>
+              <w:t>sôy©. jx¥i— p£r</w:t>
+            </w:r>
+            <w:r>
+              <w:rPr>
+                <w:rFonts w:ascii="BRH Malayalam Extra" w:hAnsi="BRH Malayalam Extra" w:cs="BRH Malayalam Extra"/>
+                <w:color w:val="000000"/>
+                <w:sz w:val="32"/>
+                <w:szCs w:val="32"/>
+                <w:highlight w:val="green"/>
+              </w:rPr>
+              <w:t>Yû</w:t>
+            </w:r>
+            <w:r>
+              <w:rPr>
+                <w:rFonts w:ascii="BRH Malayalam Extra" w:hAnsi="BRH Malayalam Extra" w:cs="BRH Malayalam Extra"/>
+                <w:color w:val="000000"/>
+                <w:sz w:val="32"/>
+                <w:szCs w:val="32"/>
+              </w:rPr>
+              <w:t xml:space="preserve">s¢ | </w:t>
+            </w:r>
+          </w:p>
+          <w:p>
+            <w:pPr>
+              <w:widowControl w:val="0"/>
+              <w:autoSpaceDE w:val="0"/>
+              <w:autoSpaceDN w:val="0"/>
+              <w:adjustRightInd w:val="0"/>
+              <w:spacing w:before="0" w:line="240" w:lineRule="auto"/>
+              <w:rPr>
+                <w:rFonts w:ascii="BRH Malayalam Extra" w:hAnsi="BRH Malayalam Extra" w:cs="BRH Malayalam Extra"/>
+                <w:color w:val="000000"/>
+                <w:sz w:val="32"/>
+                <w:szCs w:val="32"/>
+              </w:rPr>
+            </w:pPr>
+            <w:r>
+              <w:rPr>
+                <w:rFonts w:cs="BRH Malayalam Extra"/>
+                <w:color w:val="000000"/>
+                <w:szCs w:val="32"/>
+              </w:rPr>
+              <w:t>39</w:t>
+            </w:r>
+            <w:r>
+              <w:rPr>
+                <w:rFonts w:ascii="BRH Malayalam Extra" w:hAnsi="BRH Malayalam Extra" w:cs="BRH Malayalam Extra"/>
+                <w:color w:val="000000"/>
+                <w:sz w:val="32"/>
+                <w:szCs w:val="32"/>
+              </w:rPr>
+              <w:t>)</w:t>
+            </w:r>
+            <w:r>
+              <w:rPr>
+                <w:rFonts w:ascii="BRH Malayalam Extra" w:hAnsi="BRH Malayalam Extra" w:cs="BRH Malayalam Extra"/>
+                <w:color w:val="000000"/>
+                <w:sz w:val="32"/>
+                <w:szCs w:val="32"/>
+              </w:rPr>
+              <w:tab/>
+            </w:r>
+            <w:r>
+              <w:rPr>
+                <w:rFonts w:cs="BRH Malayalam Extra"/>
+                <w:color w:val="000000"/>
+                <w:szCs w:val="32"/>
+              </w:rPr>
+              <w:t>4</w:t>
+            </w:r>
+            <w:r>
+              <w:rPr>
+                <w:rFonts w:ascii="BRH Malayalam Extra" w:hAnsi="BRH Malayalam Extra" w:cs="BRH Malayalam Extra"/>
+                <w:color w:val="000000"/>
+                <w:sz w:val="32"/>
+                <w:szCs w:val="32"/>
+              </w:rPr>
+              <w:t>.</w:t>
+            </w:r>
+            <w:r>
+              <w:rPr>
+                <w:rFonts w:cs="BRH Malayalam Extra"/>
+                <w:color w:val="000000"/>
+                <w:szCs w:val="32"/>
+              </w:rPr>
+              <w:t>1</w:t>
+            </w:r>
+            <w:r>
+              <w:rPr>
+                <w:rFonts w:ascii="BRH Malayalam Extra" w:hAnsi="BRH Malayalam Extra" w:cs="BRH Malayalam Extra"/>
+                <w:color w:val="000000"/>
+                <w:sz w:val="32"/>
+                <w:szCs w:val="32"/>
+              </w:rPr>
+              <w:t>.</w:t>
+            </w:r>
+            <w:r>
+              <w:rPr>
+                <w:rFonts w:cs="BRH Malayalam Extra"/>
+                <w:color w:val="000000"/>
+                <w:szCs w:val="32"/>
+              </w:rPr>
+              <w:t>2</w:t>
+            </w:r>
+            <w:r>
+              <w:rPr>
+                <w:rFonts w:ascii="BRH Malayalam Extra" w:hAnsi="BRH Malayalam Extra" w:cs="BRH Malayalam Extra"/>
+                <w:color w:val="000000"/>
+                <w:sz w:val="32"/>
+                <w:szCs w:val="32"/>
+              </w:rPr>
+              <w:t>.</w:t>
+            </w:r>
+            <w:r>
+              <w:rPr>
+                <w:rFonts w:cs="BRH Malayalam Extra"/>
+                <w:color w:val="000000"/>
+                <w:szCs w:val="32"/>
+              </w:rPr>
+              <w:t>1</w:t>
+            </w:r>
+            <w:r>
+              <w:rPr>
+                <w:rFonts w:ascii="BRH Malayalam Extra" w:hAnsi="BRH Malayalam Extra" w:cs="BRH Malayalam Extra"/>
+                <w:color w:val="000000"/>
+                <w:sz w:val="32"/>
+                <w:szCs w:val="32"/>
+              </w:rPr>
+              <w:t>(</w:t>
+            </w:r>
+            <w:r>
+              <w:rPr>
+                <w:rFonts w:cs="BRH Malayalam Extra"/>
+                <w:color w:val="000000"/>
+                <w:szCs w:val="32"/>
+              </w:rPr>
+              <w:t>38</w:t>
+            </w:r>
+            <w:r>
+              <w:rPr>
+                <w:rFonts w:ascii="BRH Malayalam Extra" w:hAnsi="BRH Malayalam Extra" w:cs="BRH Malayalam Extra"/>
+                <w:color w:val="000000"/>
+                <w:sz w:val="32"/>
+                <w:szCs w:val="32"/>
+              </w:rPr>
+              <w:t>)- jx¥i˜ | p£</w:t>
+            </w:r>
+            <w:r>
+              <w:rPr>
+                <w:rFonts w:ascii="BRH Malayalam Extra" w:hAnsi="BRH Malayalam Extra" w:cs="BRH Malayalam Extra"/>
+                <w:color w:val="000000"/>
+                <w:sz w:val="26"/>
+                <w:szCs w:val="32"/>
+              </w:rPr>
+              <w:t>–</w:t>
+            </w:r>
+            <w:r>
+              <w:rPr>
+                <w:rFonts w:ascii="BRH Malayalam Extra" w:hAnsi="BRH Malayalam Extra" w:cs="BRH Malayalam Extra"/>
+                <w:color w:val="000000"/>
+                <w:sz w:val="32"/>
+                <w:szCs w:val="32"/>
+              </w:rPr>
+              <w:t>r</w:t>
+            </w:r>
+            <w:r>
+              <w:rPr>
+                <w:rFonts w:ascii="BRH Malayalam Extra" w:hAnsi="BRH Malayalam Extra" w:cs="BRH Malayalam Extra"/>
+                <w:color w:val="000000"/>
+                <w:sz w:val="26"/>
+                <w:szCs w:val="32"/>
+              </w:rPr>
+              <w:t>–</w:t>
+            </w:r>
+            <w:r>
+              <w:rPr>
+                <w:rFonts w:ascii="BRH Malayalam Extra" w:hAnsi="BRH Malayalam Extra" w:cs="BRH Malayalam Extra"/>
+                <w:color w:val="000000"/>
+                <w:sz w:val="32"/>
+                <w:szCs w:val="32"/>
+              </w:rPr>
+              <w:t>Yû</w:t>
+            </w:r>
+            <w:r>
+              <w:rPr>
+                <w:rFonts w:ascii="BRH Malayalam Extra" w:hAnsi="BRH Malayalam Extra" w:cs="BRH Malayalam Extra"/>
+                <w:color w:val="000000"/>
+                <w:sz w:val="26"/>
+                <w:szCs w:val="32"/>
+              </w:rPr>
+              <w:t>–</w:t>
+            </w:r>
+            <w:r>
+              <w:rPr>
+                <w:rFonts w:ascii="BRH Malayalam Extra" w:hAnsi="BRH Malayalam Extra" w:cs="BRH Malayalam Extra"/>
+                <w:color w:val="000000"/>
+                <w:sz w:val="32"/>
+                <w:szCs w:val="32"/>
+                <w:highlight w:val="green"/>
+              </w:rPr>
+              <w:t>s¢</w:t>
+            </w:r>
+            <w:r>
+              <w:rPr>
+                <w:rFonts w:ascii="BRH Malayalam Extra" w:hAnsi="BRH Malayalam Extra" w:cs="BRH Malayalam Extra"/>
+                <w:color w:val="000000"/>
+                <w:sz w:val="26"/>
+                <w:szCs w:val="32"/>
+                <w:highlight w:val="green"/>
+              </w:rPr>
+              <w:t>–</w:t>
+            </w:r>
+            <w:r>
+              <w:rPr>
+                <w:rFonts w:ascii="BRH Malayalam Extra" w:hAnsi="BRH Malayalam Extra" w:cs="BRH Malayalam Extra"/>
+                <w:color w:val="000000"/>
+                <w:sz w:val="32"/>
+                <w:szCs w:val="32"/>
+              </w:rPr>
+              <w:t xml:space="preserve"> ||</w:t>
+            </w:r>
+          </w:p>
+          <w:p>
+            <w:pPr>
+              <w:widowControl w:val="0"/>
+              <w:autoSpaceDE w:val="0"/>
+              <w:autoSpaceDN w:val="0"/>
+              <w:adjustRightInd w:val="0"/>
+              <w:spacing w:before="0" w:line="240" w:lineRule="auto"/>
+              <w:rPr>
+                <w:rFonts w:ascii="BRH Malayalam Extra" w:hAnsi="BRH Malayalam Extra" w:cs="BRH Malayalam Extra"/>
+                <w:color w:val="000000"/>
+                <w:sz w:val="32"/>
+                <w:szCs w:val="32"/>
+              </w:rPr>
+            </w:pPr>
+            <w:r>
+              <w:rPr>
+                <w:rFonts w:ascii="BRH Malayalam Extra" w:hAnsi="BRH Malayalam Extra" w:cs="BRH Malayalam Extra"/>
+                <w:color w:val="000000"/>
+                <w:sz w:val="32"/>
+                <w:szCs w:val="32"/>
+              </w:rPr>
+              <w:t>jx¥i— p£r</w:t>
+            </w:r>
+            <w:r>
+              <w:rPr>
+                <w:rFonts w:ascii="BRH Malayalam Extra" w:hAnsi="BRH Malayalam Extra" w:cs="BRH Malayalam Extra"/>
+                <w:color w:val="000000"/>
+                <w:sz w:val="32"/>
+                <w:szCs w:val="32"/>
+                <w:highlight w:val="green"/>
+              </w:rPr>
+              <w:t>Yûs¢</w:t>
+            </w:r>
+            <w:r>
+              <w:rPr>
+                <w:rFonts w:ascii="BRH Malayalam Extra" w:hAnsi="BRH Malayalam Extra" w:cs="BRH Malayalam Extra"/>
+                <w:color w:val="000000"/>
+                <w:sz w:val="26"/>
+                <w:szCs w:val="32"/>
+                <w:highlight w:val="yellow"/>
+              </w:rPr>
+              <w:t>–</w:t>
+            </w:r>
+            <w:r>
+              <w:rPr>
+                <w:rFonts w:ascii="BRH Malayalam Extra" w:hAnsi="BRH Malayalam Extra" w:cs="BRH Malayalam Extra"/>
+                <w:color w:val="000000"/>
+                <w:sz w:val="32"/>
+                <w:szCs w:val="32"/>
+              </w:rPr>
+              <w:t xml:space="preserve"> </w:t>
+            </w:r>
+            <w:r>
+              <w:rPr>
+                <w:rFonts w:ascii="BRH Malayalam Extra" w:hAnsi="BRH Malayalam Extra" w:cs="BRH Malayalam Extra"/>
+                <w:color w:val="000000"/>
+                <w:sz w:val="32"/>
+                <w:szCs w:val="32"/>
+                <w:highlight w:val="green"/>
+              </w:rPr>
+              <w:t>p£</w:t>
+            </w:r>
+            <w:r>
+              <w:rPr>
+                <w:rFonts w:ascii="BRH Malayalam Extra" w:hAnsi="BRH Malayalam Extra" w:cs="BRH Malayalam Extra"/>
+                <w:color w:val="000000"/>
+                <w:sz w:val="32"/>
+                <w:szCs w:val="32"/>
+              </w:rPr>
+              <w:t>r</w:t>
+            </w:r>
+            <w:r>
+              <w:rPr>
+                <w:rFonts w:ascii="BRH Malayalam Extra" w:hAnsi="BRH Malayalam Extra" w:cs="BRH Malayalam Extra"/>
+                <w:color w:val="000000"/>
+                <w:sz w:val="32"/>
+                <w:szCs w:val="32"/>
+                <w:highlight w:val="green"/>
+              </w:rPr>
+              <w:t>Yûs¢</w:t>
+            </w:r>
+            <w:r>
+              <w:rPr>
+                <w:rFonts w:ascii="BRH Malayalam Extra" w:hAnsi="BRH Malayalam Extra" w:cs="BRH Malayalam Extra"/>
+                <w:color w:val="000000"/>
+                <w:sz w:val="26"/>
+                <w:szCs w:val="32"/>
+                <w:highlight w:val="green"/>
+              </w:rPr>
+              <w:t>–</w:t>
+            </w:r>
+            <w:r>
+              <w:rPr>
+                <w:rFonts w:ascii="BRH Malayalam Extra" w:hAnsi="BRH Malayalam Extra" w:cs="BRH Malayalam Extra"/>
+                <w:color w:val="000000"/>
+                <w:sz w:val="32"/>
+                <w:szCs w:val="32"/>
+              </w:rPr>
+              <w:t xml:space="preserve"> jx¥i</w:t>
+            </w:r>
+            <w:r>
+              <w:rPr>
+                <w:rFonts w:ascii="BRH Malayalam Extra" w:hAnsi="BRH Malayalam Extra" w:cs="BRH Malayalam Extra"/>
+                <w:color w:val="000000"/>
+                <w:sz w:val="26"/>
+                <w:szCs w:val="32"/>
+              </w:rPr>
+              <w:t>–</w:t>
+            </w:r>
+            <w:r>
+              <w:rPr>
+                <w:rFonts w:ascii="BRH Malayalam Extra" w:hAnsi="BRH Malayalam Extra" w:cs="BRH Malayalam Extra"/>
+                <w:color w:val="000000"/>
+                <w:sz w:val="32"/>
+                <w:szCs w:val="32"/>
+              </w:rPr>
+              <w:t xml:space="preserve"> jx¥i— p£r</w:t>
+            </w:r>
+            <w:r>
+              <w:rPr>
+                <w:rFonts w:ascii="BRH Malayalam Extra" w:hAnsi="BRH Malayalam Extra" w:cs="BRH Malayalam Extra"/>
+                <w:color w:val="000000"/>
+                <w:sz w:val="32"/>
+                <w:szCs w:val="32"/>
+                <w:highlight w:val="green"/>
+              </w:rPr>
+              <w:t>Yûs¢</w:t>
+            </w:r>
+            <w:r>
+              <w:rPr>
+                <w:rFonts w:ascii="BRH Malayalam Extra" w:hAnsi="BRH Malayalam Extra" w:cs="BRH Malayalam Extra"/>
+                <w:color w:val="000000"/>
+                <w:sz w:val="32"/>
+                <w:szCs w:val="32"/>
+              </w:rPr>
+              <w:t xml:space="preserve"> | </w:t>
+            </w:r>
+          </w:p>
+          <w:p>
+            <w:pPr>
+              <w:widowControl w:val="0"/>
+              <w:autoSpaceDE w:val="0"/>
+              <w:autoSpaceDN w:val="0"/>
+              <w:adjustRightInd w:val="0"/>
+              <w:spacing w:before="0" w:line="240" w:lineRule="auto"/>
+              <w:rPr>
+                <w:rFonts w:ascii="BRH Malayalam Extra" w:hAnsi="BRH Malayalam Extra" w:cs="BRH Malayalam Extra"/>
+                <w:color w:val="000000"/>
+                <w:sz w:val="32"/>
+                <w:szCs w:val="32"/>
+              </w:rPr>
+            </w:pPr>
+            <w:r>
+              <w:rPr>
+                <w:rFonts w:cs="BRH Malayalam Extra"/>
+                <w:color w:val="000000"/>
+                <w:szCs w:val="32"/>
+              </w:rPr>
+              <w:t>40</w:t>
+            </w:r>
+            <w:r>
+              <w:rPr>
+                <w:rFonts w:ascii="BRH Malayalam Extra" w:hAnsi="BRH Malayalam Extra" w:cs="BRH Malayalam Extra"/>
+                <w:color w:val="000000"/>
+                <w:sz w:val="32"/>
+                <w:szCs w:val="32"/>
+              </w:rPr>
+              <w:t>)</w:t>
+            </w:r>
+            <w:r>
+              <w:rPr>
+                <w:rFonts w:ascii="BRH Malayalam Extra" w:hAnsi="BRH Malayalam Extra" w:cs="BRH Malayalam Extra"/>
+                <w:color w:val="000000"/>
+                <w:sz w:val="32"/>
+                <w:szCs w:val="32"/>
+              </w:rPr>
+              <w:tab/>
+            </w:r>
+            <w:r>
+              <w:rPr>
+                <w:rFonts w:cs="BRH Malayalam Extra"/>
+                <w:color w:val="000000"/>
+                <w:szCs w:val="32"/>
+              </w:rPr>
+              <w:t>4</w:t>
+            </w:r>
+            <w:r>
+              <w:rPr>
+                <w:rFonts w:ascii="BRH Malayalam Extra" w:hAnsi="BRH Malayalam Extra" w:cs="BRH Malayalam Extra"/>
+                <w:color w:val="000000"/>
+                <w:sz w:val="32"/>
+                <w:szCs w:val="32"/>
+              </w:rPr>
+              <w:t>.</w:t>
+            </w:r>
+            <w:r>
+              <w:rPr>
+                <w:rFonts w:cs="BRH Malayalam Extra"/>
+                <w:color w:val="000000"/>
+                <w:szCs w:val="32"/>
+              </w:rPr>
+              <w:t>1</w:t>
+            </w:r>
+            <w:r>
+              <w:rPr>
+                <w:rFonts w:ascii="BRH Malayalam Extra" w:hAnsi="BRH Malayalam Extra" w:cs="BRH Malayalam Extra"/>
+                <w:color w:val="000000"/>
+                <w:sz w:val="32"/>
+                <w:szCs w:val="32"/>
+              </w:rPr>
+              <w:t>.</w:t>
+            </w:r>
+            <w:r>
+              <w:rPr>
+                <w:rFonts w:cs="BRH Malayalam Extra"/>
+                <w:color w:val="000000"/>
+                <w:szCs w:val="32"/>
+              </w:rPr>
+              <w:t>2</w:t>
+            </w:r>
+            <w:r>
+              <w:rPr>
+                <w:rFonts w:ascii="BRH Malayalam Extra" w:hAnsi="BRH Malayalam Extra" w:cs="BRH Malayalam Extra"/>
+                <w:color w:val="000000"/>
+                <w:sz w:val="32"/>
+                <w:szCs w:val="32"/>
+              </w:rPr>
+              <w:t>.</w:t>
+            </w:r>
+            <w:r>
+              <w:rPr>
+                <w:rFonts w:cs="BRH Malayalam Extra"/>
+                <w:color w:val="000000"/>
+                <w:szCs w:val="32"/>
+              </w:rPr>
+              <w:t>1</w:t>
+            </w:r>
+            <w:r>
+              <w:rPr>
+                <w:rFonts w:ascii="BRH Malayalam Extra" w:hAnsi="BRH Malayalam Extra" w:cs="BRH Malayalam Extra"/>
+                <w:color w:val="000000"/>
+                <w:sz w:val="32"/>
+                <w:szCs w:val="32"/>
+              </w:rPr>
+              <w:t>(</w:t>
+            </w:r>
+            <w:r>
+              <w:rPr>
+                <w:rFonts w:cs="BRH Malayalam Extra"/>
+                <w:color w:val="000000"/>
+                <w:szCs w:val="32"/>
+              </w:rPr>
+              <w:t>39</w:t>
+            </w:r>
+            <w:r>
+              <w:rPr>
+                <w:rFonts w:ascii="BRH Malayalam Extra" w:hAnsi="BRH Malayalam Extra" w:cs="BRH Malayalam Extra"/>
+                <w:color w:val="000000"/>
+                <w:sz w:val="32"/>
+                <w:szCs w:val="32"/>
+              </w:rPr>
+              <w:t>)- p£</w:t>
+            </w:r>
+            <w:r>
+              <w:rPr>
+                <w:rFonts w:ascii="BRH Malayalam Extra" w:hAnsi="BRH Malayalam Extra" w:cs="BRH Malayalam Extra"/>
+                <w:color w:val="000000"/>
+                <w:sz w:val="26"/>
+                <w:szCs w:val="32"/>
+              </w:rPr>
+              <w:t>–</w:t>
+            </w:r>
+            <w:r>
+              <w:rPr>
+                <w:rFonts w:ascii="BRH Malayalam Extra" w:hAnsi="BRH Malayalam Extra" w:cs="BRH Malayalam Extra"/>
+                <w:color w:val="000000"/>
+                <w:sz w:val="32"/>
+                <w:szCs w:val="32"/>
+              </w:rPr>
+              <w:t>r</w:t>
+            </w:r>
+            <w:r>
+              <w:rPr>
+                <w:rFonts w:ascii="BRH Malayalam Extra" w:hAnsi="BRH Malayalam Extra" w:cs="BRH Malayalam Extra"/>
+                <w:color w:val="000000"/>
+                <w:sz w:val="26"/>
+                <w:szCs w:val="32"/>
+              </w:rPr>
+              <w:t>–</w:t>
+            </w:r>
+            <w:r>
+              <w:rPr>
+                <w:rFonts w:ascii="BRH Malayalam Extra" w:hAnsi="BRH Malayalam Extra" w:cs="BRH Malayalam Extra"/>
+                <w:color w:val="000000"/>
+                <w:sz w:val="32"/>
+                <w:szCs w:val="32"/>
+              </w:rPr>
+              <w:t>Yû</w:t>
+            </w:r>
+            <w:r>
+              <w:rPr>
+                <w:rFonts w:ascii="BRH Malayalam Extra" w:hAnsi="BRH Malayalam Extra" w:cs="BRH Malayalam Extra"/>
+                <w:color w:val="000000"/>
+                <w:sz w:val="26"/>
+                <w:szCs w:val="32"/>
+              </w:rPr>
+              <w:t>–</w:t>
+            </w:r>
+            <w:r>
+              <w:rPr>
+                <w:rFonts w:ascii="BRH Malayalam Extra" w:hAnsi="BRH Malayalam Extra" w:cs="BRH Malayalam Extra"/>
+                <w:color w:val="000000"/>
+                <w:sz w:val="32"/>
+                <w:szCs w:val="32"/>
+                <w:highlight w:val="green"/>
+              </w:rPr>
+              <w:t>s¢</w:t>
+            </w:r>
+            <w:r>
+              <w:rPr>
+                <w:rFonts w:ascii="BRH Malayalam Extra" w:hAnsi="BRH Malayalam Extra" w:cs="BRH Malayalam Extra"/>
+                <w:color w:val="000000"/>
+                <w:sz w:val="26"/>
+                <w:szCs w:val="32"/>
+              </w:rPr>
+              <w:t>–</w:t>
+            </w:r>
+            <w:r>
+              <w:rPr>
+                <w:rFonts w:ascii="BRH Malayalam Extra" w:hAnsi="BRH Malayalam Extra" w:cs="BRH Malayalam Extra"/>
+                <w:color w:val="000000"/>
+                <w:sz w:val="32"/>
+                <w:szCs w:val="32"/>
+              </w:rPr>
+              <w:t xml:space="preserve"> ||</w:t>
+            </w:r>
+          </w:p>
+          <w:p>
+            <w:pPr>
+              <w:widowControl w:val="0"/>
+              <w:autoSpaceDE w:val="0"/>
+              <w:autoSpaceDN w:val="0"/>
+              <w:adjustRightInd w:val="0"/>
+              <w:spacing w:before="0" w:line="240" w:lineRule="auto"/>
+              <w:rPr>
+                <w:rFonts w:ascii="BRH Malayalam Extra" w:hAnsi="BRH Malayalam Extra" w:cs="BRH Malayalam Extra"/>
+                <w:color w:val="000000"/>
+                <w:sz w:val="32"/>
+                <w:szCs w:val="32"/>
+              </w:rPr>
+            </w:pPr>
+            <w:r>
+              <w:rPr>
+                <w:rFonts w:ascii="BRH Malayalam Extra" w:hAnsi="BRH Malayalam Extra" w:cs="BRH Malayalam Extra"/>
+                <w:color w:val="000000"/>
+                <w:sz w:val="32"/>
+                <w:szCs w:val="32"/>
+              </w:rPr>
+              <w:t>p£</w:t>
+            </w:r>
+            <w:r>
+              <w:rPr>
+                <w:rFonts w:ascii="BRH Malayalam Extra" w:hAnsi="BRH Malayalam Extra" w:cs="BRH Malayalam Extra"/>
+                <w:color w:val="000000"/>
+                <w:sz w:val="26"/>
+                <w:szCs w:val="32"/>
+              </w:rPr>
+              <w:t>–</w:t>
+            </w:r>
+            <w:r>
+              <w:rPr>
+                <w:rFonts w:ascii="BRH Malayalam Extra" w:hAnsi="BRH Malayalam Extra" w:cs="BRH Malayalam Extra"/>
+                <w:color w:val="000000"/>
+                <w:sz w:val="32"/>
+                <w:szCs w:val="32"/>
+              </w:rPr>
+              <w:t>r</w:t>
+            </w:r>
+            <w:r>
+              <w:rPr>
+                <w:rFonts w:ascii="BRH Malayalam Extra" w:hAnsi="BRH Malayalam Extra" w:cs="BRH Malayalam Extra"/>
+                <w:color w:val="000000"/>
+                <w:sz w:val="26"/>
+                <w:szCs w:val="32"/>
+              </w:rPr>
+              <w:t>–</w:t>
+            </w:r>
+            <w:r>
+              <w:rPr>
+                <w:rFonts w:ascii="BRH Malayalam Extra" w:hAnsi="BRH Malayalam Extra" w:cs="BRH Malayalam Extra"/>
+                <w:color w:val="000000"/>
+                <w:sz w:val="32"/>
+                <w:szCs w:val="32"/>
+              </w:rPr>
+              <w:t>Yû</w:t>
+            </w:r>
+            <w:r>
+              <w:rPr>
+                <w:rFonts w:ascii="BRH Malayalam Extra" w:hAnsi="BRH Malayalam Extra" w:cs="BRH Malayalam Extra"/>
+                <w:color w:val="000000"/>
+                <w:sz w:val="26"/>
+                <w:szCs w:val="32"/>
+              </w:rPr>
+              <w:t>–</w:t>
+            </w:r>
+            <w:r>
+              <w:rPr>
+                <w:rFonts w:ascii="BRH Malayalam Extra" w:hAnsi="BRH Malayalam Extra" w:cs="BRH Malayalam Extra"/>
+                <w:color w:val="000000"/>
+                <w:sz w:val="32"/>
+                <w:szCs w:val="32"/>
+              </w:rPr>
+              <w:t>s¢</w:t>
+            </w:r>
+            <w:r>
+              <w:rPr>
+                <w:rFonts w:ascii="BRH Malayalam Extra" w:hAnsi="BRH Malayalam Extra" w:cs="BRH Malayalam Extra"/>
+                <w:color w:val="000000"/>
+                <w:sz w:val="26"/>
+                <w:szCs w:val="32"/>
+              </w:rPr>
+              <w:t>–</w:t>
+            </w:r>
+            <w:r>
+              <w:rPr>
+                <w:rFonts w:ascii="BRH Malayalam Extra" w:hAnsi="BRH Malayalam Extra" w:cs="BRH Malayalam Extra"/>
+                <w:color w:val="000000"/>
+                <w:sz w:val="32"/>
+                <w:szCs w:val="32"/>
+              </w:rPr>
+              <w:t xml:space="preserve"> CZy— p£rY§ - p</w:t>
+            </w:r>
+            <w:r>
+              <w:rPr>
+                <w:rFonts w:ascii="BRH Malayalam Extra" w:hAnsi="BRH Malayalam Extra" w:cs="BRH Malayalam Extra"/>
+                <w:color w:val="000000"/>
+                <w:sz w:val="26"/>
+                <w:szCs w:val="32"/>
+              </w:rPr>
+              <w:t>–</w:t>
+            </w:r>
+            <w:r>
+              <w:rPr>
+                <w:rFonts w:ascii="BRH Malayalam Extra" w:hAnsi="BRH Malayalam Extra" w:cs="BRH Malayalam Extra"/>
+                <w:color w:val="000000"/>
+                <w:sz w:val="32"/>
+                <w:szCs w:val="32"/>
+              </w:rPr>
+              <w:t>s¢</w:t>
+            </w:r>
+            <w:r>
+              <w:rPr>
+                <w:rFonts w:ascii="BRH Malayalam Extra" w:hAnsi="BRH Malayalam Extra" w:cs="BRH Malayalam Extra"/>
+                <w:color w:val="000000"/>
+                <w:sz w:val="26"/>
+                <w:szCs w:val="32"/>
+              </w:rPr>
+              <w:t>–</w:t>
+            </w:r>
+            <w:r>
+              <w:rPr>
+                <w:rFonts w:ascii="BRH Malayalam Extra" w:hAnsi="BRH Malayalam Extra" w:cs="BRH Malayalam Extra"/>
+                <w:color w:val="000000"/>
+                <w:sz w:val="32"/>
+                <w:szCs w:val="32"/>
+              </w:rPr>
+              <w:t xml:space="preserve"> | </w:t>
+            </w:r>
+          </w:p>
+          <w:p>
+            <w:pPr>
+              <w:widowControl w:val="0"/>
+              <w:autoSpaceDE w:val="0"/>
+              <w:autoSpaceDN w:val="0"/>
+              <w:adjustRightInd w:val="0"/>
+              <w:spacing w:before="0" w:line="240" w:lineRule="auto"/>
+              <w:rPr>
+                <w:rFonts w:cs="BRH Malayalam Extra"/>
+                <w:color w:val="FF0000"/>
+                <w:szCs w:val="40"/>
+              </w:rPr>
+            </w:pPr>
+          </w:p>
+        </w:tc>
+      </w:tr>
+      <w:tr>
+        <w:trPr>
+          <w:trHeight w:val="1123"/>
+        </w:trPr>
+        <w:tc>
+          <w:tcPr>
+            <w:tcW w:w="7166" w:type="dxa"/>
+            <w:tcBorders>
+              <w:top w:val="single" w:sz="4" w:space="0" w:color="000000"/>
+              <w:left w:val="single" w:sz="4" w:space="0" w:color="000000"/>
+              <w:bottom w:val="single" w:sz="4" w:space="0" w:color="000000"/>
+              <w:right w:val="single" w:sz="4" w:space="0" w:color="000000"/>
+            </w:tcBorders>
+          </w:tcPr>
+          <w:p>
+            <w:pPr>
+              <w:widowControl w:val="0"/>
+              <w:autoSpaceDE w:val="0"/>
+              <w:autoSpaceDN w:val="0"/>
+              <w:adjustRightInd w:val="0"/>
+              <w:spacing w:before="0" w:line="240" w:lineRule="auto"/>
+              <w:rPr>
+                <w:rFonts w:ascii="BRH Malayalam Extra" w:hAnsi="BRH Malayalam Extra" w:cs="BRH Malayalam Extra"/>
+                <w:color w:val="000000"/>
+                <w:sz w:val="32"/>
+                <w:szCs w:val="32"/>
+              </w:rPr>
+            </w:pPr>
+            <w:r>
+              <w:rPr>
+                <w:rFonts w:cs="BRH Malayalam Extra"/>
+                <w:color w:val="000000"/>
+                <w:szCs w:val="32"/>
+              </w:rPr>
+              <w:t>14</w:t>
+            </w:r>
+            <w:r>
+              <w:rPr>
+                <w:rFonts w:ascii="BRH Malayalam Extra" w:hAnsi="BRH Malayalam Extra" w:cs="BRH Malayalam Extra"/>
+                <w:color w:val="000000"/>
+                <w:sz w:val="32"/>
+                <w:szCs w:val="32"/>
+              </w:rPr>
+              <w:t>)</w:t>
+            </w:r>
+            <w:r>
+              <w:rPr>
+                <w:rFonts w:ascii="BRH Malayalam Extra" w:hAnsi="BRH Malayalam Extra" w:cs="BRH Malayalam Extra"/>
+                <w:color w:val="000000"/>
+                <w:sz w:val="32"/>
+                <w:szCs w:val="32"/>
+              </w:rPr>
+              <w:tab/>
+            </w:r>
+            <w:r>
+              <w:rPr>
+                <w:rFonts w:cs="BRH Malayalam Extra"/>
+                <w:color w:val="000000"/>
+                <w:szCs w:val="32"/>
+              </w:rPr>
+              <w:t>4</w:t>
+            </w:r>
+            <w:r>
+              <w:rPr>
+                <w:rFonts w:ascii="BRH Malayalam Extra" w:hAnsi="BRH Malayalam Extra" w:cs="BRH Malayalam Extra"/>
+                <w:color w:val="000000"/>
+                <w:sz w:val="32"/>
+                <w:szCs w:val="32"/>
+              </w:rPr>
+              <w:t>.</w:t>
+            </w:r>
+            <w:r>
+              <w:rPr>
+                <w:rFonts w:cs="BRH Malayalam Extra"/>
+                <w:color w:val="000000"/>
+                <w:szCs w:val="32"/>
+              </w:rPr>
+              <w:t>1</w:t>
+            </w:r>
+            <w:r>
+              <w:rPr>
+                <w:rFonts w:ascii="BRH Malayalam Extra" w:hAnsi="BRH Malayalam Extra" w:cs="BRH Malayalam Extra"/>
+                <w:color w:val="000000"/>
+                <w:sz w:val="32"/>
+                <w:szCs w:val="32"/>
+              </w:rPr>
+              <w:t>.</w:t>
+            </w:r>
+            <w:r>
+              <w:rPr>
+                <w:rFonts w:cs="BRH Malayalam Extra"/>
+                <w:color w:val="000000"/>
+                <w:szCs w:val="32"/>
+              </w:rPr>
+              <w:t>4</w:t>
+            </w:r>
+            <w:r>
+              <w:rPr>
+                <w:rFonts w:ascii="BRH Malayalam Extra" w:hAnsi="BRH Malayalam Extra" w:cs="BRH Malayalam Extra"/>
+                <w:color w:val="000000"/>
+                <w:sz w:val="32"/>
+                <w:szCs w:val="32"/>
+              </w:rPr>
+              <w:t>.</w:t>
+            </w:r>
+            <w:r>
+              <w:rPr>
+                <w:rFonts w:cs="BRH Malayalam Extra"/>
+                <w:color w:val="000000"/>
+                <w:szCs w:val="32"/>
+              </w:rPr>
+              <w:t>3</w:t>
+            </w:r>
+            <w:r>
+              <w:rPr>
+                <w:rFonts w:ascii="BRH Malayalam Extra" w:hAnsi="BRH Malayalam Extra" w:cs="BRH Malayalam Extra"/>
+                <w:color w:val="000000"/>
+                <w:sz w:val="32"/>
+                <w:szCs w:val="32"/>
+              </w:rPr>
+              <w:t>(</w:t>
+            </w:r>
+            <w:r>
+              <w:rPr>
+                <w:rFonts w:cs="BRH Malayalam Extra"/>
+                <w:color w:val="000000"/>
+                <w:szCs w:val="32"/>
+              </w:rPr>
+              <w:t>12</w:t>
+            </w:r>
+            <w:r>
+              <w:rPr>
+                <w:rFonts w:ascii="BRH Malayalam Extra" w:hAnsi="BRH Malayalam Extra" w:cs="BRH Malayalam Extra"/>
+                <w:color w:val="000000"/>
+                <w:sz w:val="32"/>
+                <w:szCs w:val="32"/>
+              </w:rPr>
+              <w:t>)- pd</w:t>
+            </w:r>
+            <w:r>
+              <w:rPr>
+                <w:rFonts w:ascii="BRH Malayalam Extra" w:hAnsi="BRH Malayalam Extra" w:cs="BRH Malayalam Extra"/>
+                <w:color w:val="000000"/>
+                <w:sz w:val="26"/>
+                <w:szCs w:val="32"/>
+              </w:rPr>
+              <w:t>–</w:t>
+            </w:r>
+            <w:r>
+              <w:rPr>
+                <w:rFonts w:ascii="BRH Malayalam Extra" w:hAnsi="BRH Malayalam Extra" w:cs="BRH Malayalam Extra"/>
+                <w:color w:val="000000"/>
+                <w:sz w:val="32"/>
+                <w:szCs w:val="32"/>
+              </w:rPr>
+              <w:t>sðZz©— ||</w:t>
+            </w:r>
+          </w:p>
+          <w:p>
+            <w:pPr>
+              <w:widowControl w:val="0"/>
+              <w:autoSpaceDE w:val="0"/>
+              <w:autoSpaceDN w:val="0"/>
+              <w:adjustRightInd w:val="0"/>
+              <w:spacing w:before="0" w:line="240" w:lineRule="auto"/>
+              <w:rPr>
+                <w:rFonts w:cs="BRH Malayalam Extra"/>
+                <w:color w:val="FF0000"/>
+                <w:szCs w:val="40"/>
+              </w:rPr>
+            </w:pPr>
+            <w:r>
+              <w:rPr>
+                <w:rFonts w:ascii="BRH Malayalam Extra" w:hAnsi="BRH Malayalam Extra" w:cs="BRH Malayalam Extra"/>
+                <w:color w:val="000000"/>
+                <w:sz w:val="32"/>
+                <w:szCs w:val="32"/>
+              </w:rPr>
+              <w:t>pd</w:t>
+            </w:r>
+            <w:r>
+              <w:rPr>
+                <w:rFonts w:ascii="BRH Malayalam Extra" w:hAnsi="BRH Malayalam Extra" w:cs="BRH Malayalam Extra"/>
+                <w:color w:val="000000"/>
+                <w:sz w:val="26"/>
+                <w:szCs w:val="32"/>
+              </w:rPr>
+              <w:t>–</w:t>
+            </w:r>
+            <w:r>
+              <w:rPr>
+                <w:rFonts w:ascii="BRH Malayalam Extra" w:hAnsi="BRH Malayalam Extra" w:cs="BRH Malayalam Extra"/>
+                <w:color w:val="000000"/>
+                <w:sz w:val="32"/>
+                <w:szCs w:val="32"/>
+              </w:rPr>
+              <w:t>sðZz</w:t>
+            </w:r>
+            <w:r>
+              <w:rPr>
+                <w:rFonts w:ascii="BRH Malayalam Extra" w:hAnsi="BRH Malayalam Extra" w:cs="BRH Malayalam Extra"/>
+                <w:color w:val="000000"/>
+                <w:sz w:val="26"/>
+                <w:szCs w:val="32"/>
+              </w:rPr>
+              <w:t>–</w:t>
+            </w:r>
+            <w:r>
+              <w:rPr>
+                <w:rFonts w:ascii="BRH Malayalam Extra" w:hAnsi="BRH Malayalam Extra" w:cs="BRH Malayalam Extra"/>
+                <w:color w:val="000000"/>
+                <w:sz w:val="32"/>
+                <w:szCs w:val="32"/>
+              </w:rPr>
+              <w:t>dy</w:t>
+            </w:r>
+            <w:r>
+              <w:rPr>
+                <w:rFonts w:ascii="BRH Malayalam Extra" w:hAnsi="BRH Malayalam Extra" w:cs="BRH Malayalam Extra"/>
+                <w:color w:val="000000"/>
+                <w:sz w:val="32"/>
+                <w:szCs w:val="32"/>
+                <w:highlight w:val="yellow"/>
+              </w:rPr>
+              <w:t>Zy</w:t>
+            </w:r>
+            <w:r>
+              <w:rPr>
+                <w:rFonts w:ascii="BRH Malayalam Extra" w:hAnsi="BRH Malayalam Extra" w:cs="BRH Malayalam Extra"/>
+                <w:color w:val="000000"/>
+                <w:sz w:val="32"/>
+                <w:szCs w:val="32"/>
+              </w:rPr>
+              <w:t>— pd</w:t>
+            </w:r>
+            <w:r>
+              <w:rPr>
+                <w:rFonts w:ascii="BRH Malayalam Extra" w:hAnsi="BRH Malayalam Extra" w:cs="BRH Malayalam Extra"/>
+                <w:color w:val="000000"/>
+                <w:sz w:val="26"/>
+                <w:szCs w:val="32"/>
+              </w:rPr>
+              <w:t>–</w:t>
+            </w:r>
+            <w:r>
+              <w:rPr>
+                <w:rFonts w:ascii="BRH Malayalam Extra" w:hAnsi="BRH Malayalam Extra" w:cs="BRH Malayalam Extra"/>
+                <w:color w:val="000000"/>
+                <w:sz w:val="32"/>
+                <w:szCs w:val="32"/>
+              </w:rPr>
+              <w:t xml:space="preserve">sðZz©— | </w:t>
+            </w:r>
+          </w:p>
+        </w:tc>
+        <w:tc>
+          <w:tcPr>
+            <w:tcW w:w="7371" w:type="dxa"/>
+            <w:tcBorders>
+              <w:top w:val="single" w:sz="4" w:space="0" w:color="000000"/>
+              <w:left w:val="single" w:sz="4" w:space="0" w:color="000000"/>
+              <w:bottom w:val="single" w:sz="4" w:space="0" w:color="000000"/>
+              <w:right w:val="single" w:sz="4" w:space="0" w:color="000000"/>
+            </w:tcBorders>
+          </w:tcPr>
+          <w:p>
+            <w:pPr>
+              <w:widowControl w:val="0"/>
+              <w:autoSpaceDE w:val="0"/>
+              <w:autoSpaceDN w:val="0"/>
+              <w:adjustRightInd w:val="0"/>
+              <w:spacing w:before="0" w:line="240" w:lineRule="auto"/>
+              <w:rPr>
+                <w:rFonts w:ascii="BRH Malayalam Extra" w:hAnsi="BRH Malayalam Extra" w:cs="BRH Malayalam Extra"/>
+                <w:color w:val="000000"/>
+                <w:sz w:val="32"/>
+                <w:szCs w:val="32"/>
+              </w:rPr>
+            </w:pPr>
+            <w:r>
+              <w:rPr>
+                <w:rFonts w:cs="BRH Malayalam Extra"/>
+                <w:color w:val="000000"/>
+                <w:szCs w:val="32"/>
+              </w:rPr>
+              <w:t>14</w:t>
+            </w:r>
+            <w:r>
+              <w:rPr>
+                <w:rFonts w:ascii="BRH Malayalam Extra" w:hAnsi="BRH Malayalam Extra" w:cs="BRH Malayalam Extra"/>
+                <w:color w:val="000000"/>
+                <w:sz w:val="32"/>
+                <w:szCs w:val="32"/>
+              </w:rPr>
+              <w:t>)</w:t>
+            </w:r>
+            <w:r>
+              <w:rPr>
+                <w:rFonts w:ascii="BRH Malayalam Extra" w:hAnsi="BRH Malayalam Extra" w:cs="BRH Malayalam Extra"/>
+                <w:color w:val="000000"/>
+                <w:sz w:val="32"/>
+                <w:szCs w:val="32"/>
+              </w:rPr>
+              <w:tab/>
+            </w:r>
+            <w:r>
+              <w:rPr>
+                <w:rFonts w:cs="BRH Malayalam Extra"/>
+                <w:color w:val="000000"/>
+                <w:szCs w:val="32"/>
+              </w:rPr>
+              <w:t>4</w:t>
+            </w:r>
+            <w:r>
+              <w:rPr>
+                <w:rFonts w:ascii="BRH Malayalam Extra" w:hAnsi="BRH Malayalam Extra" w:cs="BRH Malayalam Extra"/>
+                <w:color w:val="000000"/>
+                <w:sz w:val="32"/>
+                <w:szCs w:val="32"/>
+              </w:rPr>
+              <w:t>.</w:t>
+            </w:r>
+            <w:r>
+              <w:rPr>
+                <w:rFonts w:cs="BRH Malayalam Extra"/>
+                <w:color w:val="000000"/>
+                <w:szCs w:val="32"/>
+              </w:rPr>
+              <w:t>1</w:t>
+            </w:r>
+            <w:r>
+              <w:rPr>
+                <w:rFonts w:ascii="BRH Malayalam Extra" w:hAnsi="BRH Malayalam Extra" w:cs="BRH Malayalam Extra"/>
+                <w:color w:val="000000"/>
+                <w:sz w:val="32"/>
+                <w:szCs w:val="32"/>
+              </w:rPr>
+              <w:t>.</w:t>
+            </w:r>
+            <w:r>
+              <w:rPr>
+                <w:rFonts w:cs="BRH Malayalam Extra"/>
+                <w:color w:val="000000"/>
+                <w:szCs w:val="32"/>
+              </w:rPr>
+              <w:t>4</w:t>
+            </w:r>
+            <w:r>
+              <w:rPr>
+                <w:rFonts w:ascii="BRH Malayalam Extra" w:hAnsi="BRH Malayalam Extra" w:cs="BRH Malayalam Extra"/>
+                <w:color w:val="000000"/>
+                <w:sz w:val="32"/>
+                <w:szCs w:val="32"/>
+              </w:rPr>
+              <w:t>.</w:t>
+            </w:r>
+            <w:r>
+              <w:rPr>
+                <w:rFonts w:cs="BRH Malayalam Extra"/>
+                <w:color w:val="000000"/>
+                <w:szCs w:val="32"/>
+              </w:rPr>
+              <w:t>3</w:t>
+            </w:r>
+            <w:r>
+              <w:rPr>
+                <w:rFonts w:ascii="BRH Malayalam Extra" w:hAnsi="BRH Malayalam Extra" w:cs="BRH Malayalam Extra"/>
+                <w:color w:val="000000"/>
+                <w:sz w:val="32"/>
+                <w:szCs w:val="32"/>
+              </w:rPr>
+              <w:t>(</w:t>
+            </w:r>
+            <w:r>
+              <w:rPr>
+                <w:rFonts w:cs="BRH Malayalam Extra"/>
+                <w:color w:val="000000"/>
+                <w:szCs w:val="32"/>
+              </w:rPr>
+              <w:t>12</w:t>
+            </w:r>
+            <w:r>
+              <w:rPr>
+                <w:rFonts w:ascii="BRH Malayalam Extra" w:hAnsi="BRH Malayalam Extra" w:cs="BRH Malayalam Extra"/>
+                <w:color w:val="000000"/>
+                <w:sz w:val="32"/>
+                <w:szCs w:val="32"/>
+              </w:rPr>
+              <w:t>)- pd</w:t>
+            </w:r>
+            <w:r>
+              <w:rPr>
+                <w:rFonts w:ascii="BRH Malayalam Extra" w:hAnsi="BRH Malayalam Extra" w:cs="BRH Malayalam Extra"/>
+                <w:color w:val="000000"/>
+                <w:sz w:val="26"/>
+                <w:szCs w:val="32"/>
+              </w:rPr>
+              <w:t>–</w:t>
+            </w:r>
+            <w:r>
+              <w:rPr>
+                <w:rFonts w:ascii="BRH Malayalam Extra" w:hAnsi="BRH Malayalam Extra" w:cs="BRH Malayalam Extra"/>
+                <w:color w:val="000000"/>
+                <w:sz w:val="32"/>
+                <w:szCs w:val="32"/>
+              </w:rPr>
+              <w:t>sðZz©— ||</w:t>
+            </w:r>
+          </w:p>
+          <w:p>
+            <w:pPr>
+              <w:widowControl w:val="0"/>
+              <w:autoSpaceDE w:val="0"/>
+              <w:autoSpaceDN w:val="0"/>
+              <w:adjustRightInd w:val="0"/>
+              <w:spacing w:before="0" w:line="240" w:lineRule="auto"/>
+              <w:rPr>
+                <w:rFonts w:cs="BRH Malayalam Extra"/>
+                <w:color w:val="FF0000"/>
+                <w:szCs w:val="40"/>
+              </w:rPr>
+            </w:pPr>
+            <w:r>
+              <w:rPr>
+                <w:rFonts w:ascii="BRH Malayalam Extra" w:hAnsi="BRH Malayalam Extra" w:cs="BRH Malayalam Extra"/>
+                <w:color w:val="000000"/>
+                <w:sz w:val="32"/>
+                <w:szCs w:val="32"/>
+              </w:rPr>
+              <w:t>pd</w:t>
+            </w:r>
+            <w:r>
+              <w:rPr>
+                <w:rFonts w:ascii="BRH Malayalam Extra" w:hAnsi="BRH Malayalam Extra" w:cs="BRH Malayalam Extra"/>
+                <w:color w:val="000000"/>
+                <w:sz w:val="26"/>
+                <w:szCs w:val="32"/>
+              </w:rPr>
+              <w:t>–</w:t>
+            </w:r>
+            <w:r>
+              <w:rPr>
+                <w:rFonts w:ascii="BRH Malayalam Extra" w:hAnsi="BRH Malayalam Extra" w:cs="BRH Malayalam Extra"/>
+                <w:color w:val="000000"/>
+                <w:sz w:val="32"/>
+                <w:szCs w:val="32"/>
+              </w:rPr>
+              <w:t>sðZz</w:t>
+            </w:r>
+            <w:r>
+              <w:rPr>
+                <w:rFonts w:ascii="BRH Malayalam Extra" w:hAnsi="BRH Malayalam Extra" w:cs="BRH Malayalam Extra"/>
+                <w:color w:val="000000"/>
+                <w:sz w:val="26"/>
+                <w:szCs w:val="32"/>
+              </w:rPr>
+              <w:t>–</w:t>
+            </w:r>
+            <w:r>
+              <w:rPr>
+                <w:rFonts w:ascii="BRH Malayalam Extra" w:hAnsi="BRH Malayalam Extra" w:cs="BRH Malayalam Extra"/>
+                <w:color w:val="000000"/>
+                <w:sz w:val="32"/>
+                <w:szCs w:val="32"/>
+              </w:rPr>
+              <w:t>dy</w:t>
+            </w:r>
+            <w:r>
+              <w:rPr>
+                <w:rFonts w:ascii="BRH Malayalam Extra" w:hAnsi="BRH Malayalam Extra" w:cs="BRH Malayalam Extra"/>
+                <w:color w:val="000000"/>
+                <w:sz w:val="32"/>
+                <w:szCs w:val="32"/>
+                <w:highlight w:val="green"/>
+              </w:rPr>
+              <w:t>Zy</w:t>
+            </w:r>
+            <w:r>
+              <w:rPr>
+                <w:rFonts w:ascii="BRH Malayalam Extra" w:hAnsi="BRH Malayalam Extra" w:cs="BRH Malayalam Extra"/>
+                <w:color w:val="000000"/>
+                <w:sz w:val="26"/>
+                <w:szCs w:val="32"/>
+              </w:rPr>
+              <w:t>–</w:t>
+            </w:r>
+            <w:r>
+              <w:rPr>
+                <w:rFonts w:ascii="BRH Malayalam Extra" w:hAnsi="BRH Malayalam Extra" w:cs="BRH Malayalam Extra"/>
+                <w:color w:val="000000"/>
+                <w:sz w:val="32"/>
+                <w:szCs w:val="32"/>
+              </w:rPr>
+              <w:t xml:space="preserve"> pd</w:t>
+            </w:r>
+            <w:r>
+              <w:rPr>
+                <w:rFonts w:ascii="BRH Malayalam Extra" w:hAnsi="BRH Malayalam Extra" w:cs="BRH Malayalam Extra"/>
+                <w:color w:val="000000"/>
+                <w:sz w:val="26"/>
+                <w:szCs w:val="32"/>
+              </w:rPr>
+              <w:t>–</w:t>
+            </w:r>
+            <w:r>
+              <w:rPr>
+                <w:rFonts w:ascii="BRH Malayalam Extra" w:hAnsi="BRH Malayalam Extra" w:cs="BRH Malayalam Extra"/>
+                <w:color w:val="000000"/>
+                <w:sz w:val="32"/>
+                <w:szCs w:val="32"/>
+              </w:rPr>
+              <w:t xml:space="preserve">sðZz©— | </w:t>
+            </w:r>
+          </w:p>
+        </w:tc>
+      </w:tr>
+      <w:tr>
+        <w:trPr>
+          <w:trHeight w:val="1709"/>
+        </w:trPr>
+        <w:tc>
+          <w:tcPr>
+            <w:tcW w:w="7166" w:type="dxa"/>
+            <w:tcBorders>
+              <w:top w:val="single" w:sz="4" w:space="0" w:color="000000"/>
+              <w:left w:val="single" w:sz="4" w:space="0" w:color="000000"/>
+              <w:bottom w:val="single" w:sz="4" w:space="0" w:color="000000"/>
+              <w:right w:val="single" w:sz="4" w:space="0" w:color="000000"/>
+            </w:tcBorders>
+          </w:tcPr>
+          <w:p>
+            <w:pPr>
+              <w:widowControl w:val="0"/>
+              <w:autoSpaceDE w:val="0"/>
+              <w:autoSpaceDN w:val="0"/>
+              <w:adjustRightInd w:val="0"/>
+              <w:spacing w:before="0" w:line="240" w:lineRule="auto"/>
+              <w:rPr>
+                <w:rFonts w:cs="BRH Malayalam Extra"/>
+                <w:color w:val="FF0000"/>
+                <w:szCs w:val="40"/>
+              </w:rPr>
+            </w:pPr>
+          </w:p>
+        </w:tc>
+        <w:tc>
+          <w:tcPr>
+            <w:tcW w:w="7371" w:type="dxa"/>
+            <w:tcBorders>
+              <w:top w:val="single" w:sz="4" w:space="0" w:color="000000"/>
+              <w:left w:val="single" w:sz="4" w:space="0" w:color="000000"/>
+              <w:bottom w:val="single" w:sz="4" w:space="0" w:color="000000"/>
+              <w:right w:val="single" w:sz="4" w:space="0" w:color="000000"/>
+            </w:tcBorders>
+          </w:tcPr>
+          <w:p>
+            <w:pPr>
+              <w:widowControl w:val="0"/>
+              <w:autoSpaceDE w:val="0"/>
+              <w:autoSpaceDN w:val="0"/>
+              <w:adjustRightInd w:val="0"/>
+              <w:spacing w:before="0" w:line="240" w:lineRule="auto"/>
+              <w:rPr>
+                <w:rFonts w:cs="BRH Malayalam Extra"/>
+                <w:color w:val="FF0000"/>
+                <w:szCs w:val="40"/>
+              </w:rPr>
+            </w:pPr>
+          </w:p>
+        </w:tc>
+      </w:tr>
+    </w:tbl>
+    <w:p>
+      <w:pPr>
+        <w:spacing w:before="0" w:line="240" w:lineRule="auto"/>
+        <w:jc w:val="center"/>
+        <w:rPr>
+          <w:b/>
+          <w:bCs/>
+          <w:sz w:val="32"/>
+          <w:szCs w:val="32"/>
+          <w:u w:val="single"/>
+        </w:rPr>
+      </w:pPr>
+    </w:p>
+    <w:p>
+      <w:pPr>
+        <w:spacing w:before="0" w:line="240" w:lineRule="auto"/>
+        <w:jc w:val="center"/>
+        <w:rPr>
+          <w:b/>
+          <w:bCs/>
+          <w:sz w:val="32"/>
+          <w:szCs w:val="32"/>
+          <w:u w:val="single"/>
+        </w:rPr>
+      </w:pPr>
+    </w:p>
+    <w:p>
+      <w:pPr>
+        <w:spacing w:before="0" w:line="240" w:lineRule="auto"/>
+        <w:jc w:val="center"/>
+        <w:rPr>
+          <w:b/>
+          <w:bCs/>
+          <w:sz w:val="32"/>
+          <w:szCs w:val="32"/>
+          <w:u w:val="single"/>
+        </w:rPr>
+      </w:pPr>
+    </w:p>
     <w:p>
       <w:pPr>
         <w:spacing w:before="0" w:line="240" w:lineRule="auto"/>
@@ -2658,7 +5849,17 @@
                 <w:sz w:val="32"/>
                 <w:szCs w:val="32"/>
               </w:rPr>
-              <w:t>sx „„PâÉ—sx Zûx Zûx</w:t>
+              <w:t xml:space="preserve">sx „„PâÉ—sx </w:t>
+            </w:r>
+            <w:r>
+              <w:rPr>
+                <w:rFonts w:ascii="BRH Malayalam Extra" w:hAnsi="BRH Malayalam Extra" w:cs="BRH Malayalam Extra"/>
+                <w:color w:val="000000"/>
+                <w:sz w:val="32"/>
+                <w:szCs w:val="32"/>
+              </w:rPr>
+              <w:lastRenderedPageBreak/>
+              <w:t>Zûx Zûx</w:t>
             </w:r>
             <w:r>
               <w:rPr>
@@ -2743,6 +5944,7 @@
                 <w:color w:val="000000"/>
                 <w:szCs w:val="32"/>
               </w:rPr>
+              <w:lastRenderedPageBreak/>
               <w:t>53</w:t>
             </w:r>
             <w:r>
@@ -2960,7 +6162,17 @@
                 <w:sz w:val="32"/>
                 <w:szCs w:val="32"/>
               </w:rPr>
-              <w:t>sx „„PâÉ—sx Zûx Zûx</w:t>
+              <w:t xml:space="preserve">sx „„PâÉ—sx </w:t>
+            </w:r>
+            <w:r>
+              <w:rPr>
+                <w:rFonts w:ascii="BRH Malayalam Extra" w:hAnsi="BRH Malayalam Extra" w:cs="BRH Malayalam Extra"/>
+                <w:color w:val="000000"/>
+                <w:sz w:val="32"/>
+                <w:szCs w:val="32"/>
+              </w:rPr>
+              <w:lastRenderedPageBreak/>
+              <w:t>Zûx Zûx</w:t>
             </w:r>
             <w:r>
               <w:rPr>
@@ -6259,7 +9471,6 @@
                 <w:color w:val="000000"/>
                 <w:szCs w:val="32"/>
               </w:rPr>
-              <w:lastRenderedPageBreak/>
               <w:t>46</w:t>
             </w:r>
             <w:r>
@@ -9257,7 +12468,6 @@
                 <w:sz w:val="32"/>
                 <w:szCs w:val="32"/>
               </w:rPr>
-              <w:lastRenderedPageBreak/>
               <w:t>i</w:t>
             </w:r>
             <w:r>
@@ -9998,7 +13208,6 @@
                 <w:szCs w:val="32"/>
                 <w:lang w:val="it-IT"/>
               </w:rPr>
-              <w:lastRenderedPageBreak/>
               <w:t>14</w:t>
             </w:r>
             <w:r>
@@ -11088,7 +14297,6 @@
                 <w:sz w:val="32"/>
                 <w:szCs w:val="32"/>
               </w:rPr>
-              <w:lastRenderedPageBreak/>
               <w:t>i</w:t>
             </w:r>
             <w:r>
@@ -11787,7 +14995,6 @@
                 <w:szCs w:val="32"/>
                 <w:lang w:val="it-IT"/>
               </w:rPr>
-              <w:lastRenderedPageBreak/>
               <w:t>44</w:t>
             </w:r>
             <w:r>
@@ -13568,7 +16775,6 @@
                 <w:color w:val="000000"/>
                 <w:szCs w:val="32"/>
               </w:rPr>
-              <w:lastRenderedPageBreak/>
               <w:t>57</w:t>
             </w:r>
             <w:r>
@@ -16130,7 +19336,6 @@
                 <w:szCs w:val="32"/>
                 <w:highlight w:val="yellow"/>
               </w:rPr>
-              <w:lastRenderedPageBreak/>
               <w:t>s</w:t>
             </w:r>
             <w:r>
@@ -16635,7 +19840,6 @@
                 <w:color w:val="000000"/>
                 <w:szCs w:val="32"/>
               </w:rPr>
-              <w:lastRenderedPageBreak/>
               <w:t>4</w:t>
             </w:r>
             <w:r>
@@ -18506,7 +21710,6 @@
                 <w:szCs w:val="32"/>
                 <w:highlight w:val="green"/>
               </w:rPr>
-              <w:lastRenderedPageBreak/>
               <w:t>sI</w:t>
             </w:r>
             <w:r>
@@ -19035,7 +22238,6 @@
                 <w:color w:val="000000"/>
                 <w:szCs w:val="32"/>
               </w:rPr>
-              <w:lastRenderedPageBreak/>
               <w:t>6</w:t>
             </w:r>
             <w:r>
@@ -21644,7 +24846,6 @@
                 <w:color w:val="000000"/>
                 <w:szCs w:val="32"/>
               </w:rPr>
-              <w:lastRenderedPageBreak/>
               <w:t>51</w:t>
             </w:r>
             <w:r>
@@ -24965,7 +28166,6 @@
                 <w:color w:val="000000"/>
                 <w:szCs w:val="32"/>
               </w:rPr>
-              <w:lastRenderedPageBreak/>
               <w:t>33</w:t>
             </w:r>
             <w:r>
@@ -28016,7 +31216,6 @@
                 <w:color w:val="000000"/>
                 <w:szCs w:val="32"/>
               </w:rPr>
-              <w:lastRenderedPageBreak/>
               <w:t>42</w:t>
             </w:r>
             <w:r>
@@ -29406,7 +32605,27 @@
                 <w:sz w:val="32"/>
                 <w:szCs w:val="32"/>
               </w:rPr>
-              <w:t>— sëx(MÞ§) sëûI ZûI Zx© h—</w:t>
+              <w:t xml:space="preserve">— </w:t>
+            </w:r>
+            <w:proofErr w:type="gramStart"/>
+            <w:r>
+              <w:rPr>
+                <w:rFonts w:ascii="BRH Malayalam Extra" w:hAnsi="BRH Malayalam Extra" w:cs="BRH Malayalam Extra"/>
+                <w:color w:val="000000"/>
+                <w:sz w:val="32"/>
+                <w:szCs w:val="32"/>
+              </w:rPr>
+              <w:t>sëx(</w:t>
+            </w:r>
+            <w:proofErr w:type="gramEnd"/>
+            <w:r>
+              <w:rPr>
+                <w:rFonts w:ascii="BRH Malayalam Extra" w:hAnsi="BRH Malayalam Extra" w:cs="BRH Malayalam Extra"/>
+                <w:color w:val="000000"/>
+                <w:sz w:val="32"/>
+                <w:szCs w:val="32"/>
+              </w:rPr>
+              <w:t>MÞ§) sëûI ZûI Zx© h—</w:t>
             </w:r>
             <w:r>
               <w:rPr>
@@ -29484,7 +32703,27 @@
                 <w:sz w:val="32"/>
                 <w:szCs w:val="32"/>
               </w:rPr>
-              <w:t xml:space="preserve">— sëx(MÞ§) sëûI | </w:t>
+              <w:t xml:space="preserve">— </w:t>
+            </w:r>
+            <w:proofErr w:type="gramStart"/>
+            <w:r>
+              <w:rPr>
+                <w:rFonts w:ascii="BRH Malayalam Extra" w:hAnsi="BRH Malayalam Extra" w:cs="BRH Malayalam Extra"/>
+                <w:color w:val="000000"/>
+                <w:sz w:val="32"/>
+                <w:szCs w:val="32"/>
+              </w:rPr>
+              <w:t>sëx(</w:t>
+            </w:r>
+            <w:proofErr w:type="gramEnd"/>
+            <w:r>
+              <w:rPr>
+                <w:rFonts w:ascii="BRH Malayalam Extra" w:hAnsi="BRH Malayalam Extra" w:cs="BRH Malayalam Extra"/>
+                <w:color w:val="000000"/>
+                <w:sz w:val="32"/>
+                <w:szCs w:val="32"/>
+              </w:rPr>
+              <w:t xml:space="preserve">MÞ§) sëûI | </w:t>
             </w:r>
           </w:p>
           <w:p>
@@ -31084,7 +34323,27 @@
                 <w:sz w:val="32"/>
                 <w:szCs w:val="32"/>
               </w:rPr>
-              <w:t xml:space="preserve"> sëx(MÞ§) sëûI </w:t>
+              <w:t xml:space="preserve"> </w:t>
+            </w:r>
+            <w:proofErr w:type="gramStart"/>
+            <w:r>
+              <w:rPr>
+                <w:rFonts w:ascii="BRH Malayalam Extra" w:hAnsi="BRH Malayalam Extra" w:cs="BRH Malayalam Extra"/>
+                <w:color w:val="000000"/>
+                <w:sz w:val="32"/>
+                <w:szCs w:val="32"/>
+              </w:rPr>
+              <w:t>sëx(</w:t>
+            </w:r>
+            <w:proofErr w:type="gramEnd"/>
+            <w:r>
+              <w:rPr>
+                <w:rFonts w:ascii="BRH Malayalam Extra" w:hAnsi="BRH Malayalam Extra" w:cs="BRH Malayalam Extra"/>
+                <w:color w:val="000000"/>
+                <w:sz w:val="32"/>
+                <w:szCs w:val="32"/>
+              </w:rPr>
+              <w:t xml:space="preserve">MÞ§) sëûI </w:t>
             </w:r>
           </w:p>
           <w:p>
@@ -31530,7 +34789,6 @@
                 <w:color w:val="000000"/>
                 <w:szCs w:val="32"/>
               </w:rPr>
-              <w:lastRenderedPageBreak/>
               <w:t>20</w:t>
             </w:r>
             <w:r>
@@ -32204,7 +35462,6 @@
                 <w:szCs w:val="32"/>
                 <w:lang w:val="en-IN"/>
               </w:rPr>
-              <w:lastRenderedPageBreak/>
               <w:t>20</w:t>
             </w:r>
             <w:r>
@@ -33263,7 +36520,7 @@
 </file>
 
 <file path=word/endnotes.xml><?xml version="1.0" encoding="utf-8"?>
-<w:endnotes xmlns:wpc="http://schemas.microsoft.com/office/word/2010/wordprocessingCanvas" xmlns:cx="http://schemas.microsoft.com/office/drawing/2014/chartex" xmlns:cx1="http://schemas.microsoft.com/office/drawing/2015/9/8/chartex" xmlns:cx2="http://schemas.microsoft.com/office/drawing/2015/10/21/chartex" xmlns:cx3="http://schemas.microsoft.com/office/drawing/2016/5/9/chartex" xmlns:cx4="http://schemas.microsoft.com/office/drawing/2016/5/10/chartex" xmlns:cx5="http://schemas.microsoft.com/office/drawing/2016/5/11/chartex" xmlns:cx6="http://schemas.microsoft.com/office/drawing/2016/5/12/chartex" xmlns:cx7="http://schemas.microsoft.com/office/drawing/2016/5/13/chartex" xmlns:cx8="http://schemas.microsoft.com/office/drawing/2016/5/14/chartex" xmlns:mc="http://schemas.openxmlformats.org/markup-compatibility/2006" xmlns:aink="http://schemas.microsoft.com/office/drawing/2016/ink" xmlns:am3d="http://schemas.microsoft.com/office/drawing/2017/model3d" xmlns:o="urn:schemas-microsoft-com:office:office" xmlns:oel="http://schemas.microsoft.com/office/2019/extlst" xmlns:r="http://schemas.openxmlformats.org/officeDocument/2006/relationships" xmlns:m="http://schemas.openxmlformats.org/officeDocument/2006/math" xmlns:v="urn:schemas-microsoft-com:vml" xmlns:wp14="http://schemas.microsoft.com/office/word/2010/wordprocessingDrawing" xmlns:wp="http://schemas.openxmlformats.org/drawingml/2006/wordprocessingDrawing" xmlns:w10="urn:schemas-microsoft-com:office:word" xmlns:w="http://schemas.openxmlformats.org/wordprocessingml/2006/main" xmlns:w14="http://schemas.microsoft.com/office/word/2010/wordml" xmlns:w15="http://schemas.microsoft.com/office/word/2012/wordml" xmlns:w16cex="http://schemas.microsoft.com/office/word/2018/wordml/cex" xmlns:w16cid="http://schemas.microsoft.com/office/word/2016/wordml/cid" xmlns:w16="http://schemas.microsoft.com/office/word/2018/wordml" xmlns:w16sdtdh="http://schemas.microsoft.com/office/word/2020/wordml/sdtdatahash" xmlns:w16se="http://schemas.microsoft.com/office/word/2015/wordml/symex" xmlns:wpg="http://schemas.microsoft.com/office/word/2010/wordprocessingGroup" xmlns:wpi="http://schemas.microsoft.com/office/word/2010/wordprocessingInk" xmlns:wne="http://schemas.microsoft.com/office/word/2006/wordml" xmlns:wps="http://schemas.microsoft.com/office/word/2010/wordprocessingShape" mc:Ignorable="w14 w15 w16se w16cid w16 w16cex w16sdtdh wp14">
+<w:endnotes xmlns:wpc="http://schemas.microsoft.com/office/word/2010/wordprocessingCanvas" xmlns:cx="http://schemas.microsoft.com/office/drawing/2014/chartex" xmlns:cx1="http://schemas.microsoft.com/office/drawing/2015/9/8/chartex" xmlns:cx2="http://schemas.microsoft.com/office/drawing/2015/10/21/chartex" xmlns:cx3="http://schemas.microsoft.com/office/drawing/2016/5/9/chartex" xmlns:cx4="http://schemas.microsoft.com/office/drawing/2016/5/10/chartex" xmlns:cx5="http://schemas.microsoft.com/office/drawing/2016/5/11/chartex" xmlns:cx6="http://schemas.microsoft.com/office/drawing/2016/5/12/chartex" xmlns:cx7="http://schemas.microsoft.com/office/drawing/2016/5/13/chartex" xmlns:cx8="http://schemas.microsoft.com/office/drawing/2016/5/14/chartex" xmlns:mc="http://schemas.openxmlformats.org/markup-compatibility/2006" xmlns:aink="http://schemas.microsoft.com/office/drawing/2016/ink" xmlns:am3d="http://schemas.microsoft.com/office/drawing/2017/model3d" xmlns:o="urn:schemas-microsoft-com:office:office" xmlns:oel="http://schemas.microsoft.com/office/2019/extlst" xmlns:r="http://schemas.openxmlformats.org/officeDocument/2006/relationships" xmlns:m="http://schemas.openxmlformats.org/officeDocument/2006/math" xmlns:v="urn:schemas-microsoft-com:vml" xmlns:wp14="http://schemas.microsoft.com/office/word/2010/wordprocessingDrawing" xmlns:wp="http://schemas.openxmlformats.org/drawingml/2006/wordprocessingDrawing" xmlns:w10="urn:schemas-microsoft-com:office:word" xmlns:w="http://schemas.openxmlformats.org/wordprocessingml/2006/main" xmlns:w14="http://schemas.microsoft.com/office/word/2010/wordml" xmlns:w15="http://schemas.microsoft.com/office/word/2012/wordml" xmlns:w16cex="http://schemas.microsoft.com/office/word/2018/wordml/cex" xmlns:w16cid="http://schemas.microsoft.com/office/word/2016/wordml/cid" xmlns:w16="http://schemas.microsoft.com/office/word/2018/wordml" xmlns:w16du="http://schemas.microsoft.com/office/word/2023/wordml/word16du" xmlns:w16sdtdh="http://schemas.microsoft.com/office/word/2020/wordml/sdtdatahash" xmlns:w16sdtfl="http://schemas.microsoft.com/office/word/2024/wordml/sdtformatlock" xmlns:w16se="http://schemas.microsoft.com/office/word/2015/wordml/symex" xmlns:wpg="http://schemas.microsoft.com/office/word/2010/wordprocessingGroup" xmlns:wpi="http://schemas.microsoft.com/office/word/2010/wordprocessingInk" xmlns:wne="http://schemas.microsoft.com/office/word/2006/wordml" xmlns:wps="http://schemas.microsoft.com/office/word/2010/wordprocessingShape" mc:Ignorable="w14 w15 w16se w16cid w16 w16cex w16sdtdh w16sdtfl w16du wp14">
   <w:endnote w:type="separator" w:id="-1">
     <w:p>
       <w:pPr>
@@ -33288,7 +36545,7 @@
 </file>
 
 <file path=word/footer1.xml><?xml version="1.0" encoding="utf-8"?>
-<w:ftr xmlns:wpc="http://schemas.microsoft.com/office/word/2010/wordprocessingCanvas" xmlns:cx="http://schemas.microsoft.com/office/drawing/2014/chartex" xmlns:cx1="http://schemas.microsoft.com/office/drawing/2015/9/8/chartex" xmlns:cx2="http://schemas.microsoft.com/office/drawing/2015/10/21/chartex" xmlns:cx3="http://schemas.microsoft.com/office/drawing/2016/5/9/chartex" xmlns:cx4="http://schemas.microsoft.com/office/drawing/2016/5/10/chartex" xmlns:cx5="http://schemas.microsoft.com/office/drawing/2016/5/11/chartex" xmlns:cx6="http://schemas.microsoft.com/office/drawing/2016/5/12/chartex" xmlns:cx7="http://schemas.microsoft.com/office/drawing/2016/5/13/chartex" xmlns:cx8="http://schemas.microsoft.com/office/drawing/2016/5/14/chartex" xmlns:mc="http://schemas.openxmlformats.org/markup-compatibility/2006" xmlns:aink="http://schemas.microsoft.com/office/drawing/2016/ink" xmlns:am3d="http://schemas.microsoft.com/office/drawing/2017/model3d" xmlns:o="urn:schemas-microsoft-com:office:office" xmlns:oel="http://schemas.microsoft.com/office/2019/extlst" xmlns:r="http://schemas.openxmlformats.org/officeDocument/2006/relationships" xmlns:m="http://schemas.openxmlformats.org/officeDocument/2006/math" xmlns:v="urn:schemas-microsoft-com:vml" xmlns:wp14="http://schemas.microsoft.com/office/word/2010/wordprocessingDrawing" xmlns:wp="http://schemas.openxmlformats.org/drawingml/2006/wordprocessingDrawing" xmlns:w10="urn:schemas-microsoft-com:office:word" xmlns:w="http://schemas.openxmlformats.org/wordprocessingml/2006/main" xmlns:w14="http://schemas.microsoft.com/office/word/2010/wordml" xmlns:w15="http://schemas.microsoft.com/office/word/2012/wordml" xmlns:w16cex="http://schemas.microsoft.com/office/word/2018/wordml/cex" xmlns:w16cid="http://schemas.microsoft.com/office/word/2016/wordml/cid" xmlns:w16="http://schemas.microsoft.com/office/word/2018/wordml" xmlns:w16sdtdh="http://schemas.microsoft.com/office/word/2020/wordml/sdtdatahash" xmlns:w16se="http://schemas.microsoft.com/office/word/2015/wordml/symex" xmlns:wpg="http://schemas.microsoft.com/office/word/2010/wordprocessingGroup" xmlns:wpi="http://schemas.microsoft.com/office/word/2010/wordprocessingInk" xmlns:wne="http://schemas.microsoft.com/office/word/2006/wordml" xmlns:wps="http://schemas.microsoft.com/office/word/2010/wordprocessingShape" mc:Ignorable="w14 w15 w16se w16cid w16 w16cex w16sdtdh wp14">
+<w:ftr xmlns:wpc="http://schemas.microsoft.com/office/word/2010/wordprocessingCanvas" xmlns:cx="http://schemas.microsoft.com/office/drawing/2014/chartex" xmlns:cx1="http://schemas.microsoft.com/office/drawing/2015/9/8/chartex" xmlns:cx2="http://schemas.microsoft.com/office/drawing/2015/10/21/chartex" xmlns:cx3="http://schemas.microsoft.com/office/drawing/2016/5/9/chartex" xmlns:cx4="http://schemas.microsoft.com/office/drawing/2016/5/10/chartex" xmlns:cx5="http://schemas.microsoft.com/office/drawing/2016/5/11/chartex" xmlns:cx6="http://schemas.microsoft.com/office/drawing/2016/5/12/chartex" xmlns:cx7="http://schemas.microsoft.com/office/drawing/2016/5/13/chartex" xmlns:cx8="http://schemas.microsoft.com/office/drawing/2016/5/14/chartex" xmlns:mc="http://schemas.openxmlformats.org/markup-compatibility/2006" xmlns:aink="http://schemas.microsoft.com/office/drawing/2016/ink" xmlns:am3d="http://schemas.microsoft.com/office/drawing/2017/model3d" xmlns:o="urn:schemas-microsoft-com:office:office" xmlns:oel="http://schemas.microsoft.com/office/2019/extlst" xmlns:r="http://schemas.openxmlformats.org/officeDocument/2006/relationships" xmlns:m="http://schemas.openxmlformats.org/officeDocument/2006/math" xmlns:v="urn:schemas-microsoft-com:vml" xmlns:wp14="http://schemas.microsoft.com/office/word/2010/wordprocessingDrawing" xmlns:wp="http://schemas.openxmlformats.org/drawingml/2006/wordprocessingDrawing" xmlns:w10="urn:schemas-microsoft-com:office:word" xmlns:w="http://schemas.openxmlformats.org/wordprocessingml/2006/main" xmlns:w14="http://schemas.microsoft.com/office/word/2010/wordml" xmlns:w15="http://schemas.microsoft.com/office/word/2012/wordml" xmlns:w16cex="http://schemas.microsoft.com/office/word/2018/wordml/cex" xmlns:w16cid="http://schemas.microsoft.com/office/word/2016/wordml/cid" xmlns:w16="http://schemas.microsoft.com/office/word/2018/wordml" xmlns:w16du="http://schemas.microsoft.com/office/word/2023/wordml/word16du" xmlns:w16sdtdh="http://schemas.microsoft.com/office/word/2020/wordml/sdtdatahash" xmlns:w16sdtfl="http://schemas.microsoft.com/office/word/2024/wordml/sdtformatlock" xmlns:w16se="http://schemas.microsoft.com/office/word/2015/wordml/symex" xmlns:wpg="http://schemas.microsoft.com/office/word/2010/wordprocessingGroup" xmlns:wpi="http://schemas.microsoft.com/office/word/2010/wordprocessingInk" xmlns:wne="http://schemas.microsoft.com/office/word/2006/wordml" xmlns:wps="http://schemas.microsoft.com/office/word/2010/wordprocessingShape" mc:Ignorable="w14 w15 w16se w16cid w16 w16cex w16sdtdh w16sdtfl w16du wp14">
   <w:p>
     <w:pPr>
       <w:pBdr>
@@ -33470,7 +36727,7 @@
 </file>
 
 <file path=word/footer2.xml><?xml version="1.0" encoding="utf-8"?>
-<w:ftr xmlns:wpc="http://schemas.microsoft.com/office/word/2010/wordprocessingCanvas" xmlns:cx="http://schemas.microsoft.com/office/drawing/2014/chartex" xmlns:cx1="http://schemas.microsoft.com/office/drawing/2015/9/8/chartex" xmlns:cx2="http://schemas.microsoft.com/office/drawing/2015/10/21/chartex" xmlns:cx3="http://schemas.microsoft.com/office/drawing/2016/5/9/chartex" xmlns:cx4="http://schemas.microsoft.com/office/drawing/2016/5/10/chartex" xmlns:cx5="http://schemas.microsoft.com/office/drawing/2016/5/11/chartex" xmlns:cx6="http://schemas.microsoft.com/office/drawing/2016/5/12/chartex" xmlns:cx7="http://schemas.microsoft.com/office/drawing/2016/5/13/chartex" xmlns:cx8="http://schemas.microsoft.com/office/drawing/2016/5/14/chartex" xmlns:mc="http://schemas.openxmlformats.org/markup-compatibility/2006" xmlns:aink="http://schemas.microsoft.com/office/drawing/2016/ink" xmlns:am3d="http://schemas.microsoft.com/office/drawing/2017/model3d" xmlns:o="urn:schemas-microsoft-com:office:office" xmlns:oel="http://schemas.microsoft.com/office/2019/extlst" xmlns:r="http://schemas.openxmlformats.org/officeDocument/2006/relationships" xmlns:m="http://schemas.openxmlformats.org/officeDocument/2006/math" xmlns:v="urn:schemas-microsoft-com:vml" xmlns:wp14="http://schemas.microsoft.com/office/word/2010/wordprocessingDrawing" xmlns:wp="http://schemas.openxmlformats.org/drawingml/2006/wordprocessingDrawing" xmlns:w10="urn:schemas-microsoft-com:office:word" xmlns:w="http://schemas.openxmlformats.org/wordprocessingml/2006/main" xmlns:w14="http://schemas.microsoft.com/office/word/2010/wordml" xmlns:w15="http://schemas.microsoft.com/office/word/2012/wordml" xmlns:w16cex="http://schemas.microsoft.com/office/word/2018/wordml/cex" xmlns:w16cid="http://schemas.microsoft.com/office/word/2016/wordml/cid" xmlns:w16="http://schemas.microsoft.com/office/word/2018/wordml" xmlns:w16sdtdh="http://schemas.microsoft.com/office/word/2020/wordml/sdtdatahash" xmlns:w16se="http://schemas.microsoft.com/office/word/2015/wordml/symex" xmlns:wpg="http://schemas.microsoft.com/office/word/2010/wordprocessingGroup" xmlns:wpi="http://schemas.microsoft.com/office/word/2010/wordprocessingInk" xmlns:wne="http://schemas.microsoft.com/office/word/2006/wordml" xmlns:wps="http://schemas.microsoft.com/office/word/2010/wordprocessingShape" mc:Ignorable="w14 w15 w16se w16cid w16 w16cex w16sdtdh wp14">
+<w:ftr xmlns:wpc="http://schemas.microsoft.com/office/word/2010/wordprocessingCanvas" xmlns:cx="http://schemas.microsoft.com/office/drawing/2014/chartex" xmlns:cx1="http://schemas.microsoft.com/office/drawing/2015/9/8/chartex" xmlns:cx2="http://schemas.microsoft.com/office/drawing/2015/10/21/chartex" xmlns:cx3="http://schemas.microsoft.com/office/drawing/2016/5/9/chartex" xmlns:cx4="http://schemas.microsoft.com/office/drawing/2016/5/10/chartex" xmlns:cx5="http://schemas.microsoft.com/office/drawing/2016/5/11/chartex" xmlns:cx6="http://schemas.microsoft.com/office/drawing/2016/5/12/chartex" xmlns:cx7="http://schemas.microsoft.com/office/drawing/2016/5/13/chartex" xmlns:cx8="http://schemas.microsoft.com/office/drawing/2016/5/14/chartex" xmlns:mc="http://schemas.openxmlformats.org/markup-compatibility/2006" xmlns:aink="http://schemas.microsoft.com/office/drawing/2016/ink" xmlns:am3d="http://schemas.microsoft.com/office/drawing/2017/model3d" xmlns:o="urn:schemas-microsoft-com:office:office" xmlns:oel="http://schemas.microsoft.com/office/2019/extlst" xmlns:r="http://schemas.openxmlformats.org/officeDocument/2006/relationships" xmlns:m="http://schemas.openxmlformats.org/officeDocument/2006/math" xmlns:v="urn:schemas-microsoft-com:vml" xmlns:wp14="http://schemas.microsoft.com/office/word/2010/wordprocessingDrawing" xmlns:wp="http://schemas.openxmlformats.org/drawingml/2006/wordprocessingDrawing" xmlns:w10="urn:schemas-microsoft-com:office:word" xmlns:w="http://schemas.openxmlformats.org/wordprocessingml/2006/main" xmlns:w14="http://schemas.microsoft.com/office/word/2010/wordml" xmlns:w15="http://schemas.microsoft.com/office/word/2012/wordml" xmlns:w16cex="http://schemas.microsoft.com/office/word/2018/wordml/cex" xmlns:w16cid="http://schemas.microsoft.com/office/word/2016/wordml/cid" xmlns:w16="http://schemas.microsoft.com/office/word/2018/wordml" xmlns:w16du="http://schemas.microsoft.com/office/word/2023/wordml/word16du" xmlns:w16sdtdh="http://schemas.microsoft.com/office/word/2020/wordml/sdtdatahash" xmlns:w16sdtfl="http://schemas.microsoft.com/office/word/2024/wordml/sdtformatlock" xmlns:w16se="http://schemas.microsoft.com/office/word/2015/wordml/symex" xmlns:wpg="http://schemas.microsoft.com/office/word/2010/wordprocessingGroup" xmlns:wpi="http://schemas.microsoft.com/office/word/2010/wordprocessingInk" xmlns:wne="http://schemas.microsoft.com/office/word/2006/wordml" xmlns:wps="http://schemas.microsoft.com/office/word/2010/wordprocessingShape" mc:Ignorable="w14 w15 w16se w16cid w16 w16cex w16sdtdh w16sdtfl w16du wp14">
   <w:p>
     <w:pPr>
       <w:pBdr>
@@ -33676,7 +36933,7 @@
 </file>
 
 <file path=word/footnotes.xml><?xml version="1.0" encoding="utf-8"?>
-<w:footnotes xmlns:wpc="http://schemas.microsoft.com/office/word/2010/wordprocessingCanvas" xmlns:cx="http://schemas.microsoft.com/office/drawing/2014/chartex" xmlns:cx1="http://schemas.microsoft.com/office/drawing/2015/9/8/chartex" xmlns:cx2="http://schemas.microsoft.com/office/drawing/2015/10/21/chartex" xmlns:cx3="http://schemas.microsoft.com/office/drawing/2016/5/9/chartex" xmlns:cx4="http://schemas.microsoft.com/office/drawing/2016/5/10/chartex" xmlns:cx5="http://schemas.microsoft.com/office/drawing/2016/5/11/chartex" xmlns:cx6="http://schemas.microsoft.com/office/drawing/2016/5/12/chartex" xmlns:cx7="http://schemas.microsoft.com/office/drawing/2016/5/13/chartex" xmlns:cx8="http://schemas.microsoft.com/office/drawing/2016/5/14/chartex" xmlns:mc="http://schemas.openxmlformats.org/markup-compatibility/2006" xmlns:aink="http://schemas.microsoft.com/office/drawing/2016/ink" xmlns:am3d="http://schemas.microsoft.com/office/drawing/2017/model3d" xmlns:o="urn:schemas-microsoft-com:office:office" xmlns:oel="http://schemas.microsoft.com/office/2019/extlst" xmlns:r="http://schemas.openxmlformats.org/officeDocument/2006/relationships" xmlns:m="http://schemas.openxmlformats.org/officeDocument/2006/math" xmlns:v="urn:schemas-microsoft-com:vml" xmlns:wp14="http://schemas.microsoft.com/office/word/2010/wordprocessingDrawing" xmlns:wp="http://schemas.openxmlformats.org/drawingml/2006/wordprocessingDrawing" xmlns:w10="urn:schemas-microsoft-com:office:word" xmlns:w="http://schemas.openxmlformats.org/wordprocessingml/2006/main" xmlns:w14="http://schemas.microsoft.com/office/word/2010/wordml" xmlns:w15="http://schemas.microsoft.com/office/word/2012/wordml" xmlns:w16cex="http://schemas.microsoft.com/office/word/2018/wordml/cex" xmlns:w16cid="http://schemas.microsoft.com/office/word/2016/wordml/cid" xmlns:w16="http://schemas.microsoft.com/office/word/2018/wordml" xmlns:w16sdtdh="http://schemas.microsoft.com/office/word/2020/wordml/sdtdatahash" xmlns:w16se="http://schemas.microsoft.com/office/word/2015/wordml/symex" xmlns:wpg="http://schemas.microsoft.com/office/word/2010/wordprocessingGroup" xmlns:wpi="http://schemas.microsoft.com/office/word/2010/wordprocessingInk" xmlns:wne="http://schemas.microsoft.com/office/word/2006/wordml" xmlns:wps="http://schemas.microsoft.com/office/word/2010/wordprocessingShape" mc:Ignorable="w14 w15 w16se w16cid w16 w16cex w16sdtdh wp14">
+<w:footnotes xmlns:wpc="http://schemas.microsoft.com/office/word/2010/wordprocessingCanvas" xmlns:cx="http://schemas.microsoft.com/office/drawing/2014/chartex" xmlns:cx1="http://schemas.microsoft.com/office/drawing/2015/9/8/chartex" xmlns:cx2="http://schemas.microsoft.com/office/drawing/2015/10/21/chartex" xmlns:cx3="http://schemas.microsoft.com/office/drawing/2016/5/9/chartex" xmlns:cx4="http://schemas.microsoft.com/office/drawing/2016/5/10/chartex" xmlns:cx5="http://schemas.microsoft.com/office/drawing/2016/5/11/chartex" xmlns:cx6="http://schemas.microsoft.com/office/drawing/2016/5/12/chartex" xmlns:cx7="http://schemas.microsoft.com/office/drawing/2016/5/13/chartex" xmlns:cx8="http://schemas.microsoft.com/office/drawing/2016/5/14/chartex" xmlns:mc="http://schemas.openxmlformats.org/markup-compatibility/2006" xmlns:aink="http://schemas.microsoft.com/office/drawing/2016/ink" xmlns:am3d="http://schemas.microsoft.com/office/drawing/2017/model3d" xmlns:o="urn:schemas-microsoft-com:office:office" xmlns:oel="http://schemas.microsoft.com/office/2019/extlst" xmlns:r="http://schemas.openxmlformats.org/officeDocument/2006/relationships" xmlns:m="http://schemas.openxmlformats.org/officeDocument/2006/math" xmlns:v="urn:schemas-microsoft-com:vml" xmlns:wp14="http://schemas.microsoft.com/office/word/2010/wordprocessingDrawing" xmlns:wp="http://schemas.openxmlformats.org/drawingml/2006/wordprocessingDrawing" xmlns:w10="urn:schemas-microsoft-com:office:word" xmlns:w="http://schemas.openxmlformats.org/wordprocessingml/2006/main" xmlns:w14="http://schemas.microsoft.com/office/word/2010/wordml" xmlns:w15="http://schemas.microsoft.com/office/word/2012/wordml" xmlns:w16cex="http://schemas.microsoft.com/office/word/2018/wordml/cex" xmlns:w16cid="http://schemas.microsoft.com/office/word/2016/wordml/cid" xmlns:w16="http://schemas.microsoft.com/office/word/2018/wordml" xmlns:w16du="http://schemas.microsoft.com/office/word/2023/wordml/word16du" xmlns:w16sdtdh="http://schemas.microsoft.com/office/word/2020/wordml/sdtdatahash" xmlns:w16sdtfl="http://schemas.microsoft.com/office/word/2024/wordml/sdtformatlock" xmlns:w16se="http://schemas.microsoft.com/office/word/2015/wordml/symex" xmlns:wpg="http://schemas.microsoft.com/office/word/2010/wordprocessingGroup" xmlns:wpi="http://schemas.microsoft.com/office/word/2010/wordprocessingInk" xmlns:wne="http://schemas.microsoft.com/office/word/2006/wordml" xmlns:wps="http://schemas.microsoft.com/office/word/2010/wordprocessingShape" mc:Ignorable="w14 w15 w16se w16cid w16 w16cex w16sdtdh w16sdtfl w16du wp14">
   <w:footnote w:type="separator" w:id="-1">
     <w:p>
       <w:pPr>
@@ -33701,7 +36958,7 @@
 </file>
 
 <file path=word/header1.xml><?xml version="1.0" encoding="utf-8"?>
-<w:hdr xmlns:wpc="http://schemas.microsoft.com/office/word/2010/wordprocessingCanvas" xmlns:cx="http://schemas.microsoft.com/office/drawing/2014/chartex" xmlns:cx1="http://schemas.microsoft.com/office/drawing/2015/9/8/chartex" xmlns:cx2="http://schemas.microsoft.com/office/drawing/2015/10/21/chartex" xmlns:cx3="http://schemas.microsoft.com/office/drawing/2016/5/9/chartex" xmlns:cx4="http://schemas.microsoft.com/office/drawing/2016/5/10/chartex" xmlns:cx5="http://schemas.microsoft.com/office/drawing/2016/5/11/chartex" xmlns:cx6="http://schemas.microsoft.com/office/drawing/2016/5/12/chartex" xmlns:cx7="http://schemas.microsoft.com/office/drawing/2016/5/13/chartex" xmlns:cx8="http://schemas.microsoft.com/office/drawing/2016/5/14/chartex" xmlns:mc="http://schemas.openxmlformats.org/markup-compatibility/2006" xmlns:aink="http://schemas.microsoft.com/office/drawing/2016/ink" xmlns:am3d="http://schemas.microsoft.com/office/drawing/2017/model3d" xmlns:o="urn:schemas-microsoft-com:office:office" xmlns:oel="http://schemas.microsoft.com/office/2019/extlst" xmlns:r="http://schemas.openxmlformats.org/officeDocument/2006/relationships" xmlns:m="http://schemas.openxmlformats.org/officeDocument/2006/math" xmlns:v="urn:schemas-microsoft-com:vml" xmlns:wp14="http://schemas.microsoft.com/office/word/2010/wordprocessingDrawing" xmlns:wp="http://schemas.openxmlformats.org/drawingml/2006/wordprocessingDrawing" xmlns:w10="urn:schemas-microsoft-com:office:word" xmlns:w="http://schemas.openxmlformats.org/wordprocessingml/2006/main" xmlns:w14="http://schemas.microsoft.com/office/word/2010/wordml" xmlns:w15="http://schemas.microsoft.com/office/word/2012/wordml" xmlns:w16cex="http://schemas.microsoft.com/office/word/2018/wordml/cex" xmlns:w16cid="http://schemas.microsoft.com/office/word/2016/wordml/cid" xmlns:w16="http://schemas.microsoft.com/office/word/2018/wordml" xmlns:w16sdtdh="http://schemas.microsoft.com/office/word/2020/wordml/sdtdatahash" xmlns:w16se="http://schemas.microsoft.com/office/word/2015/wordml/symex" xmlns:wpg="http://schemas.microsoft.com/office/word/2010/wordprocessingGroup" xmlns:wpi="http://schemas.microsoft.com/office/word/2010/wordprocessingInk" xmlns:wne="http://schemas.microsoft.com/office/word/2006/wordml" xmlns:wps="http://schemas.microsoft.com/office/word/2010/wordprocessingShape" mc:Ignorable="w14 w15 w16se w16cid w16 w16cex w16sdtdh wp14">
+<w:hdr xmlns:wpc="http://schemas.microsoft.com/office/word/2010/wordprocessingCanvas" xmlns:cx="http://schemas.microsoft.com/office/drawing/2014/chartex" xmlns:cx1="http://schemas.microsoft.com/office/drawing/2015/9/8/chartex" xmlns:cx2="http://schemas.microsoft.com/office/drawing/2015/10/21/chartex" xmlns:cx3="http://schemas.microsoft.com/office/drawing/2016/5/9/chartex" xmlns:cx4="http://schemas.microsoft.com/office/drawing/2016/5/10/chartex" xmlns:cx5="http://schemas.microsoft.com/office/drawing/2016/5/11/chartex" xmlns:cx6="http://schemas.microsoft.com/office/drawing/2016/5/12/chartex" xmlns:cx7="http://schemas.microsoft.com/office/drawing/2016/5/13/chartex" xmlns:cx8="http://schemas.microsoft.com/office/drawing/2016/5/14/chartex" xmlns:mc="http://schemas.openxmlformats.org/markup-compatibility/2006" xmlns:aink="http://schemas.microsoft.com/office/drawing/2016/ink" xmlns:am3d="http://schemas.microsoft.com/office/drawing/2017/model3d" xmlns:o="urn:schemas-microsoft-com:office:office" xmlns:oel="http://schemas.microsoft.com/office/2019/extlst" xmlns:r="http://schemas.openxmlformats.org/officeDocument/2006/relationships" xmlns:m="http://schemas.openxmlformats.org/officeDocument/2006/math" xmlns:v="urn:schemas-microsoft-com:vml" xmlns:wp14="http://schemas.microsoft.com/office/word/2010/wordprocessingDrawing" xmlns:wp="http://schemas.openxmlformats.org/drawingml/2006/wordprocessingDrawing" xmlns:w10="urn:schemas-microsoft-com:office:word" xmlns:w="http://schemas.openxmlformats.org/wordprocessingml/2006/main" xmlns:w14="http://schemas.microsoft.com/office/word/2010/wordml" xmlns:w15="http://schemas.microsoft.com/office/word/2012/wordml" xmlns:w16cex="http://schemas.microsoft.com/office/word/2018/wordml/cex" xmlns:w16cid="http://schemas.microsoft.com/office/word/2016/wordml/cid" xmlns:w16="http://schemas.microsoft.com/office/word/2018/wordml" xmlns:w16du="http://schemas.microsoft.com/office/word/2023/wordml/word16du" xmlns:w16sdtdh="http://schemas.microsoft.com/office/word/2020/wordml/sdtdatahash" xmlns:w16sdtfl="http://schemas.microsoft.com/office/word/2024/wordml/sdtformatlock" xmlns:w16se="http://schemas.microsoft.com/office/word/2015/wordml/symex" xmlns:wpg="http://schemas.microsoft.com/office/word/2010/wordprocessingGroup" xmlns:wpi="http://schemas.microsoft.com/office/word/2010/wordprocessingInk" xmlns:wne="http://schemas.microsoft.com/office/word/2006/wordml" xmlns:wps="http://schemas.microsoft.com/office/word/2010/wordprocessingShape" mc:Ignorable="w14 w15 w16se w16cid w16 w16cex w16sdtdh w16sdtfl w16du wp14">
   <w:p>
     <w:pPr>
       <w:pStyle w:val="Header"/>
@@ -33722,7 +36979,7 @@
 </file>
 
 <file path=word/header2.xml><?xml version="1.0" encoding="utf-8"?>
-<w:hdr xmlns:wpc="http://schemas.microsoft.com/office/word/2010/wordprocessingCanvas" xmlns:cx="http://schemas.microsoft.com/office/drawing/2014/chartex" xmlns:cx1="http://schemas.microsoft.com/office/drawing/2015/9/8/chartex" xmlns:cx2="http://schemas.microsoft.com/office/drawing/2015/10/21/chartex" xmlns:cx3="http://schemas.microsoft.com/office/drawing/2016/5/9/chartex" xmlns:cx4="http://schemas.microsoft.com/office/drawing/2016/5/10/chartex" xmlns:cx5="http://schemas.microsoft.com/office/drawing/2016/5/11/chartex" xmlns:cx6="http://schemas.microsoft.com/office/drawing/2016/5/12/chartex" xmlns:cx7="http://schemas.microsoft.com/office/drawing/2016/5/13/chartex" xmlns:cx8="http://schemas.microsoft.com/office/drawing/2016/5/14/chartex" xmlns:mc="http://schemas.openxmlformats.org/markup-compatibility/2006" xmlns:aink="http://schemas.microsoft.com/office/drawing/2016/ink" xmlns:am3d="http://schemas.microsoft.com/office/drawing/2017/model3d" xmlns:o="urn:schemas-microsoft-com:office:office" xmlns:oel="http://schemas.microsoft.com/office/2019/extlst" xmlns:r="http://schemas.openxmlformats.org/officeDocument/2006/relationships" xmlns:m="http://schemas.openxmlformats.org/officeDocument/2006/math" xmlns:v="urn:schemas-microsoft-com:vml" xmlns:wp14="http://schemas.microsoft.com/office/word/2010/wordprocessingDrawing" xmlns:wp="http://schemas.openxmlformats.org/drawingml/2006/wordprocessingDrawing" xmlns:w10="urn:schemas-microsoft-com:office:word" xmlns:w="http://schemas.openxmlformats.org/wordprocessingml/2006/main" xmlns:w14="http://schemas.microsoft.com/office/word/2010/wordml" xmlns:w15="http://schemas.microsoft.com/office/word/2012/wordml" xmlns:w16cex="http://schemas.microsoft.com/office/word/2018/wordml/cex" xmlns:w16cid="http://schemas.microsoft.com/office/word/2016/wordml/cid" xmlns:w16="http://schemas.microsoft.com/office/word/2018/wordml" xmlns:w16sdtdh="http://schemas.microsoft.com/office/word/2020/wordml/sdtdatahash" xmlns:w16se="http://schemas.microsoft.com/office/word/2015/wordml/symex" xmlns:wpg="http://schemas.microsoft.com/office/word/2010/wordprocessingGroup" xmlns:wpi="http://schemas.microsoft.com/office/word/2010/wordprocessingInk" xmlns:wne="http://schemas.microsoft.com/office/word/2006/wordml" xmlns:wps="http://schemas.microsoft.com/office/word/2010/wordprocessingShape" mc:Ignorable="w14 w15 w16se w16cid w16 w16cex w16sdtdh wp14">
+<w:hdr xmlns:wpc="http://schemas.microsoft.com/office/word/2010/wordprocessingCanvas" xmlns:cx="http://schemas.microsoft.com/office/drawing/2014/chartex" xmlns:cx1="http://schemas.microsoft.com/office/drawing/2015/9/8/chartex" xmlns:cx2="http://schemas.microsoft.com/office/drawing/2015/10/21/chartex" xmlns:cx3="http://schemas.microsoft.com/office/drawing/2016/5/9/chartex" xmlns:cx4="http://schemas.microsoft.com/office/drawing/2016/5/10/chartex" xmlns:cx5="http://schemas.microsoft.com/office/drawing/2016/5/11/chartex" xmlns:cx6="http://schemas.microsoft.com/office/drawing/2016/5/12/chartex" xmlns:cx7="http://schemas.microsoft.com/office/drawing/2016/5/13/chartex" xmlns:cx8="http://schemas.microsoft.com/office/drawing/2016/5/14/chartex" xmlns:mc="http://schemas.openxmlformats.org/markup-compatibility/2006" xmlns:aink="http://schemas.microsoft.com/office/drawing/2016/ink" xmlns:am3d="http://schemas.microsoft.com/office/drawing/2017/model3d" xmlns:o="urn:schemas-microsoft-com:office:office" xmlns:oel="http://schemas.microsoft.com/office/2019/extlst" xmlns:r="http://schemas.openxmlformats.org/officeDocument/2006/relationships" xmlns:m="http://schemas.openxmlformats.org/officeDocument/2006/math" xmlns:v="urn:schemas-microsoft-com:vml" xmlns:wp14="http://schemas.microsoft.com/office/word/2010/wordprocessingDrawing" xmlns:wp="http://schemas.openxmlformats.org/drawingml/2006/wordprocessingDrawing" xmlns:w10="urn:schemas-microsoft-com:office:word" xmlns:w="http://schemas.openxmlformats.org/wordprocessingml/2006/main" xmlns:w14="http://schemas.microsoft.com/office/word/2010/wordml" xmlns:w15="http://schemas.microsoft.com/office/word/2012/wordml" xmlns:w16cex="http://schemas.microsoft.com/office/word/2018/wordml/cex" xmlns:w16cid="http://schemas.microsoft.com/office/word/2016/wordml/cid" xmlns:w16="http://schemas.microsoft.com/office/word/2018/wordml" xmlns:w16du="http://schemas.microsoft.com/office/word/2023/wordml/word16du" xmlns:w16sdtdh="http://schemas.microsoft.com/office/word/2020/wordml/sdtdatahash" xmlns:w16sdtfl="http://schemas.microsoft.com/office/word/2024/wordml/sdtformatlock" xmlns:w16se="http://schemas.microsoft.com/office/word/2015/wordml/symex" xmlns:wpg="http://schemas.microsoft.com/office/word/2010/wordprocessingGroup" xmlns:wpi="http://schemas.microsoft.com/office/word/2010/wordprocessingInk" xmlns:wne="http://schemas.microsoft.com/office/word/2006/wordml" xmlns:wps="http://schemas.microsoft.com/office/word/2010/wordprocessingShape" mc:Ignorable="w14 w15 w16se w16cid w16 w16cex w16sdtdh w16sdtfl w16du wp14">
   <w:p>
     <w:pPr>
       <w:pStyle w:val="Header"/>
@@ -33735,7 +36992,7 @@
 </file>
 
 <file path=word/styles.xml><?xml version="1.0" encoding="utf-8"?>
-<w:styles xmlns:mc="http://schemas.openxmlformats.org/markup-compatibility/2006" xmlns:r="http://schemas.openxmlformats.org/officeDocument/2006/relationships" xmlns:w="http://schemas.openxmlformats.org/wordprocessingml/2006/main" xmlns:w14="http://schemas.microsoft.com/office/word/2010/wordml" xmlns:w15="http://schemas.microsoft.com/office/word/2012/wordml" xmlns:w16cex="http://schemas.microsoft.com/office/word/2018/wordml/cex" xmlns:w16cid="http://schemas.microsoft.com/office/word/2016/wordml/cid" xmlns:w16="http://schemas.microsoft.com/office/word/2018/wordml" xmlns:w16sdtdh="http://schemas.microsoft.com/office/word/2020/wordml/sdtdatahash" xmlns:w16se="http://schemas.microsoft.com/office/word/2015/wordml/symex" mc:Ignorable="w14 w15 w16se w16cid w16 w16cex w16sdtdh">
+<w:styles xmlns:mc="http://schemas.openxmlformats.org/markup-compatibility/2006" xmlns:r="http://schemas.openxmlformats.org/officeDocument/2006/relationships" xmlns:w="http://schemas.openxmlformats.org/wordprocessingml/2006/main" xmlns:w14="http://schemas.microsoft.com/office/word/2010/wordml" xmlns:w15="http://schemas.microsoft.com/office/word/2012/wordml" xmlns:w16cex="http://schemas.microsoft.com/office/word/2018/wordml/cex" xmlns:w16cid="http://schemas.microsoft.com/office/word/2016/wordml/cid" xmlns:w16="http://schemas.microsoft.com/office/word/2018/wordml" xmlns:w16du="http://schemas.microsoft.com/office/word/2023/wordml/word16du" xmlns:w16sdtdh="http://schemas.microsoft.com/office/word/2020/wordml/sdtdatahash" xmlns:w16sdtfl="http://schemas.microsoft.com/office/word/2024/wordml/sdtformatlock" xmlns:w16se="http://schemas.microsoft.com/office/word/2015/wordml/symex" mc:Ignorable="w14 w15 w16se w16cid w16 w16cex w16sdtdh w16sdtfl w16du">
   <w:docDefaults>
     <w:rPrDefault>
       <w:rPr>

</xml_diff>

<commit_message>
nmv 17 09 2026
</commit_message>
<xml_diff>
--- a/TS Jatai Ghanam Project/TS 4.1/TS 4.1 Ghanam Malayalam Corrections.docx
+++ b/TS Jatai Ghanam Project/TS 4.1/TS 4.1 Ghanam Malayalam Corrections.docx
@@ -24,7 +24,6 @@
         </w:rPr>
         <w:t xml:space="preserve">TS </w:t>
       </w:r>
-      <w:proofErr w:type="gramStart"/>
       <w:r>
         <w:rPr>
           <w:b/>
@@ -53,18 +52,7 @@
           <w:szCs w:val="32"/>
           <w:u w:val="single"/>
         </w:rPr>
-        <w:t>–</w:t>
-      </w:r>
-      <w:proofErr w:type="gramEnd"/>
-      <w:r>
-        <w:rPr>
-          <w:b/>
-          <w:bCs/>
-          <w:sz w:val="32"/>
-          <w:szCs w:val="32"/>
-          <w:u w:val="single"/>
-        </w:rPr>
-        <w:t xml:space="preserve"> TS </w:t>
+        <w:t xml:space="preserve">– TS </w:t>
       </w:r>
       <w:r>
         <w:rPr>
@@ -124,18 +112,7 @@
           <w:szCs w:val="32"/>
           <w:u w:val="single"/>
         </w:rPr>
-        <w:t xml:space="preserve">Observed </w:t>
-      </w:r>
-      <w:proofErr w:type="gramStart"/>
-      <w:r>
-        <w:rPr>
-          <w:b/>
-          <w:bCs/>
-          <w:sz w:val="32"/>
-          <w:szCs w:val="32"/>
-          <w:u w:val="single"/>
-        </w:rPr>
-        <w:t xml:space="preserve">till </w:t>
+        <w:t xml:space="preserve">Observed till </w:t>
       </w:r>
       <w:r>
         <w:rPr>
@@ -148,7 +125,6 @@
         </w:rPr>
         <w:t>?????</w:t>
       </w:r>
-      <w:proofErr w:type="gramEnd"/>
     </w:p>
     <w:p>
       <w:pPr>
@@ -3100,7 +3076,7 @@
       </w:tr>
       <w:tr>
         <w:trPr>
-          <w:trHeight w:val="1709"/>
+          <w:trHeight w:val="3919"/>
         </w:trPr>
         <w:tc>
           <w:tcPr>
@@ -3120,11 +3096,1215 @@
               <w:adjustRightInd w:val="0"/>
               <w:spacing w:before="0" w:line="240" w:lineRule="auto"/>
               <w:rPr>
+                <w:rFonts w:ascii="BRH Malayalam Extra" w:hAnsi="BRH Malayalam Extra" w:cs="BRH Malayalam Extra"/>
+                <w:color w:val="000000"/>
+                <w:sz w:val="32"/>
+                <w:szCs w:val="32"/>
+              </w:rPr>
+            </w:pPr>
+            <w:r>
+              <w:rPr>
+                <w:rFonts w:cs="BRH Malayalam Extra"/>
+                <w:color w:val="000000"/>
+                <w:szCs w:val="32"/>
+              </w:rPr>
+              <w:lastRenderedPageBreak/>
+              <w:t>52</w:t>
+            </w:r>
+            <w:r>
+              <w:rPr>
+                <w:rFonts w:ascii="BRH Malayalam Extra" w:hAnsi="BRH Malayalam Extra" w:cs="BRH Malayalam Extra"/>
+                <w:color w:val="000000"/>
+                <w:sz w:val="32"/>
+                <w:szCs w:val="32"/>
+              </w:rPr>
+              <w:t>)</w:t>
+            </w:r>
+            <w:r>
+              <w:rPr>
+                <w:rFonts w:ascii="BRH Malayalam Extra" w:hAnsi="BRH Malayalam Extra" w:cs="BRH Malayalam Extra"/>
+                <w:color w:val="000000"/>
+                <w:sz w:val="32"/>
+                <w:szCs w:val="32"/>
+              </w:rPr>
+              <w:tab/>
+            </w:r>
+            <w:r>
+              <w:rPr>
+                <w:rFonts w:cs="BRH Malayalam Extra"/>
+                <w:color w:val="000000"/>
+                <w:szCs w:val="32"/>
+              </w:rPr>
+              <w:t>4</w:t>
+            </w:r>
+            <w:r>
+              <w:rPr>
+                <w:rFonts w:ascii="BRH Malayalam Extra" w:hAnsi="BRH Malayalam Extra" w:cs="BRH Malayalam Extra"/>
+                <w:color w:val="000000"/>
+                <w:sz w:val="32"/>
+                <w:szCs w:val="32"/>
+              </w:rPr>
+              <w:t>.</w:t>
+            </w:r>
+            <w:r>
+              <w:rPr>
+                <w:rFonts w:cs="BRH Malayalam Extra"/>
+                <w:color w:val="000000"/>
+                <w:szCs w:val="32"/>
+              </w:rPr>
+              <w:t>1</w:t>
+            </w:r>
+            <w:r>
+              <w:rPr>
+                <w:rFonts w:ascii="BRH Malayalam Extra" w:hAnsi="BRH Malayalam Extra" w:cs="BRH Malayalam Extra"/>
+                <w:color w:val="000000"/>
+                <w:sz w:val="32"/>
+                <w:szCs w:val="32"/>
+              </w:rPr>
+              <w:t>.</w:t>
+            </w:r>
+            <w:r>
+              <w:rPr>
+                <w:rFonts w:cs="BRH Malayalam Extra"/>
+                <w:color w:val="000000"/>
+                <w:szCs w:val="32"/>
+              </w:rPr>
+              <w:t>10</w:t>
+            </w:r>
+            <w:r>
+              <w:rPr>
+                <w:rFonts w:ascii="BRH Malayalam Extra" w:hAnsi="BRH Malayalam Extra" w:cs="BRH Malayalam Extra"/>
+                <w:color w:val="000000"/>
+                <w:sz w:val="32"/>
+                <w:szCs w:val="32"/>
+              </w:rPr>
+              <w:t>.</w:t>
+            </w:r>
+            <w:r>
+              <w:rPr>
+                <w:rFonts w:cs="BRH Malayalam Extra"/>
+                <w:color w:val="000000"/>
+                <w:szCs w:val="32"/>
+              </w:rPr>
+              <w:t>4</w:t>
+            </w:r>
+            <w:r>
+              <w:rPr>
+                <w:rFonts w:ascii="BRH Malayalam Extra" w:hAnsi="BRH Malayalam Extra" w:cs="BRH Malayalam Extra"/>
+                <w:color w:val="000000"/>
+                <w:sz w:val="32"/>
+                <w:szCs w:val="32"/>
+              </w:rPr>
+              <w:t>(</w:t>
+            </w:r>
+            <w:r>
+              <w:rPr>
+                <w:rFonts w:cs="BRH Malayalam Extra"/>
+                <w:color w:val="000000"/>
+                <w:szCs w:val="32"/>
+              </w:rPr>
+              <w:t>45</w:t>
+            </w:r>
+            <w:r>
+              <w:rPr>
+                <w:rFonts w:ascii="BRH Malayalam Extra" w:hAnsi="BRH Malayalam Extra" w:cs="BRH Malayalam Extra"/>
+                <w:color w:val="000000"/>
+                <w:sz w:val="32"/>
+                <w:szCs w:val="32"/>
+              </w:rPr>
+              <w:t xml:space="preserve">)- qyq¡˜I | GK˜I | </w:t>
+            </w:r>
+            <w:r>
+              <w:rPr>
+                <w:rFonts w:ascii="BRH Malayalam Extra" w:hAnsi="BRH Malayalam Extra" w:cs="BRH Malayalam Extra"/>
+                <w:color w:val="000000"/>
+                <w:sz w:val="32"/>
+                <w:szCs w:val="32"/>
+                <w:highlight w:val="yellow"/>
+              </w:rPr>
+              <w:t>s</w:t>
+            </w:r>
+            <w:r>
+              <w:rPr>
+                <w:rFonts w:ascii="BRH Malayalam Extra" w:hAnsi="BRH Malayalam Extra" w:cs="BRH Malayalam Extra"/>
+                <w:color w:val="000000"/>
+                <w:sz w:val="26"/>
+                <w:szCs w:val="32"/>
+                <w:highlight w:val="yellow"/>
+              </w:rPr>
+              <w:t>–</w:t>
+            </w:r>
+            <w:r>
+              <w:rPr>
+                <w:rFonts w:ascii="BRH Malayalam Extra" w:hAnsi="BRH Malayalam Extra" w:cs="BRH Malayalam Extra"/>
+                <w:color w:val="000000"/>
+                <w:sz w:val="32"/>
+                <w:szCs w:val="32"/>
+                <w:highlight w:val="yellow"/>
+              </w:rPr>
+              <w:t>izPz˜</w:t>
+            </w:r>
+            <w:r>
+              <w:rPr>
+                <w:rFonts w:ascii="BRH Malayalam Extra" w:hAnsi="BRH Malayalam Extra" w:cs="BRH Malayalam Extra"/>
+                <w:color w:val="000000"/>
+                <w:sz w:val="32"/>
+                <w:szCs w:val="32"/>
+              </w:rPr>
+              <w:t xml:space="preserve"> ||</w:t>
+            </w:r>
+          </w:p>
+          <w:p>
+            <w:pPr>
+              <w:widowControl w:val="0"/>
+              <w:autoSpaceDE w:val="0"/>
+              <w:autoSpaceDN w:val="0"/>
+              <w:adjustRightInd w:val="0"/>
+              <w:spacing w:before="0" w:line="240" w:lineRule="auto"/>
+              <w:rPr>
+                <w:rFonts w:ascii="BRH Malayalam Extra" w:hAnsi="BRH Malayalam Extra" w:cs="BRH Malayalam Extra"/>
+                <w:color w:val="000000"/>
+                <w:sz w:val="32"/>
+                <w:szCs w:val="32"/>
+              </w:rPr>
+            </w:pPr>
+            <w:r>
+              <w:rPr>
+                <w:rFonts w:ascii="BRH Malayalam Extra" w:hAnsi="BRH Malayalam Extra" w:cs="BRH Malayalam Extra"/>
+                <w:color w:val="000000"/>
+                <w:sz w:val="32"/>
+                <w:szCs w:val="32"/>
+              </w:rPr>
+              <w:t>qyq¡</w:t>
+            </w:r>
+            <w:r>
+              <w:rPr>
+                <w:rFonts w:ascii="BRH Malayalam Extra" w:hAnsi="BRH Malayalam Extra" w:cs="BRH Malayalam Extra"/>
+                <w:color w:val="000000"/>
+                <w:sz w:val="26"/>
+                <w:szCs w:val="32"/>
+              </w:rPr>
+              <w:t>–</w:t>
+            </w:r>
+            <w:r>
+              <w:rPr>
+                <w:rFonts w:ascii="BRH Malayalam Extra" w:hAnsi="BRH Malayalam Extra" w:cs="BRH Malayalam Extra"/>
+                <w:color w:val="000000"/>
+                <w:sz w:val="32"/>
+                <w:szCs w:val="32"/>
+              </w:rPr>
+              <w:t xml:space="preserve"> ¥iK</w:t>
+            </w:r>
+            <w:r>
+              <w:rPr>
+                <w:rFonts w:ascii="BRH Malayalam Extra" w:hAnsi="BRH Malayalam Extra" w:cs="BRH Malayalam Extra"/>
+                <w:color w:val="000000"/>
+                <w:sz w:val="26"/>
+                <w:szCs w:val="32"/>
+              </w:rPr>
+              <w:t>–</w:t>
+            </w:r>
+            <w:r>
+              <w:rPr>
+                <w:rFonts w:ascii="BRH Malayalam Extra" w:hAnsi="BRH Malayalam Extra" w:cs="BRH Malayalam Extra"/>
+                <w:color w:val="000000"/>
+                <w:sz w:val="32"/>
+                <w:szCs w:val="32"/>
+              </w:rPr>
+              <w:t xml:space="preserve"> ¥iK</w:t>
+            </w:r>
+            <w:r>
+              <w:rPr>
+                <w:rFonts w:ascii="BRH Malayalam Extra" w:hAnsi="BRH Malayalam Extra" w:cs="BRH Malayalam Extra"/>
+                <w:color w:val="000000"/>
+                <w:sz w:val="26"/>
+                <w:szCs w:val="32"/>
+              </w:rPr>
+              <w:t>–</w:t>
+            </w:r>
+            <w:r>
+              <w:rPr>
+                <w:rFonts w:ascii="BRH Devanagari Extra" w:hAnsi="BRH Devanagari Extra" w:cs="BRH Malayalam Extra"/>
+                <w:color w:val="000000"/>
+                <w:sz w:val="26"/>
+                <w:szCs w:val="32"/>
+              </w:rPr>
+              <w:t>óè</w:t>
+            </w:r>
+            <w:r>
+              <w:rPr>
+                <w:rFonts w:ascii="BRH Malayalam Extra" w:hAnsi="BRH Malayalam Extra" w:cs="BRH Malayalam Extra"/>
+                <w:color w:val="000000"/>
+                <w:sz w:val="26"/>
+                <w:szCs w:val="32"/>
+              </w:rPr>
+              <w:t>–</w:t>
+            </w:r>
+            <w:r>
+              <w:rPr>
+                <w:rFonts w:ascii="BRH Malayalam Extra" w:hAnsi="BRH Malayalam Extra" w:cs="BRH Malayalam Extra"/>
+                <w:color w:val="000000"/>
+                <w:sz w:val="32"/>
+                <w:szCs w:val="32"/>
+              </w:rPr>
+              <w:t xml:space="preserve"> qyq¡</w:t>
+            </w:r>
+            <w:r>
+              <w:rPr>
+                <w:rFonts w:ascii="BRH Malayalam Extra" w:hAnsi="BRH Malayalam Extra" w:cs="BRH Malayalam Extra"/>
+                <w:color w:val="000000"/>
+                <w:sz w:val="26"/>
+                <w:szCs w:val="32"/>
+              </w:rPr>
+              <w:t>–</w:t>
+            </w:r>
+            <w:r>
+              <w:rPr>
+                <w:rFonts w:ascii="BRH Devanagari Extra" w:hAnsi="BRH Devanagari Extra" w:cs="BRH Malayalam Extra"/>
+                <w:color w:val="000000"/>
+                <w:sz w:val="26"/>
+                <w:szCs w:val="32"/>
+              </w:rPr>
+              <w:t>óè</w:t>
+            </w:r>
+            <w:r>
+              <w:rPr>
+                <w:rFonts w:ascii="BRH Malayalam Extra" w:hAnsi="BRH Malayalam Extra" w:cs="BRH Malayalam Extra"/>
+                <w:color w:val="000000"/>
+                <w:sz w:val="26"/>
+                <w:szCs w:val="32"/>
+              </w:rPr>
+              <w:t>–</w:t>
+            </w:r>
+            <w:r>
+              <w:rPr>
+                <w:rFonts w:ascii="BRH Malayalam Extra" w:hAnsi="BRH Malayalam Extra" w:cs="BRH Malayalam Extra"/>
+                <w:color w:val="000000"/>
+                <w:sz w:val="32"/>
+                <w:szCs w:val="32"/>
+              </w:rPr>
+              <w:t xml:space="preserve"> qyq¡</w:t>
+            </w:r>
+            <w:r>
+              <w:rPr>
+                <w:rFonts w:ascii="BRH Malayalam Extra" w:hAnsi="BRH Malayalam Extra" w:cs="BRH Malayalam Extra"/>
+                <w:color w:val="000000"/>
+                <w:sz w:val="26"/>
+                <w:szCs w:val="32"/>
+              </w:rPr>
+              <w:t>–</w:t>
+            </w:r>
+            <w:r>
+              <w:rPr>
+                <w:rFonts w:ascii="BRH Malayalam Extra" w:hAnsi="BRH Malayalam Extra" w:cs="BRH Malayalam Extra"/>
+                <w:color w:val="000000"/>
+                <w:sz w:val="32"/>
+                <w:szCs w:val="32"/>
+              </w:rPr>
+              <w:t xml:space="preserve"> ¥iK</w:t>
+            </w:r>
+            <w:r>
+              <w:rPr>
+                <w:rFonts w:ascii="BRH Devanagari Extra" w:hAnsi="BRH Devanagari Extra" w:cs="BRH Malayalam Extra"/>
+                <w:color w:val="000000"/>
+                <w:sz w:val="26"/>
+                <w:szCs w:val="32"/>
+              </w:rPr>
+              <w:t>óè</w:t>
+            </w:r>
+            <w:r>
+              <w:rPr>
+                <w:rFonts w:ascii="BRH Malayalam Extra" w:hAnsi="BRH Malayalam Extra" w:cs="BRH Malayalam Extra"/>
+                <w:color w:val="000000"/>
+                <w:sz w:val="32"/>
+                <w:szCs w:val="32"/>
+              </w:rPr>
+              <w:t xml:space="preserve">— </w:t>
+            </w:r>
+            <w:r>
+              <w:rPr>
+                <w:rFonts w:ascii="BRH Malayalam Extra" w:hAnsi="BRH Malayalam Extra" w:cs="BRH Malayalam Extra"/>
+                <w:color w:val="000000"/>
+                <w:sz w:val="32"/>
+                <w:szCs w:val="32"/>
+                <w:highlight w:val="yellow"/>
+              </w:rPr>
+              <w:t>s</w:t>
+            </w:r>
+            <w:r>
+              <w:rPr>
+                <w:rFonts w:ascii="BRH Malayalam Extra" w:hAnsi="BRH Malayalam Extra" w:cs="BRH Malayalam Extra"/>
+                <w:color w:val="000000"/>
+                <w:sz w:val="26"/>
+                <w:szCs w:val="32"/>
+                <w:highlight w:val="yellow"/>
+              </w:rPr>
+              <w:t>–</w:t>
+            </w:r>
+            <w:r>
+              <w:rPr>
+                <w:rFonts w:ascii="BRH Malayalam Extra" w:hAnsi="BRH Malayalam Extra" w:cs="BRH Malayalam Extra"/>
+                <w:color w:val="000000"/>
+                <w:sz w:val="32"/>
+                <w:szCs w:val="32"/>
+                <w:highlight w:val="yellow"/>
+              </w:rPr>
+              <w:t>izPz</w:t>
+            </w:r>
+            <w:r>
+              <w:rPr>
+                <w:rFonts w:ascii="BRH Malayalam Extra" w:hAnsi="BRH Malayalam Extra" w:cs="BRH Malayalam Extra"/>
+                <w:color w:val="000000"/>
+                <w:sz w:val="32"/>
+                <w:szCs w:val="32"/>
+              </w:rPr>
+              <w:t xml:space="preserve">— </w:t>
+            </w:r>
+          </w:p>
+          <w:p>
+            <w:pPr>
+              <w:widowControl w:val="0"/>
+              <w:autoSpaceDE w:val="0"/>
+              <w:autoSpaceDN w:val="0"/>
+              <w:adjustRightInd w:val="0"/>
+              <w:spacing w:before="0" w:line="240" w:lineRule="auto"/>
+              <w:rPr>
+                <w:rFonts w:ascii="BRH Malayalam Extra" w:hAnsi="BRH Malayalam Extra" w:cs="BRH Malayalam Extra"/>
+                <w:color w:val="000000"/>
+                <w:sz w:val="32"/>
+                <w:szCs w:val="32"/>
+              </w:rPr>
+            </w:pPr>
+            <w:r>
+              <w:rPr>
+                <w:rFonts w:ascii="BRH Malayalam Extra" w:hAnsi="BRH Malayalam Extra" w:cs="BRH Malayalam Extra"/>
+                <w:color w:val="000000"/>
+                <w:sz w:val="32"/>
+                <w:szCs w:val="32"/>
+                <w:highlight w:val="yellow"/>
+              </w:rPr>
+              <w:t>s</w:t>
+            </w:r>
+            <w:r>
+              <w:rPr>
+                <w:rFonts w:ascii="BRH Malayalam Extra" w:hAnsi="BRH Malayalam Extra" w:cs="BRH Malayalam Extra"/>
+                <w:color w:val="000000"/>
+                <w:sz w:val="26"/>
+                <w:szCs w:val="32"/>
+                <w:highlight w:val="yellow"/>
+              </w:rPr>
+              <w:t>–</w:t>
+            </w:r>
+            <w:r>
+              <w:rPr>
+                <w:rFonts w:ascii="BRH Malayalam Extra" w:hAnsi="BRH Malayalam Extra" w:cs="BRH Malayalam Extra"/>
+                <w:color w:val="000000"/>
+                <w:sz w:val="32"/>
+                <w:szCs w:val="32"/>
+                <w:highlight w:val="yellow"/>
+              </w:rPr>
+              <w:t>izPz</w:t>
+            </w:r>
+            <w:r>
+              <w:rPr>
+                <w:rFonts w:ascii="BRH Malayalam Extra" w:hAnsi="BRH Malayalam Extra" w:cs="BRH Malayalam Extra"/>
+                <w:color w:val="000000"/>
+                <w:sz w:val="26"/>
+                <w:szCs w:val="32"/>
+              </w:rPr>
+              <w:t>–</w:t>
+            </w:r>
+            <w:r>
+              <w:rPr>
+                <w:rFonts w:ascii="BRH Malayalam Extra" w:hAnsi="BRH Malayalam Extra" w:cs="BRH Malayalam Extra"/>
+                <w:color w:val="000000"/>
+                <w:sz w:val="32"/>
+                <w:szCs w:val="32"/>
+              </w:rPr>
+              <w:t xml:space="preserve"> GK</w:t>
+            </w:r>
+            <w:r>
+              <w:rPr>
+                <w:rFonts w:ascii="BRH Malayalam Extra" w:hAnsi="BRH Malayalam Extra" w:cs="BRH Malayalam Extra"/>
+                <w:color w:val="000000"/>
+                <w:sz w:val="26"/>
+                <w:szCs w:val="32"/>
+              </w:rPr>
+              <w:t>–</w:t>
+            </w:r>
+            <w:r>
+              <w:rPr>
+                <w:rFonts w:ascii="BRH Devanagari Extra" w:hAnsi="BRH Devanagari Extra" w:cs="BRH Malayalam Extra"/>
+                <w:color w:val="000000"/>
+                <w:sz w:val="26"/>
+                <w:szCs w:val="32"/>
+              </w:rPr>
+              <w:t>óè</w:t>
+            </w:r>
+            <w:r>
+              <w:rPr>
+                <w:rFonts w:ascii="BRH Malayalam Extra" w:hAnsi="BRH Malayalam Extra" w:cs="BRH Malayalam Extra"/>
+                <w:color w:val="000000"/>
+                <w:sz w:val="26"/>
+                <w:szCs w:val="32"/>
+              </w:rPr>
+              <w:t>–</w:t>
+            </w:r>
+            <w:r>
+              <w:rPr>
+                <w:rFonts w:ascii="BRH Malayalam Extra" w:hAnsi="BRH Malayalam Extra" w:cs="BRH Malayalam Extra"/>
+                <w:color w:val="000000"/>
+                <w:sz w:val="32"/>
+                <w:szCs w:val="32"/>
+              </w:rPr>
+              <w:t xml:space="preserve"> qyq¡</w:t>
+            </w:r>
+            <w:r>
+              <w:rPr>
+                <w:rFonts w:ascii="BRH Malayalam Extra" w:hAnsi="BRH Malayalam Extra" w:cs="BRH Malayalam Extra"/>
+                <w:color w:val="000000"/>
+                <w:sz w:val="26"/>
+                <w:szCs w:val="32"/>
+              </w:rPr>
+              <w:t>–</w:t>
+            </w:r>
+            <w:r>
+              <w:rPr>
+                <w:rFonts w:ascii="BRH Devanagari Extra" w:hAnsi="BRH Devanagari Extra" w:cs="BRH Malayalam Extra"/>
+                <w:color w:val="000000"/>
+                <w:sz w:val="26"/>
+                <w:szCs w:val="32"/>
+              </w:rPr>
+              <w:t>óè</w:t>
+            </w:r>
+            <w:r>
+              <w:rPr>
+                <w:rFonts w:ascii="BRH Malayalam Extra" w:hAnsi="BRH Malayalam Extra" w:cs="BRH Malayalam Extra"/>
+                <w:color w:val="000000"/>
+                <w:sz w:val="26"/>
+                <w:szCs w:val="32"/>
+              </w:rPr>
+              <w:t>–</w:t>
+            </w:r>
+            <w:r>
+              <w:rPr>
+                <w:rFonts w:ascii="BRH Malayalam Extra" w:hAnsi="BRH Malayalam Extra" w:cs="BRH Malayalam Extra"/>
+                <w:color w:val="000000"/>
+                <w:sz w:val="32"/>
+                <w:szCs w:val="32"/>
+              </w:rPr>
+              <w:t xml:space="preserve"> qyq¡</w:t>
+            </w:r>
+            <w:r>
+              <w:rPr>
+                <w:rFonts w:ascii="BRH Malayalam Extra" w:hAnsi="BRH Malayalam Extra" w:cs="BRH Malayalam Extra"/>
+                <w:color w:val="000000"/>
+                <w:sz w:val="26"/>
+                <w:szCs w:val="32"/>
+              </w:rPr>
+              <w:t>–</w:t>
+            </w:r>
+            <w:r>
+              <w:rPr>
+                <w:rFonts w:ascii="BRH Malayalam Extra" w:hAnsi="BRH Malayalam Extra" w:cs="BRH Malayalam Extra"/>
+                <w:color w:val="000000"/>
+                <w:sz w:val="32"/>
+                <w:szCs w:val="32"/>
+              </w:rPr>
+              <w:t xml:space="preserve"> ¥iK</w:t>
+            </w:r>
+            <w:r>
+              <w:rPr>
+                <w:rFonts w:ascii="BRH Devanagari Extra" w:hAnsi="BRH Devanagari Extra" w:cs="BRH Malayalam Extra"/>
+                <w:color w:val="000000"/>
+                <w:sz w:val="26"/>
+                <w:szCs w:val="32"/>
+              </w:rPr>
+              <w:t>óè</w:t>
+            </w:r>
+            <w:r>
+              <w:rPr>
+                <w:rFonts w:ascii="BRH Malayalam Extra" w:hAnsi="BRH Malayalam Extra" w:cs="BRH Malayalam Extra"/>
+                <w:color w:val="000000"/>
+                <w:sz w:val="32"/>
+                <w:szCs w:val="32"/>
+              </w:rPr>
+              <w:t xml:space="preserve">— </w:t>
+            </w:r>
+            <w:r>
+              <w:rPr>
+                <w:rFonts w:ascii="BRH Malayalam Extra" w:hAnsi="BRH Malayalam Extra" w:cs="BRH Malayalam Extra"/>
+                <w:color w:val="000000"/>
+                <w:sz w:val="32"/>
+                <w:szCs w:val="32"/>
+                <w:highlight w:val="yellow"/>
+              </w:rPr>
+              <w:t>s</w:t>
+            </w:r>
+            <w:r>
+              <w:rPr>
+                <w:rFonts w:ascii="BRH Malayalam Extra" w:hAnsi="BRH Malayalam Extra" w:cs="BRH Malayalam Extra"/>
+                <w:color w:val="000000"/>
+                <w:sz w:val="26"/>
+                <w:szCs w:val="32"/>
+                <w:highlight w:val="yellow"/>
+              </w:rPr>
+              <w:t>–</w:t>
+            </w:r>
+            <w:r>
+              <w:rPr>
+                <w:rFonts w:ascii="BRH Malayalam Extra" w:hAnsi="BRH Malayalam Extra" w:cs="BRH Malayalam Extra"/>
+                <w:color w:val="000000"/>
+                <w:sz w:val="32"/>
+                <w:szCs w:val="32"/>
+                <w:highlight w:val="yellow"/>
+              </w:rPr>
+              <w:t>izPz˜</w:t>
+            </w:r>
+            <w:r>
+              <w:rPr>
+                <w:rFonts w:ascii="BRH Malayalam Extra" w:hAnsi="BRH Malayalam Extra" w:cs="BRH Malayalam Extra"/>
+                <w:color w:val="000000"/>
+                <w:sz w:val="32"/>
+                <w:szCs w:val="32"/>
+              </w:rPr>
+              <w:t xml:space="preserve"> | </w:t>
+            </w:r>
+          </w:p>
+          <w:p>
+            <w:pPr>
+              <w:widowControl w:val="0"/>
+              <w:autoSpaceDE w:val="0"/>
+              <w:autoSpaceDN w:val="0"/>
+              <w:adjustRightInd w:val="0"/>
+              <w:spacing w:before="0" w:line="240" w:lineRule="auto"/>
+              <w:rPr>
+                <w:rFonts w:ascii="BRH Malayalam Extra" w:hAnsi="BRH Malayalam Extra" w:cs="BRH Malayalam Extra"/>
+                <w:color w:val="000000"/>
+                <w:sz w:val="32"/>
+                <w:szCs w:val="32"/>
+              </w:rPr>
+            </w:pPr>
+            <w:r>
+              <w:rPr>
+                <w:rFonts w:cs="BRH Malayalam Extra"/>
+                <w:color w:val="000000"/>
+                <w:szCs w:val="32"/>
+              </w:rPr>
+              <w:t>53</w:t>
+            </w:r>
+            <w:r>
+              <w:rPr>
+                <w:rFonts w:ascii="BRH Malayalam Extra" w:hAnsi="BRH Malayalam Extra" w:cs="BRH Malayalam Extra"/>
+                <w:color w:val="000000"/>
+                <w:sz w:val="32"/>
+                <w:szCs w:val="32"/>
+              </w:rPr>
+              <w:t>)</w:t>
+            </w:r>
+            <w:r>
+              <w:rPr>
+                <w:rFonts w:ascii="BRH Malayalam Extra" w:hAnsi="BRH Malayalam Extra" w:cs="BRH Malayalam Extra"/>
+                <w:color w:val="000000"/>
+                <w:sz w:val="32"/>
+                <w:szCs w:val="32"/>
+              </w:rPr>
+              <w:tab/>
+            </w:r>
+            <w:r>
+              <w:rPr>
+                <w:rFonts w:cs="BRH Malayalam Extra"/>
+                <w:color w:val="000000"/>
+                <w:szCs w:val="32"/>
+              </w:rPr>
+              <w:t>4</w:t>
+            </w:r>
+            <w:r>
+              <w:rPr>
+                <w:rFonts w:ascii="BRH Malayalam Extra" w:hAnsi="BRH Malayalam Extra" w:cs="BRH Malayalam Extra"/>
+                <w:color w:val="000000"/>
+                <w:sz w:val="32"/>
+                <w:szCs w:val="32"/>
+              </w:rPr>
+              <w:t>.</w:t>
+            </w:r>
+            <w:r>
+              <w:rPr>
+                <w:rFonts w:cs="BRH Malayalam Extra"/>
+                <w:color w:val="000000"/>
+                <w:szCs w:val="32"/>
+              </w:rPr>
+              <w:t>1</w:t>
+            </w:r>
+            <w:r>
+              <w:rPr>
+                <w:rFonts w:ascii="BRH Malayalam Extra" w:hAnsi="BRH Malayalam Extra" w:cs="BRH Malayalam Extra"/>
+                <w:color w:val="000000"/>
+                <w:sz w:val="32"/>
+                <w:szCs w:val="32"/>
+              </w:rPr>
+              <w:t>.</w:t>
+            </w:r>
+            <w:r>
+              <w:rPr>
+                <w:rFonts w:cs="BRH Malayalam Extra"/>
+                <w:color w:val="000000"/>
+                <w:szCs w:val="32"/>
+              </w:rPr>
+              <w:t>10</w:t>
+            </w:r>
+            <w:r>
+              <w:rPr>
+                <w:rFonts w:ascii="BRH Malayalam Extra" w:hAnsi="BRH Malayalam Extra" w:cs="BRH Malayalam Extra"/>
+                <w:color w:val="000000"/>
+                <w:sz w:val="32"/>
+                <w:szCs w:val="32"/>
+              </w:rPr>
+              <w:t>.</w:t>
+            </w:r>
+            <w:r>
+              <w:rPr>
+                <w:rFonts w:cs="BRH Malayalam Extra"/>
+                <w:color w:val="000000"/>
+                <w:szCs w:val="32"/>
+              </w:rPr>
+              <w:t>4</w:t>
+            </w:r>
+            <w:r>
+              <w:rPr>
+                <w:rFonts w:ascii="BRH Malayalam Extra" w:hAnsi="BRH Malayalam Extra" w:cs="BRH Malayalam Extra"/>
+                <w:color w:val="000000"/>
+                <w:sz w:val="32"/>
+                <w:szCs w:val="32"/>
+              </w:rPr>
+              <w:t>(</w:t>
+            </w:r>
+            <w:r>
+              <w:rPr>
+                <w:rFonts w:cs="BRH Malayalam Extra"/>
+                <w:color w:val="000000"/>
+                <w:szCs w:val="32"/>
+              </w:rPr>
+              <w:t>46</w:t>
+            </w:r>
+            <w:r>
+              <w:rPr>
+                <w:rFonts w:ascii="BRH Malayalam Extra" w:hAnsi="BRH Malayalam Extra" w:cs="BRH Malayalam Extra"/>
+                <w:color w:val="000000"/>
+                <w:sz w:val="32"/>
+                <w:szCs w:val="32"/>
+              </w:rPr>
+              <w:t xml:space="preserve">)- GK˜I | </w:t>
+            </w:r>
+            <w:r>
+              <w:rPr>
+                <w:rFonts w:ascii="BRH Malayalam Extra" w:hAnsi="BRH Malayalam Extra" w:cs="BRH Malayalam Extra"/>
+                <w:color w:val="000000"/>
+                <w:sz w:val="32"/>
+                <w:szCs w:val="32"/>
+                <w:highlight w:val="yellow"/>
+              </w:rPr>
+              <w:t>s</w:t>
+            </w:r>
+            <w:r>
+              <w:rPr>
+                <w:rFonts w:ascii="BRH Malayalam Extra" w:hAnsi="BRH Malayalam Extra" w:cs="BRH Malayalam Extra"/>
+                <w:color w:val="000000"/>
+                <w:sz w:val="26"/>
+                <w:szCs w:val="32"/>
+                <w:highlight w:val="yellow"/>
+              </w:rPr>
+              <w:t>–</w:t>
+            </w:r>
+            <w:r>
+              <w:rPr>
+                <w:rFonts w:ascii="BRH Malayalam Extra" w:hAnsi="BRH Malayalam Extra" w:cs="BRH Malayalam Extra"/>
+                <w:color w:val="000000"/>
+                <w:sz w:val="32"/>
+                <w:szCs w:val="32"/>
+                <w:highlight w:val="yellow"/>
+              </w:rPr>
+              <w:t>izPz˜</w:t>
+            </w:r>
+            <w:r>
+              <w:rPr>
+                <w:rFonts w:ascii="BRH Malayalam Extra" w:hAnsi="BRH Malayalam Extra" w:cs="BRH Malayalam Extra"/>
+                <w:color w:val="000000"/>
+                <w:sz w:val="32"/>
+                <w:szCs w:val="32"/>
+              </w:rPr>
+              <w:t xml:space="preserve"> ||</w:t>
+            </w:r>
+          </w:p>
+          <w:p>
+            <w:pPr>
+              <w:widowControl w:val="0"/>
+              <w:autoSpaceDE w:val="0"/>
+              <w:autoSpaceDN w:val="0"/>
+              <w:adjustRightInd w:val="0"/>
+              <w:spacing w:before="0" w:line="240" w:lineRule="auto"/>
+              <w:rPr>
+                <w:rFonts w:ascii="BRH Malayalam Extra" w:hAnsi="BRH Malayalam Extra" w:cs="BRH Malayalam Extra"/>
+                <w:color w:val="000000"/>
+                <w:sz w:val="32"/>
+                <w:szCs w:val="32"/>
+              </w:rPr>
+            </w:pPr>
+            <w:r>
+              <w:rPr>
+                <w:rFonts w:ascii="BRH Malayalam Extra" w:hAnsi="BRH Malayalam Extra" w:cs="BRH Malayalam Extra"/>
+                <w:color w:val="000000"/>
+                <w:sz w:val="32"/>
+                <w:szCs w:val="32"/>
+              </w:rPr>
+              <w:t>GK</w:t>
+            </w:r>
+            <w:r>
+              <w:rPr>
+                <w:rFonts w:ascii="BRH Devanagari Extra" w:hAnsi="BRH Devanagari Extra" w:cs="BRH Malayalam Extra"/>
+                <w:color w:val="000000"/>
+                <w:sz w:val="26"/>
+                <w:szCs w:val="32"/>
+              </w:rPr>
+              <w:t>óè</w:t>
+            </w:r>
+            <w:r>
+              <w:rPr>
+                <w:rFonts w:ascii="BRH Malayalam Extra" w:hAnsi="BRH Malayalam Extra" w:cs="BRH Malayalam Extra"/>
+                <w:color w:val="000000"/>
+                <w:sz w:val="32"/>
+                <w:szCs w:val="32"/>
+              </w:rPr>
+              <w:t xml:space="preserve">— </w:t>
+            </w:r>
+            <w:r>
+              <w:rPr>
+                <w:rFonts w:ascii="BRH Malayalam Extra" w:hAnsi="BRH Malayalam Extra" w:cs="BRH Malayalam Extra"/>
+                <w:color w:val="000000"/>
+                <w:sz w:val="32"/>
+                <w:szCs w:val="32"/>
+                <w:highlight w:val="yellow"/>
+              </w:rPr>
+              <w:t>s</w:t>
+            </w:r>
+            <w:r>
+              <w:rPr>
+                <w:rFonts w:ascii="BRH Malayalam Extra" w:hAnsi="BRH Malayalam Extra" w:cs="BRH Malayalam Extra"/>
+                <w:color w:val="000000"/>
+                <w:sz w:val="26"/>
+                <w:szCs w:val="32"/>
+                <w:highlight w:val="yellow"/>
+              </w:rPr>
+              <w:t>–</w:t>
+            </w:r>
+            <w:r>
+              <w:rPr>
+                <w:rFonts w:ascii="BRH Malayalam Extra" w:hAnsi="BRH Malayalam Extra" w:cs="BRH Malayalam Extra"/>
+                <w:color w:val="000000"/>
+                <w:sz w:val="32"/>
+                <w:szCs w:val="32"/>
+                <w:highlight w:val="yellow"/>
+              </w:rPr>
+              <w:t>izPz</w:t>
+            </w:r>
+            <w:r>
+              <w:rPr>
+                <w:rFonts w:ascii="BRH Malayalam Extra" w:hAnsi="BRH Malayalam Extra" w:cs="BRH Malayalam Extra"/>
+                <w:color w:val="000000"/>
+                <w:sz w:val="32"/>
+                <w:szCs w:val="32"/>
+              </w:rPr>
+              <w:t xml:space="preserve">— </w:t>
+            </w:r>
+            <w:r>
+              <w:rPr>
+                <w:rFonts w:ascii="BRH Malayalam Extra" w:hAnsi="BRH Malayalam Extra" w:cs="BRH Malayalam Extra"/>
+                <w:color w:val="000000"/>
+                <w:sz w:val="32"/>
+                <w:szCs w:val="32"/>
+                <w:highlight w:val="yellow"/>
+              </w:rPr>
+              <w:t>s</w:t>
+            </w:r>
+            <w:r>
+              <w:rPr>
+                <w:rFonts w:ascii="BRH Malayalam Extra" w:hAnsi="BRH Malayalam Extra" w:cs="BRH Malayalam Extra"/>
+                <w:color w:val="000000"/>
+                <w:sz w:val="26"/>
+                <w:szCs w:val="32"/>
+                <w:highlight w:val="yellow"/>
+              </w:rPr>
+              <w:t>–</w:t>
+            </w:r>
+            <w:r>
+              <w:rPr>
+                <w:rFonts w:ascii="BRH Malayalam Extra" w:hAnsi="BRH Malayalam Extra" w:cs="BRH Malayalam Extra"/>
+                <w:color w:val="000000"/>
+                <w:sz w:val="32"/>
+                <w:szCs w:val="32"/>
+                <w:highlight w:val="yellow"/>
+              </w:rPr>
+              <w:t>izPz</w:t>
+            </w:r>
+            <w:r>
+              <w:rPr>
+                <w:rFonts w:ascii="BRH Malayalam Extra" w:hAnsi="BRH Malayalam Extra" w:cs="BRH Malayalam Extra"/>
+                <w:color w:val="000000"/>
+                <w:sz w:val="26"/>
+                <w:szCs w:val="32"/>
+              </w:rPr>
+              <w:t>–</w:t>
+            </w:r>
+            <w:r>
+              <w:rPr>
+                <w:rFonts w:ascii="BRH Malayalam Extra" w:hAnsi="BRH Malayalam Extra" w:cs="BRH Malayalam Extra"/>
+                <w:color w:val="000000"/>
+                <w:sz w:val="32"/>
+                <w:szCs w:val="32"/>
+              </w:rPr>
+              <w:t xml:space="preserve"> GK</w:t>
+            </w:r>
+            <w:r>
+              <w:rPr>
+                <w:rFonts w:ascii="BRH Malayalam Extra" w:hAnsi="BRH Malayalam Extra" w:cs="BRH Malayalam Extra"/>
+                <w:color w:val="000000"/>
+                <w:sz w:val="26"/>
+                <w:szCs w:val="32"/>
+              </w:rPr>
+              <w:t>–</w:t>
+            </w:r>
+            <w:r>
+              <w:rPr>
+                <w:rFonts w:ascii="BRH Malayalam Extra" w:hAnsi="BRH Malayalam Extra" w:cs="BRH Malayalam Extra"/>
+                <w:color w:val="000000"/>
+                <w:sz w:val="32"/>
+                <w:szCs w:val="32"/>
+              </w:rPr>
+              <w:t xml:space="preserve"> ¥iK</w:t>
+            </w:r>
+            <w:r>
+              <w:rPr>
+                <w:rFonts w:ascii="BRH Devanagari Extra" w:hAnsi="BRH Devanagari Extra" w:cs="BRH Malayalam Extra"/>
+                <w:color w:val="000000"/>
+                <w:sz w:val="26"/>
+                <w:szCs w:val="32"/>
+              </w:rPr>
+              <w:t>óè</w:t>
+            </w:r>
+            <w:r>
+              <w:rPr>
+                <w:rFonts w:ascii="BRH Malayalam Extra" w:hAnsi="BRH Malayalam Extra" w:cs="BRH Malayalam Extra"/>
+                <w:color w:val="000000"/>
+                <w:sz w:val="32"/>
+                <w:szCs w:val="32"/>
+              </w:rPr>
+              <w:t xml:space="preserve">— </w:t>
+            </w:r>
+            <w:r>
+              <w:rPr>
+                <w:rFonts w:ascii="BRH Malayalam Extra" w:hAnsi="BRH Malayalam Extra" w:cs="BRH Malayalam Extra"/>
+                <w:color w:val="000000"/>
+                <w:sz w:val="32"/>
+                <w:szCs w:val="32"/>
+                <w:highlight w:val="yellow"/>
+              </w:rPr>
+              <w:t>s</w:t>
+            </w:r>
+            <w:r>
+              <w:rPr>
+                <w:rFonts w:ascii="BRH Malayalam Extra" w:hAnsi="BRH Malayalam Extra" w:cs="BRH Malayalam Extra"/>
+                <w:color w:val="000000"/>
+                <w:sz w:val="26"/>
+                <w:szCs w:val="32"/>
+                <w:highlight w:val="yellow"/>
+              </w:rPr>
+              <w:t>–</w:t>
+            </w:r>
+            <w:r>
+              <w:rPr>
+                <w:rFonts w:ascii="BRH Malayalam Extra" w:hAnsi="BRH Malayalam Extra" w:cs="BRH Malayalam Extra"/>
+                <w:color w:val="000000"/>
+                <w:sz w:val="32"/>
+                <w:szCs w:val="32"/>
+                <w:highlight w:val="yellow"/>
+              </w:rPr>
+              <w:t>izPz˜</w:t>
+            </w:r>
+            <w:r>
+              <w:rPr>
+                <w:rFonts w:ascii="BRH Malayalam Extra" w:hAnsi="BRH Malayalam Extra" w:cs="BRH Malayalam Extra"/>
+                <w:color w:val="000000"/>
+                <w:sz w:val="32"/>
+                <w:szCs w:val="32"/>
+              </w:rPr>
+              <w:t xml:space="preserve"> | </w:t>
+            </w:r>
+          </w:p>
+          <w:p>
+            <w:pPr>
+              <w:widowControl w:val="0"/>
+              <w:autoSpaceDE w:val="0"/>
+              <w:autoSpaceDN w:val="0"/>
+              <w:adjustRightInd w:val="0"/>
+              <w:spacing w:before="0" w:line="240" w:lineRule="auto"/>
+              <w:rPr>
+                <w:rFonts w:ascii="BRH Malayalam Extra" w:hAnsi="BRH Malayalam Extra" w:cs="BRH Malayalam Extra"/>
+                <w:color w:val="000000"/>
+                <w:sz w:val="32"/>
+                <w:szCs w:val="32"/>
+              </w:rPr>
+            </w:pPr>
+            <w:r>
+              <w:rPr>
+                <w:rFonts w:cs="BRH Malayalam Extra"/>
+                <w:color w:val="000000"/>
+                <w:szCs w:val="32"/>
+              </w:rPr>
+              <w:t>54</w:t>
+            </w:r>
+            <w:r>
+              <w:rPr>
+                <w:rFonts w:ascii="BRH Malayalam Extra" w:hAnsi="BRH Malayalam Extra" w:cs="BRH Malayalam Extra"/>
+                <w:color w:val="000000"/>
+                <w:sz w:val="32"/>
+                <w:szCs w:val="32"/>
+              </w:rPr>
+              <w:t>)</w:t>
+            </w:r>
+            <w:r>
+              <w:rPr>
+                <w:rFonts w:ascii="BRH Malayalam Extra" w:hAnsi="BRH Malayalam Extra" w:cs="BRH Malayalam Extra"/>
+                <w:color w:val="000000"/>
+                <w:sz w:val="32"/>
+                <w:szCs w:val="32"/>
+              </w:rPr>
+              <w:tab/>
+            </w:r>
+            <w:r>
+              <w:rPr>
+                <w:rFonts w:cs="BRH Malayalam Extra"/>
+                <w:color w:val="000000"/>
+                <w:szCs w:val="32"/>
+              </w:rPr>
+              <w:t>4</w:t>
+            </w:r>
+            <w:r>
+              <w:rPr>
+                <w:rFonts w:ascii="BRH Malayalam Extra" w:hAnsi="BRH Malayalam Extra" w:cs="BRH Malayalam Extra"/>
+                <w:color w:val="000000"/>
+                <w:sz w:val="32"/>
+                <w:szCs w:val="32"/>
+              </w:rPr>
+              <w:t>.</w:t>
+            </w:r>
+            <w:r>
+              <w:rPr>
+                <w:rFonts w:cs="BRH Malayalam Extra"/>
+                <w:color w:val="000000"/>
+                <w:szCs w:val="32"/>
+              </w:rPr>
+              <w:t>1</w:t>
+            </w:r>
+            <w:r>
+              <w:rPr>
+                <w:rFonts w:ascii="BRH Malayalam Extra" w:hAnsi="BRH Malayalam Extra" w:cs="BRH Malayalam Extra"/>
+                <w:color w:val="000000"/>
+                <w:sz w:val="32"/>
+                <w:szCs w:val="32"/>
+              </w:rPr>
+              <w:t>.</w:t>
+            </w:r>
+            <w:r>
+              <w:rPr>
+                <w:rFonts w:cs="BRH Malayalam Extra"/>
+                <w:color w:val="000000"/>
+                <w:szCs w:val="32"/>
+              </w:rPr>
+              <w:t>10</w:t>
+            </w:r>
+            <w:r>
+              <w:rPr>
+                <w:rFonts w:ascii="BRH Malayalam Extra" w:hAnsi="BRH Malayalam Extra" w:cs="BRH Malayalam Extra"/>
+                <w:color w:val="000000"/>
+                <w:sz w:val="32"/>
+                <w:szCs w:val="32"/>
+              </w:rPr>
+              <w:t>.</w:t>
+            </w:r>
+            <w:r>
+              <w:rPr>
+                <w:rFonts w:cs="BRH Malayalam Extra"/>
+                <w:color w:val="000000"/>
+                <w:szCs w:val="32"/>
+              </w:rPr>
+              <w:t>4</w:t>
+            </w:r>
+            <w:r>
+              <w:rPr>
+                <w:rFonts w:ascii="BRH Malayalam Extra" w:hAnsi="BRH Malayalam Extra" w:cs="BRH Malayalam Extra"/>
+                <w:color w:val="000000"/>
+                <w:sz w:val="32"/>
+                <w:szCs w:val="32"/>
+              </w:rPr>
+              <w:t>(</w:t>
+            </w:r>
+            <w:r>
+              <w:rPr>
+                <w:rFonts w:cs="BRH Malayalam Extra"/>
+                <w:color w:val="000000"/>
+                <w:szCs w:val="32"/>
+              </w:rPr>
+              <w:t>47</w:t>
+            </w:r>
+            <w:r>
+              <w:rPr>
+                <w:rFonts w:ascii="BRH Malayalam Extra" w:hAnsi="BRH Malayalam Extra" w:cs="BRH Malayalam Extra"/>
+                <w:color w:val="000000"/>
+                <w:sz w:val="32"/>
+                <w:szCs w:val="32"/>
+              </w:rPr>
+              <w:t xml:space="preserve">)- </w:t>
+            </w:r>
+            <w:r>
+              <w:rPr>
+                <w:rFonts w:ascii="BRH Malayalam Extra" w:hAnsi="BRH Malayalam Extra" w:cs="BRH Malayalam Extra"/>
+                <w:color w:val="000000"/>
+                <w:sz w:val="32"/>
+                <w:szCs w:val="32"/>
+                <w:highlight w:val="yellow"/>
+              </w:rPr>
+              <w:t>s</w:t>
+            </w:r>
+            <w:r>
+              <w:rPr>
+                <w:rFonts w:ascii="BRH Malayalam Extra" w:hAnsi="BRH Malayalam Extra" w:cs="BRH Malayalam Extra"/>
+                <w:color w:val="000000"/>
+                <w:sz w:val="26"/>
+                <w:szCs w:val="32"/>
+                <w:highlight w:val="yellow"/>
+              </w:rPr>
+              <w:t>–</w:t>
+            </w:r>
+            <w:r>
+              <w:rPr>
+                <w:rFonts w:ascii="BRH Malayalam Extra" w:hAnsi="BRH Malayalam Extra" w:cs="BRH Malayalam Extra"/>
+                <w:color w:val="000000"/>
+                <w:sz w:val="32"/>
+                <w:szCs w:val="32"/>
+                <w:highlight w:val="yellow"/>
+              </w:rPr>
+              <w:t>izPz˜</w:t>
+            </w:r>
+            <w:r>
+              <w:rPr>
+                <w:rFonts w:ascii="BRH Malayalam Extra" w:hAnsi="BRH Malayalam Extra" w:cs="BRH Malayalam Extra"/>
+                <w:color w:val="000000"/>
+                <w:sz w:val="32"/>
+                <w:szCs w:val="32"/>
+              </w:rPr>
+              <w:t xml:space="preserve"> ||</w:t>
+            </w:r>
+          </w:p>
+          <w:p>
+            <w:pPr>
+              <w:widowControl w:val="0"/>
+              <w:autoSpaceDE w:val="0"/>
+              <w:autoSpaceDN w:val="0"/>
+              <w:adjustRightInd w:val="0"/>
+              <w:spacing w:before="0" w:line="240" w:lineRule="auto"/>
+              <w:rPr>
                 <w:rFonts w:cs="BRH Malayalam Extra"/>
                 <w:color w:val="FF0000"/>
                 <w:szCs w:val="40"/>
               </w:rPr>
             </w:pPr>
+            <w:r>
+              <w:rPr>
+                <w:rFonts w:ascii="BRH Malayalam Extra" w:hAnsi="BRH Malayalam Extra" w:cs="BRH Malayalam Extra"/>
+                <w:color w:val="000000"/>
+                <w:sz w:val="32"/>
+                <w:szCs w:val="32"/>
+                <w:highlight w:val="yellow"/>
+              </w:rPr>
+              <w:t>s</w:t>
+            </w:r>
+            <w:r>
+              <w:rPr>
+                <w:rFonts w:ascii="BRH Malayalam Extra" w:hAnsi="BRH Malayalam Extra" w:cs="BRH Malayalam Extra"/>
+                <w:color w:val="000000"/>
+                <w:sz w:val="26"/>
+                <w:szCs w:val="32"/>
+                <w:highlight w:val="yellow"/>
+              </w:rPr>
+              <w:t>–</w:t>
+            </w:r>
+            <w:r>
+              <w:rPr>
+                <w:rFonts w:ascii="BRH Malayalam Extra" w:hAnsi="BRH Malayalam Extra" w:cs="BRH Malayalam Extra"/>
+                <w:color w:val="000000"/>
+                <w:sz w:val="32"/>
+                <w:szCs w:val="32"/>
+                <w:highlight w:val="yellow"/>
+              </w:rPr>
+              <w:t>izPz</w:t>
+            </w:r>
+            <w:r>
+              <w:rPr>
+                <w:rFonts w:ascii="BRH Malayalam Extra" w:hAnsi="BRH Malayalam Extra" w:cs="BRH Malayalam Extra"/>
+                <w:color w:val="000000"/>
+                <w:sz w:val="26"/>
+                <w:szCs w:val="32"/>
+              </w:rPr>
+              <w:t>–</w:t>
+            </w:r>
+            <w:r>
+              <w:rPr>
+                <w:rFonts w:ascii="BRH Malayalam Extra" w:hAnsi="BRH Malayalam Extra" w:cs="BRH Malayalam Extra"/>
+                <w:color w:val="000000"/>
+                <w:sz w:val="32"/>
+                <w:szCs w:val="32"/>
+              </w:rPr>
+              <w:t xml:space="preserve"> CZy— </w:t>
+            </w:r>
+            <w:r>
+              <w:rPr>
+                <w:rFonts w:ascii="BRH Malayalam Extra" w:hAnsi="BRH Malayalam Extra" w:cs="BRH Malayalam Extra"/>
+                <w:color w:val="000000"/>
+                <w:sz w:val="32"/>
+                <w:szCs w:val="32"/>
+                <w:highlight w:val="yellow"/>
+              </w:rPr>
+              <w:t>s</w:t>
+            </w:r>
+            <w:r>
+              <w:rPr>
+                <w:rFonts w:ascii="BRH Malayalam Extra" w:hAnsi="BRH Malayalam Extra" w:cs="BRH Malayalam Extra"/>
+                <w:color w:val="000000"/>
+                <w:sz w:val="26"/>
+                <w:szCs w:val="32"/>
+                <w:highlight w:val="yellow"/>
+              </w:rPr>
+              <w:t>–</w:t>
+            </w:r>
+            <w:r>
+              <w:rPr>
+                <w:rFonts w:ascii="BRH Malayalam Extra" w:hAnsi="BRH Malayalam Extra" w:cs="BRH Malayalam Extra"/>
+                <w:color w:val="000000"/>
+                <w:sz w:val="32"/>
+                <w:szCs w:val="32"/>
+                <w:highlight w:val="yellow"/>
+              </w:rPr>
+              <w:t>izPz˜</w:t>
+            </w:r>
+            <w:r>
+              <w:rPr>
+                <w:rFonts w:ascii="BRH Malayalam Extra" w:hAnsi="BRH Malayalam Extra" w:cs="BRH Malayalam Extra"/>
+                <w:color w:val="000000"/>
+                <w:sz w:val="32"/>
+                <w:szCs w:val="32"/>
+              </w:rPr>
+              <w:t xml:space="preserve"> | </w:t>
+            </w:r>
           </w:p>
         </w:tc>
         <w:tc>
@@ -3145,11 +4325,1282 @@
               <w:adjustRightInd w:val="0"/>
               <w:spacing w:before="0" w:line="240" w:lineRule="auto"/>
               <w:rPr>
+                <w:rFonts w:ascii="BRH Malayalam Extra" w:hAnsi="BRH Malayalam Extra" w:cs="BRH Malayalam Extra"/>
+                <w:color w:val="000000"/>
+                <w:sz w:val="32"/>
+                <w:szCs w:val="32"/>
+              </w:rPr>
+            </w:pPr>
+            <w:r>
+              <w:rPr>
+                <w:rFonts w:cs="BRH Malayalam Extra"/>
+                <w:color w:val="000000"/>
+                <w:szCs w:val="32"/>
+              </w:rPr>
+              <w:t>52</w:t>
+            </w:r>
+            <w:r>
+              <w:rPr>
+                <w:rFonts w:ascii="BRH Malayalam Extra" w:hAnsi="BRH Malayalam Extra" w:cs="BRH Malayalam Extra"/>
+                <w:color w:val="000000"/>
+                <w:sz w:val="32"/>
+                <w:szCs w:val="32"/>
+              </w:rPr>
+              <w:t>)</w:t>
+            </w:r>
+            <w:r>
+              <w:rPr>
+                <w:rFonts w:ascii="BRH Malayalam Extra" w:hAnsi="BRH Malayalam Extra" w:cs="BRH Malayalam Extra"/>
+                <w:color w:val="000000"/>
+                <w:sz w:val="32"/>
+                <w:szCs w:val="32"/>
+              </w:rPr>
+              <w:tab/>
+            </w:r>
+            <w:r>
+              <w:rPr>
+                <w:rFonts w:cs="BRH Malayalam Extra"/>
+                <w:color w:val="000000"/>
+                <w:szCs w:val="32"/>
+              </w:rPr>
+              <w:t>4</w:t>
+            </w:r>
+            <w:r>
+              <w:rPr>
+                <w:rFonts w:ascii="BRH Malayalam Extra" w:hAnsi="BRH Malayalam Extra" w:cs="BRH Malayalam Extra"/>
+                <w:color w:val="000000"/>
+                <w:sz w:val="32"/>
+                <w:szCs w:val="32"/>
+              </w:rPr>
+              <w:t>.</w:t>
+            </w:r>
+            <w:r>
+              <w:rPr>
+                <w:rFonts w:cs="BRH Malayalam Extra"/>
+                <w:color w:val="000000"/>
+                <w:szCs w:val="32"/>
+              </w:rPr>
+              <w:t>1</w:t>
+            </w:r>
+            <w:r>
+              <w:rPr>
+                <w:rFonts w:ascii="BRH Malayalam Extra" w:hAnsi="BRH Malayalam Extra" w:cs="BRH Malayalam Extra"/>
+                <w:color w:val="000000"/>
+                <w:sz w:val="32"/>
+                <w:szCs w:val="32"/>
+              </w:rPr>
+              <w:t>.</w:t>
+            </w:r>
+            <w:r>
+              <w:rPr>
+                <w:rFonts w:cs="BRH Malayalam Extra"/>
+                <w:color w:val="000000"/>
+                <w:szCs w:val="32"/>
+              </w:rPr>
+              <w:t>10</w:t>
+            </w:r>
+            <w:r>
+              <w:rPr>
+                <w:rFonts w:ascii="BRH Malayalam Extra" w:hAnsi="BRH Malayalam Extra" w:cs="BRH Malayalam Extra"/>
+                <w:color w:val="000000"/>
+                <w:sz w:val="32"/>
+                <w:szCs w:val="32"/>
+              </w:rPr>
+              <w:t>.</w:t>
+            </w:r>
+            <w:r>
+              <w:rPr>
+                <w:rFonts w:cs="BRH Malayalam Extra"/>
+                <w:color w:val="000000"/>
+                <w:szCs w:val="32"/>
+              </w:rPr>
+              <w:t>4</w:t>
+            </w:r>
+            <w:r>
+              <w:rPr>
+                <w:rFonts w:ascii="BRH Malayalam Extra" w:hAnsi="BRH Malayalam Extra" w:cs="BRH Malayalam Extra"/>
+                <w:color w:val="000000"/>
+                <w:sz w:val="32"/>
+                <w:szCs w:val="32"/>
+              </w:rPr>
+              <w:t>(</w:t>
+            </w:r>
+            <w:r>
+              <w:rPr>
+                <w:rFonts w:cs="BRH Malayalam Extra"/>
+                <w:color w:val="000000"/>
+                <w:szCs w:val="32"/>
+              </w:rPr>
+              <w:t>45</w:t>
+            </w:r>
+            <w:r>
+              <w:rPr>
+                <w:rFonts w:ascii="BRH Malayalam Extra" w:hAnsi="BRH Malayalam Extra" w:cs="BRH Malayalam Extra"/>
+                <w:color w:val="000000"/>
+                <w:sz w:val="32"/>
+                <w:szCs w:val="32"/>
+              </w:rPr>
+              <w:t xml:space="preserve">)- qyq¡˜I | GK˜I | </w:t>
+            </w:r>
+            <w:r>
+              <w:rPr>
+                <w:rFonts w:ascii="BRH Malayalam Extra" w:hAnsi="BRH Malayalam Extra" w:cs="BRH Malayalam Extra"/>
+                <w:color w:val="000000"/>
+                <w:sz w:val="32"/>
+                <w:szCs w:val="32"/>
+                <w:highlight w:val="green"/>
+              </w:rPr>
+              <w:t>s</w:t>
+            </w:r>
+            <w:r>
+              <w:rPr>
+                <w:rFonts w:ascii="BRH Malayalam Extra" w:hAnsi="BRH Malayalam Extra" w:cs="BRH Malayalam Extra"/>
+                <w:color w:val="000000"/>
+                <w:sz w:val="26"/>
+                <w:szCs w:val="32"/>
+                <w:highlight w:val="green"/>
+              </w:rPr>
+              <w:t>–</w:t>
+            </w:r>
+            <w:r>
+              <w:rPr>
+                <w:rFonts w:ascii="BRH Malayalam Extra" w:hAnsi="BRH Malayalam Extra" w:cs="BRH Malayalam Extra"/>
+                <w:color w:val="000000"/>
+                <w:sz w:val="32"/>
+                <w:szCs w:val="32"/>
+                <w:highlight w:val="green"/>
+              </w:rPr>
+              <w:t>iz</w:t>
+            </w:r>
+            <w:r>
+              <w:rPr>
+                <w:rFonts w:ascii="BRH Malayalam Extra" w:hAnsi="BRH Malayalam Extra" w:cs="BRH Malayalam Extra"/>
+                <w:color w:val="000000"/>
+                <w:sz w:val="26"/>
+                <w:szCs w:val="32"/>
+                <w:highlight w:val="green"/>
+              </w:rPr>
+              <w:t>–</w:t>
+            </w:r>
+            <w:r>
+              <w:rPr>
+                <w:rFonts w:ascii="BRH Malayalam Extra" w:hAnsi="BRH Malayalam Extra" w:cs="BRH Malayalam Extra"/>
+                <w:color w:val="000000"/>
+                <w:sz w:val="32"/>
+                <w:szCs w:val="32"/>
+                <w:highlight w:val="green"/>
+              </w:rPr>
+              <w:t>Pz</w:t>
+            </w:r>
+            <w:r>
+              <w:rPr>
+                <w:rFonts w:ascii="BRH Malayalam Extra" w:hAnsi="BRH Malayalam Extra" w:cs="BRH Malayalam Extra"/>
+                <w:color w:val="000000"/>
+                <w:sz w:val="32"/>
+                <w:szCs w:val="32"/>
+              </w:rPr>
+              <w:t xml:space="preserve"> ||</w:t>
+            </w:r>
+          </w:p>
+          <w:p>
+            <w:pPr>
+              <w:widowControl w:val="0"/>
+              <w:autoSpaceDE w:val="0"/>
+              <w:autoSpaceDN w:val="0"/>
+              <w:adjustRightInd w:val="0"/>
+              <w:spacing w:before="0" w:line="240" w:lineRule="auto"/>
+              <w:rPr>
+                <w:rFonts w:ascii="BRH Malayalam Extra" w:hAnsi="BRH Malayalam Extra" w:cs="BRH Malayalam Extra"/>
+                <w:color w:val="000000"/>
+                <w:sz w:val="32"/>
+                <w:szCs w:val="32"/>
+              </w:rPr>
+            </w:pPr>
+            <w:r>
+              <w:rPr>
+                <w:rFonts w:ascii="BRH Malayalam Extra" w:hAnsi="BRH Malayalam Extra" w:cs="BRH Malayalam Extra"/>
+                <w:color w:val="000000"/>
+                <w:sz w:val="32"/>
+                <w:szCs w:val="32"/>
+              </w:rPr>
+              <w:t>qyq¡</w:t>
+            </w:r>
+            <w:r>
+              <w:rPr>
+                <w:rFonts w:ascii="BRH Malayalam Extra" w:hAnsi="BRH Malayalam Extra" w:cs="BRH Malayalam Extra"/>
+                <w:color w:val="000000"/>
+                <w:sz w:val="26"/>
+                <w:szCs w:val="32"/>
+              </w:rPr>
+              <w:t>–</w:t>
+            </w:r>
+            <w:r>
+              <w:rPr>
+                <w:rFonts w:ascii="BRH Malayalam Extra" w:hAnsi="BRH Malayalam Extra" w:cs="BRH Malayalam Extra"/>
+                <w:color w:val="000000"/>
+                <w:sz w:val="32"/>
+                <w:szCs w:val="32"/>
+              </w:rPr>
+              <w:t xml:space="preserve"> ¥iK</w:t>
+            </w:r>
+            <w:r>
+              <w:rPr>
+                <w:rFonts w:ascii="BRH Malayalam Extra" w:hAnsi="BRH Malayalam Extra" w:cs="BRH Malayalam Extra"/>
+                <w:color w:val="000000"/>
+                <w:sz w:val="26"/>
+                <w:szCs w:val="32"/>
+              </w:rPr>
+              <w:t>–</w:t>
+            </w:r>
+            <w:r>
+              <w:rPr>
+                <w:rFonts w:ascii="BRH Malayalam Extra" w:hAnsi="BRH Malayalam Extra" w:cs="BRH Malayalam Extra"/>
+                <w:color w:val="000000"/>
+                <w:sz w:val="32"/>
+                <w:szCs w:val="32"/>
+              </w:rPr>
+              <w:t xml:space="preserve"> ¥iK</w:t>
+            </w:r>
+            <w:r>
+              <w:rPr>
+                <w:rFonts w:ascii="BRH Malayalam Extra" w:hAnsi="BRH Malayalam Extra" w:cs="BRH Malayalam Extra"/>
+                <w:color w:val="000000"/>
+                <w:sz w:val="26"/>
+                <w:szCs w:val="32"/>
+              </w:rPr>
+              <w:t>–</w:t>
+            </w:r>
+            <w:r>
+              <w:rPr>
+                <w:rFonts w:ascii="BRH Devanagari Extra" w:hAnsi="BRH Devanagari Extra" w:cs="BRH Malayalam Extra"/>
+                <w:color w:val="000000"/>
+                <w:sz w:val="26"/>
+                <w:szCs w:val="32"/>
+              </w:rPr>
+              <w:t>óè</w:t>
+            </w:r>
+            <w:r>
+              <w:rPr>
+                <w:rFonts w:ascii="BRH Malayalam Extra" w:hAnsi="BRH Malayalam Extra" w:cs="BRH Malayalam Extra"/>
+                <w:color w:val="000000"/>
+                <w:sz w:val="26"/>
+                <w:szCs w:val="32"/>
+              </w:rPr>
+              <w:t>–</w:t>
+            </w:r>
+            <w:r>
+              <w:rPr>
+                <w:rFonts w:ascii="BRH Malayalam Extra" w:hAnsi="BRH Malayalam Extra" w:cs="BRH Malayalam Extra"/>
+                <w:color w:val="000000"/>
+                <w:sz w:val="32"/>
+                <w:szCs w:val="32"/>
+              </w:rPr>
+              <w:t xml:space="preserve"> qyq¡</w:t>
+            </w:r>
+            <w:r>
+              <w:rPr>
+                <w:rFonts w:ascii="BRH Malayalam Extra" w:hAnsi="BRH Malayalam Extra" w:cs="BRH Malayalam Extra"/>
+                <w:color w:val="000000"/>
+                <w:sz w:val="26"/>
+                <w:szCs w:val="32"/>
+              </w:rPr>
+              <w:t>–</w:t>
+            </w:r>
+            <w:r>
+              <w:rPr>
+                <w:rFonts w:ascii="BRH Devanagari Extra" w:hAnsi="BRH Devanagari Extra" w:cs="BRH Malayalam Extra"/>
+                <w:color w:val="000000"/>
+                <w:sz w:val="26"/>
+                <w:szCs w:val="32"/>
+              </w:rPr>
+              <w:t>óè</w:t>
+            </w:r>
+            <w:r>
+              <w:rPr>
+                <w:rFonts w:ascii="BRH Malayalam Extra" w:hAnsi="BRH Malayalam Extra" w:cs="BRH Malayalam Extra"/>
+                <w:color w:val="000000"/>
+                <w:sz w:val="26"/>
+                <w:szCs w:val="32"/>
+              </w:rPr>
+              <w:t>–</w:t>
+            </w:r>
+            <w:r>
+              <w:rPr>
+                <w:rFonts w:ascii="BRH Malayalam Extra" w:hAnsi="BRH Malayalam Extra" w:cs="BRH Malayalam Extra"/>
+                <w:color w:val="000000"/>
+                <w:sz w:val="32"/>
+                <w:szCs w:val="32"/>
+              </w:rPr>
+              <w:t xml:space="preserve"> qyq¡</w:t>
+            </w:r>
+            <w:r>
+              <w:rPr>
+                <w:rFonts w:ascii="BRH Malayalam Extra" w:hAnsi="BRH Malayalam Extra" w:cs="BRH Malayalam Extra"/>
+                <w:color w:val="000000"/>
+                <w:sz w:val="26"/>
+                <w:szCs w:val="32"/>
+              </w:rPr>
+              <w:t>–</w:t>
+            </w:r>
+            <w:r>
+              <w:rPr>
+                <w:rFonts w:ascii="BRH Malayalam Extra" w:hAnsi="BRH Malayalam Extra" w:cs="BRH Malayalam Extra"/>
+                <w:color w:val="000000"/>
+                <w:sz w:val="32"/>
+                <w:szCs w:val="32"/>
+              </w:rPr>
+              <w:t xml:space="preserve"> ¥iK</w:t>
+            </w:r>
+            <w:r>
+              <w:rPr>
+                <w:rFonts w:ascii="BRH Devanagari Extra" w:hAnsi="BRH Devanagari Extra" w:cs="BRH Malayalam Extra"/>
+                <w:color w:val="000000"/>
+                <w:sz w:val="26"/>
+                <w:szCs w:val="32"/>
+              </w:rPr>
+              <w:t>óè</w:t>
+            </w:r>
+            <w:r>
+              <w:rPr>
+                <w:rFonts w:ascii="BRH Malayalam Extra" w:hAnsi="BRH Malayalam Extra" w:cs="BRH Malayalam Extra"/>
+                <w:color w:val="000000"/>
+                <w:sz w:val="32"/>
+                <w:szCs w:val="32"/>
+              </w:rPr>
+              <w:t xml:space="preserve">— </w:t>
+            </w:r>
+            <w:r>
+              <w:rPr>
+                <w:rFonts w:ascii="BRH Malayalam Extra" w:hAnsi="BRH Malayalam Extra" w:cs="BRH Malayalam Extra"/>
+                <w:color w:val="000000"/>
+                <w:sz w:val="32"/>
+                <w:szCs w:val="32"/>
+                <w:highlight w:val="green"/>
+              </w:rPr>
+              <w:t>siz</w:t>
+            </w:r>
+            <w:r>
+              <w:rPr>
+                <w:rFonts w:ascii="BRH Malayalam Extra" w:hAnsi="BRH Malayalam Extra" w:cs="BRH Malayalam Extra"/>
+                <w:color w:val="000000"/>
+                <w:sz w:val="26"/>
+                <w:szCs w:val="32"/>
+                <w:highlight w:val="green"/>
+              </w:rPr>
+              <w:t>–</w:t>
+            </w:r>
+            <w:r>
+              <w:rPr>
+                <w:rFonts w:ascii="BRH Malayalam Extra" w:hAnsi="BRH Malayalam Extra" w:cs="BRH Malayalam Extra"/>
+                <w:color w:val="000000"/>
+                <w:sz w:val="32"/>
+                <w:szCs w:val="32"/>
+                <w:highlight w:val="green"/>
+              </w:rPr>
+              <w:t>Pz</w:t>
+            </w:r>
+            <w:r>
+              <w:rPr>
+                <w:rFonts w:ascii="BRH Malayalam Extra" w:hAnsi="BRH Malayalam Extra" w:cs="BRH Malayalam Extra"/>
+                <w:color w:val="000000"/>
+                <w:sz w:val="32"/>
+                <w:szCs w:val="32"/>
+              </w:rPr>
+              <w:t xml:space="preserve"> </w:t>
+            </w:r>
+          </w:p>
+          <w:p>
+            <w:pPr>
+              <w:widowControl w:val="0"/>
+              <w:autoSpaceDE w:val="0"/>
+              <w:autoSpaceDN w:val="0"/>
+              <w:adjustRightInd w:val="0"/>
+              <w:spacing w:before="0" w:line="240" w:lineRule="auto"/>
+              <w:rPr>
+                <w:rFonts w:ascii="BRH Malayalam Extra" w:hAnsi="BRH Malayalam Extra" w:cs="BRH Malayalam Extra"/>
+                <w:color w:val="000000"/>
+                <w:sz w:val="32"/>
+                <w:szCs w:val="32"/>
+              </w:rPr>
+            </w:pPr>
+            <w:r>
+              <w:rPr>
+                <w:rFonts w:ascii="BRH Malayalam Extra" w:hAnsi="BRH Malayalam Extra" w:cs="BRH Malayalam Extra"/>
+                <w:color w:val="000000"/>
+                <w:sz w:val="32"/>
+                <w:szCs w:val="32"/>
+                <w:highlight w:val="green"/>
+              </w:rPr>
+              <w:t>s—iz</w:t>
+            </w:r>
+            <w:r>
+              <w:rPr>
+                <w:rFonts w:ascii="BRH Malayalam Extra" w:hAnsi="BRH Malayalam Extra" w:cs="BRH Malayalam Extra"/>
+                <w:color w:val="000000"/>
+                <w:sz w:val="26"/>
+                <w:szCs w:val="32"/>
+                <w:highlight w:val="green"/>
+              </w:rPr>
+              <w:t>–</w:t>
+            </w:r>
+            <w:r>
+              <w:rPr>
+                <w:rFonts w:ascii="BRH Malayalam Extra" w:hAnsi="BRH Malayalam Extra" w:cs="BRH Malayalam Extra"/>
+                <w:color w:val="000000"/>
+                <w:sz w:val="32"/>
+                <w:szCs w:val="32"/>
+                <w:highlight w:val="green"/>
+              </w:rPr>
+              <w:t>Pz</w:t>
+            </w:r>
+            <w:r>
+              <w:rPr>
+                <w:rFonts w:ascii="BRH Malayalam Extra" w:hAnsi="BRH Malayalam Extra" w:cs="BRH Malayalam Extra"/>
+                <w:color w:val="000000"/>
+                <w:sz w:val="32"/>
+                <w:szCs w:val="32"/>
+              </w:rPr>
+              <w:t xml:space="preserve"> GK</w:t>
+            </w:r>
+            <w:r>
+              <w:rPr>
+                <w:rFonts w:ascii="BRH Malayalam Extra" w:hAnsi="BRH Malayalam Extra" w:cs="BRH Malayalam Extra"/>
+                <w:color w:val="000000"/>
+                <w:sz w:val="26"/>
+                <w:szCs w:val="32"/>
+              </w:rPr>
+              <w:t>–</w:t>
+            </w:r>
+            <w:r>
+              <w:rPr>
+                <w:rFonts w:ascii="BRH Devanagari Extra" w:hAnsi="BRH Devanagari Extra" w:cs="BRH Malayalam Extra"/>
+                <w:color w:val="000000"/>
+                <w:sz w:val="26"/>
+                <w:szCs w:val="32"/>
+              </w:rPr>
+              <w:t>óè</w:t>
+            </w:r>
+            <w:r>
+              <w:rPr>
+                <w:rFonts w:ascii="BRH Malayalam Extra" w:hAnsi="BRH Malayalam Extra" w:cs="BRH Malayalam Extra"/>
+                <w:color w:val="000000"/>
+                <w:sz w:val="26"/>
+                <w:szCs w:val="32"/>
+              </w:rPr>
+              <w:t>–</w:t>
+            </w:r>
+            <w:r>
+              <w:rPr>
+                <w:rFonts w:ascii="BRH Malayalam Extra" w:hAnsi="BRH Malayalam Extra" w:cs="BRH Malayalam Extra"/>
+                <w:color w:val="000000"/>
+                <w:sz w:val="32"/>
+                <w:szCs w:val="32"/>
+              </w:rPr>
+              <w:t xml:space="preserve"> qyq¡</w:t>
+            </w:r>
+            <w:r>
+              <w:rPr>
+                <w:rFonts w:ascii="BRH Malayalam Extra" w:hAnsi="BRH Malayalam Extra" w:cs="BRH Malayalam Extra"/>
+                <w:color w:val="000000"/>
+                <w:sz w:val="26"/>
+                <w:szCs w:val="32"/>
+              </w:rPr>
+              <w:t>–</w:t>
+            </w:r>
+            <w:r>
+              <w:rPr>
+                <w:rFonts w:ascii="BRH Devanagari Extra" w:hAnsi="BRH Devanagari Extra" w:cs="BRH Malayalam Extra"/>
+                <w:color w:val="000000"/>
+                <w:sz w:val="26"/>
+                <w:szCs w:val="32"/>
+              </w:rPr>
+              <w:t>óè</w:t>
+            </w:r>
+            <w:r>
+              <w:rPr>
+                <w:rFonts w:ascii="BRH Malayalam Extra" w:hAnsi="BRH Malayalam Extra" w:cs="BRH Malayalam Extra"/>
+                <w:color w:val="000000"/>
+                <w:sz w:val="26"/>
+                <w:szCs w:val="32"/>
+              </w:rPr>
+              <w:t>–</w:t>
+            </w:r>
+            <w:r>
+              <w:rPr>
+                <w:rFonts w:ascii="BRH Malayalam Extra" w:hAnsi="BRH Malayalam Extra" w:cs="BRH Malayalam Extra"/>
+                <w:color w:val="000000"/>
+                <w:sz w:val="32"/>
+                <w:szCs w:val="32"/>
+              </w:rPr>
+              <w:t xml:space="preserve"> qyq¡</w:t>
+            </w:r>
+            <w:r>
+              <w:rPr>
+                <w:rFonts w:ascii="BRH Malayalam Extra" w:hAnsi="BRH Malayalam Extra" w:cs="BRH Malayalam Extra"/>
+                <w:color w:val="000000"/>
+                <w:sz w:val="26"/>
+                <w:szCs w:val="32"/>
+              </w:rPr>
+              <w:t>–</w:t>
+            </w:r>
+            <w:r>
+              <w:rPr>
+                <w:rFonts w:ascii="BRH Malayalam Extra" w:hAnsi="BRH Malayalam Extra" w:cs="BRH Malayalam Extra"/>
+                <w:color w:val="000000"/>
+                <w:sz w:val="32"/>
+                <w:szCs w:val="32"/>
+              </w:rPr>
+              <w:t xml:space="preserve"> ¥iK</w:t>
+            </w:r>
+            <w:r>
+              <w:rPr>
+                <w:rFonts w:ascii="BRH Devanagari Extra" w:hAnsi="BRH Devanagari Extra" w:cs="BRH Malayalam Extra"/>
+                <w:color w:val="000000"/>
+                <w:sz w:val="26"/>
+                <w:szCs w:val="32"/>
+              </w:rPr>
+              <w:t>óè</w:t>
+            </w:r>
+            <w:r>
+              <w:rPr>
+                <w:rFonts w:ascii="BRH Malayalam Extra" w:hAnsi="BRH Malayalam Extra" w:cs="BRH Malayalam Extra"/>
+                <w:color w:val="000000"/>
+                <w:sz w:val="32"/>
+                <w:szCs w:val="32"/>
+              </w:rPr>
+              <w:t xml:space="preserve">— </w:t>
+            </w:r>
+            <w:r>
+              <w:rPr>
+                <w:rFonts w:ascii="BRH Malayalam Extra" w:hAnsi="BRH Malayalam Extra" w:cs="BRH Malayalam Extra"/>
+                <w:color w:val="000000"/>
+                <w:sz w:val="32"/>
+                <w:szCs w:val="32"/>
+                <w:highlight w:val="green"/>
+              </w:rPr>
+              <w:t>siz</w:t>
+            </w:r>
+            <w:r>
+              <w:rPr>
+                <w:rFonts w:ascii="BRH Malayalam Extra" w:hAnsi="BRH Malayalam Extra" w:cs="BRH Malayalam Extra"/>
+                <w:color w:val="000000"/>
+                <w:sz w:val="26"/>
+                <w:szCs w:val="32"/>
+                <w:highlight w:val="green"/>
+              </w:rPr>
+              <w:t>–</w:t>
+            </w:r>
+            <w:r>
+              <w:rPr>
+                <w:rFonts w:ascii="BRH Malayalam Extra" w:hAnsi="BRH Malayalam Extra" w:cs="BRH Malayalam Extra"/>
+                <w:color w:val="000000"/>
+                <w:sz w:val="32"/>
+                <w:szCs w:val="32"/>
+                <w:highlight w:val="green"/>
+              </w:rPr>
+              <w:t>Pz</w:t>
+            </w:r>
+            <w:r>
+              <w:rPr>
+                <w:rFonts w:ascii="BRH Malayalam Extra" w:hAnsi="BRH Malayalam Extra" w:cs="BRH Malayalam Extra"/>
+                <w:color w:val="000000"/>
+                <w:sz w:val="32"/>
+                <w:szCs w:val="32"/>
+              </w:rPr>
+              <w:t xml:space="preserve"> | </w:t>
+            </w:r>
+          </w:p>
+          <w:p>
+            <w:pPr>
+              <w:widowControl w:val="0"/>
+              <w:autoSpaceDE w:val="0"/>
+              <w:autoSpaceDN w:val="0"/>
+              <w:adjustRightInd w:val="0"/>
+              <w:spacing w:before="0" w:line="240" w:lineRule="auto"/>
+              <w:rPr>
+                <w:rFonts w:ascii="BRH Malayalam Extra" w:hAnsi="BRH Malayalam Extra" w:cs="BRH Malayalam Extra"/>
+                <w:color w:val="000000"/>
+                <w:sz w:val="32"/>
+                <w:szCs w:val="32"/>
+              </w:rPr>
+            </w:pPr>
+            <w:r>
+              <w:rPr>
+                <w:rFonts w:cs="BRH Malayalam Extra"/>
+                <w:color w:val="000000"/>
+                <w:szCs w:val="32"/>
+              </w:rPr>
+              <w:t>53</w:t>
+            </w:r>
+            <w:r>
+              <w:rPr>
+                <w:rFonts w:ascii="BRH Malayalam Extra" w:hAnsi="BRH Malayalam Extra" w:cs="BRH Malayalam Extra"/>
+                <w:color w:val="000000"/>
+                <w:sz w:val="32"/>
+                <w:szCs w:val="32"/>
+              </w:rPr>
+              <w:t>)</w:t>
+            </w:r>
+            <w:r>
+              <w:rPr>
+                <w:rFonts w:ascii="BRH Malayalam Extra" w:hAnsi="BRH Malayalam Extra" w:cs="BRH Malayalam Extra"/>
+                <w:color w:val="000000"/>
+                <w:sz w:val="32"/>
+                <w:szCs w:val="32"/>
+              </w:rPr>
+              <w:tab/>
+            </w:r>
+            <w:r>
+              <w:rPr>
+                <w:rFonts w:cs="BRH Malayalam Extra"/>
+                <w:color w:val="000000"/>
+                <w:szCs w:val="32"/>
+              </w:rPr>
+              <w:t>4</w:t>
+            </w:r>
+            <w:r>
+              <w:rPr>
+                <w:rFonts w:ascii="BRH Malayalam Extra" w:hAnsi="BRH Malayalam Extra" w:cs="BRH Malayalam Extra"/>
+                <w:color w:val="000000"/>
+                <w:sz w:val="32"/>
+                <w:szCs w:val="32"/>
+              </w:rPr>
+              <w:t>.</w:t>
+            </w:r>
+            <w:r>
+              <w:rPr>
+                <w:rFonts w:cs="BRH Malayalam Extra"/>
+                <w:color w:val="000000"/>
+                <w:szCs w:val="32"/>
+              </w:rPr>
+              <w:t>1</w:t>
+            </w:r>
+            <w:r>
+              <w:rPr>
+                <w:rFonts w:ascii="BRH Malayalam Extra" w:hAnsi="BRH Malayalam Extra" w:cs="BRH Malayalam Extra"/>
+                <w:color w:val="000000"/>
+                <w:sz w:val="32"/>
+                <w:szCs w:val="32"/>
+              </w:rPr>
+              <w:t>.</w:t>
+            </w:r>
+            <w:r>
+              <w:rPr>
+                <w:rFonts w:cs="BRH Malayalam Extra"/>
+                <w:color w:val="000000"/>
+                <w:szCs w:val="32"/>
+              </w:rPr>
+              <w:t>10</w:t>
+            </w:r>
+            <w:r>
+              <w:rPr>
+                <w:rFonts w:ascii="BRH Malayalam Extra" w:hAnsi="BRH Malayalam Extra" w:cs="BRH Malayalam Extra"/>
+                <w:color w:val="000000"/>
+                <w:sz w:val="32"/>
+                <w:szCs w:val="32"/>
+              </w:rPr>
+              <w:t>.</w:t>
+            </w:r>
+            <w:r>
+              <w:rPr>
+                <w:rFonts w:cs="BRH Malayalam Extra"/>
+                <w:color w:val="000000"/>
+                <w:szCs w:val="32"/>
+              </w:rPr>
+              <w:t>4</w:t>
+            </w:r>
+            <w:r>
+              <w:rPr>
+                <w:rFonts w:ascii="BRH Malayalam Extra" w:hAnsi="BRH Malayalam Extra" w:cs="BRH Malayalam Extra"/>
+                <w:color w:val="000000"/>
+                <w:sz w:val="32"/>
+                <w:szCs w:val="32"/>
+              </w:rPr>
+              <w:t>(</w:t>
+            </w:r>
+            <w:r>
+              <w:rPr>
+                <w:rFonts w:cs="BRH Malayalam Extra"/>
+                <w:color w:val="000000"/>
+                <w:szCs w:val="32"/>
+              </w:rPr>
+              <w:t>46</w:t>
+            </w:r>
+            <w:r>
+              <w:rPr>
+                <w:rFonts w:ascii="BRH Malayalam Extra" w:hAnsi="BRH Malayalam Extra" w:cs="BRH Malayalam Extra"/>
+                <w:color w:val="000000"/>
+                <w:sz w:val="32"/>
+                <w:szCs w:val="32"/>
+              </w:rPr>
+              <w:t xml:space="preserve">)- GK˜I | </w:t>
+            </w:r>
+            <w:r>
+              <w:rPr>
+                <w:rFonts w:ascii="BRH Malayalam Extra" w:hAnsi="BRH Malayalam Extra" w:cs="BRH Malayalam Extra"/>
+                <w:color w:val="000000"/>
+                <w:sz w:val="32"/>
+                <w:szCs w:val="32"/>
+                <w:highlight w:val="green"/>
+              </w:rPr>
+              <w:t>s</w:t>
+            </w:r>
+            <w:r>
+              <w:rPr>
+                <w:rFonts w:ascii="BRH Malayalam Extra" w:hAnsi="BRH Malayalam Extra" w:cs="BRH Malayalam Extra"/>
+                <w:color w:val="000000"/>
+                <w:sz w:val="26"/>
+                <w:szCs w:val="32"/>
+                <w:highlight w:val="green"/>
+              </w:rPr>
+              <w:t>–</w:t>
+            </w:r>
+            <w:r>
+              <w:rPr>
+                <w:rFonts w:ascii="BRH Malayalam Extra" w:hAnsi="BRH Malayalam Extra" w:cs="BRH Malayalam Extra"/>
+                <w:color w:val="000000"/>
+                <w:sz w:val="32"/>
+                <w:szCs w:val="32"/>
+                <w:highlight w:val="green"/>
+              </w:rPr>
+              <w:t>iz</w:t>
+            </w:r>
+            <w:r>
+              <w:rPr>
+                <w:rFonts w:ascii="BRH Malayalam Extra" w:hAnsi="BRH Malayalam Extra" w:cs="BRH Malayalam Extra"/>
+                <w:color w:val="000000"/>
+                <w:sz w:val="26"/>
+                <w:szCs w:val="32"/>
+                <w:highlight w:val="green"/>
+              </w:rPr>
+              <w:t>–</w:t>
+            </w:r>
+            <w:r>
+              <w:rPr>
+                <w:rFonts w:ascii="BRH Malayalam Extra" w:hAnsi="BRH Malayalam Extra" w:cs="BRH Malayalam Extra"/>
+                <w:color w:val="000000"/>
+                <w:sz w:val="32"/>
+                <w:szCs w:val="32"/>
+                <w:highlight w:val="green"/>
+              </w:rPr>
+              <w:t>Pz</w:t>
+            </w:r>
+            <w:r>
+              <w:rPr>
+                <w:rFonts w:ascii="BRH Malayalam Extra" w:hAnsi="BRH Malayalam Extra" w:cs="BRH Malayalam Extra"/>
+                <w:color w:val="000000"/>
+                <w:sz w:val="32"/>
+                <w:szCs w:val="32"/>
+              </w:rPr>
+              <w:t xml:space="preserve"> ||</w:t>
+            </w:r>
+          </w:p>
+          <w:p>
+            <w:pPr>
+              <w:widowControl w:val="0"/>
+              <w:autoSpaceDE w:val="0"/>
+              <w:autoSpaceDN w:val="0"/>
+              <w:adjustRightInd w:val="0"/>
+              <w:spacing w:before="0" w:line="240" w:lineRule="auto"/>
+              <w:rPr>
+                <w:rFonts w:ascii="BRH Malayalam Extra" w:hAnsi="BRH Malayalam Extra" w:cs="BRH Malayalam Extra"/>
+                <w:color w:val="000000"/>
+                <w:sz w:val="32"/>
+                <w:szCs w:val="32"/>
+              </w:rPr>
+            </w:pPr>
+            <w:r>
+              <w:rPr>
+                <w:rFonts w:ascii="BRH Malayalam Extra" w:hAnsi="BRH Malayalam Extra" w:cs="BRH Malayalam Extra"/>
+                <w:color w:val="000000"/>
+                <w:sz w:val="32"/>
+                <w:szCs w:val="32"/>
+              </w:rPr>
+              <w:t>GK</w:t>
+            </w:r>
+            <w:r>
+              <w:rPr>
+                <w:rFonts w:ascii="BRH Devanagari Extra" w:hAnsi="BRH Devanagari Extra" w:cs="BRH Malayalam Extra"/>
+                <w:color w:val="000000"/>
+                <w:sz w:val="26"/>
+                <w:szCs w:val="32"/>
+              </w:rPr>
+              <w:t>óè</w:t>
+            </w:r>
+            <w:r>
+              <w:rPr>
+                <w:rFonts w:ascii="BRH Malayalam Extra" w:hAnsi="BRH Malayalam Extra" w:cs="BRH Malayalam Extra"/>
+                <w:color w:val="000000"/>
+                <w:sz w:val="32"/>
+                <w:szCs w:val="32"/>
+              </w:rPr>
+              <w:t xml:space="preserve">— </w:t>
+            </w:r>
+            <w:r>
+              <w:rPr>
+                <w:rFonts w:ascii="BRH Malayalam Extra" w:hAnsi="BRH Malayalam Extra" w:cs="BRH Malayalam Extra"/>
+                <w:color w:val="000000"/>
+                <w:sz w:val="32"/>
+                <w:szCs w:val="32"/>
+                <w:highlight w:val="green"/>
+              </w:rPr>
+              <w:t>siz</w:t>
+            </w:r>
+            <w:r>
+              <w:rPr>
+                <w:rFonts w:ascii="BRH Malayalam Extra" w:hAnsi="BRH Malayalam Extra" w:cs="BRH Malayalam Extra"/>
+                <w:color w:val="000000"/>
+                <w:sz w:val="26"/>
+                <w:szCs w:val="32"/>
+                <w:highlight w:val="green"/>
+              </w:rPr>
+              <w:t>–</w:t>
+            </w:r>
+            <w:r>
+              <w:rPr>
+                <w:rFonts w:ascii="BRH Malayalam Extra" w:hAnsi="BRH Malayalam Extra" w:cs="BRH Malayalam Extra"/>
+                <w:color w:val="000000"/>
+                <w:sz w:val="32"/>
+                <w:szCs w:val="32"/>
+                <w:highlight w:val="green"/>
+              </w:rPr>
+              <w:t>Pz</w:t>
+            </w:r>
+            <w:r>
+              <w:rPr>
+                <w:rFonts w:ascii="BRH Malayalam Extra" w:hAnsi="BRH Malayalam Extra" w:cs="BRH Malayalam Extra"/>
+                <w:color w:val="000000"/>
+                <w:sz w:val="32"/>
+                <w:szCs w:val="32"/>
+              </w:rPr>
+              <w:t xml:space="preserve"> </w:t>
+            </w:r>
+            <w:r>
+              <w:rPr>
+                <w:rFonts w:ascii="BRH Malayalam Extra" w:hAnsi="BRH Malayalam Extra" w:cs="BRH Malayalam Extra"/>
+                <w:color w:val="000000"/>
+                <w:sz w:val="32"/>
+                <w:szCs w:val="32"/>
+                <w:highlight w:val="green"/>
+              </w:rPr>
+              <w:t>s—iz</w:t>
+            </w:r>
+            <w:r>
+              <w:rPr>
+                <w:rFonts w:ascii="BRH Malayalam Extra" w:hAnsi="BRH Malayalam Extra" w:cs="BRH Malayalam Extra"/>
+                <w:color w:val="000000"/>
+                <w:sz w:val="26"/>
+                <w:szCs w:val="32"/>
+                <w:highlight w:val="green"/>
+              </w:rPr>
+              <w:t>–</w:t>
+            </w:r>
+            <w:r>
+              <w:rPr>
+                <w:rFonts w:ascii="BRH Malayalam Extra" w:hAnsi="BRH Malayalam Extra" w:cs="BRH Malayalam Extra"/>
+                <w:color w:val="000000"/>
+                <w:sz w:val="32"/>
+                <w:szCs w:val="32"/>
+                <w:highlight w:val="green"/>
+              </w:rPr>
+              <w:t>Pz</w:t>
+            </w:r>
+            <w:r>
+              <w:rPr>
+                <w:rFonts w:ascii="BRH Malayalam Extra" w:hAnsi="BRH Malayalam Extra" w:cs="BRH Malayalam Extra"/>
+                <w:color w:val="000000"/>
+                <w:sz w:val="32"/>
+                <w:szCs w:val="32"/>
+              </w:rPr>
+              <w:t xml:space="preserve"> GK</w:t>
+            </w:r>
+            <w:r>
+              <w:rPr>
+                <w:rFonts w:ascii="BRH Malayalam Extra" w:hAnsi="BRH Malayalam Extra" w:cs="BRH Malayalam Extra"/>
+                <w:color w:val="000000"/>
+                <w:sz w:val="26"/>
+                <w:szCs w:val="32"/>
+              </w:rPr>
+              <w:t>–</w:t>
+            </w:r>
+            <w:r>
+              <w:rPr>
+                <w:rFonts w:ascii="BRH Malayalam Extra" w:hAnsi="BRH Malayalam Extra" w:cs="BRH Malayalam Extra"/>
+                <w:color w:val="000000"/>
+                <w:sz w:val="32"/>
+                <w:szCs w:val="32"/>
+              </w:rPr>
+              <w:t xml:space="preserve"> ¥iK</w:t>
+            </w:r>
+            <w:r>
+              <w:rPr>
+                <w:rFonts w:ascii="BRH Devanagari Extra" w:hAnsi="BRH Devanagari Extra" w:cs="BRH Malayalam Extra"/>
+                <w:color w:val="000000"/>
+                <w:sz w:val="26"/>
+                <w:szCs w:val="32"/>
+              </w:rPr>
+              <w:t>óè</w:t>
+            </w:r>
+            <w:r>
+              <w:rPr>
+                <w:rFonts w:ascii="BRH Malayalam Extra" w:hAnsi="BRH Malayalam Extra" w:cs="BRH Malayalam Extra"/>
+                <w:color w:val="000000"/>
+                <w:sz w:val="32"/>
+                <w:szCs w:val="32"/>
+              </w:rPr>
+              <w:t xml:space="preserve">— </w:t>
+            </w:r>
+            <w:r>
+              <w:rPr>
+                <w:rFonts w:ascii="BRH Malayalam Extra" w:hAnsi="BRH Malayalam Extra" w:cs="BRH Malayalam Extra"/>
+                <w:color w:val="000000"/>
+                <w:sz w:val="32"/>
+                <w:szCs w:val="32"/>
+                <w:highlight w:val="green"/>
+              </w:rPr>
+              <w:t>siz</w:t>
+            </w:r>
+            <w:r>
+              <w:rPr>
+                <w:rFonts w:ascii="BRH Malayalam Extra" w:hAnsi="BRH Malayalam Extra" w:cs="BRH Malayalam Extra"/>
+                <w:color w:val="000000"/>
+                <w:sz w:val="26"/>
+                <w:szCs w:val="32"/>
+                <w:highlight w:val="green"/>
+              </w:rPr>
+              <w:t>–</w:t>
+            </w:r>
+            <w:r>
+              <w:rPr>
+                <w:rFonts w:ascii="BRH Malayalam Extra" w:hAnsi="BRH Malayalam Extra" w:cs="BRH Malayalam Extra"/>
+                <w:color w:val="000000"/>
+                <w:sz w:val="32"/>
+                <w:szCs w:val="32"/>
+                <w:highlight w:val="green"/>
+              </w:rPr>
+              <w:t>Pz</w:t>
+            </w:r>
+            <w:r>
+              <w:rPr>
+                <w:rFonts w:ascii="BRH Malayalam Extra" w:hAnsi="BRH Malayalam Extra" w:cs="BRH Malayalam Extra"/>
+                <w:color w:val="000000"/>
+                <w:sz w:val="32"/>
+                <w:szCs w:val="32"/>
+              </w:rPr>
+              <w:t xml:space="preserve"> | </w:t>
+            </w:r>
+          </w:p>
+          <w:p>
+            <w:pPr>
+              <w:widowControl w:val="0"/>
+              <w:autoSpaceDE w:val="0"/>
+              <w:autoSpaceDN w:val="0"/>
+              <w:adjustRightInd w:val="0"/>
+              <w:spacing w:before="0" w:line="240" w:lineRule="auto"/>
+              <w:rPr>
+                <w:rFonts w:ascii="BRH Malayalam Extra" w:hAnsi="BRH Malayalam Extra" w:cs="BRH Malayalam Extra"/>
+                <w:color w:val="000000"/>
+                <w:sz w:val="32"/>
+                <w:szCs w:val="32"/>
+              </w:rPr>
+            </w:pPr>
+            <w:r>
+              <w:rPr>
+                <w:rFonts w:cs="BRH Malayalam Extra"/>
+                <w:color w:val="000000"/>
+                <w:szCs w:val="32"/>
+              </w:rPr>
+              <w:t>54</w:t>
+            </w:r>
+            <w:r>
+              <w:rPr>
+                <w:rFonts w:ascii="BRH Malayalam Extra" w:hAnsi="BRH Malayalam Extra" w:cs="BRH Malayalam Extra"/>
+                <w:color w:val="000000"/>
+                <w:sz w:val="32"/>
+                <w:szCs w:val="32"/>
+              </w:rPr>
+              <w:t>)</w:t>
+            </w:r>
+            <w:r>
+              <w:rPr>
+                <w:rFonts w:ascii="BRH Malayalam Extra" w:hAnsi="BRH Malayalam Extra" w:cs="BRH Malayalam Extra"/>
+                <w:color w:val="000000"/>
+                <w:sz w:val="32"/>
+                <w:szCs w:val="32"/>
+              </w:rPr>
+              <w:tab/>
+            </w:r>
+            <w:r>
+              <w:rPr>
+                <w:rFonts w:cs="BRH Malayalam Extra"/>
+                <w:color w:val="000000"/>
+                <w:szCs w:val="32"/>
+              </w:rPr>
+              <w:t>4</w:t>
+            </w:r>
+            <w:r>
+              <w:rPr>
+                <w:rFonts w:ascii="BRH Malayalam Extra" w:hAnsi="BRH Malayalam Extra" w:cs="BRH Malayalam Extra"/>
+                <w:color w:val="000000"/>
+                <w:sz w:val="32"/>
+                <w:szCs w:val="32"/>
+              </w:rPr>
+              <w:t>.</w:t>
+            </w:r>
+            <w:r>
+              <w:rPr>
+                <w:rFonts w:cs="BRH Malayalam Extra"/>
+                <w:color w:val="000000"/>
+                <w:szCs w:val="32"/>
+              </w:rPr>
+              <w:t>1</w:t>
+            </w:r>
+            <w:r>
+              <w:rPr>
+                <w:rFonts w:ascii="BRH Malayalam Extra" w:hAnsi="BRH Malayalam Extra" w:cs="BRH Malayalam Extra"/>
+                <w:color w:val="000000"/>
+                <w:sz w:val="32"/>
+                <w:szCs w:val="32"/>
+              </w:rPr>
+              <w:t>.</w:t>
+            </w:r>
+            <w:r>
+              <w:rPr>
+                <w:rFonts w:cs="BRH Malayalam Extra"/>
+                <w:color w:val="000000"/>
+                <w:szCs w:val="32"/>
+              </w:rPr>
+              <w:t>10</w:t>
+            </w:r>
+            <w:r>
+              <w:rPr>
+                <w:rFonts w:ascii="BRH Malayalam Extra" w:hAnsi="BRH Malayalam Extra" w:cs="BRH Malayalam Extra"/>
+                <w:color w:val="000000"/>
+                <w:sz w:val="32"/>
+                <w:szCs w:val="32"/>
+              </w:rPr>
+              <w:t>.</w:t>
+            </w:r>
+            <w:r>
+              <w:rPr>
+                <w:rFonts w:cs="BRH Malayalam Extra"/>
+                <w:color w:val="000000"/>
+                <w:szCs w:val="32"/>
+              </w:rPr>
+              <w:t>4</w:t>
+            </w:r>
+            <w:r>
+              <w:rPr>
+                <w:rFonts w:ascii="BRH Malayalam Extra" w:hAnsi="BRH Malayalam Extra" w:cs="BRH Malayalam Extra"/>
+                <w:color w:val="000000"/>
+                <w:sz w:val="32"/>
+                <w:szCs w:val="32"/>
+              </w:rPr>
+              <w:t>(</w:t>
+            </w:r>
+            <w:r>
+              <w:rPr>
+                <w:rFonts w:cs="BRH Malayalam Extra"/>
+                <w:color w:val="000000"/>
+                <w:szCs w:val="32"/>
+              </w:rPr>
+              <w:t>47</w:t>
+            </w:r>
+            <w:r>
+              <w:rPr>
+                <w:rFonts w:ascii="BRH Malayalam Extra" w:hAnsi="BRH Malayalam Extra" w:cs="BRH Malayalam Extra"/>
+                <w:color w:val="000000"/>
+                <w:sz w:val="32"/>
+                <w:szCs w:val="32"/>
+              </w:rPr>
+              <w:t xml:space="preserve">)- </w:t>
+            </w:r>
+            <w:r>
+              <w:rPr>
+                <w:rFonts w:ascii="BRH Malayalam Extra" w:hAnsi="BRH Malayalam Extra" w:cs="BRH Malayalam Extra"/>
+                <w:color w:val="000000"/>
+                <w:sz w:val="32"/>
+                <w:szCs w:val="32"/>
+                <w:highlight w:val="green"/>
+                <w:lang w:val="en-IN"/>
+              </w:rPr>
+              <w:t>s</w:t>
+            </w:r>
+            <w:r>
+              <w:rPr>
+                <w:rFonts w:ascii="BRH Malayalam Extra" w:hAnsi="BRH Malayalam Extra" w:cs="BRH Malayalam Extra"/>
+                <w:color w:val="000000"/>
+                <w:sz w:val="26"/>
+                <w:szCs w:val="32"/>
+                <w:highlight w:val="green"/>
+                <w:lang w:val="en-IN"/>
+              </w:rPr>
+              <w:t>–</w:t>
+            </w:r>
+            <w:r>
+              <w:rPr>
+                <w:rFonts w:ascii="BRH Malayalam Extra" w:hAnsi="BRH Malayalam Extra" w:cs="BRH Malayalam Extra"/>
+                <w:color w:val="000000"/>
+                <w:sz w:val="32"/>
+                <w:szCs w:val="32"/>
+                <w:highlight w:val="green"/>
+                <w:lang w:val="en-IN"/>
+              </w:rPr>
+              <w:t>iz</w:t>
+            </w:r>
+            <w:r>
+              <w:rPr>
+                <w:rFonts w:ascii="BRH Malayalam Extra" w:hAnsi="BRH Malayalam Extra" w:cs="BRH Malayalam Extra"/>
+                <w:color w:val="000000"/>
+                <w:sz w:val="26"/>
+                <w:szCs w:val="32"/>
+                <w:highlight w:val="green"/>
+                <w:lang w:val="en-IN"/>
+              </w:rPr>
+              <w:t>–</w:t>
+            </w:r>
+            <w:r>
+              <w:rPr>
+                <w:rFonts w:ascii="BRH Malayalam Extra" w:hAnsi="BRH Malayalam Extra" w:cs="BRH Malayalam Extra"/>
+                <w:color w:val="000000"/>
+                <w:sz w:val="32"/>
+                <w:szCs w:val="32"/>
+                <w:highlight w:val="green"/>
+                <w:lang w:val="en-IN"/>
+              </w:rPr>
+              <w:t>Pz</w:t>
+            </w:r>
+            <w:r>
+              <w:rPr>
+                <w:rFonts w:ascii="BRH Malayalam Extra" w:hAnsi="BRH Malayalam Extra" w:cs="BRH Malayalam Extra"/>
+                <w:color w:val="000000"/>
+                <w:sz w:val="32"/>
+                <w:szCs w:val="32"/>
+                <w:lang w:val="en-IN"/>
+              </w:rPr>
+              <w:t xml:space="preserve"> </w:t>
+            </w:r>
+            <w:r>
+              <w:rPr>
+                <w:rFonts w:ascii="BRH Malayalam Extra" w:hAnsi="BRH Malayalam Extra" w:cs="BRH Malayalam Extra"/>
+                <w:color w:val="000000"/>
+                <w:sz w:val="32"/>
+                <w:szCs w:val="32"/>
+              </w:rPr>
+              <w:t>||</w:t>
+            </w:r>
+          </w:p>
+          <w:p>
+            <w:pPr>
+              <w:widowControl w:val="0"/>
+              <w:autoSpaceDE w:val="0"/>
+              <w:autoSpaceDN w:val="0"/>
+              <w:adjustRightInd w:val="0"/>
+              <w:spacing w:before="0" w:line="240" w:lineRule="auto"/>
+              <w:rPr>
                 <w:rFonts w:cs="BRH Malayalam Extra"/>
                 <w:color w:val="FF0000"/>
                 <w:szCs w:val="40"/>
               </w:rPr>
             </w:pPr>
+            <w:r>
+              <w:rPr>
+                <w:rFonts w:ascii="BRH Malayalam Extra" w:hAnsi="BRH Malayalam Extra" w:cs="BRH Malayalam Extra"/>
+                <w:color w:val="000000"/>
+                <w:sz w:val="32"/>
+                <w:szCs w:val="32"/>
+                <w:highlight w:val="green"/>
+              </w:rPr>
+              <w:t>s</w:t>
+            </w:r>
+            <w:r>
+              <w:rPr>
+                <w:rFonts w:ascii="BRH Malayalam Extra" w:hAnsi="BRH Malayalam Extra" w:cs="BRH Malayalam Extra"/>
+                <w:color w:val="000000"/>
+                <w:sz w:val="26"/>
+                <w:szCs w:val="32"/>
+                <w:highlight w:val="green"/>
+              </w:rPr>
+              <w:t>–</w:t>
+            </w:r>
+            <w:r>
+              <w:rPr>
+                <w:rFonts w:ascii="BRH Malayalam Extra" w:hAnsi="BRH Malayalam Extra" w:cs="BRH Malayalam Extra"/>
+                <w:color w:val="000000"/>
+                <w:sz w:val="32"/>
+                <w:szCs w:val="32"/>
+                <w:highlight w:val="green"/>
+              </w:rPr>
+              <w:t>iz</w:t>
+            </w:r>
+            <w:r>
+              <w:rPr>
+                <w:rFonts w:ascii="BRH Malayalam Extra" w:hAnsi="BRH Malayalam Extra" w:cs="BRH Malayalam Extra"/>
+                <w:color w:val="000000"/>
+                <w:sz w:val="26"/>
+                <w:szCs w:val="32"/>
+                <w:highlight w:val="green"/>
+              </w:rPr>
+              <w:t>–</w:t>
+            </w:r>
+            <w:r>
+              <w:rPr>
+                <w:rFonts w:ascii="BRH Malayalam Extra" w:hAnsi="BRH Malayalam Extra" w:cs="BRH Malayalam Extra"/>
+                <w:color w:val="000000"/>
+                <w:sz w:val="32"/>
+                <w:szCs w:val="32"/>
+                <w:highlight w:val="green"/>
+              </w:rPr>
+              <w:t>Pz</w:t>
+            </w:r>
+            <w:r>
+              <w:rPr>
+                <w:rFonts w:ascii="BRH Malayalam Extra" w:hAnsi="BRH Malayalam Extra" w:cs="BRH Malayalam Extra"/>
+                <w:color w:val="000000"/>
+                <w:sz w:val="32"/>
+                <w:szCs w:val="32"/>
+              </w:rPr>
+              <w:t xml:space="preserve"> CZy— </w:t>
+            </w:r>
+            <w:r>
+              <w:rPr>
+                <w:rFonts w:ascii="BRH Malayalam Extra" w:hAnsi="BRH Malayalam Extra" w:cs="BRH Malayalam Extra"/>
+                <w:color w:val="000000"/>
+                <w:sz w:val="32"/>
+                <w:szCs w:val="32"/>
+                <w:highlight w:val="green"/>
+              </w:rPr>
+              <w:t>siz</w:t>
+            </w:r>
+            <w:r>
+              <w:rPr>
+                <w:rFonts w:ascii="BRH Malayalam Extra" w:hAnsi="BRH Malayalam Extra" w:cs="BRH Malayalam Extra"/>
+                <w:color w:val="000000"/>
+                <w:sz w:val="26"/>
+                <w:szCs w:val="32"/>
+                <w:highlight w:val="green"/>
+              </w:rPr>
+              <w:t>–</w:t>
+            </w:r>
+            <w:r>
+              <w:rPr>
+                <w:rFonts w:ascii="BRH Malayalam Extra" w:hAnsi="BRH Malayalam Extra" w:cs="BRH Malayalam Extra"/>
+                <w:color w:val="000000"/>
+                <w:sz w:val="32"/>
+                <w:szCs w:val="32"/>
+                <w:highlight w:val="green"/>
+              </w:rPr>
+              <w:t>Pz</w:t>
+            </w:r>
+            <w:r>
+              <w:rPr>
+                <w:rFonts w:ascii="BRH Malayalam Extra" w:hAnsi="BRH Malayalam Extra" w:cs="BRH Malayalam Extra"/>
+                <w:color w:val="000000"/>
+                <w:sz w:val="32"/>
+                <w:szCs w:val="32"/>
+              </w:rPr>
+              <w:t xml:space="preserve"> | </w:t>
+            </w:r>
           </w:p>
         </w:tc>
       </w:tr>
@@ -3215,7 +5666,6 @@
         </w:rPr>
         <w:t xml:space="preserve">TS </w:t>
       </w:r>
-      <w:proofErr w:type="gramStart"/>
       <w:r>
         <w:rPr>
           <w:b/>
@@ -3254,18 +5704,7 @@
           <w:szCs w:val="32"/>
           <w:u w:val="single"/>
         </w:rPr>
-        <w:t>–</w:t>
-      </w:r>
-      <w:proofErr w:type="gramEnd"/>
-      <w:r>
-        <w:rPr>
-          <w:b/>
-          <w:bCs/>
-          <w:sz w:val="32"/>
-          <w:szCs w:val="32"/>
-          <w:u w:val="single"/>
-        </w:rPr>
-        <w:t xml:space="preserve"> TS </w:t>
+        <w:t xml:space="preserve">– TS </w:t>
       </w:r>
       <w:r>
         <w:rPr>
@@ -4456,6 +6895,7 @@
                 <w:color w:val="000000"/>
                 <w:szCs w:val="32"/>
               </w:rPr>
+              <w:lastRenderedPageBreak/>
               <w:t>11</w:t>
             </w:r>
             <w:r>
@@ -5849,17 +8289,7 @@
                 <w:sz w:val="32"/>
                 <w:szCs w:val="32"/>
               </w:rPr>
-              <w:t xml:space="preserve">sx „„PâÉ—sx </w:t>
-            </w:r>
-            <w:r>
-              <w:rPr>
-                <w:rFonts w:ascii="BRH Malayalam Extra" w:hAnsi="BRH Malayalam Extra" w:cs="BRH Malayalam Extra"/>
-                <w:color w:val="000000"/>
-                <w:sz w:val="32"/>
-                <w:szCs w:val="32"/>
-              </w:rPr>
-              <w:lastRenderedPageBreak/>
-              <w:t>Zûx Zûx</w:t>
+              <w:t>sx „„PâÉ—sx Zûx Zûx</w:t>
             </w:r>
             <w:r>
               <w:rPr>
@@ -5944,7 +8374,6 @@
                 <w:color w:val="000000"/>
                 <w:szCs w:val="32"/>
               </w:rPr>
-              <w:lastRenderedPageBreak/>
               <w:t>53</w:t>
             </w:r>
             <w:r>
@@ -6162,17 +8591,7 @@
                 <w:sz w:val="32"/>
                 <w:szCs w:val="32"/>
               </w:rPr>
-              <w:t xml:space="preserve">sx „„PâÉ—sx </w:t>
-            </w:r>
-            <w:r>
-              <w:rPr>
-                <w:rFonts w:ascii="BRH Malayalam Extra" w:hAnsi="BRH Malayalam Extra" w:cs="BRH Malayalam Extra"/>
-                <w:color w:val="000000"/>
-                <w:sz w:val="32"/>
-                <w:szCs w:val="32"/>
-              </w:rPr>
-              <w:lastRenderedPageBreak/>
-              <w:t>Zûx Zûx</w:t>
+              <w:t>sx „„PâÉ—sx Zûx Zûx</w:t>
             </w:r>
             <w:r>
               <w:rPr>
@@ -6280,7 +8699,6 @@
                 <w:color w:val="000000"/>
                 <w:szCs w:val="32"/>
               </w:rPr>
-              <w:lastRenderedPageBreak/>
               <w:t>68</w:t>
             </w:r>
             <w:r>
@@ -7710,6 +10128,7 @@
                 <w:szCs w:val="32"/>
                 <w:lang w:val="it-IT"/>
               </w:rPr>
+              <w:lastRenderedPageBreak/>
               <w:t>D</w:t>
             </w:r>
             <w:r>
@@ -7813,6 +10232,7 @@
                 <w:szCs w:val="32"/>
                 <w:lang w:val="it-IT"/>
               </w:rPr>
+              <w:lastRenderedPageBreak/>
               <w:t>8</w:t>
             </w:r>
             <w:r>
@@ -7974,6 +10394,7 @@
                 <w:szCs w:val="32"/>
                 <w:lang w:val="it-IT"/>
               </w:rPr>
+              <w:lastRenderedPageBreak/>
               <w:t>D</w:t>
             </w:r>
             <w:r>
@@ -8100,6 +10521,7 @@
                 <w:color w:val="000000"/>
                 <w:szCs w:val="32"/>
               </w:rPr>
+              <w:lastRenderedPageBreak/>
               <w:t>16</w:t>
             </w:r>
             <w:r>
@@ -10587,6 +13009,7 @@
                 <w:color w:val="000000"/>
                 <w:szCs w:val="32"/>
               </w:rPr>
+              <w:lastRenderedPageBreak/>
               <w:t>2</w:t>
             </w:r>
             <w:r>
@@ -15175,6 +17598,7 @@
                 <w:szCs w:val="32"/>
                 <w:lang w:val="it-IT"/>
               </w:rPr>
+              <w:lastRenderedPageBreak/>
               <w:t>D</w:t>
             </w:r>
             <w:r>
@@ -15253,6 +17677,7 @@
                 <w:szCs w:val="32"/>
                 <w:lang w:val="it-IT"/>
               </w:rPr>
+              <w:lastRenderedPageBreak/>
               <w:t>44</w:t>
             </w:r>
             <w:r>
@@ -15433,6 +17858,7 @@
                 <w:szCs w:val="32"/>
                 <w:lang w:val="it-IT"/>
               </w:rPr>
+              <w:lastRenderedPageBreak/>
               <w:t>D</w:t>
             </w:r>
             <w:r>
@@ -15515,6 +17941,7 @@
                 <w:color w:val="000000"/>
                 <w:szCs w:val="32"/>
               </w:rPr>
+              <w:lastRenderedPageBreak/>
               <w:t>43</w:t>
             </w:r>
             <w:r>
@@ -18369,6 +20796,7 @@
                 <w:sz w:val="32"/>
                 <w:szCs w:val="32"/>
               </w:rPr>
+              <w:lastRenderedPageBreak/>
               <w:t>p</w:t>
             </w:r>
             <w:r>
@@ -19840,6 +22268,7 @@
                 <w:color w:val="000000"/>
                 <w:szCs w:val="32"/>
               </w:rPr>
+              <w:lastRenderedPageBreak/>
               <w:t>4</w:t>
             </w:r>
             <w:r>
@@ -20722,6 +23151,7 @@
                 <w:sz w:val="32"/>
                 <w:szCs w:val="32"/>
               </w:rPr>
+              <w:lastRenderedPageBreak/>
               <w:t>p</w:t>
             </w:r>
             <w:r>
@@ -22238,6 +24668,7 @@
                 <w:color w:val="000000"/>
                 <w:szCs w:val="32"/>
               </w:rPr>
+              <w:lastRenderedPageBreak/>
               <w:t>6</w:t>
             </w:r>
             <w:r>
@@ -25584,6 +28015,7 @@
                 <w:sz w:val="32"/>
                 <w:szCs w:val="32"/>
               </w:rPr>
+              <w:lastRenderedPageBreak/>
               <w:t>py</w:t>
             </w:r>
             <w:r>
@@ -25679,6 +28111,7 @@
                 <w:color w:val="000000"/>
                 <w:szCs w:val="32"/>
               </w:rPr>
+              <w:lastRenderedPageBreak/>
               <w:t>12</w:t>
             </w:r>
             <w:r>
@@ -25860,6 +28293,7 @@
                 <w:sz w:val="32"/>
                 <w:szCs w:val="32"/>
               </w:rPr>
+              <w:lastRenderedPageBreak/>
               <w:t>py</w:t>
             </w:r>
             <w:r>
@@ -25961,6 +28395,7 @@
                 <w:color w:val="000000"/>
                 <w:szCs w:val="32"/>
               </w:rPr>
+              <w:lastRenderedPageBreak/>
               <w:t>17</w:t>
             </w:r>
             <w:r>
@@ -29222,6 +31657,7 @@
                 <w:color w:val="000000"/>
                 <w:szCs w:val="32"/>
               </w:rPr>
+              <w:lastRenderedPageBreak/>
               <w:t>15</w:t>
             </w:r>
             <w:r>
@@ -31216,6 +33652,7 @@
                 <w:color w:val="000000"/>
                 <w:szCs w:val="32"/>
               </w:rPr>
+              <w:lastRenderedPageBreak/>
               <w:t>42</w:t>
             </w:r>
             <w:r>
@@ -31407,27 +33844,7 @@
                 <w:sz w:val="32"/>
                 <w:szCs w:val="32"/>
               </w:rPr>
-              <w:t>td¢˜</w:t>
-            </w:r>
-            <w:proofErr w:type="gramStart"/>
-            <w:r>
-              <w:rPr>
-                <w:rFonts w:ascii="BRH Malayalam Extra" w:hAnsi="BRH Malayalam Extra" w:cs="BRH Malayalam Extra"/>
-                <w:color w:val="000000"/>
-                <w:sz w:val="32"/>
-                <w:szCs w:val="32"/>
-              </w:rPr>
-              <w:t>hõx(</w:t>
-            </w:r>
-            <w:proofErr w:type="gramEnd"/>
-            <w:r>
-              <w:rPr>
-                <w:rFonts w:ascii="BRH Malayalam Extra" w:hAnsi="BRH Malayalam Extra" w:cs="BRH Malayalam Extra"/>
-                <w:color w:val="000000"/>
-                <w:sz w:val="32"/>
-                <w:szCs w:val="32"/>
-              </w:rPr>
-              <w:t>MÞ§) ¥së</w:t>
+              <w:t>td¢˜hõx(MÞ§) ¥së</w:t>
             </w:r>
             <w:r>
               <w:rPr>
@@ -31499,27 +33916,7 @@
                 <w:sz w:val="32"/>
                 <w:szCs w:val="32"/>
               </w:rPr>
-              <w:t xml:space="preserve"> td¢˜</w:t>
-            </w:r>
-            <w:proofErr w:type="gramStart"/>
-            <w:r>
-              <w:rPr>
-                <w:rFonts w:ascii="BRH Malayalam Extra" w:hAnsi="BRH Malayalam Extra" w:cs="BRH Malayalam Extra"/>
-                <w:color w:val="000000"/>
-                <w:sz w:val="32"/>
-                <w:szCs w:val="32"/>
-              </w:rPr>
-              <w:t>hõx(</w:t>
-            </w:r>
-            <w:proofErr w:type="gramEnd"/>
-            <w:r>
-              <w:rPr>
-                <w:rFonts w:ascii="BRH Malayalam Extra" w:hAnsi="BRH Malayalam Extra" w:cs="BRH Malayalam Extra"/>
-                <w:color w:val="000000"/>
-                <w:sz w:val="32"/>
-                <w:szCs w:val="32"/>
-              </w:rPr>
-              <w:t>MÞ§) ¥së</w:t>
+              <w:t xml:space="preserve"> td¢˜hõx(MÞ§) ¥së</w:t>
             </w:r>
             <w:r>
               <w:rPr>
@@ -31669,27 +34066,7 @@
                 <w:sz w:val="32"/>
                 <w:szCs w:val="32"/>
               </w:rPr>
-              <w:t xml:space="preserve"> td¢˜</w:t>
-            </w:r>
-            <w:proofErr w:type="gramStart"/>
-            <w:r>
-              <w:rPr>
-                <w:rFonts w:ascii="BRH Malayalam Extra" w:hAnsi="BRH Malayalam Extra" w:cs="BRH Malayalam Extra"/>
-                <w:color w:val="000000"/>
-                <w:sz w:val="32"/>
-                <w:szCs w:val="32"/>
-              </w:rPr>
-              <w:t>hõx(</w:t>
-            </w:r>
-            <w:proofErr w:type="gramEnd"/>
-            <w:r>
-              <w:rPr>
-                <w:rFonts w:ascii="BRH Malayalam Extra" w:hAnsi="BRH Malayalam Extra" w:cs="BRH Malayalam Extra"/>
-                <w:color w:val="000000"/>
-                <w:sz w:val="32"/>
-                <w:szCs w:val="32"/>
-              </w:rPr>
-              <w:t>MÞ§) ¥së</w:t>
+              <w:t xml:space="preserve"> td¢˜hõx(MÞ§) ¥së</w:t>
             </w:r>
             <w:r>
               <w:rPr>
@@ -32131,27 +34508,7 @@
                 <w:sz w:val="32"/>
                 <w:szCs w:val="32"/>
               </w:rPr>
-              <w:t xml:space="preserve">— </w:t>
-            </w:r>
-            <w:proofErr w:type="gramStart"/>
-            <w:r>
-              <w:rPr>
-                <w:rFonts w:ascii="BRH Malayalam Extra" w:hAnsi="BRH Malayalam Extra" w:cs="BRH Malayalam Extra"/>
-                <w:color w:val="000000"/>
-                <w:sz w:val="32"/>
-                <w:szCs w:val="32"/>
-              </w:rPr>
-              <w:t>sëx(</w:t>
-            </w:r>
-            <w:proofErr w:type="gramEnd"/>
-            <w:r>
-              <w:rPr>
-                <w:rFonts w:ascii="BRH Malayalam Extra" w:hAnsi="BRH Malayalam Extra" w:cs="BRH Malayalam Extra"/>
-                <w:color w:val="000000"/>
-                <w:sz w:val="32"/>
-                <w:szCs w:val="32"/>
-              </w:rPr>
-              <w:t>MÞ§) sëx© h—</w:t>
+              <w:t>— sëx(MÞ§) sëx© h—</w:t>
             </w:r>
             <w:r>
               <w:rPr>
@@ -32507,27 +34864,7 @@
                 <w:sz w:val="32"/>
                 <w:szCs w:val="32"/>
               </w:rPr>
-              <w:t xml:space="preserve"> </w:t>
-            </w:r>
-            <w:proofErr w:type="gramStart"/>
-            <w:r>
-              <w:rPr>
-                <w:rFonts w:ascii="BRH Malayalam Extra" w:hAnsi="BRH Malayalam Extra" w:cs="BRH Malayalam Extra"/>
-                <w:color w:val="000000"/>
-                <w:sz w:val="32"/>
-                <w:szCs w:val="32"/>
-              </w:rPr>
-              <w:t>sëx(</w:t>
-            </w:r>
-            <w:proofErr w:type="gramEnd"/>
-            <w:r>
-              <w:rPr>
-                <w:rFonts w:ascii="BRH Malayalam Extra" w:hAnsi="BRH Malayalam Extra" w:cs="BRH Malayalam Extra"/>
-                <w:color w:val="000000"/>
-                <w:sz w:val="32"/>
-                <w:szCs w:val="32"/>
-              </w:rPr>
-              <w:t>MÞ§) sëx© h</w:t>
+              <w:t xml:space="preserve"> sëx(MÞ§) sëx© h</w:t>
             </w:r>
             <w:r>
               <w:rPr>
@@ -32605,27 +34942,7 @@
                 <w:sz w:val="32"/>
                 <w:szCs w:val="32"/>
               </w:rPr>
-              <w:t xml:space="preserve">— </w:t>
-            </w:r>
-            <w:proofErr w:type="gramStart"/>
-            <w:r>
-              <w:rPr>
-                <w:rFonts w:ascii="BRH Malayalam Extra" w:hAnsi="BRH Malayalam Extra" w:cs="BRH Malayalam Extra"/>
-                <w:color w:val="000000"/>
-                <w:sz w:val="32"/>
-                <w:szCs w:val="32"/>
-              </w:rPr>
-              <w:t>sëx(</w:t>
-            </w:r>
-            <w:proofErr w:type="gramEnd"/>
-            <w:r>
-              <w:rPr>
-                <w:rFonts w:ascii="BRH Malayalam Extra" w:hAnsi="BRH Malayalam Extra" w:cs="BRH Malayalam Extra"/>
-                <w:color w:val="000000"/>
-                <w:sz w:val="32"/>
-                <w:szCs w:val="32"/>
-              </w:rPr>
-              <w:t>MÞ§) sëûI ZûI Zx© h—</w:t>
+              <w:t>— sëx(MÞ§) sëûI ZûI Zx© h—</w:t>
             </w:r>
             <w:r>
               <w:rPr>
@@ -32703,27 +35020,7 @@
                 <w:sz w:val="32"/>
                 <w:szCs w:val="32"/>
               </w:rPr>
-              <w:t xml:space="preserve">— </w:t>
-            </w:r>
-            <w:proofErr w:type="gramStart"/>
-            <w:r>
-              <w:rPr>
-                <w:rFonts w:ascii="BRH Malayalam Extra" w:hAnsi="BRH Malayalam Extra" w:cs="BRH Malayalam Extra"/>
-                <w:color w:val="000000"/>
-                <w:sz w:val="32"/>
-                <w:szCs w:val="32"/>
-              </w:rPr>
-              <w:t>sëx(</w:t>
-            </w:r>
-            <w:proofErr w:type="gramEnd"/>
-            <w:r>
-              <w:rPr>
-                <w:rFonts w:ascii="BRH Malayalam Extra" w:hAnsi="BRH Malayalam Extra" w:cs="BRH Malayalam Extra"/>
-                <w:color w:val="000000"/>
-                <w:sz w:val="32"/>
-                <w:szCs w:val="32"/>
-              </w:rPr>
-              <w:t xml:space="preserve">MÞ§) sëûI | </w:t>
+              <w:t xml:space="preserve">— sëx(MÞ§) sëûI | </w:t>
             </w:r>
           </w:p>
           <w:p>
@@ -33235,27 +35532,7 @@
                 <w:sz w:val="32"/>
                 <w:szCs w:val="32"/>
               </w:rPr>
-              <w:t>td¢˜</w:t>
-            </w:r>
-            <w:proofErr w:type="gramStart"/>
-            <w:r>
-              <w:rPr>
-                <w:rFonts w:ascii="BRH Malayalam Extra" w:hAnsi="BRH Malayalam Extra" w:cs="BRH Malayalam Extra"/>
-                <w:color w:val="000000"/>
-                <w:sz w:val="32"/>
-                <w:szCs w:val="32"/>
-              </w:rPr>
-              <w:t>hõx(</w:t>
-            </w:r>
-            <w:proofErr w:type="gramEnd"/>
-            <w:r>
-              <w:rPr>
-                <w:rFonts w:ascii="BRH Malayalam Extra" w:hAnsi="BRH Malayalam Extra" w:cs="BRH Malayalam Extra"/>
-                <w:color w:val="000000"/>
-                <w:sz w:val="32"/>
-                <w:szCs w:val="32"/>
-              </w:rPr>
-              <w:t>MÞ§) ¥së</w:t>
+              <w:t>td¢˜hõx(MÞ§) ¥së</w:t>
             </w:r>
             <w:r>
               <w:rPr>
@@ -33327,27 +35604,7 @@
                 <w:sz w:val="32"/>
                 <w:szCs w:val="32"/>
               </w:rPr>
-              <w:t xml:space="preserve"> td¢˜</w:t>
-            </w:r>
-            <w:proofErr w:type="gramStart"/>
-            <w:r>
-              <w:rPr>
-                <w:rFonts w:ascii="BRH Malayalam Extra" w:hAnsi="BRH Malayalam Extra" w:cs="BRH Malayalam Extra"/>
-                <w:color w:val="000000"/>
-                <w:sz w:val="32"/>
-                <w:szCs w:val="32"/>
-              </w:rPr>
-              <w:t>hõx(</w:t>
-            </w:r>
-            <w:proofErr w:type="gramEnd"/>
-            <w:r>
-              <w:rPr>
-                <w:rFonts w:ascii="BRH Malayalam Extra" w:hAnsi="BRH Malayalam Extra" w:cs="BRH Malayalam Extra"/>
-                <w:color w:val="000000"/>
-                <w:sz w:val="32"/>
-                <w:szCs w:val="32"/>
-              </w:rPr>
-              <w:t>MÞ§) ¥së</w:t>
+              <w:t xml:space="preserve"> td¢˜hõx(MÞ§) ¥së</w:t>
             </w:r>
             <w:r>
               <w:rPr>
@@ -33457,27 +35714,7 @@
                 <w:sz w:val="32"/>
                 <w:szCs w:val="32"/>
               </w:rPr>
-              <w:t xml:space="preserve"> td¢˜</w:t>
-            </w:r>
-            <w:proofErr w:type="gramStart"/>
-            <w:r>
-              <w:rPr>
-                <w:rFonts w:ascii="BRH Malayalam Extra" w:hAnsi="BRH Malayalam Extra" w:cs="BRH Malayalam Extra"/>
-                <w:color w:val="000000"/>
-                <w:sz w:val="32"/>
-                <w:szCs w:val="32"/>
-              </w:rPr>
-              <w:t>hõx(</w:t>
-            </w:r>
-            <w:proofErr w:type="gramEnd"/>
-            <w:r>
-              <w:rPr>
-                <w:rFonts w:ascii="BRH Malayalam Extra" w:hAnsi="BRH Malayalam Extra" w:cs="BRH Malayalam Extra"/>
-                <w:color w:val="000000"/>
-                <w:sz w:val="32"/>
-                <w:szCs w:val="32"/>
-              </w:rPr>
-              <w:t>MÞ§) ¥së</w:t>
+              <w:t xml:space="preserve"> td¢˜hõx(MÞ§) ¥së</w:t>
             </w:r>
             <w:r>
               <w:rPr>
@@ -33868,27 +36105,7 @@
                 <w:sz w:val="32"/>
                 <w:szCs w:val="32"/>
               </w:rPr>
-              <w:t xml:space="preserve"> </w:t>
-            </w:r>
-            <w:proofErr w:type="gramStart"/>
-            <w:r>
-              <w:rPr>
-                <w:rFonts w:ascii="BRH Malayalam Extra" w:hAnsi="BRH Malayalam Extra" w:cs="BRH Malayalam Extra"/>
-                <w:color w:val="000000"/>
-                <w:sz w:val="32"/>
-                <w:szCs w:val="32"/>
-              </w:rPr>
-              <w:t>sëx(</w:t>
-            </w:r>
-            <w:proofErr w:type="gramEnd"/>
-            <w:r>
-              <w:rPr>
-                <w:rFonts w:ascii="BRH Malayalam Extra" w:hAnsi="BRH Malayalam Extra" w:cs="BRH Malayalam Extra"/>
-                <w:color w:val="000000"/>
-                <w:sz w:val="32"/>
-                <w:szCs w:val="32"/>
-              </w:rPr>
-              <w:t>MÞ§) sëx© h—</w:t>
+              <w:t xml:space="preserve"> sëx(MÞ§) sëx© h—</w:t>
             </w:r>
             <w:r>
               <w:rPr>
@@ -34246,27 +36463,7 @@
                 <w:sz w:val="32"/>
                 <w:szCs w:val="32"/>
               </w:rPr>
-              <w:t xml:space="preserve"> </w:t>
-            </w:r>
-            <w:proofErr w:type="gramStart"/>
-            <w:r>
-              <w:rPr>
-                <w:rFonts w:ascii="BRH Malayalam Extra" w:hAnsi="BRH Malayalam Extra" w:cs="BRH Malayalam Extra"/>
-                <w:color w:val="000000"/>
-                <w:sz w:val="32"/>
-                <w:szCs w:val="32"/>
-              </w:rPr>
-              <w:t>sëx(</w:t>
-            </w:r>
-            <w:proofErr w:type="gramEnd"/>
-            <w:r>
-              <w:rPr>
-                <w:rFonts w:ascii="BRH Malayalam Extra" w:hAnsi="BRH Malayalam Extra" w:cs="BRH Malayalam Extra"/>
-                <w:color w:val="000000"/>
-                <w:sz w:val="32"/>
-                <w:szCs w:val="32"/>
-              </w:rPr>
-              <w:t>MÞ§) sëx© h</w:t>
+              <w:t xml:space="preserve"> sëx(MÞ§) sëx© h</w:t>
             </w:r>
             <w:r>
               <w:rPr>
@@ -34323,27 +36520,7 @@
                 <w:sz w:val="32"/>
                 <w:szCs w:val="32"/>
               </w:rPr>
-              <w:t xml:space="preserve"> </w:t>
-            </w:r>
-            <w:proofErr w:type="gramStart"/>
-            <w:r>
-              <w:rPr>
-                <w:rFonts w:ascii="BRH Malayalam Extra" w:hAnsi="BRH Malayalam Extra" w:cs="BRH Malayalam Extra"/>
-                <w:color w:val="000000"/>
-                <w:sz w:val="32"/>
-                <w:szCs w:val="32"/>
-              </w:rPr>
-              <w:t>sëx(</w:t>
-            </w:r>
-            <w:proofErr w:type="gramEnd"/>
-            <w:r>
-              <w:rPr>
-                <w:rFonts w:ascii="BRH Malayalam Extra" w:hAnsi="BRH Malayalam Extra" w:cs="BRH Malayalam Extra"/>
-                <w:color w:val="000000"/>
-                <w:sz w:val="32"/>
-                <w:szCs w:val="32"/>
-              </w:rPr>
-              <w:t xml:space="preserve">MÞ§) sëûI </w:t>
+              <w:t xml:space="preserve"> sëx(MÞ§) sëûI </w:t>
             </w:r>
           </w:p>
           <w:p>
@@ -34414,27 +36591,7 @@
                 <w:sz w:val="32"/>
                 <w:szCs w:val="32"/>
               </w:rPr>
-              <w:t xml:space="preserve"> </w:t>
-            </w:r>
-            <w:proofErr w:type="gramStart"/>
-            <w:r>
-              <w:rPr>
-                <w:rFonts w:ascii="BRH Malayalam Extra" w:hAnsi="BRH Malayalam Extra" w:cs="BRH Malayalam Extra"/>
-                <w:color w:val="000000"/>
-                <w:sz w:val="32"/>
-                <w:szCs w:val="32"/>
-              </w:rPr>
-              <w:t>sëx(</w:t>
-            </w:r>
-            <w:proofErr w:type="gramEnd"/>
-            <w:r>
-              <w:rPr>
-                <w:rFonts w:ascii="BRH Malayalam Extra" w:hAnsi="BRH Malayalam Extra" w:cs="BRH Malayalam Extra"/>
-                <w:color w:val="000000"/>
-                <w:sz w:val="32"/>
-                <w:szCs w:val="32"/>
-              </w:rPr>
-              <w:t xml:space="preserve">MÞ§) sëûI | </w:t>
+              <w:t xml:space="preserve"> sëx(MÞ§) sëûI | </w:t>
             </w:r>
           </w:p>
           <w:p>
@@ -36062,7 +38219,6 @@
         </w:rPr>
         <w:t xml:space="preserve">TS </w:t>
       </w:r>
-      <w:proofErr w:type="gramStart"/>
       <w:r>
         <w:rPr>
           <w:b/>
@@ -36101,18 +38257,7 @@
           <w:szCs w:val="32"/>
           <w:u w:val="single"/>
         </w:rPr>
-        <w:t>–</w:t>
-      </w:r>
-      <w:proofErr w:type="gramEnd"/>
-      <w:r>
-        <w:rPr>
-          <w:b/>
-          <w:bCs/>
-          <w:sz w:val="32"/>
-          <w:szCs w:val="32"/>
-          <w:u w:val="single"/>
-        </w:rPr>
-        <w:t xml:space="preserve"> TS </w:t>
+        <w:t xml:space="preserve">– TS </w:t>
       </w:r>
       <w:r>
         <w:rPr>

</xml_diff>

<commit_message>
nmv 09 10 2026
</commit_message>
<xml_diff>
--- a/TS Jatai Ghanam Project/TS 4.1/TS 4.1 Ghanam Malayalam Corrections.docx
+++ b/TS Jatai Ghanam Project/TS 4.1/TS 4.1 Ghanam Malayalam Corrections.docx
@@ -24,6 +24,7 @@
         </w:rPr>
         <w:t xml:space="preserve">TS </w:t>
       </w:r>
+      <w:proofErr w:type="gramStart"/>
       <w:r>
         <w:rPr>
           <w:b/>
@@ -52,7 +53,18 @@
           <w:szCs w:val="32"/>
           <w:u w:val="single"/>
         </w:rPr>
-        <w:t xml:space="preserve">– TS </w:t>
+        <w:t>–</w:t>
+      </w:r>
+      <w:proofErr w:type="gramEnd"/>
+      <w:r>
+        <w:rPr>
+          <w:b/>
+          <w:bCs/>
+          <w:sz w:val="32"/>
+          <w:szCs w:val="32"/>
+          <w:u w:val="single"/>
+        </w:rPr>
+        <w:t xml:space="preserve"> TS </w:t>
       </w:r>
       <w:r>
         <w:rPr>
@@ -120,10 +132,9 @@
           <w:bCs/>
           <w:sz w:val="32"/>
           <w:szCs w:val="32"/>
-          <w:highlight w:val="red"/>
           <w:u w:val="single"/>
         </w:rPr>
-        <w:t>?????</w:t>
+        <w:t>31st Oct 2026</w:t>
       </w:r>
     </w:p>
     <w:p>
@@ -226,7 +237,7 @@
       </w:tr>
       <w:tr>
         <w:trPr>
-          <w:trHeight w:val="2175"/>
+          <w:trHeight w:val="4740"/>
         </w:trPr>
         <w:tc>
           <w:tcPr>
@@ -1278,143 +1289,128 @@
               <w:adjustRightInd w:val="0"/>
               <w:spacing w:before="0" w:line="240" w:lineRule="auto"/>
               <w:rPr>
-                <w:rFonts w:ascii="BRH Malayalam Extra" w:hAnsi="BRH Malayalam Extra" w:cs="BRH Malayalam Extra"/>
-                <w:color w:val="000000"/>
-                <w:sz w:val="32"/>
-                <w:szCs w:val="32"/>
-              </w:rPr>
-            </w:pPr>
-            <w:r>
-              <w:rPr>
-                <w:rFonts w:ascii="BRH Malayalam Extra" w:hAnsi="BRH Malayalam Extra" w:cs="BRH Malayalam Extra"/>
-                <w:color w:val="000000"/>
-                <w:sz w:val="32"/>
-                <w:szCs w:val="32"/>
-              </w:rPr>
-              <w:t>p£</w:t>
-            </w:r>
-            <w:r>
-              <w:rPr>
-                <w:rFonts w:ascii="BRH Malayalam Extra" w:hAnsi="BRH Malayalam Extra" w:cs="BRH Malayalam Extra"/>
-                <w:color w:val="000000"/>
-                <w:sz w:val="26"/>
-                <w:szCs w:val="32"/>
-              </w:rPr>
-              <w:t>–</w:t>
-            </w:r>
-            <w:r>
-              <w:rPr>
-                <w:rFonts w:ascii="BRH Malayalam Extra" w:hAnsi="BRH Malayalam Extra" w:cs="BRH Malayalam Extra"/>
-                <w:color w:val="000000"/>
-                <w:sz w:val="32"/>
-                <w:szCs w:val="32"/>
-              </w:rPr>
-              <w:t>r</w:t>
-            </w:r>
-            <w:r>
-              <w:rPr>
-                <w:rFonts w:ascii="BRH Malayalam Extra" w:hAnsi="BRH Malayalam Extra" w:cs="BRH Malayalam Extra"/>
-                <w:color w:val="000000"/>
-                <w:sz w:val="26"/>
-                <w:szCs w:val="32"/>
-              </w:rPr>
-              <w:t>–</w:t>
-            </w:r>
-            <w:r>
-              <w:rPr>
-                <w:rFonts w:ascii="BRH Malayalam Extra" w:hAnsi="BRH Malayalam Extra" w:cs="BRH Malayalam Extra"/>
-                <w:color w:val="000000"/>
-                <w:sz w:val="32"/>
-                <w:szCs w:val="32"/>
-              </w:rPr>
-              <w:t>Yû</w:t>
-            </w:r>
-            <w:r>
-              <w:rPr>
-                <w:rFonts w:ascii="BRH Malayalam Extra" w:hAnsi="BRH Malayalam Extra" w:cs="BRH Malayalam Extra"/>
-                <w:color w:val="000000"/>
-                <w:sz w:val="26"/>
-                <w:szCs w:val="32"/>
-              </w:rPr>
-              <w:t>–</w:t>
-            </w:r>
-            <w:r>
-              <w:rPr>
-                <w:rFonts w:ascii="BRH Malayalam Extra" w:hAnsi="BRH Malayalam Extra" w:cs="BRH Malayalam Extra"/>
-                <w:color w:val="000000"/>
-                <w:sz w:val="32"/>
-                <w:szCs w:val="32"/>
-              </w:rPr>
-              <w:t>s¢</w:t>
-            </w:r>
-            <w:r>
-              <w:rPr>
-                <w:rFonts w:ascii="BRH Malayalam Extra" w:hAnsi="BRH Malayalam Extra" w:cs="BRH Malayalam Extra"/>
-                <w:color w:val="000000"/>
-                <w:sz w:val="26"/>
-                <w:szCs w:val="32"/>
-              </w:rPr>
-              <w:t>–</w:t>
-            </w:r>
-            <w:r>
-              <w:rPr>
-                <w:rFonts w:ascii="BRH Malayalam Extra" w:hAnsi="BRH Malayalam Extra" w:cs="BRH Malayalam Extra"/>
-                <w:color w:val="000000"/>
-                <w:sz w:val="32"/>
-                <w:szCs w:val="32"/>
-              </w:rPr>
-              <w:t xml:space="preserve"> CZy— p£rY§ - p</w:t>
-            </w:r>
-            <w:r>
-              <w:rPr>
-                <w:rFonts w:ascii="BRH Malayalam Extra" w:hAnsi="BRH Malayalam Extra" w:cs="BRH Malayalam Extra"/>
-                <w:color w:val="000000"/>
-                <w:sz w:val="26"/>
-                <w:szCs w:val="32"/>
-              </w:rPr>
-              <w:t>–</w:t>
-            </w:r>
-            <w:r>
-              <w:rPr>
-                <w:rFonts w:ascii="BRH Malayalam Extra" w:hAnsi="BRH Malayalam Extra" w:cs="BRH Malayalam Extra"/>
-                <w:color w:val="000000"/>
-                <w:sz w:val="32"/>
-                <w:szCs w:val="32"/>
-              </w:rPr>
-              <w:t>s¢</w:t>
-            </w:r>
-            <w:r>
-              <w:rPr>
-                <w:rFonts w:ascii="BRH Malayalam Extra" w:hAnsi="BRH Malayalam Extra" w:cs="BRH Malayalam Extra"/>
-                <w:color w:val="000000"/>
-                <w:sz w:val="26"/>
-                <w:szCs w:val="32"/>
-              </w:rPr>
-              <w:t>–</w:t>
-            </w:r>
-            <w:r>
-              <w:rPr>
-                <w:rFonts w:ascii="BRH Malayalam Extra" w:hAnsi="BRH Malayalam Extra" w:cs="BRH Malayalam Extra"/>
-                <w:color w:val="000000"/>
-                <w:sz w:val="32"/>
-                <w:szCs w:val="32"/>
-              </w:rPr>
-              <w:t xml:space="preserve"> | </w:t>
-            </w:r>
-          </w:p>
-          <w:p>
-            <w:pPr>
-              <w:widowControl w:val="0"/>
-              <w:autoSpaceDE w:val="0"/>
-              <w:autoSpaceDN w:val="0"/>
-              <w:adjustRightInd w:val="0"/>
-              <w:spacing w:before="0" w:line="240" w:lineRule="auto"/>
-              <w:rPr>
                 <w:rFonts w:cs="BRH Malayalam Extra"/>
                 <w:color w:val="FF0000"/>
                 <w:szCs w:val="40"/>
               </w:rPr>
             </w:pPr>
+            <w:r>
+              <w:rPr>
+                <w:rFonts w:ascii="BRH Malayalam Extra" w:hAnsi="BRH Malayalam Extra" w:cs="BRH Malayalam Extra"/>
+                <w:color w:val="000000"/>
+                <w:sz w:val="32"/>
+                <w:szCs w:val="32"/>
+              </w:rPr>
+              <w:t>p£</w:t>
+            </w:r>
+            <w:r>
+              <w:rPr>
+                <w:rFonts w:ascii="BRH Malayalam Extra" w:hAnsi="BRH Malayalam Extra" w:cs="BRH Malayalam Extra"/>
+                <w:color w:val="000000"/>
+                <w:sz w:val="26"/>
+                <w:szCs w:val="32"/>
+              </w:rPr>
+              <w:t>–</w:t>
+            </w:r>
+            <w:r>
+              <w:rPr>
+                <w:rFonts w:ascii="BRH Malayalam Extra" w:hAnsi="BRH Malayalam Extra" w:cs="BRH Malayalam Extra"/>
+                <w:color w:val="000000"/>
+                <w:sz w:val="32"/>
+                <w:szCs w:val="32"/>
+              </w:rPr>
+              <w:t>r</w:t>
+            </w:r>
+            <w:r>
+              <w:rPr>
+                <w:rFonts w:ascii="BRH Malayalam Extra" w:hAnsi="BRH Malayalam Extra" w:cs="BRH Malayalam Extra"/>
+                <w:color w:val="000000"/>
+                <w:sz w:val="26"/>
+                <w:szCs w:val="32"/>
+              </w:rPr>
+              <w:t>–</w:t>
+            </w:r>
+            <w:r>
+              <w:rPr>
+                <w:rFonts w:ascii="BRH Malayalam Extra" w:hAnsi="BRH Malayalam Extra" w:cs="BRH Malayalam Extra"/>
+                <w:color w:val="000000"/>
+                <w:sz w:val="32"/>
+                <w:szCs w:val="32"/>
+              </w:rPr>
+              <w:t>Yû</w:t>
+            </w:r>
+            <w:r>
+              <w:rPr>
+                <w:rFonts w:ascii="BRH Malayalam Extra" w:hAnsi="BRH Malayalam Extra" w:cs="BRH Malayalam Extra"/>
+                <w:color w:val="000000"/>
+                <w:sz w:val="26"/>
+                <w:szCs w:val="32"/>
+              </w:rPr>
+              <w:t>–</w:t>
+            </w:r>
+            <w:r>
+              <w:rPr>
+                <w:rFonts w:ascii="BRH Malayalam Extra" w:hAnsi="BRH Malayalam Extra" w:cs="BRH Malayalam Extra"/>
+                <w:color w:val="000000"/>
+                <w:sz w:val="32"/>
+                <w:szCs w:val="32"/>
+              </w:rPr>
+              <w:t>s¢</w:t>
+            </w:r>
+            <w:r>
+              <w:rPr>
+                <w:rFonts w:ascii="BRH Malayalam Extra" w:hAnsi="BRH Malayalam Extra" w:cs="BRH Malayalam Extra"/>
+                <w:color w:val="000000"/>
+                <w:sz w:val="26"/>
+                <w:szCs w:val="32"/>
+              </w:rPr>
+              <w:t>–</w:t>
+            </w:r>
+            <w:r>
+              <w:rPr>
+                <w:rFonts w:ascii="BRH Malayalam Extra" w:hAnsi="BRH Malayalam Extra" w:cs="BRH Malayalam Extra"/>
+                <w:color w:val="000000"/>
+                <w:sz w:val="32"/>
+                <w:szCs w:val="32"/>
+              </w:rPr>
+              <w:t xml:space="preserve"> CZy— p£rY§ - p</w:t>
+            </w:r>
+            <w:r>
+              <w:rPr>
+                <w:rFonts w:ascii="BRH Malayalam Extra" w:hAnsi="BRH Malayalam Extra" w:cs="BRH Malayalam Extra"/>
+                <w:color w:val="000000"/>
+                <w:sz w:val="26"/>
+                <w:szCs w:val="32"/>
+              </w:rPr>
+              <w:t>–</w:t>
+            </w:r>
+            <w:r>
+              <w:rPr>
+                <w:rFonts w:ascii="BRH Malayalam Extra" w:hAnsi="BRH Malayalam Extra" w:cs="BRH Malayalam Extra"/>
+                <w:color w:val="000000"/>
+                <w:sz w:val="32"/>
+                <w:szCs w:val="32"/>
+              </w:rPr>
+              <w:t>s¢</w:t>
+            </w:r>
+            <w:r>
+              <w:rPr>
+                <w:rFonts w:ascii="BRH Malayalam Extra" w:hAnsi="BRH Malayalam Extra" w:cs="BRH Malayalam Extra"/>
+                <w:color w:val="000000"/>
+                <w:sz w:val="26"/>
+                <w:szCs w:val="32"/>
+              </w:rPr>
+              <w:t>–</w:t>
+            </w:r>
+            <w:r>
+              <w:rPr>
+                <w:rFonts w:ascii="BRH Malayalam Extra" w:hAnsi="BRH Malayalam Extra" w:cs="BRH Malayalam Extra"/>
+                <w:color w:val="000000"/>
+                <w:sz w:val="32"/>
+                <w:szCs w:val="32"/>
+              </w:rPr>
+              <w:t xml:space="preserve"> | </w:t>
+            </w:r>
           </w:p>
         </w:tc>
         <w:tc>
@@ -2418,143 +2414,128 @@
               <w:adjustRightInd w:val="0"/>
               <w:spacing w:before="0" w:line="240" w:lineRule="auto"/>
               <w:rPr>
-                <w:rFonts w:ascii="BRH Malayalam Extra" w:hAnsi="BRH Malayalam Extra" w:cs="BRH Malayalam Extra"/>
-                <w:color w:val="000000"/>
-                <w:sz w:val="32"/>
-                <w:szCs w:val="32"/>
-              </w:rPr>
-            </w:pPr>
-            <w:r>
-              <w:rPr>
-                <w:rFonts w:ascii="BRH Malayalam Extra" w:hAnsi="BRH Malayalam Extra" w:cs="BRH Malayalam Extra"/>
-                <w:color w:val="000000"/>
-                <w:sz w:val="32"/>
-                <w:szCs w:val="32"/>
-              </w:rPr>
-              <w:t>p£</w:t>
-            </w:r>
-            <w:r>
-              <w:rPr>
-                <w:rFonts w:ascii="BRH Malayalam Extra" w:hAnsi="BRH Malayalam Extra" w:cs="BRH Malayalam Extra"/>
-                <w:color w:val="000000"/>
-                <w:sz w:val="26"/>
-                <w:szCs w:val="32"/>
-              </w:rPr>
-              <w:t>–</w:t>
-            </w:r>
-            <w:r>
-              <w:rPr>
-                <w:rFonts w:ascii="BRH Malayalam Extra" w:hAnsi="BRH Malayalam Extra" w:cs="BRH Malayalam Extra"/>
-                <w:color w:val="000000"/>
-                <w:sz w:val="32"/>
-                <w:szCs w:val="32"/>
-              </w:rPr>
-              <w:t>r</w:t>
-            </w:r>
-            <w:r>
-              <w:rPr>
-                <w:rFonts w:ascii="BRH Malayalam Extra" w:hAnsi="BRH Malayalam Extra" w:cs="BRH Malayalam Extra"/>
-                <w:color w:val="000000"/>
-                <w:sz w:val="26"/>
-                <w:szCs w:val="32"/>
-              </w:rPr>
-              <w:t>–</w:t>
-            </w:r>
-            <w:r>
-              <w:rPr>
-                <w:rFonts w:ascii="BRH Malayalam Extra" w:hAnsi="BRH Malayalam Extra" w:cs="BRH Malayalam Extra"/>
-                <w:color w:val="000000"/>
-                <w:sz w:val="32"/>
-                <w:szCs w:val="32"/>
-              </w:rPr>
-              <w:t>Yû</w:t>
-            </w:r>
-            <w:r>
-              <w:rPr>
-                <w:rFonts w:ascii="BRH Malayalam Extra" w:hAnsi="BRH Malayalam Extra" w:cs="BRH Malayalam Extra"/>
-                <w:color w:val="000000"/>
-                <w:sz w:val="26"/>
-                <w:szCs w:val="32"/>
-              </w:rPr>
-              <w:t>–</w:t>
-            </w:r>
-            <w:r>
-              <w:rPr>
-                <w:rFonts w:ascii="BRH Malayalam Extra" w:hAnsi="BRH Malayalam Extra" w:cs="BRH Malayalam Extra"/>
-                <w:color w:val="000000"/>
-                <w:sz w:val="32"/>
-                <w:szCs w:val="32"/>
-              </w:rPr>
-              <w:t>s¢</w:t>
-            </w:r>
-            <w:r>
-              <w:rPr>
-                <w:rFonts w:ascii="BRH Malayalam Extra" w:hAnsi="BRH Malayalam Extra" w:cs="BRH Malayalam Extra"/>
-                <w:color w:val="000000"/>
-                <w:sz w:val="26"/>
-                <w:szCs w:val="32"/>
-              </w:rPr>
-              <w:t>–</w:t>
-            </w:r>
-            <w:r>
-              <w:rPr>
-                <w:rFonts w:ascii="BRH Malayalam Extra" w:hAnsi="BRH Malayalam Extra" w:cs="BRH Malayalam Extra"/>
-                <w:color w:val="000000"/>
-                <w:sz w:val="32"/>
-                <w:szCs w:val="32"/>
-              </w:rPr>
-              <w:t xml:space="preserve"> CZy— p£rY§ - p</w:t>
-            </w:r>
-            <w:r>
-              <w:rPr>
-                <w:rFonts w:ascii="BRH Malayalam Extra" w:hAnsi="BRH Malayalam Extra" w:cs="BRH Malayalam Extra"/>
-                <w:color w:val="000000"/>
-                <w:sz w:val="26"/>
-                <w:szCs w:val="32"/>
-              </w:rPr>
-              <w:t>–</w:t>
-            </w:r>
-            <w:r>
-              <w:rPr>
-                <w:rFonts w:ascii="BRH Malayalam Extra" w:hAnsi="BRH Malayalam Extra" w:cs="BRH Malayalam Extra"/>
-                <w:color w:val="000000"/>
-                <w:sz w:val="32"/>
-                <w:szCs w:val="32"/>
-              </w:rPr>
-              <w:t>s¢</w:t>
-            </w:r>
-            <w:r>
-              <w:rPr>
-                <w:rFonts w:ascii="BRH Malayalam Extra" w:hAnsi="BRH Malayalam Extra" w:cs="BRH Malayalam Extra"/>
-                <w:color w:val="000000"/>
-                <w:sz w:val="26"/>
-                <w:szCs w:val="32"/>
-              </w:rPr>
-              <w:t>–</w:t>
-            </w:r>
-            <w:r>
-              <w:rPr>
-                <w:rFonts w:ascii="BRH Malayalam Extra" w:hAnsi="BRH Malayalam Extra" w:cs="BRH Malayalam Extra"/>
-                <w:color w:val="000000"/>
-                <w:sz w:val="32"/>
-                <w:szCs w:val="32"/>
-              </w:rPr>
-              <w:t xml:space="preserve"> | </w:t>
-            </w:r>
-          </w:p>
-          <w:p>
-            <w:pPr>
-              <w:widowControl w:val="0"/>
-              <w:autoSpaceDE w:val="0"/>
-              <w:autoSpaceDN w:val="0"/>
-              <w:adjustRightInd w:val="0"/>
-              <w:spacing w:before="0" w:line="240" w:lineRule="auto"/>
-              <w:rPr>
                 <w:rFonts w:cs="BRH Malayalam Extra"/>
                 <w:color w:val="FF0000"/>
                 <w:szCs w:val="40"/>
               </w:rPr>
             </w:pPr>
+            <w:r>
+              <w:rPr>
+                <w:rFonts w:ascii="BRH Malayalam Extra" w:hAnsi="BRH Malayalam Extra" w:cs="BRH Malayalam Extra"/>
+                <w:color w:val="000000"/>
+                <w:sz w:val="32"/>
+                <w:szCs w:val="32"/>
+              </w:rPr>
+              <w:t>p£</w:t>
+            </w:r>
+            <w:r>
+              <w:rPr>
+                <w:rFonts w:ascii="BRH Malayalam Extra" w:hAnsi="BRH Malayalam Extra" w:cs="BRH Malayalam Extra"/>
+                <w:color w:val="000000"/>
+                <w:sz w:val="26"/>
+                <w:szCs w:val="32"/>
+              </w:rPr>
+              <w:t>–</w:t>
+            </w:r>
+            <w:r>
+              <w:rPr>
+                <w:rFonts w:ascii="BRH Malayalam Extra" w:hAnsi="BRH Malayalam Extra" w:cs="BRH Malayalam Extra"/>
+                <w:color w:val="000000"/>
+                <w:sz w:val="32"/>
+                <w:szCs w:val="32"/>
+              </w:rPr>
+              <w:t>r</w:t>
+            </w:r>
+            <w:r>
+              <w:rPr>
+                <w:rFonts w:ascii="BRH Malayalam Extra" w:hAnsi="BRH Malayalam Extra" w:cs="BRH Malayalam Extra"/>
+                <w:color w:val="000000"/>
+                <w:sz w:val="26"/>
+                <w:szCs w:val="32"/>
+              </w:rPr>
+              <w:t>–</w:t>
+            </w:r>
+            <w:r>
+              <w:rPr>
+                <w:rFonts w:ascii="BRH Malayalam Extra" w:hAnsi="BRH Malayalam Extra" w:cs="BRH Malayalam Extra"/>
+                <w:color w:val="000000"/>
+                <w:sz w:val="32"/>
+                <w:szCs w:val="32"/>
+              </w:rPr>
+              <w:t>Yû</w:t>
+            </w:r>
+            <w:r>
+              <w:rPr>
+                <w:rFonts w:ascii="BRH Malayalam Extra" w:hAnsi="BRH Malayalam Extra" w:cs="BRH Malayalam Extra"/>
+                <w:color w:val="000000"/>
+                <w:sz w:val="26"/>
+                <w:szCs w:val="32"/>
+              </w:rPr>
+              <w:t>–</w:t>
+            </w:r>
+            <w:r>
+              <w:rPr>
+                <w:rFonts w:ascii="BRH Malayalam Extra" w:hAnsi="BRH Malayalam Extra" w:cs="BRH Malayalam Extra"/>
+                <w:color w:val="000000"/>
+                <w:sz w:val="32"/>
+                <w:szCs w:val="32"/>
+              </w:rPr>
+              <w:t>s¢</w:t>
+            </w:r>
+            <w:r>
+              <w:rPr>
+                <w:rFonts w:ascii="BRH Malayalam Extra" w:hAnsi="BRH Malayalam Extra" w:cs="BRH Malayalam Extra"/>
+                <w:color w:val="000000"/>
+                <w:sz w:val="26"/>
+                <w:szCs w:val="32"/>
+              </w:rPr>
+              <w:t>–</w:t>
+            </w:r>
+            <w:r>
+              <w:rPr>
+                <w:rFonts w:ascii="BRH Malayalam Extra" w:hAnsi="BRH Malayalam Extra" w:cs="BRH Malayalam Extra"/>
+                <w:color w:val="000000"/>
+                <w:sz w:val="32"/>
+                <w:szCs w:val="32"/>
+              </w:rPr>
+              <w:t xml:space="preserve"> CZy— p£rY§ - p</w:t>
+            </w:r>
+            <w:r>
+              <w:rPr>
+                <w:rFonts w:ascii="BRH Malayalam Extra" w:hAnsi="BRH Malayalam Extra" w:cs="BRH Malayalam Extra"/>
+                <w:color w:val="000000"/>
+                <w:sz w:val="26"/>
+                <w:szCs w:val="32"/>
+              </w:rPr>
+              <w:t>–</w:t>
+            </w:r>
+            <w:r>
+              <w:rPr>
+                <w:rFonts w:ascii="BRH Malayalam Extra" w:hAnsi="BRH Malayalam Extra" w:cs="BRH Malayalam Extra"/>
+                <w:color w:val="000000"/>
+                <w:sz w:val="32"/>
+                <w:szCs w:val="32"/>
+              </w:rPr>
+              <w:t>s¢</w:t>
+            </w:r>
+            <w:r>
+              <w:rPr>
+                <w:rFonts w:ascii="BRH Malayalam Extra" w:hAnsi="BRH Malayalam Extra" w:cs="BRH Malayalam Extra"/>
+                <w:color w:val="000000"/>
+                <w:sz w:val="26"/>
+                <w:szCs w:val="32"/>
+              </w:rPr>
+              <w:t>–</w:t>
+            </w:r>
+            <w:r>
+              <w:rPr>
+                <w:rFonts w:ascii="BRH Malayalam Extra" w:hAnsi="BRH Malayalam Extra" w:cs="BRH Malayalam Extra"/>
+                <w:color w:val="000000"/>
+                <w:sz w:val="32"/>
+                <w:szCs w:val="32"/>
+              </w:rPr>
+              <w:t xml:space="preserve"> | </w:t>
+            </w:r>
           </w:p>
         </w:tc>
       </w:tr>
@@ -5630,6 +5611,16 @@
           <w:u w:val="single"/>
         </w:rPr>
       </w:pPr>
+      <w:r>
+        <w:rPr>
+          <w:b/>
+          <w:bCs/>
+          <w:sz w:val="32"/>
+          <w:szCs w:val="32"/>
+          <w:u w:val="single"/>
+        </w:rPr>
+        <w:t>==============</w:t>
+      </w:r>
     </w:p>
     <w:p>
       <w:pPr>
@@ -5666,6 +5657,7 @@
         </w:rPr>
         <w:t xml:space="preserve">TS </w:t>
       </w:r>
+      <w:proofErr w:type="gramStart"/>
       <w:r>
         <w:rPr>
           <w:b/>
@@ -5704,7 +5696,18 @@
           <w:szCs w:val="32"/>
           <w:u w:val="single"/>
         </w:rPr>
-        <w:t xml:space="preserve">– TS </w:t>
+        <w:t>–</w:t>
+      </w:r>
+      <w:proofErr w:type="gramEnd"/>
+      <w:r>
+        <w:rPr>
+          <w:b/>
+          <w:bCs/>
+          <w:sz w:val="32"/>
+          <w:szCs w:val="32"/>
+          <w:u w:val="single"/>
+        </w:rPr>
+        <w:t xml:space="preserve"> TS </w:t>
       </w:r>
       <w:r>
         <w:rPr>
@@ -9933,7 +9936,7 @@
       </w:tr>
       <w:tr>
         <w:trPr>
-          <w:trHeight w:val="1130"/>
+          <w:trHeight w:val="787"/>
         </w:trPr>
         <w:tc>
           <w:tcPr>
@@ -9953,157 +9956,12 @@
               <w:adjustRightInd w:val="0"/>
               <w:spacing w:line="240" w:lineRule="auto"/>
               <w:rPr>
-                <w:rFonts w:ascii="BRH Malayalam Extra" w:hAnsi="BRH Malayalam Extra" w:cs="BRH Malayalam Extra"/>
-                <w:color w:val="000000"/>
-                <w:sz w:val="32"/>
+                <w:rFonts w:cs="BRH Malayalam Extra"/>
+                <w:color w:val="000000"/>
                 <w:szCs w:val="32"/>
                 <w:lang w:val="it-IT"/>
               </w:rPr>
             </w:pPr>
-            <w:r>
-              <w:rPr>
-                <w:rFonts w:cs="BRH Malayalam Extra"/>
-                <w:color w:val="000000"/>
-                <w:szCs w:val="32"/>
-                <w:lang w:val="it-IT"/>
-              </w:rPr>
-              <w:t>8</w:t>
-            </w:r>
-            <w:r>
-              <w:rPr>
-                <w:rFonts w:ascii="BRH Malayalam Extra" w:hAnsi="BRH Malayalam Extra" w:cs="BRH Malayalam Extra"/>
-                <w:color w:val="000000"/>
-                <w:sz w:val="32"/>
-                <w:szCs w:val="32"/>
-                <w:lang w:val="it-IT"/>
-              </w:rPr>
-              <w:t>)</w:t>
-            </w:r>
-            <w:r>
-              <w:rPr>
-                <w:rFonts w:ascii="BRH Malayalam Extra" w:hAnsi="BRH Malayalam Extra" w:cs="BRH Malayalam Extra"/>
-                <w:color w:val="000000"/>
-                <w:sz w:val="32"/>
-                <w:szCs w:val="32"/>
-                <w:lang w:val="it-IT"/>
-              </w:rPr>
-              <w:tab/>
-            </w:r>
-            <w:r>
-              <w:rPr>
-                <w:rFonts w:cs="BRH Malayalam Extra"/>
-                <w:color w:val="000000"/>
-                <w:szCs w:val="32"/>
-                <w:lang w:val="it-IT"/>
-              </w:rPr>
-              <w:t>4</w:t>
-            </w:r>
-            <w:r>
-              <w:rPr>
-                <w:rFonts w:ascii="BRH Malayalam Extra" w:hAnsi="BRH Malayalam Extra" w:cs="BRH Malayalam Extra"/>
-                <w:color w:val="000000"/>
-                <w:sz w:val="32"/>
-                <w:szCs w:val="32"/>
-                <w:lang w:val="it-IT"/>
-              </w:rPr>
-              <w:t>.</w:t>
-            </w:r>
-            <w:r>
-              <w:rPr>
-                <w:rFonts w:cs="BRH Malayalam Extra"/>
-                <w:color w:val="000000"/>
-                <w:szCs w:val="32"/>
-                <w:lang w:val="it-IT"/>
-              </w:rPr>
-              <w:t>1</w:t>
-            </w:r>
-            <w:r>
-              <w:rPr>
-                <w:rFonts w:ascii="BRH Malayalam Extra" w:hAnsi="BRH Malayalam Extra" w:cs="BRH Malayalam Extra"/>
-                <w:color w:val="000000"/>
-                <w:sz w:val="32"/>
-                <w:szCs w:val="32"/>
-                <w:lang w:val="it-IT"/>
-              </w:rPr>
-              <w:t>.</w:t>
-            </w:r>
-            <w:r>
-              <w:rPr>
-                <w:rFonts w:cs="BRH Malayalam Extra"/>
-                <w:color w:val="000000"/>
-                <w:szCs w:val="32"/>
-                <w:lang w:val="it-IT"/>
-              </w:rPr>
-              <w:t>3</w:t>
-            </w:r>
-            <w:r>
-              <w:rPr>
-                <w:rFonts w:ascii="BRH Malayalam Extra" w:hAnsi="BRH Malayalam Extra" w:cs="BRH Malayalam Extra"/>
-                <w:color w:val="000000"/>
-                <w:sz w:val="32"/>
-                <w:szCs w:val="32"/>
-                <w:lang w:val="it-IT"/>
-              </w:rPr>
-              <w:t>.</w:t>
-            </w:r>
-            <w:r>
-              <w:rPr>
-                <w:rFonts w:cs="BRH Malayalam Extra"/>
-                <w:color w:val="000000"/>
-                <w:szCs w:val="32"/>
-                <w:lang w:val="it-IT"/>
-              </w:rPr>
-              <w:t>2</w:t>
-            </w:r>
-            <w:r>
-              <w:rPr>
-                <w:rFonts w:ascii="BRH Malayalam Extra" w:hAnsi="BRH Malayalam Extra" w:cs="BRH Malayalam Extra"/>
-                <w:color w:val="000000"/>
-                <w:sz w:val="32"/>
-                <w:szCs w:val="32"/>
-                <w:lang w:val="it-IT"/>
-              </w:rPr>
-              <w:t>(</w:t>
-            </w:r>
-            <w:r>
-              <w:rPr>
-                <w:rFonts w:cs="BRH Malayalam Extra"/>
-                <w:color w:val="000000"/>
-                <w:szCs w:val="32"/>
-                <w:lang w:val="it-IT"/>
-              </w:rPr>
-              <w:t>6</w:t>
-            </w:r>
-            <w:r>
-              <w:rPr>
-                <w:rFonts w:ascii="BRH Malayalam Extra" w:hAnsi="BRH Malayalam Extra" w:cs="BRH Malayalam Extra"/>
-                <w:color w:val="000000"/>
-                <w:sz w:val="32"/>
-                <w:szCs w:val="32"/>
-                <w:lang w:val="it-IT"/>
-              </w:rPr>
-              <w:t>)- D</w:t>
-            </w:r>
-            <w:r>
-              <w:rPr>
-                <w:rFonts w:ascii="BRH Malayalam Extra" w:hAnsi="BRH Malayalam Extra" w:cs="BRH Malayalam Extra"/>
-                <w:color w:val="000000"/>
-                <w:sz w:val="26"/>
-                <w:szCs w:val="32"/>
-                <w:lang w:val="it-IT"/>
-              </w:rPr>
-              <w:t>–</w:t>
-            </w:r>
-            <w:r>
-              <w:rPr>
-                <w:rFonts w:ascii="BRH Malayalam Extra" w:hAnsi="BRH Malayalam Extra" w:cs="BRH Malayalam Extra"/>
-                <w:color w:val="000000"/>
-                <w:sz w:val="32"/>
-                <w:szCs w:val="32"/>
-                <w:lang w:val="it-IT"/>
-              </w:rPr>
-              <w:t>¥h ||</w:t>
-            </w:r>
           </w:p>
           <w:p>
             <w:pPr>
@@ -10113,76 +9971,12 @@
               <w:adjustRightInd w:val="0"/>
               <w:spacing w:line="240" w:lineRule="auto"/>
               <w:rPr>
-                <w:rFonts w:ascii="BRH Malayalam Extra" w:hAnsi="BRH Malayalam Extra" w:cs="BRH Malayalam Extra"/>
-                <w:color w:val="000000"/>
-                <w:sz w:val="32"/>
+                <w:rFonts w:cs="BRH Malayalam Extra"/>
+                <w:color w:val="000000"/>
                 <w:szCs w:val="32"/>
                 <w:lang w:val="it-IT"/>
               </w:rPr>
             </w:pPr>
-            <w:r>
-              <w:rPr>
-                <w:rFonts w:ascii="BRH Malayalam Extra" w:hAnsi="BRH Malayalam Extra" w:cs="BRH Malayalam Extra"/>
-                <w:color w:val="000000"/>
-                <w:sz w:val="32"/>
-                <w:szCs w:val="32"/>
-                <w:lang w:val="it-IT"/>
-              </w:rPr>
-              <w:lastRenderedPageBreak/>
-              <w:t>D</w:t>
-            </w:r>
-            <w:r>
-              <w:rPr>
-                <w:rFonts w:ascii="BRH Malayalam Extra" w:hAnsi="BRH Malayalam Extra" w:cs="BRH Malayalam Extra"/>
-                <w:color w:val="000000"/>
-                <w:sz w:val="26"/>
-                <w:szCs w:val="32"/>
-                <w:lang w:val="it-IT"/>
-              </w:rPr>
-              <w:t>–</w:t>
-            </w:r>
-            <w:r>
-              <w:rPr>
-                <w:rFonts w:ascii="BRH Malayalam Extra" w:hAnsi="BRH Malayalam Extra" w:cs="BRH Malayalam Extra"/>
-                <w:color w:val="000000"/>
-                <w:sz w:val="32"/>
-                <w:szCs w:val="32"/>
-                <w:lang w:val="it-IT"/>
-              </w:rPr>
-              <w:t>¥h C</w:t>
-            </w:r>
-            <w:r>
-              <w:rPr>
-                <w:rFonts w:ascii="BRH Malayalam Extra" w:hAnsi="BRH Malayalam Extra" w:cs="BRH Malayalam Extra"/>
-                <w:color w:val="000000"/>
-                <w:sz w:val="32"/>
-                <w:szCs w:val="32"/>
-                <w:highlight w:val="yellow"/>
-                <w:lang w:val="it-IT"/>
-              </w:rPr>
-              <w:t>Z¡</w:t>
-            </w:r>
-            <w:r>
-              <w:rPr>
-                <w:rFonts w:ascii="BRH Malayalam Extra" w:hAnsi="BRH Malayalam Extra" w:cs="BRH Malayalam Extra"/>
-                <w:color w:val="000000"/>
-                <w:sz w:val="26"/>
-                <w:szCs w:val="32"/>
-                <w:highlight w:val="yellow"/>
-                <w:lang w:val="it-IT"/>
-              </w:rPr>
-              <w:t>–</w:t>
-            </w:r>
-            <w:r>
-              <w:rPr>
-                <w:rFonts w:ascii="BRH Malayalam Extra" w:hAnsi="BRH Malayalam Extra" w:cs="BRH Malayalam Extra"/>
-                <w:color w:val="000000"/>
-                <w:sz w:val="32"/>
-                <w:szCs w:val="32"/>
-                <w:lang w:val="it-IT"/>
-              </w:rPr>
-              <w:t xml:space="preserve">¥h | </w:t>
-            </w:r>
           </w:p>
           <w:p>
             <w:pPr>
@@ -10190,7 +9984,168 @@
               <w:autoSpaceDE w:val="0"/>
               <w:autoSpaceDN w:val="0"/>
               <w:adjustRightInd w:val="0"/>
-              <w:spacing w:before="0" w:line="240" w:lineRule="auto"/>
+              <w:spacing w:line="240" w:lineRule="auto"/>
+              <w:rPr>
+                <w:rFonts w:ascii="BRH Malayalam Extra" w:hAnsi="BRH Malayalam Extra" w:cs="BRH Malayalam Extra"/>
+                <w:color w:val="000000"/>
+                <w:sz w:val="32"/>
+                <w:szCs w:val="32"/>
+                <w:lang w:val="it-IT"/>
+              </w:rPr>
+            </w:pPr>
+            <w:r>
+              <w:rPr>
+                <w:rFonts w:cs="BRH Malayalam Extra"/>
+                <w:color w:val="000000"/>
+                <w:szCs w:val="32"/>
+                <w:lang w:val="it-IT"/>
+              </w:rPr>
+              <w:lastRenderedPageBreak/>
+              <w:t>8</w:t>
+            </w:r>
+            <w:r>
+              <w:rPr>
+                <w:rFonts w:ascii="BRH Malayalam Extra" w:hAnsi="BRH Malayalam Extra" w:cs="BRH Malayalam Extra"/>
+                <w:color w:val="000000"/>
+                <w:sz w:val="32"/>
+                <w:szCs w:val="32"/>
+                <w:lang w:val="it-IT"/>
+              </w:rPr>
+              <w:t>)</w:t>
+            </w:r>
+            <w:r>
+              <w:rPr>
+                <w:rFonts w:ascii="BRH Malayalam Extra" w:hAnsi="BRH Malayalam Extra" w:cs="BRH Malayalam Extra"/>
+                <w:color w:val="000000"/>
+                <w:sz w:val="32"/>
+                <w:szCs w:val="32"/>
+                <w:lang w:val="it-IT"/>
+              </w:rPr>
+              <w:tab/>
+            </w:r>
+            <w:r>
+              <w:rPr>
+                <w:rFonts w:cs="BRH Malayalam Extra"/>
+                <w:color w:val="000000"/>
+                <w:szCs w:val="32"/>
+                <w:lang w:val="it-IT"/>
+              </w:rPr>
+              <w:t>4</w:t>
+            </w:r>
+            <w:r>
+              <w:rPr>
+                <w:rFonts w:ascii="BRH Malayalam Extra" w:hAnsi="BRH Malayalam Extra" w:cs="BRH Malayalam Extra"/>
+                <w:color w:val="000000"/>
+                <w:sz w:val="32"/>
+                <w:szCs w:val="32"/>
+                <w:lang w:val="it-IT"/>
+              </w:rPr>
+              <w:t>.</w:t>
+            </w:r>
+            <w:r>
+              <w:rPr>
+                <w:rFonts w:cs="BRH Malayalam Extra"/>
+                <w:color w:val="000000"/>
+                <w:szCs w:val="32"/>
+                <w:lang w:val="it-IT"/>
+              </w:rPr>
+              <w:t>1</w:t>
+            </w:r>
+            <w:r>
+              <w:rPr>
+                <w:rFonts w:ascii="BRH Malayalam Extra" w:hAnsi="BRH Malayalam Extra" w:cs="BRH Malayalam Extra"/>
+                <w:color w:val="000000"/>
+                <w:sz w:val="32"/>
+                <w:szCs w:val="32"/>
+                <w:lang w:val="it-IT"/>
+              </w:rPr>
+              <w:t>.</w:t>
+            </w:r>
+            <w:r>
+              <w:rPr>
+                <w:rFonts w:cs="BRH Malayalam Extra"/>
+                <w:color w:val="000000"/>
+                <w:szCs w:val="32"/>
+                <w:lang w:val="it-IT"/>
+              </w:rPr>
+              <w:t>3</w:t>
+            </w:r>
+            <w:r>
+              <w:rPr>
+                <w:rFonts w:ascii="BRH Malayalam Extra" w:hAnsi="BRH Malayalam Extra" w:cs="BRH Malayalam Extra"/>
+                <w:color w:val="000000"/>
+                <w:sz w:val="32"/>
+                <w:szCs w:val="32"/>
+                <w:lang w:val="it-IT"/>
+              </w:rPr>
+              <w:t>.</w:t>
+            </w:r>
+            <w:r>
+              <w:rPr>
+                <w:rFonts w:cs="BRH Malayalam Extra"/>
+                <w:color w:val="000000"/>
+                <w:szCs w:val="32"/>
+                <w:lang w:val="it-IT"/>
+              </w:rPr>
+              <w:t>2</w:t>
+            </w:r>
+            <w:r>
+              <w:rPr>
+                <w:rFonts w:ascii="BRH Malayalam Extra" w:hAnsi="BRH Malayalam Extra" w:cs="BRH Malayalam Extra"/>
+                <w:color w:val="000000"/>
+                <w:sz w:val="32"/>
+                <w:szCs w:val="32"/>
+                <w:lang w:val="it-IT"/>
+              </w:rPr>
+              <w:t>(</w:t>
+            </w:r>
+            <w:r>
+              <w:rPr>
+                <w:rFonts w:cs="BRH Malayalam Extra"/>
+                <w:color w:val="000000"/>
+                <w:szCs w:val="32"/>
+                <w:lang w:val="it-IT"/>
+              </w:rPr>
+              <w:t>6</w:t>
+            </w:r>
+            <w:r>
+              <w:rPr>
+                <w:rFonts w:ascii="BRH Malayalam Extra" w:hAnsi="BRH Malayalam Extra" w:cs="BRH Malayalam Extra"/>
+                <w:color w:val="000000"/>
+                <w:sz w:val="32"/>
+                <w:szCs w:val="32"/>
+                <w:lang w:val="it-IT"/>
+              </w:rPr>
+              <w:t>)- D</w:t>
+            </w:r>
+            <w:r>
+              <w:rPr>
+                <w:rFonts w:ascii="BRH Malayalam Extra" w:hAnsi="BRH Malayalam Extra" w:cs="BRH Malayalam Extra"/>
+                <w:color w:val="000000"/>
+                <w:sz w:val="26"/>
+                <w:szCs w:val="32"/>
+                <w:lang w:val="it-IT"/>
+              </w:rPr>
+              <w:t>–</w:t>
+            </w:r>
+            <w:r>
+              <w:rPr>
+                <w:rFonts w:ascii="BRH Malayalam Extra" w:hAnsi="BRH Malayalam Extra" w:cs="BRH Malayalam Extra"/>
+                <w:color w:val="000000"/>
+                <w:sz w:val="32"/>
+                <w:szCs w:val="32"/>
+                <w:lang w:val="it-IT"/>
+              </w:rPr>
+              <w:t>¥h ||</w:t>
+            </w:r>
+          </w:p>
+          <w:p>
+            <w:pPr>
+              <w:widowControl w:val="0"/>
+              <w:autoSpaceDE w:val="0"/>
+              <w:autoSpaceDN w:val="0"/>
+              <w:adjustRightInd w:val="0"/>
+              <w:spacing w:line="240" w:lineRule="auto"/>
               <w:rPr>
                 <w:rFonts w:cs="BRH Malayalam Extra"/>
                 <w:color w:val="FF0000"/>
@@ -10198,6 +10153,68 @@
                 <w:lang w:val="en-IN"/>
               </w:rPr>
             </w:pPr>
+            <w:r>
+              <w:rPr>
+                <w:rFonts w:ascii="BRH Malayalam Extra" w:hAnsi="BRH Malayalam Extra" w:cs="BRH Malayalam Extra"/>
+                <w:color w:val="000000"/>
+                <w:sz w:val="32"/>
+                <w:szCs w:val="32"/>
+                <w:lang w:val="it-IT"/>
+              </w:rPr>
+              <w:t>D</w:t>
+            </w:r>
+            <w:r>
+              <w:rPr>
+                <w:rFonts w:ascii="BRH Malayalam Extra" w:hAnsi="BRH Malayalam Extra" w:cs="BRH Malayalam Extra"/>
+                <w:color w:val="000000"/>
+                <w:sz w:val="26"/>
+                <w:szCs w:val="32"/>
+                <w:lang w:val="it-IT"/>
+              </w:rPr>
+              <w:t>–</w:t>
+            </w:r>
+            <w:r>
+              <w:rPr>
+                <w:rFonts w:ascii="BRH Malayalam Extra" w:hAnsi="BRH Malayalam Extra" w:cs="BRH Malayalam Extra"/>
+                <w:color w:val="000000"/>
+                <w:sz w:val="32"/>
+                <w:szCs w:val="32"/>
+                <w:lang w:val="it-IT"/>
+              </w:rPr>
+              <w:t>¥h C</w:t>
+            </w:r>
+            <w:r>
+              <w:rPr>
+                <w:rFonts w:ascii="BRH Malayalam Extra" w:hAnsi="BRH Malayalam Extra" w:cs="BRH Malayalam Extra"/>
+                <w:color w:val="000000"/>
+                <w:sz w:val="32"/>
+                <w:szCs w:val="32"/>
+                <w:highlight w:val="yellow"/>
+                <w:lang w:val="it-IT"/>
+              </w:rPr>
+              <w:t>Z¡</w:t>
+            </w:r>
+            <w:r>
+              <w:rPr>
+                <w:rFonts w:ascii="BRH Malayalam Extra" w:hAnsi="BRH Malayalam Extra" w:cs="BRH Malayalam Extra"/>
+                <w:color w:val="000000"/>
+                <w:sz w:val="26"/>
+                <w:szCs w:val="32"/>
+                <w:highlight w:val="yellow"/>
+                <w:lang w:val="it-IT"/>
+              </w:rPr>
+              <w:t>–</w:t>
+            </w:r>
+            <w:r>
+              <w:rPr>
+                <w:rFonts w:ascii="BRH Malayalam Extra" w:hAnsi="BRH Malayalam Extra" w:cs="BRH Malayalam Extra"/>
+                <w:color w:val="000000"/>
+                <w:sz w:val="32"/>
+                <w:szCs w:val="32"/>
+                <w:lang w:val="it-IT"/>
+              </w:rPr>
+              <w:t xml:space="preserve">¥h | </w:t>
+            </w:r>
           </w:p>
         </w:tc>
         <w:tc>
@@ -10218,158 +10235,12 @@
               <w:adjustRightInd w:val="0"/>
               <w:spacing w:line="240" w:lineRule="auto"/>
               <w:rPr>
-                <w:rFonts w:ascii="BRH Malayalam Extra" w:hAnsi="BRH Malayalam Extra" w:cs="BRH Malayalam Extra"/>
-                <w:color w:val="000000"/>
-                <w:sz w:val="32"/>
+                <w:rFonts w:cs="BRH Malayalam Extra"/>
+                <w:color w:val="000000"/>
                 <w:szCs w:val="32"/>
                 <w:lang w:val="it-IT"/>
               </w:rPr>
             </w:pPr>
-            <w:r>
-              <w:rPr>
-                <w:rFonts w:cs="BRH Malayalam Extra"/>
-                <w:color w:val="000000"/>
-                <w:szCs w:val="32"/>
-                <w:lang w:val="it-IT"/>
-              </w:rPr>
-              <w:lastRenderedPageBreak/>
-              <w:t>8</w:t>
-            </w:r>
-            <w:r>
-              <w:rPr>
-                <w:rFonts w:ascii="BRH Malayalam Extra" w:hAnsi="BRH Malayalam Extra" w:cs="BRH Malayalam Extra"/>
-                <w:color w:val="000000"/>
-                <w:sz w:val="32"/>
-                <w:szCs w:val="32"/>
-                <w:lang w:val="it-IT"/>
-              </w:rPr>
-              <w:t>)</w:t>
-            </w:r>
-            <w:r>
-              <w:rPr>
-                <w:rFonts w:ascii="BRH Malayalam Extra" w:hAnsi="BRH Malayalam Extra" w:cs="BRH Malayalam Extra"/>
-                <w:color w:val="000000"/>
-                <w:sz w:val="32"/>
-                <w:szCs w:val="32"/>
-                <w:lang w:val="it-IT"/>
-              </w:rPr>
-              <w:tab/>
-            </w:r>
-            <w:r>
-              <w:rPr>
-                <w:rFonts w:cs="BRH Malayalam Extra"/>
-                <w:color w:val="000000"/>
-                <w:szCs w:val="32"/>
-                <w:lang w:val="it-IT"/>
-              </w:rPr>
-              <w:t>4</w:t>
-            </w:r>
-            <w:r>
-              <w:rPr>
-                <w:rFonts w:ascii="BRH Malayalam Extra" w:hAnsi="BRH Malayalam Extra" w:cs="BRH Malayalam Extra"/>
-                <w:color w:val="000000"/>
-                <w:sz w:val="32"/>
-                <w:szCs w:val="32"/>
-                <w:lang w:val="it-IT"/>
-              </w:rPr>
-              <w:t>.</w:t>
-            </w:r>
-            <w:r>
-              <w:rPr>
-                <w:rFonts w:cs="BRH Malayalam Extra"/>
-                <w:color w:val="000000"/>
-                <w:szCs w:val="32"/>
-                <w:lang w:val="it-IT"/>
-              </w:rPr>
-              <w:t>1</w:t>
-            </w:r>
-            <w:r>
-              <w:rPr>
-                <w:rFonts w:ascii="BRH Malayalam Extra" w:hAnsi="BRH Malayalam Extra" w:cs="BRH Malayalam Extra"/>
-                <w:color w:val="000000"/>
-                <w:sz w:val="32"/>
-                <w:szCs w:val="32"/>
-                <w:lang w:val="it-IT"/>
-              </w:rPr>
-              <w:t>.</w:t>
-            </w:r>
-            <w:r>
-              <w:rPr>
-                <w:rFonts w:cs="BRH Malayalam Extra"/>
-                <w:color w:val="000000"/>
-                <w:szCs w:val="32"/>
-                <w:lang w:val="it-IT"/>
-              </w:rPr>
-              <w:t>3</w:t>
-            </w:r>
-            <w:r>
-              <w:rPr>
-                <w:rFonts w:ascii="BRH Malayalam Extra" w:hAnsi="BRH Malayalam Extra" w:cs="BRH Malayalam Extra"/>
-                <w:color w:val="000000"/>
-                <w:sz w:val="32"/>
-                <w:szCs w:val="32"/>
-                <w:lang w:val="it-IT"/>
-              </w:rPr>
-              <w:t>.</w:t>
-            </w:r>
-            <w:r>
-              <w:rPr>
-                <w:rFonts w:cs="BRH Malayalam Extra"/>
-                <w:color w:val="000000"/>
-                <w:szCs w:val="32"/>
-                <w:lang w:val="it-IT"/>
-              </w:rPr>
-              <w:t>2</w:t>
-            </w:r>
-            <w:r>
-              <w:rPr>
-                <w:rFonts w:ascii="BRH Malayalam Extra" w:hAnsi="BRH Malayalam Extra" w:cs="BRH Malayalam Extra"/>
-                <w:color w:val="000000"/>
-                <w:sz w:val="32"/>
-                <w:szCs w:val="32"/>
-                <w:lang w:val="it-IT"/>
-              </w:rPr>
-              <w:t>(</w:t>
-            </w:r>
-            <w:r>
-              <w:rPr>
-                <w:rFonts w:cs="BRH Malayalam Extra"/>
-                <w:color w:val="000000"/>
-                <w:szCs w:val="32"/>
-                <w:lang w:val="it-IT"/>
-              </w:rPr>
-              <w:t>6</w:t>
-            </w:r>
-            <w:r>
-              <w:rPr>
-                <w:rFonts w:ascii="BRH Malayalam Extra" w:hAnsi="BRH Malayalam Extra" w:cs="BRH Malayalam Extra"/>
-                <w:color w:val="000000"/>
-                <w:sz w:val="32"/>
-                <w:szCs w:val="32"/>
-                <w:lang w:val="it-IT"/>
-              </w:rPr>
-              <w:t>)- D</w:t>
-            </w:r>
-            <w:r>
-              <w:rPr>
-                <w:rFonts w:ascii="BRH Malayalam Extra" w:hAnsi="BRH Malayalam Extra" w:cs="BRH Malayalam Extra"/>
-                <w:color w:val="000000"/>
-                <w:sz w:val="26"/>
-                <w:szCs w:val="32"/>
-                <w:lang w:val="it-IT"/>
-              </w:rPr>
-              <w:t>–</w:t>
-            </w:r>
-            <w:r>
-              <w:rPr>
-                <w:rFonts w:ascii="BRH Malayalam Extra" w:hAnsi="BRH Malayalam Extra" w:cs="BRH Malayalam Extra"/>
-                <w:color w:val="000000"/>
-                <w:sz w:val="32"/>
-                <w:szCs w:val="32"/>
-                <w:lang w:val="it-IT"/>
-              </w:rPr>
-              <w:t>¥h ||</w:t>
-            </w:r>
           </w:p>
           <w:p>
             <w:pPr>
@@ -10379,96 +10250,12 @@
               <w:adjustRightInd w:val="0"/>
               <w:spacing w:line="240" w:lineRule="auto"/>
               <w:rPr>
-                <w:rFonts w:ascii="BRH Malayalam Extra" w:hAnsi="BRH Malayalam Extra" w:cs="BRH Malayalam Extra"/>
-                <w:color w:val="000000"/>
-                <w:sz w:val="32"/>
+                <w:rFonts w:cs="BRH Malayalam Extra"/>
+                <w:color w:val="000000"/>
                 <w:szCs w:val="32"/>
                 <w:lang w:val="it-IT"/>
               </w:rPr>
             </w:pPr>
-            <w:r>
-              <w:rPr>
-                <w:rFonts w:ascii="BRH Malayalam Extra" w:hAnsi="BRH Malayalam Extra" w:cs="BRH Malayalam Extra"/>
-                <w:color w:val="000000"/>
-                <w:sz w:val="32"/>
-                <w:szCs w:val="32"/>
-                <w:lang w:val="it-IT"/>
-              </w:rPr>
-              <w:lastRenderedPageBreak/>
-              <w:t>D</w:t>
-            </w:r>
-            <w:r>
-              <w:rPr>
-                <w:rFonts w:ascii="BRH Malayalam Extra" w:hAnsi="BRH Malayalam Extra" w:cs="BRH Malayalam Extra"/>
-                <w:color w:val="000000"/>
-                <w:sz w:val="26"/>
-                <w:szCs w:val="32"/>
-                <w:lang w:val="it-IT"/>
-              </w:rPr>
-              <w:t>–</w:t>
-            </w:r>
-            <w:r>
-              <w:rPr>
-                <w:rFonts w:ascii="BRH Malayalam Extra" w:hAnsi="BRH Malayalam Extra" w:cs="BRH Malayalam Extra"/>
-                <w:color w:val="000000"/>
-                <w:sz w:val="32"/>
-                <w:szCs w:val="32"/>
-                <w:lang w:val="it-IT"/>
-              </w:rPr>
-              <w:t>¥h C</w:t>
-            </w:r>
-            <w:r>
-              <w:rPr>
-                <w:rFonts w:ascii="BRH Malayalam Extra" w:hAnsi="BRH Malayalam Extra" w:cs="BRH Malayalam Extra"/>
-                <w:color w:val="000000"/>
-                <w:sz w:val="32"/>
-                <w:szCs w:val="32"/>
-                <w:lang w:val="it-IT"/>
-              </w:rPr>
-              <w:t>Z</w:t>
-            </w:r>
-            <w:r>
-              <w:rPr>
-                <w:rFonts w:ascii="BRH Malayalam Extra" w:hAnsi="BRH Malayalam Extra" w:cs="BRH Malayalam Extra"/>
-                <w:color w:val="000000"/>
-                <w:sz w:val="32"/>
-                <w:szCs w:val="32"/>
-                <w:highlight w:val="green"/>
-                <w:lang w:val="it-IT"/>
-              </w:rPr>
-              <w:t>õ</w:t>
-            </w:r>
-            <w:r>
-              <w:rPr>
-                <w:rFonts w:ascii="BRH Malayalam Extra" w:hAnsi="BRH Malayalam Extra" w:cs="BRH Malayalam Extra"/>
-                <w:color w:val="000000"/>
-                <w:sz w:val="32"/>
-                <w:szCs w:val="32"/>
-                <w:lang w:val="it-IT"/>
-              </w:rPr>
-              <w:t>¡</w:t>
-            </w:r>
-            <w:r>
-              <w:rPr>
-                <w:rFonts w:ascii="BRH Malayalam Extra" w:hAnsi="BRH Malayalam Extra" w:cs="BRH Malayalam Extra"/>
-                <w:color w:val="000000"/>
-                <w:sz w:val="26"/>
-                <w:szCs w:val="32"/>
-                <w:highlight w:val="yellow"/>
-                <w:lang w:val="it-IT"/>
-              </w:rPr>
-              <w:t>–</w:t>
-            </w:r>
-            <w:r>
-              <w:rPr>
-                <w:rFonts w:ascii="BRH Malayalam Extra" w:hAnsi="BRH Malayalam Extra" w:cs="BRH Malayalam Extra"/>
-                <w:color w:val="000000"/>
-                <w:sz w:val="32"/>
-                <w:szCs w:val="32"/>
-                <w:lang w:val="it-IT"/>
-              </w:rPr>
-              <w:t xml:space="preserve">¥h | </w:t>
-            </w:r>
           </w:p>
           <w:p>
             <w:pPr>
@@ -10476,7 +10263,168 @@
               <w:autoSpaceDE w:val="0"/>
               <w:autoSpaceDN w:val="0"/>
               <w:adjustRightInd w:val="0"/>
-              <w:spacing w:before="0" w:line="240" w:lineRule="auto"/>
+              <w:spacing w:line="240" w:lineRule="auto"/>
+              <w:rPr>
+                <w:rFonts w:ascii="BRH Malayalam Extra" w:hAnsi="BRH Malayalam Extra" w:cs="BRH Malayalam Extra"/>
+                <w:color w:val="000000"/>
+                <w:sz w:val="32"/>
+                <w:szCs w:val="32"/>
+                <w:lang w:val="it-IT"/>
+              </w:rPr>
+            </w:pPr>
+            <w:r>
+              <w:rPr>
+                <w:rFonts w:cs="BRH Malayalam Extra"/>
+                <w:color w:val="000000"/>
+                <w:szCs w:val="32"/>
+                <w:lang w:val="it-IT"/>
+              </w:rPr>
+              <w:lastRenderedPageBreak/>
+              <w:t>8</w:t>
+            </w:r>
+            <w:r>
+              <w:rPr>
+                <w:rFonts w:ascii="BRH Malayalam Extra" w:hAnsi="BRH Malayalam Extra" w:cs="BRH Malayalam Extra"/>
+                <w:color w:val="000000"/>
+                <w:sz w:val="32"/>
+                <w:szCs w:val="32"/>
+                <w:lang w:val="it-IT"/>
+              </w:rPr>
+              <w:t>)</w:t>
+            </w:r>
+            <w:r>
+              <w:rPr>
+                <w:rFonts w:ascii="BRH Malayalam Extra" w:hAnsi="BRH Malayalam Extra" w:cs="BRH Malayalam Extra"/>
+                <w:color w:val="000000"/>
+                <w:sz w:val="32"/>
+                <w:szCs w:val="32"/>
+                <w:lang w:val="it-IT"/>
+              </w:rPr>
+              <w:tab/>
+            </w:r>
+            <w:r>
+              <w:rPr>
+                <w:rFonts w:cs="BRH Malayalam Extra"/>
+                <w:color w:val="000000"/>
+                <w:szCs w:val="32"/>
+                <w:lang w:val="it-IT"/>
+              </w:rPr>
+              <w:t>4</w:t>
+            </w:r>
+            <w:r>
+              <w:rPr>
+                <w:rFonts w:ascii="BRH Malayalam Extra" w:hAnsi="BRH Malayalam Extra" w:cs="BRH Malayalam Extra"/>
+                <w:color w:val="000000"/>
+                <w:sz w:val="32"/>
+                <w:szCs w:val="32"/>
+                <w:lang w:val="it-IT"/>
+              </w:rPr>
+              <w:t>.</w:t>
+            </w:r>
+            <w:r>
+              <w:rPr>
+                <w:rFonts w:cs="BRH Malayalam Extra"/>
+                <w:color w:val="000000"/>
+                <w:szCs w:val="32"/>
+                <w:lang w:val="it-IT"/>
+              </w:rPr>
+              <w:t>1</w:t>
+            </w:r>
+            <w:r>
+              <w:rPr>
+                <w:rFonts w:ascii="BRH Malayalam Extra" w:hAnsi="BRH Malayalam Extra" w:cs="BRH Malayalam Extra"/>
+                <w:color w:val="000000"/>
+                <w:sz w:val="32"/>
+                <w:szCs w:val="32"/>
+                <w:lang w:val="it-IT"/>
+              </w:rPr>
+              <w:t>.</w:t>
+            </w:r>
+            <w:r>
+              <w:rPr>
+                <w:rFonts w:cs="BRH Malayalam Extra"/>
+                <w:color w:val="000000"/>
+                <w:szCs w:val="32"/>
+                <w:lang w:val="it-IT"/>
+              </w:rPr>
+              <w:t>3</w:t>
+            </w:r>
+            <w:r>
+              <w:rPr>
+                <w:rFonts w:ascii="BRH Malayalam Extra" w:hAnsi="BRH Malayalam Extra" w:cs="BRH Malayalam Extra"/>
+                <w:color w:val="000000"/>
+                <w:sz w:val="32"/>
+                <w:szCs w:val="32"/>
+                <w:lang w:val="it-IT"/>
+              </w:rPr>
+              <w:t>.</w:t>
+            </w:r>
+            <w:r>
+              <w:rPr>
+                <w:rFonts w:cs="BRH Malayalam Extra"/>
+                <w:color w:val="000000"/>
+                <w:szCs w:val="32"/>
+                <w:lang w:val="it-IT"/>
+              </w:rPr>
+              <w:t>2</w:t>
+            </w:r>
+            <w:r>
+              <w:rPr>
+                <w:rFonts w:ascii="BRH Malayalam Extra" w:hAnsi="BRH Malayalam Extra" w:cs="BRH Malayalam Extra"/>
+                <w:color w:val="000000"/>
+                <w:sz w:val="32"/>
+                <w:szCs w:val="32"/>
+                <w:lang w:val="it-IT"/>
+              </w:rPr>
+              <w:t>(</w:t>
+            </w:r>
+            <w:r>
+              <w:rPr>
+                <w:rFonts w:cs="BRH Malayalam Extra"/>
+                <w:color w:val="000000"/>
+                <w:szCs w:val="32"/>
+                <w:lang w:val="it-IT"/>
+              </w:rPr>
+              <w:t>6</w:t>
+            </w:r>
+            <w:r>
+              <w:rPr>
+                <w:rFonts w:ascii="BRH Malayalam Extra" w:hAnsi="BRH Malayalam Extra" w:cs="BRH Malayalam Extra"/>
+                <w:color w:val="000000"/>
+                <w:sz w:val="32"/>
+                <w:szCs w:val="32"/>
+                <w:lang w:val="it-IT"/>
+              </w:rPr>
+              <w:t>)- D</w:t>
+            </w:r>
+            <w:r>
+              <w:rPr>
+                <w:rFonts w:ascii="BRH Malayalam Extra" w:hAnsi="BRH Malayalam Extra" w:cs="BRH Malayalam Extra"/>
+                <w:color w:val="000000"/>
+                <w:sz w:val="26"/>
+                <w:szCs w:val="32"/>
+                <w:lang w:val="it-IT"/>
+              </w:rPr>
+              <w:t>–</w:t>
+            </w:r>
+            <w:r>
+              <w:rPr>
+                <w:rFonts w:ascii="BRH Malayalam Extra" w:hAnsi="BRH Malayalam Extra" w:cs="BRH Malayalam Extra"/>
+                <w:color w:val="000000"/>
+                <w:sz w:val="32"/>
+                <w:szCs w:val="32"/>
+                <w:lang w:val="it-IT"/>
+              </w:rPr>
+              <w:t>¥h ||</w:t>
+            </w:r>
+          </w:p>
+          <w:p>
+            <w:pPr>
+              <w:widowControl w:val="0"/>
+              <w:autoSpaceDE w:val="0"/>
+              <w:autoSpaceDN w:val="0"/>
+              <w:adjustRightInd w:val="0"/>
+              <w:spacing w:line="240" w:lineRule="auto"/>
               <w:rPr>
                 <w:rFonts w:cs="BRH Malayalam Extra"/>
                 <w:color w:val="FF0000"/>
@@ -10484,6 +10432,88 @@
                 <w:lang w:val="en-IN"/>
               </w:rPr>
             </w:pPr>
+            <w:r>
+              <w:rPr>
+                <w:rFonts w:ascii="BRH Malayalam Extra" w:hAnsi="BRH Malayalam Extra" w:cs="BRH Malayalam Extra"/>
+                <w:color w:val="000000"/>
+                <w:sz w:val="32"/>
+                <w:szCs w:val="32"/>
+                <w:lang w:val="it-IT"/>
+              </w:rPr>
+              <w:t>D</w:t>
+            </w:r>
+            <w:r>
+              <w:rPr>
+                <w:rFonts w:ascii="BRH Malayalam Extra" w:hAnsi="BRH Malayalam Extra" w:cs="BRH Malayalam Extra"/>
+                <w:color w:val="000000"/>
+                <w:sz w:val="26"/>
+                <w:szCs w:val="32"/>
+                <w:lang w:val="it-IT"/>
+              </w:rPr>
+              <w:t>–</w:t>
+            </w:r>
+            <w:r>
+              <w:rPr>
+                <w:rFonts w:ascii="BRH Malayalam Extra" w:hAnsi="BRH Malayalam Extra" w:cs="BRH Malayalam Extra"/>
+                <w:color w:val="000000"/>
+                <w:sz w:val="32"/>
+                <w:szCs w:val="32"/>
+                <w:lang w:val="it-IT"/>
+              </w:rPr>
+              <w:t>¥h C</w:t>
+            </w:r>
+            <w:r>
+              <w:rPr>
+                <w:rFonts w:ascii="BRH Malayalam Extra" w:hAnsi="BRH Malayalam Extra" w:cs="BRH Malayalam Extra"/>
+                <w:color w:val="000000"/>
+                <w:sz w:val="32"/>
+                <w:szCs w:val="32"/>
+                <w:lang w:val="it-IT"/>
+              </w:rPr>
+              <w:t>Z</w:t>
+            </w:r>
+            <w:r>
+              <w:rPr>
+                <w:rFonts w:ascii="BRH Malayalam Extra" w:hAnsi="BRH Malayalam Extra" w:cs="BRH Malayalam Extra"/>
+                <w:color w:val="000000"/>
+                <w:sz w:val="32"/>
+                <w:szCs w:val="32"/>
+                <w:highlight w:val="green"/>
+                <w:lang w:val="it-IT"/>
+              </w:rPr>
+              <w:t>õ</w:t>
+            </w:r>
+            <w:r>
+              <w:rPr>
+                <w:rFonts w:ascii="BRH Malayalam Extra" w:hAnsi="BRH Malayalam Extra" w:cs="BRH Malayalam Extra"/>
+                <w:color w:val="000000"/>
+                <w:sz w:val="32"/>
+                <w:szCs w:val="32"/>
+                <w:lang w:val="it-IT"/>
+              </w:rPr>
+              <w:t>¡</w:t>
+            </w:r>
+            <w:r>
+              <w:rPr>
+                <w:rFonts w:ascii="BRH Malayalam Extra" w:hAnsi="BRH Malayalam Extra" w:cs="BRH Malayalam Extra"/>
+                <w:color w:val="000000"/>
+                <w:sz w:val="26"/>
+                <w:szCs w:val="32"/>
+                <w:highlight w:val="yellow"/>
+                <w:lang w:val="it-IT"/>
+              </w:rPr>
+              <w:t>–</w:t>
+            </w:r>
+            <w:r>
+              <w:rPr>
+                <w:rFonts w:ascii="BRH Malayalam Extra" w:hAnsi="BRH Malayalam Extra" w:cs="BRH Malayalam Extra"/>
+                <w:color w:val="000000"/>
+                <w:sz w:val="32"/>
+                <w:szCs w:val="32"/>
+                <w:lang w:val="it-IT"/>
+              </w:rPr>
+              <w:t xml:space="preserve">¥h | </w:t>
+            </w:r>
           </w:p>
         </w:tc>
       </w:tr>
@@ -17404,177 +17434,12 @@
               <w:adjustRightInd w:val="0"/>
               <w:spacing w:before="0" w:line="240" w:lineRule="auto"/>
               <w:rPr>
-                <w:rFonts w:ascii="BRH Malayalam Extra" w:hAnsi="BRH Malayalam Extra" w:cs="BRH Malayalam Extra"/>
-                <w:color w:val="000000"/>
-                <w:sz w:val="32"/>
+                <w:rFonts w:cs="BRH Malayalam Extra"/>
+                <w:color w:val="000000"/>
                 <w:szCs w:val="32"/>
                 <w:lang w:val="it-IT"/>
               </w:rPr>
             </w:pPr>
-            <w:r>
-              <w:rPr>
-                <w:rFonts w:cs="BRH Malayalam Extra"/>
-                <w:color w:val="000000"/>
-                <w:szCs w:val="32"/>
-                <w:lang w:val="it-IT"/>
-              </w:rPr>
-              <w:t>44</w:t>
-            </w:r>
-            <w:r>
-              <w:rPr>
-                <w:rFonts w:ascii="BRH Malayalam Extra" w:hAnsi="BRH Malayalam Extra" w:cs="BRH Malayalam Extra"/>
-                <w:color w:val="000000"/>
-                <w:sz w:val="32"/>
-                <w:szCs w:val="32"/>
-                <w:lang w:val="it-IT"/>
-              </w:rPr>
-              <w:t>)</w:t>
-            </w:r>
-            <w:r>
-              <w:rPr>
-                <w:rFonts w:ascii="BRH Malayalam Extra" w:hAnsi="BRH Malayalam Extra" w:cs="BRH Malayalam Extra"/>
-                <w:color w:val="000000"/>
-                <w:sz w:val="32"/>
-                <w:szCs w:val="32"/>
-                <w:lang w:val="it-IT"/>
-              </w:rPr>
-              <w:tab/>
-            </w:r>
-            <w:r>
-              <w:rPr>
-                <w:rFonts w:cs="BRH Malayalam Extra"/>
-                <w:color w:val="000000"/>
-                <w:szCs w:val="32"/>
-                <w:lang w:val="it-IT"/>
-              </w:rPr>
-              <w:t>4</w:t>
-            </w:r>
-            <w:r>
-              <w:rPr>
-                <w:rFonts w:ascii="BRH Malayalam Extra" w:hAnsi="BRH Malayalam Extra" w:cs="BRH Malayalam Extra"/>
-                <w:color w:val="000000"/>
-                <w:sz w:val="32"/>
-                <w:szCs w:val="32"/>
-                <w:lang w:val="it-IT"/>
-              </w:rPr>
-              <w:t>.</w:t>
-            </w:r>
-            <w:r>
-              <w:rPr>
-                <w:rFonts w:cs="BRH Malayalam Extra"/>
-                <w:color w:val="000000"/>
-                <w:szCs w:val="32"/>
-                <w:lang w:val="it-IT"/>
-              </w:rPr>
-              <w:t>1</w:t>
-            </w:r>
-            <w:r>
-              <w:rPr>
-                <w:rFonts w:ascii="BRH Malayalam Extra" w:hAnsi="BRH Malayalam Extra" w:cs="BRH Malayalam Extra"/>
-                <w:color w:val="000000"/>
-                <w:sz w:val="32"/>
-                <w:szCs w:val="32"/>
-                <w:lang w:val="it-IT"/>
-              </w:rPr>
-              <w:t>.</w:t>
-            </w:r>
-            <w:r>
-              <w:rPr>
-                <w:rFonts w:cs="BRH Malayalam Extra"/>
-                <w:color w:val="000000"/>
-                <w:szCs w:val="32"/>
-                <w:lang w:val="it-IT"/>
-              </w:rPr>
-              <w:t>6</w:t>
-            </w:r>
-            <w:r>
-              <w:rPr>
-                <w:rFonts w:ascii="BRH Malayalam Extra" w:hAnsi="BRH Malayalam Extra" w:cs="BRH Malayalam Extra"/>
-                <w:color w:val="000000"/>
-                <w:sz w:val="32"/>
-                <w:szCs w:val="32"/>
-                <w:lang w:val="it-IT"/>
-              </w:rPr>
-              <w:t>.</w:t>
-            </w:r>
-            <w:r>
-              <w:rPr>
-                <w:rFonts w:cs="BRH Malayalam Extra"/>
-                <w:color w:val="000000"/>
-                <w:szCs w:val="32"/>
-                <w:lang w:val="it-IT"/>
-              </w:rPr>
-              <w:t>2</w:t>
-            </w:r>
-            <w:r>
-              <w:rPr>
-                <w:rFonts w:ascii="BRH Malayalam Extra" w:hAnsi="BRH Malayalam Extra" w:cs="BRH Malayalam Extra"/>
-                <w:color w:val="000000"/>
-                <w:sz w:val="32"/>
-                <w:szCs w:val="32"/>
-                <w:lang w:val="it-IT"/>
-              </w:rPr>
-              <w:t>(</w:t>
-            </w:r>
-            <w:r>
-              <w:rPr>
-                <w:rFonts w:cs="BRH Malayalam Extra"/>
-                <w:color w:val="000000"/>
-                <w:szCs w:val="32"/>
-                <w:lang w:val="it-IT"/>
-              </w:rPr>
-              <w:t>36</w:t>
-            </w:r>
-            <w:r>
-              <w:rPr>
-                <w:rFonts w:ascii="BRH Malayalam Extra" w:hAnsi="BRH Malayalam Extra" w:cs="BRH Malayalam Extra"/>
-                <w:color w:val="000000"/>
-                <w:sz w:val="32"/>
-                <w:szCs w:val="32"/>
-                <w:lang w:val="it-IT"/>
-              </w:rPr>
-              <w:t>)- D</w:t>
-            </w:r>
-            <w:r>
-              <w:rPr>
-                <w:rFonts w:ascii="BRH Malayalam Extra" w:hAnsi="BRH Malayalam Extra" w:cs="BRH Malayalam Extra"/>
-                <w:color w:val="000000"/>
-                <w:sz w:val="26"/>
-                <w:szCs w:val="32"/>
-                <w:lang w:val="it-IT"/>
-              </w:rPr>
-              <w:t>–</w:t>
-            </w:r>
-            <w:r>
-              <w:rPr>
-                <w:rFonts w:ascii="BRH Malayalam Extra" w:hAnsi="BRH Malayalam Extra" w:cs="BRH Malayalam Extra"/>
-                <w:color w:val="000000"/>
-                <w:sz w:val="32"/>
-                <w:szCs w:val="32"/>
-                <w:lang w:val="it-IT"/>
-              </w:rPr>
-              <w:t>¥L</w:t>
-            </w:r>
-            <w:r>
-              <w:rPr>
-                <w:rFonts w:ascii="BRH Malayalam Extra" w:hAnsi="BRH Malayalam Extra" w:cs="BRH Malayalam Extra"/>
-                <w:color w:val="000000"/>
-                <w:sz w:val="26"/>
-                <w:szCs w:val="32"/>
-                <w:lang w:val="it-IT"/>
-              </w:rPr>
-              <w:t>–</w:t>
-            </w:r>
-            <w:r>
-              <w:rPr>
-                <w:rFonts w:ascii="BRH Malayalam Extra" w:hAnsi="BRH Malayalam Extra" w:cs="BRH Malayalam Extra"/>
-                <w:color w:val="000000"/>
-                <w:sz w:val="32"/>
-                <w:szCs w:val="32"/>
-                <w:lang w:val="it-IT"/>
-              </w:rPr>
-              <w:t xml:space="preserve"> ||</w:t>
-            </w:r>
           </w:p>
           <w:p>
             <w:pPr>
@@ -17585,6 +17450,202 @@
               <w:spacing w:before="0" w:line="240" w:lineRule="auto"/>
               <w:rPr>
                 <w:rFonts w:cs="BRH Malayalam Extra"/>
+                <w:color w:val="000000"/>
+                <w:szCs w:val="32"/>
+                <w:lang w:val="it-IT"/>
+              </w:rPr>
+            </w:pPr>
+          </w:p>
+          <w:p>
+            <w:pPr>
+              <w:widowControl w:val="0"/>
+              <w:autoSpaceDE w:val="0"/>
+              <w:autoSpaceDN w:val="0"/>
+              <w:adjustRightInd w:val="0"/>
+              <w:spacing w:before="0" w:line="240" w:lineRule="auto"/>
+              <w:rPr>
+                <w:rFonts w:ascii="BRH Malayalam Extra" w:hAnsi="BRH Malayalam Extra" w:cs="BRH Malayalam Extra"/>
+                <w:color w:val="000000"/>
+                <w:sz w:val="32"/>
+                <w:szCs w:val="32"/>
+                <w:lang w:val="it-IT"/>
+              </w:rPr>
+            </w:pPr>
+            <w:r>
+              <w:rPr>
+                <w:rFonts w:cs="BRH Malayalam Extra"/>
+                <w:color w:val="000000"/>
+                <w:szCs w:val="32"/>
+                <w:lang w:val="it-IT"/>
+              </w:rPr>
+              <w:lastRenderedPageBreak/>
+              <w:t>44</w:t>
+            </w:r>
+            <w:r>
+              <w:rPr>
+                <w:rFonts w:ascii="BRH Malayalam Extra" w:hAnsi="BRH Malayalam Extra" w:cs="BRH Malayalam Extra"/>
+                <w:color w:val="000000"/>
+                <w:sz w:val="32"/>
+                <w:szCs w:val="32"/>
+                <w:lang w:val="it-IT"/>
+              </w:rPr>
+              <w:t>)</w:t>
+            </w:r>
+            <w:r>
+              <w:rPr>
+                <w:rFonts w:ascii="BRH Malayalam Extra" w:hAnsi="BRH Malayalam Extra" w:cs="BRH Malayalam Extra"/>
+                <w:color w:val="000000"/>
+                <w:sz w:val="32"/>
+                <w:szCs w:val="32"/>
+                <w:lang w:val="it-IT"/>
+              </w:rPr>
+              <w:tab/>
+            </w:r>
+            <w:r>
+              <w:rPr>
+                <w:rFonts w:cs="BRH Malayalam Extra"/>
+                <w:color w:val="000000"/>
+                <w:szCs w:val="32"/>
+                <w:lang w:val="it-IT"/>
+              </w:rPr>
+              <w:t>4</w:t>
+            </w:r>
+            <w:r>
+              <w:rPr>
+                <w:rFonts w:ascii="BRH Malayalam Extra" w:hAnsi="BRH Malayalam Extra" w:cs="BRH Malayalam Extra"/>
+                <w:color w:val="000000"/>
+                <w:sz w:val="32"/>
+                <w:szCs w:val="32"/>
+                <w:lang w:val="it-IT"/>
+              </w:rPr>
+              <w:t>.</w:t>
+            </w:r>
+            <w:r>
+              <w:rPr>
+                <w:rFonts w:cs="BRH Malayalam Extra"/>
+                <w:color w:val="000000"/>
+                <w:szCs w:val="32"/>
+                <w:lang w:val="it-IT"/>
+              </w:rPr>
+              <w:t>1</w:t>
+            </w:r>
+            <w:r>
+              <w:rPr>
+                <w:rFonts w:ascii="BRH Malayalam Extra" w:hAnsi="BRH Malayalam Extra" w:cs="BRH Malayalam Extra"/>
+                <w:color w:val="000000"/>
+                <w:sz w:val="32"/>
+                <w:szCs w:val="32"/>
+                <w:lang w:val="it-IT"/>
+              </w:rPr>
+              <w:t>.</w:t>
+            </w:r>
+            <w:r>
+              <w:rPr>
+                <w:rFonts w:cs="BRH Malayalam Extra"/>
+                <w:color w:val="000000"/>
+                <w:szCs w:val="32"/>
+                <w:lang w:val="it-IT"/>
+              </w:rPr>
+              <w:t>6</w:t>
+            </w:r>
+            <w:r>
+              <w:rPr>
+                <w:rFonts w:ascii="BRH Malayalam Extra" w:hAnsi="BRH Malayalam Extra" w:cs="BRH Malayalam Extra"/>
+                <w:color w:val="000000"/>
+                <w:sz w:val="32"/>
+                <w:szCs w:val="32"/>
+                <w:lang w:val="it-IT"/>
+              </w:rPr>
+              <w:t>.</w:t>
+            </w:r>
+            <w:r>
+              <w:rPr>
+                <w:rFonts w:cs="BRH Malayalam Extra"/>
+                <w:color w:val="000000"/>
+                <w:szCs w:val="32"/>
+                <w:lang w:val="it-IT"/>
+              </w:rPr>
+              <w:t>2</w:t>
+            </w:r>
+            <w:r>
+              <w:rPr>
+                <w:rFonts w:ascii="BRH Malayalam Extra" w:hAnsi="BRH Malayalam Extra" w:cs="BRH Malayalam Extra"/>
+                <w:color w:val="000000"/>
+                <w:sz w:val="32"/>
+                <w:szCs w:val="32"/>
+                <w:lang w:val="it-IT"/>
+              </w:rPr>
+              <w:t>(</w:t>
+            </w:r>
+            <w:r>
+              <w:rPr>
+                <w:rFonts w:cs="BRH Malayalam Extra"/>
+                <w:color w:val="000000"/>
+                <w:szCs w:val="32"/>
+                <w:lang w:val="it-IT"/>
+              </w:rPr>
+              <w:t>36</w:t>
+            </w:r>
+            <w:r>
+              <w:rPr>
+                <w:rFonts w:ascii="BRH Malayalam Extra" w:hAnsi="BRH Malayalam Extra" w:cs="BRH Malayalam Extra"/>
+                <w:color w:val="000000"/>
+                <w:sz w:val="32"/>
+                <w:szCs w:val="32"/>
+                <w:lang w:val="it-IT"/>
+              </w:rPr>
+              <w:t>)- D</w:t>
+            </w:r>
+            <w:r>
+              <w:rPr>
+                <w:rFonts w:ascii="BRH Malayalam Extra" w:hAnsi="BRH Malayalam Extra" w:cs="BRH Malayalam Extra"/>
+                <w:color w:val="000000"/>
+                <w:sz w:val="26"/>
+                <w:szCs w:val="32"/>
+                <w:lang w:val="it-IT"/>
+              </w:rPr>
+              <w:t>–</w:t>
+            </w:r>
+            <w:r>
+              <w:rPr>
+                <w:rFonts w:ascii="BRH Malayalam Extra" w:hAnsi="BRH Malayalam Extra" w:cs="BRH Malayalam Extra"/>
+                <w:color w:val="000000"/>
+                <w:sz w:val="32"/>
+                <w:szCs w:val="32"/>
+                <w:lang w:val="it-IT"/>
+              </w:rPr>
+              <w:t>¥L</w:t>
+            </w:r>
+            <w:r>
+              <w:rPr>
+                <w:rFonts w:ascii="BRH Malayalam Extra" w:hAnsi="BRH Malayalam Extra" w:cs="BRH Malayalam Extra"/>
+                <w:color w:val="000000"/>
+                <w:sz w:val="26"/>
+                <w:szCs w:val="32"/>
+                <w:lang w:val="it-IT"/>
+              </w:rPr>
+              <w:t>–</w:t>
+            </w:r>
+            <w:r>
+              <w:rPr>
+                <w:rFonts w:ascii="BRH Malayalam Extra" w:hAnsi="BRH Malayalam Extra" w:cs="BRH Malayalam Extra"/>
+                <w:color w:val="000000"/>
+                <w:sz w:val="32"/>
+                <w:szCs w:val="32"/>
+                <w:lang w:val="it-IT"/>
+              </w:rPr>
+              <w:t xml:space="preserve"> ||</w:t>
+            </w:r>
+          </w:p>
+          <w:p>
+            <w:pPr>
+              <w:widowControl w:val="0"/>
+              <w:autoSpaceDE w:val="0"/>
+              <w:autoSpaceDN w:val="0"/>
+              <w:adjustRightInd w:val="0"/>
+              <w:spacing w:before="0" w:line="240" w:lineRule="auto"/>
+              <w:rPr>
+                <w:rFonts w:cs="BRH Malayalam Extra"/>
                 <w:color w:val="FF0000"/>
                 <w:szCs w:val="40"/>
                 <w:lang w:val="en-IN"/>
@@ -17598,7 +17659,6 @@
                 <w:szCs w:val="32"/>
                 <w:lang w:val="it-IT"/>
               </w:rPr>
-              <w:lastRenderedPageBreak/>
               <w:t>D</w:t>
             </w:r>
             <w:r>
@@ -17663,178 +17723,12 @@
               <w:adjustRightInd w:val="0"/>
               <w:spacing w:before="0" w:line="240" w:lineRule="auto"/>
               <w:rPr>
-                <w:rFonts w:ascii="BRH Malayalam Extra" w:hAnsi="BRH Malayalam Extra" w:cs="BRH Malayalam Extra"/>
-                <w:color w:val="000000"/>
-                <w:sz w:val="32"/>
+                <w:rFonts w:cs="BRH Malayalam Extra"/>
+                <w:color w:val="000000"/>
                 <w:szCs w:val="32"/>
                 <w:lang w:val="it-IT"/>
               </w:rPr>
             </w:pPr>
-            <w:r>
-              <w:rPr>
-                <w:rFonts w:cs="BRH Malayalam Extra"/>
-                <w:color w:val="000000"/>
-                <w:szCs w:val="32"/>
-                <w:lang w:val="it-IT"/>
-              </w:rPr>
-              <w:lastRenderedPageBreak/>
-              <w:t>44</w:t>
-            </w:r>
-            <w:r>
-              <w:rPr>
-                <w:rFonts w:ascii="BRH Malayalam Extra" w:hAnsi="BRH Malayalam Extra" w:cs="BRH Malayalam Extra"/>
-                <w:color w:val="000000"/>
-                <w:sz w:val="32"/>
-                <w:szCs w:val="32"/>
-                <w:lang w:val="it-IT"/>
-              </w:rPr>
-              <w:t>)</w:t>
-            </w:r>
-            <w:r>
-              <w:rPr>
-                <w:rFonts w:ascii="BRH Malayalam Extra" w:hAnsi="BRH Malayalam Extra" w:cs="BRH Malayalam Extra"/>
-                <w:color w:val="000000"/>
-                <w:sz w:val="32"/>
-                <w:szCs w:val="32"/>
-                <w:lang w:val="it-IT"/>
-              </w:rPr>
-              <w:tab/>
-            </w:r>
-            <w:r>
-              <w:rPr>
-                <w:rFonts w:cs="BRH Malayalam Extra"/>
-                <w:color w:val="000000"/>
-                <w:szCs w:val="32"/>
-                <w:lang w:val="it-IT"/>
-              </w:rPr>
-              <w:t>4</w:t>
-            </w:r>
-            <w:r>
-              <w:rPr>
-                <w:rFonts w:ascii="BRH Malayalam Extra" w:hAnsi="BRH Malayalam Extra" w:cs="BRH Malayalam Extra"/>
-                <w:color w:val="000000"/>
-                <w:sz w:val="32"/>
-                <w:szCs w:val="32"/>
-                <w:lang w:val="it-IT"/>
-              </w:rPr>
-              <w:t>.</w:t>
-            </w:r>
-            <w:r>
-              <w:rPr>
-                <w:rFonts w:cs="BRH Malayalam Extra"/>
-                <w:color w:val="000000"/>
-                <w:szCs w:val="32"/>
-                <w:lang w:val="it-IT"/>
-              </w:rPr>
-              <w:t>1</w:t>
-            </w:r>
-            <w:r>
-              <w:rPr>
-                <w:rFonts w:ascii="BRH Malayalam Extra" w:hAnsi="BRH Malayalam Extra" w:cs="BRH Malayalam Extra"/>
-                <w:color w:val="000000"/>
-                <w:sz w:val="32"/>
-                <w:szCs w:val="32"/>
-                <w:lang w:val="it-IT"/>
-              </w:rPr>
-              <w:t>.</w:t>
-            </w:r>
-            <w:r>
-              <w:rPr>
-                <w:rFonts w:cs="BRH Malayalam Extra"/>
-                <w:color w:val="000000"/>
-                <w:szCs w:val="32"/>
-                <w:lang w:val="it-IT"/>
-              </w:rPr>
-              <w:t>6</w:t>
-            </w:r>
-            <w:r>
-              <w:rPr>
-                <w:rFonts w:ascii="BRH Malayalam Extra" w:hAnsi="BRH Malayalam Extra" w:cs="BRH Malayalam Extra"/>
-                <w:color w:val="000000"/>
-                <w:sz w:val="32"/>
-                <w:szCs w:val="32"/>
-                <w:lang w:val="it-IT"/>
-              </w:rPr>
-              <w:t>.</w:t>
-            </w:r>
-            <w:r>
-              <w:rPr>
-                <w:rFonts w:cs="BRH Malayalam Extra"/>
-                <w:color w:val="000000"/>
-                <w:szCs w:val="32"/>
-                <w:lang w:val="it-IT"/>
-              </w:rPr>
-              <w:t>2</w:t>
-            </w:r>
-            <w:r>
-              <w:rPr>
-                <w:rFonts w:ascii="BRH Malayalam Extra" w:hAnsi="BRH Malayalam Extra" w:cs="BRH Malayalam Extra"/>
-                <w:color w:val="000000"/>
-                <w:sz w:val="32"/>
-                <w:szCs w:val="32"/>
-                <w:lang w:val="it-IT"/>
-              </w:rPr>
-              <w:t>(</w:t>
-            </w:r>
-            <w:r>
-              <w:rPr>
-                <w:rFonts w:cs="BRH Malayalam Extra"/>
-                <w:color w:val="000000"/>
-                <w:szCs w:val="32"/>
-                <w:lang w:val="it-IT"/>
-              </w:rPr>
-              <w:t>36</w:t>
-            </w:r>
-            <w:r>
-              <w:rPr>
-                <w:rFonts w:ascii="BRH Malayalam Extra" w:hAnsi="BRH Malayalam Extra" w:cs="BRH Malayalam Extra"/>
-                <w:color w:val="000000"/>
-                <w:sz w:val="32"/>
-                <w:szCs w:val="32"/>
-                <w:lang w:val="it-IT"/>
-              </w:rPr>
-              <w:t>)- D</w:t>
-            </w:r>
-            <w:r>
-              <w:rPr>
-                <w:rFonts w:ascii="BRH Malayalam Extra" w:hAnsi="BRH Malayalam Extra" w:cs="BRH Malayalam Extra"/>
-                <w:color w:val="000000"/>
-                <w:sz w:val="26"/>
-                <w:szCs w:val="32"/>
-                <w:lang w:val="it-IT"/>
-              </w:rPr>
-              <w:t>–</w:t>
-            </w:r>
-            <w:r>
-              <w:rPr>
-                <w:rFonts w:ascii="BRH Malayalam Extra" w:hAnsi="BRH Malayalam Extra" w:cs="BRH Malayalam Extra"/>
-                <w:color w:val="000000"/>
-                <w:sz w:val="32"/>
-                <w:szCs w:val="32"/>
-                <w:lang w:val="it-IT"/>
-              </w:rPr>
-              <w:t>¥L</w:t>
-            </w:r>
-            <w:r>
-              <w:rPr>
-                <w:rFonts w:ascii="BRH Malayalam Extra" w:hAnsi="BRH Malayalam Extra" w:cs="BRH Malayalam Extra"/>
-                <w:color w:val="000000"/>
-                <w:sz w:val="26"/>
-                <w:szCs w:val="32"/>
-                <w:lang w:val="it-IT"/>
-              </w:rPr>
-              <w:t>–</w:t>
-            </w:r>
-            <w:r>
-              <w:rPr>
-                <w:rFonts w:ascii="BRH Malayalam Extra" w:hAnsi="BRH Malayalam Extra" w:cs="BRH Malayalam Extra"/>
-                <w:color w:val="000000"/>
-                <w:sz w:val="32"/>
-                <w:szCs w:val="32"/>
-                <w:lang w:val="it-IT"/>
-              </w:rPr>
-              <w:t xml:space="preserve"> ||</w:t>
-            </w:r>
           </w:p>
           <w:p>
             <w:pPr>
@@ -17845,6 +17739,202 @@
               <w:spacing w:before="0" w:line="240" w:lineRule="auto"/>
               <w:rPr>
                 <w:rFonts w:cs="BRH Malayalam Extra"/>
+                <w:color w:val="000000"/>
+                <w:szCs w:val="32"/>
+                <w:lang w:val="it-IT"/>
+              </w:rPr>
+            </w:pPr>
+          </w:p>
+          <w:p>
+            <w:pPr>
+              <w:widowControl w:val="0"/>
+              <w:autoSpaceDE w:val="0"/>
+              <w:autoSpaceDN w:val="0"/>
+              <w:adjustRightInd w:val="0"/>
+              <w:spacing w:before="0" w:line="240" w:lineRule="auto"/>
+              <w:rPr>
+                <w:rFonts w:ascii="BRH Malayalam Extra" w:hAnsi="BRH Malayalam Extra" w:cs="BRH Malayalam Extra"/>
+                <w:color w:val="000000"/>
+                <w:sz w:val="32"/>
+                <w:szCs w:val="32"/>
+                <w:lang w:val="it-IT"/>
+              </w:rPr>
+            </w:pPr>
+            <w:r>
+              <w:rPr>
+                <w:rFonts w:cs="BRH Malayalam Extra"/>
+                <w:color w:val="000000"/>
+                <w:szCs w:val="32"/>
+                <w:lang w:val="it-IT"/>
+              </w:rPr>
+              <w:lastRenderedPageBreak/>
+              <w:t>44</w:t>
+            </w:r>
+            <w:r>
+              <w:rPr>
+                <w:rFonts w:ascii="BRH Malayalam Extra" w:hAnsi="BRH Malayalam Extra" w:cs="BRH Malayalam Extra"/>
+                <w:color w:val="000000"/>
+                <w:sz w:val="32"/>
+                <w:szCs w:val="32"/>
+                <w:lang w:val="it-IT"/>
+              </w:rPr>
+              <w:t>)</w:t>
+            </w:r>
+            <w:r>
+              <w:rPr>
+                <w:rFonts w:ascii="BRH Malayalam Extra" w:hAnsi="BRH Malayalam Extra" w:cs="BRH Malayalam Extra"/>
+                <w:color w:val="000000"/>
+                <w:sz w:val="32"/>
+                <w:szCs w:val="32"/>
+                <w:lang w:val="it-IT"/>
+              </w:rPr>
+              <w:tab/>
+            </w:r>
+            <w:r>
+              <w:rPr>
+                <w:rFonts w:cs="BRH Malayalam Extra"/>
+                <w:color w:val="000000"/>
+                <w:szCs w:val="32"/>
+                <w:lang w:val="it-IT"/>
+              </w:rPr>
+              <w:t>4</w:t>
+            </w:r>
+            <w:r>
+              <w:rPr>
+                <w:rFonts w:ascii="BRH Malayalam Extra" w:hAnsi="BRH Malayalam Extra" w:cs="BRH Malayalam Extra"/>
+                <w:color w:val="000000"/>
+                <w:sz w:val="32"/>
+                <w:szCs w:val="32"/>
+                <w:lang w:val="it-IT"/>
+              </w:rPr>
+              <w:t>.</w:t>
+            </w:r>
+            <w:r>
+              <w:rPr>
+                <w:rFonts w:cs="BRH Malayalam Extra"/>
+                <w:color w:val="000000"/>
+                <w:szCs w:val="32"/>
+                <w:lang w:val="it-IT"/>
+              </w:rPr>
+              <w:t>1</w:t>
+            </w:r>
+            <w:r>
+              <w:rPr>
+                <w:rFonts w:ascii="BRH Malayalam Extra" w:hAnsi="BRH Malayalam Extra" w:cs="BRH Malayalam Extra"/>
+                <w:color w:val="000000"/>
+                <w:sz w:val="32"/>
+                <w:szCs w:val="32"/>
+                <w:lang w:val="it-IT"/>
+              </w:rPr>
+              <w:t>.</w:t>
+            </w:r>
+            <w:r>
+              <w:rPr>
+                <w:rFonts w:cs="BRH Malayalam Extra"/>
+                <w:color w:val="000000"/>
+                <w:szCs w:val="32"/>
+                <w:lang w:val="it-IT"/>
+              </w:rPr>
+              <w:t>6</w:t>
+            </w:r>
+            <w:r>
+              <w:rPr>
+                <w:rFonts w:ascii="BRH Malayalam Extra" w:hAnsi="BRH Malayalam Extra" w:cs="BRH Malayalam Extra"/>
+                <w:color w:val="000000"/>
+                <w:sz w:val="32"/>
+                <w:szCs w:val="32"/>
+                <w:lang w:val="it-IT"/>
+              </w:rPr>
+              <w:t>.</w:t>
+            </w:r>
+            <w:r>
+              <w:rPr>
+                <w:rFonts w:cs="BRH Malayalam Extra"/>
+                <w:color w:val="000000"/>
+                <w:szCs w:val="32"/>
+                <w:lang w:val="it-IT"/>
+              </w:rPr>
+              <w:t>2</w:t>
+            </w:r>
+            <w:r>
+              <w:rPr>
+                <w:rFonts w:ascii="BRH Malayalam Extra" w:hAnsi="BRH Malayalam Extra" w:cs="BRH Malayalam Extra"/>
+                <w:color w:val="000000"/>
+                <w:sz w:val="32"/>
+                <w:szCs w:val="32"/>
+                <w:lang w:val="it-IT"/>
+              </w:rPr>
+              <w:t>(</w:t>
+            </w:r>
+            <w:r>
+              <w:rPr>
+                <w:rFonts w:cs="BRH Malayalam Extra"/>
+                <w:color w:val="000000"/>
+                <w:szCs w:val="32"/>
+                <w:lang w:val="it-IT"/>
+              </w:rPr>
+              <w:t>36</w:t>
+            </w:r>
+            <w:r>
+              <w:rPr>
+                <w:rFonts w:ascii="BRH Malayalam Extra" w:hAnsi="BRH Malayalam Extra" w:cs="BRH Malayalam Extra"/>
+                <w:color w:val="000000"/>
+                <w:sz w:val="32"/>
+                <w:szCs w:val="32"/>
+                <w:lang w:val="it-IT"/>
+              </w:rPr>
+              <w:t>)- D</w:t>
+            </w:r>
+            <w:r>
+              <w:rPr>
+                <w:rFonts w:ascii="BRH Malayalam Extra" w:hAnsi="BRH Malayalam Extra" w:cs="BRH Malayalam Extra"/>
+                <w:color w:val="000000"/>
+                <w:sz w:val="26"/>
+                <w:szCs w:val="32"/>
+                <w:lang w:val="it-IT"/>
+              </w:rPr>
+              <w:t>–</w:t>
+            </w:r>
+            <w:r>
+              <w:rPr>
+                <w:rFonts w:ascii="BRH Malayalam Extra" w:hAnsi="BRH Malayalam Extra" w:cs="BRH Malayalam Extra"/>
+                <w:color w:val="000000"/>
+                <w:sz w:val="32"/>
+                <w:szCs w:val="32"/>
+                <w:lang w:val="it-IT"/>
+              </w:rPr>
+              <w:t>¥L</w:t>
+            </w:r>
+            <w:r>
+              <w:rPr>
+                <w:rFonts w:ascii="BRH Malayalam Extra" w:hAnsi="BRH Malayalam Extra" w:cs="BRH Malayalam Extra"/>
+                <w:color w:val="000000"/>
+                <w:sz w:val="26"/>
+                <w:szCs w:val="32"/>
+                <w:lang w:val="it-IT"/>
+              </w:rPr>
+              <w:t>–</w:t>
+            </w:r>
+            <w:r>
+              <w:rPr>
+                <w:rFonts w:ascii="BRH Malayalam Extra" w:hAnsi="BRH Malayalam Extra" w:cs="BRH Malayalam Extra"/>
+                <w:color w:val="000000"/>
+                <w:sz w:val="32"/>
+                <w:szCs w:val="32"/>
+                <w:lang w:val="it-IT"/>
+              </w:rPr>
+              <w:t xml:space="preserve"> ||</w:t>
+            </w:r>
+          </w:p>
+          <w:p>
+            <w:pPr>
+              <w:widowControl w:val="0"/>
+              <w:autoSpaceDE w:val="0"/>
+              <w:autoSpaceDN w:val="0"/>
+              <w:adjustRightInd w:val="0"/>
+              <w:spacing w:before="0" w:line="240" w:lineRule="auto"/>
+              <w:rPr>
+                <w:rFonts w:cs="BRH Malayalam Extra"/>
                 <w:color w:val="FF0000"/>
                 <w:szCs w:val="40"/>
                 <w:lang w:val="en-IN"/>
@@ -17858,7 +17948,6 @@
                 <w:szCs w:val="32"/>
                 <w:lang w:val="it-IT"/>
               </w:rPr>
-              <w:lastRenderedPageBreak/>
               <w:t>D</w:t>
             </w:r>
             <w:r>
@@ -20520,6 +20609,7 @@
                 <w:color w:val="000000"/>
                 <w:szCs w:val="32"/>
               </w:rPr>
+              <w:lastRenderedPageBreak/>
               <w:t>5</w:t>
             </w:r>
             <w:r>
@@ -20796,7 +20886,6 @@
                 <w:sz w:val="32"/>
                 <w:szCs w:val="32"/>
               </w:rPr>
-              <w:lastRenderedPageBreak/>
               <w:t>p</w:t>
             </w:r>
             <w:r>
@@ -22865,6 +22954,7 @@
                 <w:color w:val="000000"/>
                 <w:szCs w:val="32"/>
               </w:rPr>
+              <w:lastRenderedPageBreak/>
               <w:t>5</w:t>
             </w:r>
             <w:r>
@@ -23151,7 +23241,6 @@
                 <w:sz w:val="32"/>
                 <w:szCs w:val="32"/>
               </w:rPr>
-              <w:lastRenderedPageBreak/>
               <w:t>p</w:t>
             </w:r>
             <w:r>
@@ -26175,7 +26264,7 @@
       </w:tr>
       <w:tr>
         <w:trPr>
-          <w:trHeight w:val="771"/>
+          <w:trHeight w:val="1211"/>
         </w:trPr>
         <w:tc>
           <w:tcPr>
@@ -27822,177 +27911,11 @@
               <w:adjustRightInd w:val="0"/>
               <w:spacing w:line="240" w:lineRule="auto"/>
               <w:rPr>
-                <w:rFonts w:ascii="BRH Malayalam Extra" w:hAnsi="BRH Malayalam Extra" w:cs="BRH Malayalam Extra"/>
-                <w:color w:val="000000"/>
-                <w:sz w:val="32"/>
+                <w:rFonts w:cs="BRH Malayalam Extra"/>
+                <w:color w:val="000000"/>
                 <w:szCs w:val="32"/>
               </w:rPr>
             </w:pPr>
-            <w:r>
-              <w:rPr>
-                <w:rFonts w:cs="BRH Malayalam Extra"/>
-                <w:color w:val="000000"/>
-                <w:szCs w:val="32"/>
-              </w:rPr>
-              <w:t>12</w:t>
-            </w:r>
-            <w:r>
-              <w:rPr>
-                <w:rFonts w:ascii="BRH Malayalam Extra" w:hAnsi="BRH Malayalam Extra" w:cs="BRH Malayalam Extra"/>
-                <w:color w:val="000000"/>
-                <w:sz w:val="32"/>
-                <w:szCs w:val="32"/>
-              </w:rPr>
-              <w:t>)</w:t>
-            </w:r>
-            <w:r>
-              <w:rPr>
-                <w:rFonts w:ascii="BRH Malayalam Extra" w:hAnsi="BRH Malayalam Extra" w:cs="BRH Malayalam Extra"/>
-                <w:color w:val="000000"/>
-                <w:sz w:val="32"/>
-                <w:szCs w:val="32"/>
-              </w:rPr>
-              <w:tab/>
-            </w:r>
-            <w:r>
-              <w:rPr>
-                <w:rFonts w:cs="BRH Malayalam Extra"/>
-                <w:color w:val="000000"/>
-                <w:szCs w:val="32"/>
-              </w:rPr>
-              <w:t>4</w:t>
-            </w:r>
-            <w:r>
-              <w:rPr>
-                <w:rFonts w:ascii="BRH Malayalam Extra" w:hAnsi="BRH Malayalam Extra" w:cs="BRH Malayalam Extra"/>
-                <w:color w:val="000000"/>
-                <w:sz w:val="32"/>
-                <w:szCs w:val="32"/>
-              </w:rPr>
-              <w:t>.</w:t>
-            </w:r>
-            <w:r>
-              <w:rPr>
-                <w:rFonts w:cs="BRH Malayalam Extra"/>
-                <w:color w:val="000000"/>
-                <w:szCs w:val="32"/>
-              </w:rPr>
-              <w:t>1</w:t>
-            </w:r>
-            <w:r>
-              <w:rPr>
-                <w:rFonts w:ascii="BRH Malayalam Extra" w:hAnsi="BRH Malayalam Extra" w:cs="BRH Malayalam Extra"/>
-                <w:color w:val="000000"/>
-                <w:sz w:val="32"/>
-                <w:szCs w:val="32"/>
-              </w:rPr>
-              <w:t>.</w:t>
-            </w:r>
-            <w:r>
-              <w:rPr>
-                <w:rFonts w:cs="BRH Malayalam Extra"/>
-                <w:color w:val="000000"/>
-                <w:szCs w:val="32"/>
-              </w:rPr>
-              <w:t>8</w:t>
-            </w:r>
-            <w:r>
-              <w:rPr>
-                <w:rFonts w:ascii="BRH Malayalam Extra" w:hAnsi="BRH Malayalam Extra" w:cs="BRH Malayalam Extra"/>
-                <w:color w:val="000000"/>
-                <w:sz w:val="32"/>
-                <w:szCs w:val="32"/>
-              </w:rPr>
-              <w:t>.</w:t>
-            </w:r>
-            <w:r>
-              <w:rPr>
-                <w:rFonts w:cs="BRH Malayalam Extra"/>
-                <w:color w:val="000000"/>
-                <w:szCs w:val="32"/>
-              </w:rPr>
-              <w:t>5</w:t>
-            </w:r>
-            <w:r>
-              <w:rPr>
-                <w:rFonts w:ascii="BRH Malayalam Extra" w:hAnsi="BRH Malayalam Extra" w:cs="BRH Malayalam Extra"/>
-                <w:color w:val="000000"/>
-                <w:sz w:val="32"/>
-                <w:szCs w:val="32"/>
-              </w:rPr>
-              <w:t>(</w:t>
-            </w:r>
-            <w:r>
-              <w:rPr>
-                <w:rFonts w:cs="BRH Malayalam Extra"/>
-                <w:color w:val="000000"/>
-                <w:szCs w:val="32"/>
-              </w:rPr>
-              <w:t>10</w:t>
-            </w:r>
-            <w:r>
-              <w:rPr>
-                <w:rFonts w:ascii="BRH Malayalam Extra" w:hAnsi="BRH Malayalam Extra" w:cs="BRH Malayalam Extra"/>
-                <w:color w:val="000000"/>
-                <w:sz w:val="32"/>
-                <w:szCs w:val="32"/>
-              </w:rPr>
-              <w:t>)- py</w:t>
-            </w:r>
-            <w:r>
-              <w:rPr>
-                <w:rFonts w:ascii="BRH Malayalam Extra" w:hAnsi="BRH Malayalam Extra" w:cs="BRH Malayalam Extra"/>
-                <w:color w:val="000000"/>
-                <w:sz w:val="26"/>
-                <w:szCs w:val="32"/>
-              </w:rPr>
-              <w:t>–</w:t>
-            </w:r>
-            <w:r>
-              <w:rPr>
-                <w:rFonts w:ascii="BRH Malayalam Extra" w:hAnsi="BRH Malayalam Extra" w:cs="BRH Malayalam Extra"/>
-                <w:color w:val="000000"/>
-                <w:sz w:val="32"/>
-                <w:szCs w:val="32"/>
-              </w:rPr>
-              <w:t>¥c</w:t>
-            </w:r>
-            <w:r>
-              <w:rPr>
-                <w:rFonts w:ascii="BRH Malayalam Extra" w:hAnsi="BRH Malayalam Extra" w:cs="BRH Malayalam Extra"/>
-                <w:color w:val="000000"/>
-                <w:sz w:val="26"/>
-                <w:szCs w:val="32"/>
-              </w:rPr>
-              <w:t>–</w:t>
-            </w:r>
-            <w:r>
-              <w:rPr>
-                <w:rFonts w:ascii="BRH Malayalam Extra" w:hAnsi="BRH Malayalam Extra" w:cs="BRH Malayalam Extra"/>
-                <w:color w:val="000000"/>
-                <w:sz w:val="32"/>
-                <w:szCs w:val="32"/>
-              </w:rPr>
-              <w:t>i</w:t>
-            </w:r>
-            <w:r>
-              <w:rPr>
-                <w:rFonts w:ascii="BRH Malayalam Extra" w:hAnsi="BRH Malayalam Extra" w:cs="BRH Malayalam Extra"/>
-                <w:color w:val="000000"/>
-                <w:sz w:val="26"/>
-                <w:szCs w:val="32"/>
-              </w:rPr>
-              <w:t>–</w:t>
-            </w:r>
-            <w:r>
-              <w:rPr>
-                <w:rFonts w:ascii="BRH Malayalam Extra" w:hAnsi="BRH Malayalam Extra" w:cs="BRH Malayalam Extra"/>
-                <w:color w:val="000000"/>
-                <w:sz w:val="32"/>
-                <w:szCs w:val="32"/>
-              </w:rPr>
-              <w:t xml:space="preserve"> ||</w:t>
-            </w:r>
           </w:p>
           <w:p>
             <w:pPr>
@@ -28010,12 +27933,192 @@
             </w:pPr>
             <w:r>
               <w:rPr>
-                <w:rFonts w:ascii="BRH Malayalam Extra" w:hAnsi="BRH Malayalam Extra" w:cs="BRH Malayalam Extra"/>
-                <w:color w:val="000000"/>
-                <w:sz w:val="32"/>
+                <w:rFonts w:cs="BRH Malayalam Extra"/>
+                <w:color w:val="000000"/>
                 <w:szCs w:val="32"/>
               </w:rPr>
               <w:lastRenderedPageBreak/>
+              <w:t>12</w:t>
+            </w:r>
+            <w:r>
+              <w:rPr>
+                <w:rFonts w:ascii="BRH Malayalam Extra" w:hAnsi="BRH Malayalam Extra" w:cs="BRH Malayalam Extra"/>
+                <w:color w:val="000000"/>
+                <w:sz w:val="32"/>
+                <w:szCs w:val="32"/>
+              </w:rPr>
+              <w:t>)</w:t>
+            </w:r>
+            <w:r>
+              <w:rPr>
+                <w:rFonts w:ascii="BRH Malayalam Extra" w:hAnsi="BRH Malayalam Extra" w:cs="BRH Malayalam Extra"/>
+                <w:color w:val="000000"/>
+                <w:sz w:val="32"/>
+                <w:szCs w:val="32"/>
+              </w:rPr>
+              <w:tab/>
+            </w:r>
+            <w:r>
+              <w:rPr>
+                <w:rFonts w:cs="BRH Malayalam Extra"/>
+                <w:color w:val="000000"/>
+                <w:szCs w:val="32"/>
+              </w:rPr>
+              <w:t>4</w:t>
+            </w:r>
+            <w:r>
+              <w:rPr>
+                <w:rFonts w:ascii="BRH Malayalam Extra" w:hAnsi="BRH Malayalam Extra" w:cs="BRH Malayalam Extra"/>
+                <w:color w:val="000000"/>
+                <w:sz w:val="32"/>
+                <w:szCs w:val="32"/>
+              </w:rPr>
+              <w:t>.</w:t>
+            </w:r>
+            <w:r>
+              <w:rPr>
+                <w:rFonts w:cs="BRH Malayalam Extra"/>
+                <w:color w:val="000000"/>
+                <w:szCs w:val="32"/>
+              </w:rPr>
+              <w:t>1</w:t>
+            </w:r>
+            <w:r>
+              <w:rPr>
+                <w:rFonts w:ascii="BRH Malayalam Extra" w:hAnsi="BRH Malayalam Extra" w:cs="BRH Malayalam Extra"/>
+                <w:color w:val="000000"/>
+                <w:sz w:val="32"/>
+                <w:szCs w:val="32"/>
+              </w:rPr>
+              <w:t>.</w:t>
+            </w:r>
+            <w:r>
+              <w:rPr>
+                <w:rFonts w:cs="BRH Malayalam Extra"/>
+                <w:color w:val="000000"/>
+                <w:szCs w:val="32"/>
+              </w:rPr>
+              <w:t>8</w:t>
+            </w:r>
+            <w:r>
+              <w:rPr>
+                <w:rFonts w:ascii="BRH Malayalam Extra" w:hAnsi="BRH Malayalam Extra" w:cs="BRH Malayalam Extra"/>
+                <w:color w:val="000000"/>
+                <w:sz w:val="32"/>
+                <w:szCs w:val="32"/>
+              </w:rPr>
+              <w:t>.</w:t>
+            </w:r>
+            <w:r>
+              <w:rPr>
+                <w:rFonts w:cs="BRH Malayalam Extra"/>
+                <w:color w:val="000000"/>
+                <w:szCs w:val="32"/>
+              </w:rPr>
+              <w:t>5</w:t>
+            </w:r>
+            <w:r>
+              <w:rPr>
+                <w:rFonts w:ascii="BRH Malayalam Extra" w:hAnsi="BRH Malayalam Extra" w:cs="BRH Malayalam Extra"/>
+                <w:color w:val="000000"/>
+                <w:sz w:val="32"/>
+                <w:szCs w:val="32"/>
+              </w:rPr>
+              <w:t>(</w:t>
+            </w:r>
+            <w:r>
+              <w:rPr>
+                <w:rFonts w:cs="BRH Malayalam Extra"/>
+                <w:color w:val="000000"/>
+                <w:szCs w:val="32"/>
+              </w:rPr>
+              <w:t>10</w:t>
+            </w:r>
+            <w:r>
+              <w:rPr>
+                <w:rFonts w:ascii="BRH Malayalam Extra" w:hAnsi="BRH Malayalam Extra" w:cs="BRH Malayalam Extra"/>
+                <w:color w:val="000000"/>
+                <w:sz w:val="32"/>
+                <w:szCs w:val="32"/>
+              </w:rPr>
+              <w:t>)- py</w:t>
+            </w:r>
+            <w:r>
+              <w:rPr>
+                <w:rFonts w:ascii="BRH Malayalam Extra" w:hAnsi="BRH Malayalam Extra" w:cs="BRH Malayalam Extra"/>
+                <w:color w:val="000000"/>
+                <w:sz w:val="26"/>
+                <w:szCs w:val="32"/>
+              </w:rPr>
+              <w:t>–</w:t>
+            </w:r>
+            <w:r>
+              <w:rPr>
+                <w:rFonts w:ascii="BRH Malayalam Extra" w:hAnsi="BRH Malayalam Extra" w:cs="BRH Malayalam Extra"/>
+                <w:color w:val="000000"/>
+                <w:sz w:val="32"/>
+                <w:szCs w:val="32"/>
+              </w:rPr>
+              <w:t>¥c</w:t>
+            </w:r>
+            <w:r>
+              <w:rPr>
+                <w:rFonts w:ascii="BRH Malayalam Extra" w:hAnsi="BRH Malayalam Extra" w:cs="BRH Malayalam Extra"/>
+                <w:color w:val="000000"/>
+                <w:sz w:val="26"/>
+                <w:szCs w:val="32"/>
+              </w:rPr>
+              <w:t>–</w:t>
+            </w:r>
+            <w:r>
+              <w:rPr>
+                <w:rFonts w:ascii="BRH Malayalam Extra" w:hAnsi="BRH Malayalam Extra" w:cs="BRH Malayalam Extra"/>
+                <w:color w:val="000000"/>
+                <w:sz w:val="32"/>
+                <w:szCs w:val="32"/>
+              </w:rPr>
+              <w:t>i</w:t>
+            </w:r>
+            <w:r>
+              <w:rPr>
+                <w:rFonts w:ascii="BRH Malayalam Extra" w:hAnsi="BRH Malayalam Extra" w:cs="BRH Malayalam Extra"/>
+                <w:color w:val="000000"/>
+                <w:sz w:val="26"/>
+                <w:szCs w:val="32"/>
+              </w:rPr>
+              <w:t>–</w:t>
+            </w:r>
+            <w:r>
+              <w:rPr>
+                <w:rFonts w:ascii="BRH Malayalam Extra" w:hAnsi="BRH Malayalam Extra" w:cs="BRH Malayalam Extra"/>
+                <w:color w:val="000000"/>
+                <w:sz w:val="32"/>
+                <w:szCs w:val="32"/>
+              </w:rPr>
+              <w:t xml:space="preserve"> ||</w:t>
+            </w:r>
+          </w:p>
+          <w:p>
+            <w:pPr>
+              <w:widowControl w:val="0"/>
+              <w:autoSpaceDE w:val="0"/>
+              <w:autoSpaceDN w:val="0"/>
+              <w:adjustRightInd w:val="0"/>
+              <w:spacing w:line="240" w:lineRule="auto"/>
+              <w:rPr>
+                <w:rFonts w:ascii="BRH Malayalam Extra" w:hAnsi="BRH Malayalam Extra" w:cs="BRH Malayalam Extra"/>
+                <w:color w:val="000000"/>
+                <w:sz w:val="32"/>
+                <w:szCs w:val="32"/>
+              </w:rPr>
+            </w:pPr>
+            <w:r>
+              <w:rPr>
+                <w:rFonts w:ascii="BRH Malayalam Extra" w:hAnsi="BRH Malayalam Extra" w:cs="BRH Malayalam Extra"/>
+                <w:color w:val="000000"/>
+                <w:sz w:val="32"/>
+                <w:szCs w:val="32"/>
+              </w:rPr>
               <w:t>py</w:t>
             </w:r>
             <w:r>
@@ -28099,178 +28202,11 @@
               <w:adjustRightInd w:val="0"/>
               <w:spacing w:line="240" w:lineRule="auto"/>
               <w:rPr>
-                <w:rFonts w:ascii="BRH Malayalam Extra" w:hAnsi="BRH Malayalam Extra" w:cs="BRH Malayalam Extra"/>
-                <w:color w:val="000000"/>
-                <w:sz w:val="32"/>
+                <w:rFonts w:cs="BRH Malayalam Extra"/>
+                <w:color w:val="000000"/>
                 <w:szCs w:val="32"/>
               </w:rPr>
             </w:pPr>
-            <w:r>
-              <w:rPr>
-                <w:rFonts w:cs="BRH Malayalam Extra"/>
-                <w:color w:val="000000"/>
-                <w:szCs w:val="32"/>
-              </w:rPr>
-              <w:lastRenderedPageBreak/>
-              <w:t>12</w:t>
-            </w:r>
-            <w:r>
-              <w:rPr>
-                <w:rFonts w:ascii="BRH Malayalam Extra" w:hAnsi="BRH Malayalam Extra" w:cs="BRH Malayalam Extra"/>
-                <w:color w:val="000000"/>
-                <w:sz w:val="32"/>
-                <w:szCs w:val="32"/>
-              </w:rPr>
-              <w:t>)</w:t>
-            </w:r>
-            <w:r>
-              <w:rPr>
-                <w:rFonts w:ascii="BRH Malayalam Extra" w:hAnsi="BRH Malayalam Extra" w:cs="BRH Malayalam Extra"/>
-                <w:color w:val="000000"/>
-                <w:sz w:val="32"/>
-                <w:szCs w:val="32"/>
-              </w:rPr>
-              <w:tab/>
-            </w:r>
-            <w:r>
-              <w:rPr>
-                <w:rFonts w:cs="BRH Malayalam Extra"/>
-                <w:color w:val="000000"/>
-                <w:szCs w:val="32"/>
-              </w:rPr>
-              <w:t>4</w:t>
-            </w:r>
-            <w:r>
-              <w:rPr>
-                <w:rFonts w:ascii="BRH Malayalam Extra" w:hAnsi="BRH Malayalam Extra" w:cs="BRH Malayalam Extra"/>
-                <w:color w:val="000000"/>
-                <w:sz w:val="32"/>
-                <w:szCs w:val="32"/>
-              </w:rPr>
-              <w:t>.</w:t>
-            </w:r>
-            <w:r>
-              <w:rPr>
-                <w:rFonts w:cs="BRH Malayalam Extra"/>
-                <w:color w:val="000000"/>
-                <w:szCs w:val="32"/>
-              </w:rPr>
-              <w:t>1</w:t>
-            </w:r>
-            <w:r>
-              <w:rPr>
-                <w:rFonts w:ascii="BRH Malayalam Extra" w:hAnsi="BRH Malayalam Extra" w:cs="BRH Malayalam Extra"/>
-                <w:color w:val="000000"/>
-                <w:sz w:val="32"/>
-                <w:szCs w:val="32"/>
-              </w:rPr>
-              <w:t>.</w:t>
-            </w:r>
-            <w:r>
-              <w:rPr>
-                <w:rFonts w:cs="BRH Malayalam Extra"/>
-                <w:color w:val="000000"/>
-                <w:szCs w:val="32"/>
-              </w:rPr>
-              <w:t>8</w:t>
-            </w:r>
-            <w:r>
-              <w:rPr>
-                <w:rFonts w:ascii="BRH Malayalam Extra" w:hAnsi="BRH Malayalam Extra" w:cs="BRH Malayalam Extra"/>
-                <w:color w:val="000000"/>
-                <w:sz w:val="32"/>
-                <w:szCs w:val="32"/>
-              </w:rPr>
-              <w:t>.</w:t>
-            </w:r>
-            <w:r>
-              <w:rPr>
-                <w:rFonts w:cs="BRH Malayalam Extra"/>
-                <w:color w:val="000000"/>
-                <w:szCs w:val="32"/>
-              </w:rPr>
-              <w:t>5</w:t>
-            </w:r>
-            <w:r>
-              <w:rPr>
-                <w:rFonts w:ascii="BRH Malayalam Extra" w:hAnsi="BRH Malayalam Extra" w:cs="BRH Malayalam Extra"/>
-                <w:color w:val="000000"/>
-                <w:sz w:val="32"/>
-                <w:szCs w:val="32"/>
-              </w:rPr>
-              <w:t>(</w:t>
-            </w:r>
-            <w:r>
-              <w:rPr>
-                <w:rFonts w:cs="BRH Malayalam Extra"/>
-                <w:color w:val="000000"/>
-                <w:szCs w:val="32"/>
-              </w:rPr>
-              <w:t>10</w:t>
-            </w:r>
-            <w:r>
-              <w:rPr>
-                <w:rFonts w:ascii="BRH Malayalam Extra" w:hAnsi="BRH Malayalam Extra" w:cs="BRH Malayalam Extra"/>
-                <w:color w:val="000000"/>
-                <w:sz w:val="32"/>
-                <w:szCs w:val="32"/>
-              </w:rPr>
-              <w:t>)- py</w:t>
-            </w:r>
-            <w:r>
-              <w:rPr>
-                <w:rFonts w:ascii="BRH Malayalam Extra" w:hAnsi="BRH Malayalam Extra" w:cs="BRH Malayalam Extra"/>
-                <w:color w:val="000000"/>
-                <w:sz w:val="26"/>
-                <w:szCs w:val="32"/>
-              </w:rPr>
-              <w:t>–</w:t>
-            </w:r>
-            <w:r>
-              <w:rPr>
-                <w:rFonts w:ascii="BRH Malayalam Extra" w:hAnsi="BRH Malayalam Extra" w:cs="BRH Malayalam Extra"/>
-                <w:color w:val="000000"/>
-                <w:sz w:val="32"/>
-                <w:szCs w:val="32"/>
-              </w:rPr>
-              <w:t>¥c</w:t>
-            </w:r>
-            <w:r>
-              <w:rPr>
-                <w:rFonts w:ascii="BRH Malayalam Extra" w:hAnsi="BRH Malayalam Extra" w:cs="BRH Malayalam Extra"/>
-                <w:color w:val="000000"/>
-                <w:sz w:val="26"/>
-                <w:szCs w:val="32"/>
-              </w:rPr>
-              <w:t>–</w:t>
-            </w:r>
-            <w:r>
-              <w:rPr>
-                <w:rFonts w:ascii="BRH Malayalam Extra" w:hAnsi="BRH Malayalam Extra" w:cs="BRH Malayalam Extra"/>
-                <w:color w:val="000000"/>
-                <w:sz w:val="32"/>
-                <w:szCs w:val="32"/>
-              </w:rPr>
-              <w:t>i</w:t>
-            </w:r>
-            <w:r>
-              <w:rPr>
-                <w:rFonts w:ascii="BRH Malayalam Extra" w:hAnsi="BRH Malayalam Extra" w:cs="BRH Malayalam Extra"/>
-                <w:color w:val="000000"/>
-                <w:sz w:val="26"/>
-                <w:szCs w:val="32"/>
-              </w:rPr>
-              <w:t>–</w:t>
-            </w:r>
-            <w:r>
-              <w:rPr>
-                <w:rFonts w:ascii="BRH Malayalam Extra" w:hAnsi="BRH Malayalam Extra" w:cs="BRH Malayalam Extra"/>
-                <w:color w:val="000000"/>
-                <w:sz w:val="32"/>
-                <w:szCs w:val="32"/>
-              </w:rPr>
-              <w:t xml:space="preserve"> ||</w:t>
-            </w:r>
           </w:p>
           <w:p>
             <w:pPr>
@@ -28288,12 +28224,192 @@
             </w:pPr>
             <w:r>
               <w:rPr>
-                <w:rFonts w:ascii="BRH Malayalam Extra" w:hAnsi="BRH Malayalam Extra" w:cs="BRH Malayalam Extra"/>
-                <w:color w:val="000000"/>
-                <w:sz w:val="32"/>
+                <w:rFonts w:cs="BRH Malayalam Extra"/>
+                <w:color w:val="000000"/>
                 <w:szCs w:val="32"/>
               </w:rPr>
               <w:lastRenderedPageBreak/>
+              <w:t>12</w:t>
+            </w:r>
+            <w:r>
+              <w:rPr>
+                <w:rFonts w:ascii="BRH Malayalam Extra" w:hAnsi="BRH Malayalam Extra" w:cs="BRH Malayalam Extra"/>
+                <w:color w:val="000000"/>
+                <w:sz w:val="32"/>
+                <w:szCs w:val="32"/>
+              </w:rPr>
+              <w:t>)</w:t>
+            </w:r>
+            <w:r>
+              <w:rPr>
+                <w:rFonts w:ascii="BRH Malayalam Extra" w:hAnsi="BRH Malayalam Extra" w:cs="BRH Malayalam Extra"/>
+                <w:color w:val="000000"/>
+                <w:sz w:val="32"/>
+                <w:szCs w:val="32"/>
+              </w:rPr>
+              <w:tab/>
+            </w:r>
+            <w:r>
+              <w:rPr>
+                <w:rFonts w:cs="BRH Malayalam Extra"/>
+                <w:color w:val="000000"/>
+                <w:szCs w:val="32"/>
+              </w:rPr>
+              <w:t>4</w:t>
+            </w:r>
+            <w:r>
+              <w:rPr>
+                <w:rFonts w:ascii="BRH Malayalam Extra" w:hAnsi="BRH Malayalam Extra" w:cs="BRH Malayalam Extra"/>
+                <w:color w:val="000000"/>
+                <w:sz w:val="32"/>
+                <w:szCs w:val="32"/>
+              </w:rPr>
+              <w:t>.</w:t>
+            </w:r>
+            <w:r>
+              <w:rPr>
+                <w:rFonts w:cs="BRH Malayalam Extra"/>
+                <w:color w:val="000000"/>
+                <w:szCs w:val="32"/>
+              </w:rPr>
+              <w:t>1</w:t>
+            </w:r>
+            <w:r>
+              <w:rPr>
+                <w:rFonts w:ascii="BRH Malayalam Extra" w:hAnsi="BRH Malayalam Extra" w:cs="BRH Malayalam Extra"/>
+                <w:color w:val="000000"/>
+                <w:sz w:val="32"/>
+                <w:szCs w:val="32"/>
+              </w:rPr>
+              <w:t>.</w:t>
+            </w:r>
+            <w:r>
+              <w:rPr>
+                <w:rFonts w:cs="BRH Malayalam Extra"/>
+                <w:color w:val="000000"/>
+                <w:szCs w:val="32"/>
+              </w:rPr>
+              <w:t>8</w:t>
+            </w:r>
+            <w:r>
+              <w:rPr>
+                <w:rFonts w:ascii="BRH Malayalam Extra" w:hAnsi="BRH Malayalam Extra" w:cs="BRH Malayalam Extra"/>
+                <w:color w:val="000000"/>
+                <w:sz w:val="32"/>
+                <w:szCs w:val="32"/>
+              </w:rPr>
+              <w:t>.</w:t>
+            </w:r>
+            <w:r>
+              <w:rPr>
+                <w:rFonts w:cs="BRH Malayalam Extra"/>
+                <w:color w:val="000000"/>
+                <w:szCs w:val="32"/>
+              </w:rPr>
+              <w:t>5</w:t>
+            </w:r>
+            <w:r>
+              <w:rPr>
+                <w:rFonts w:ascii="BRH Malayalam Extra" w:hAnsi="BRH Malayalam Extra" w:cs="BRH Malayalam Extra"/>
+                <w:color w:val="000000"/>
+                <w:sz w:val="32"/>
+                <w:szCs w:val="32"/>
+              </w:rPr>
+              <w:t>(</w:t>
+            </w:r>
+            <w:r>
+              <w:rPr>
+                <w:rFonts w:cs="BRH Malayalam Extra"/>
+                <w:color w:val="000000"/>
+                <w:szCs w:val="32"/>
+              </w:rPr>
+              <w:t>10</w:t>
+            </w:r>
+            <w:r>
+              <w:rPr>
+                <w:rFonts w:ascii="BRH Malayalam Extra" w:hAnsi="BRH Malayalam Extra" w:cs="BRH Malayalam Extra"/>
+                <w:color w:val="000000"/>
+                <w:sz w:val="32"/>
+                <w:szCs w:val="32"/>
+              </w:rPr>
+              <w:t>)- py</w:t>
+            </w:r>
+            <w:r>
+              <w:rPr>
+                <w:rFonts w:ascii="BRH Malayalam Extra" w:hAnsi="BRH Malayalam Extra" w:cs="BRH Malayalam Extra"/>
+                <w:color w:val="000000"/>
+                <w:sz w:val="26"/>
+                <w:szCs w:val="32"/>
+              </w:rPr>
+              <w:t>–</w:t>
+            </w:r>
+            <w:r>
+              <w:rPr>
+                <w:rFonts w:ascii="BRH Malayalam Extra" w:hAnsi="BRH Malayalam Extra" w:cs="BRH Malayalam Extra"/>
+                <w:color w:val="000000"/>
+                <w:sz w:val="32"/>
+                <w:szCs w:val="32"/>
+              </w:rPr>
+              <w:t>¥c</w:t>
+            </w:r>
+            <w:r>
+              <w:rPr>
+                <w:rFonts w:ascii="BRH Malayalam Extra" w:hAnsi="BRH Malayalam Extra" w:cs="BRH Malayalam Extra"/>
+                <w:color w:val="000000"/>
+                <w:sz w:val="26"/>
+                <w:szCs w:val="32"/>
+              </w:rPr>
+              <w:t>–</w:t>
+            </w:r>
+            <w:r>
+              <w:rPr>
+                <w:rFonts w:ascii="BRH Malayalam Extra" w:hAnsi="BRH Malayalam Extra" w:cs="BRH Malayalam Extra"/>
+                <w:color w:val="000000"/>
+                <w:sz w:val="32"/>
+                <w:szCs w:val="32"/>
+              </w:rPr>
+              <w:t>i</w:t>
+            </w:r>
+            <w:r>
+              <w:rPr>
+                <w:rFonts w:ascii="BRH Malayalam Extra" w:hAnsi="BRH Malayalam Extra" w:cs="BRH Malayalam Extra"/>
+                <w:color w:val="000000"/>
+                <w:sz w:val="26"/>
+                <w:szCs w:val="32"/>
+              </w:rPr>
+              <w:t>–</w:t>
+            </w:r>
+            <w:r>
+              <w:rPr>
+                <w:rFonts w:ascii="BRH Malayalam Extra" w:hAnsi="BRH Malayalam Extra" w:cs="BRH Malayalam Extra"/>
+                <w:color w:val="000000"/>
+                <w:sz w:val="32"/>
+                <w:szCs w:val="32"/>
+              </w:rPr>
+              <w:t xml:space="preserve"> ||</w:t>
+            </w:r>
+          </w:p>
+          <w:p>
+            <w:pPr>
+              <w:widowControl w:val="0"/>
+              <w:autoSpaceDE w:val="0"/>
+              <w:autoSpaceDN w:val="0"/>
+              <w:adjustRightInd w:val="0"/>
+              <w:spacing w:line="240" w:lineRule="auto"/>
+              <w:rPr>
+                <w:rFonts w:ascii="BRH Malayalam Extra" w:hAnsi="BRH Malayalam Extra" w:cs="BRH Malayalam Extra"/>
+                <w:color w:val="000000"/>
+                <w:sz w:val="32"/>
+                <w:szCs w:val="32"/>
+              </w:rPr>
+            </w:pPr>
+            <w:r>
+              <w:rPr>
+                <w:rFonts w:ascii="BRH Malayalam Extra" w:hAnsi="BRH Malayalam Extra" w:cs="BRH Malayalam Extra"/>
+                <w:color w:val="000000"/>
+                <w:sz w:val="32"/>
+                <w:szCs w:val="32"/>
+              </w:rPr>
               <w:t>py</w:t>
             </w:r>
             <w:r>
@@ -31129,6 +31245,7 @@
                 <w:color w:val="000000"/>
                 <w:szCs w:val="32"/>
               </w:rPr>
+              <w:lastRenderedPageBreak/>
               <w:t>54</w:t>
             </w:r>
             <w:r>
@@ -31657,7 +31774,6 @@
                 <w:color w:val="000000"/>
                 <w:szCs w:val="32"/>
               </w:rPr>
-              <w:lastRenderedPageBreak/>
               <w:t>15</w:t>
             </w:r>
             <w:r>
@@ -33844,7 +33960,27 @@
                 <w:sz w:val="32"/>
                 <w:szCs w:val="32"/>
               </w:rPr>
-              <w:t>td¢˜hõx(MÞ§) ¥së</w:t>
+              <w:t>td¢˜</w:t>
+            </w:r>
+            <w:proofErr w:type="gramStart"/>
+            <w:r>
+              <w:rPr>
+                <w:rFonts w:ascii="BRH Malayalam Extra" w:hAnsi="BRH Malayalam Extra" w:cs="BRH Malayalam Extra"/>
+                <w:color w:val="000000"/>
+                <w:sz w:val="32"/>
+                <w:szCs w:val="32"/>
+              </w:rPr>
+              <w:t>hõx(</w:t>
+            </w:r>
+            <w:proofErr w:type="gramEnd"/>
+            <w:r>
+              <w:rPr>
+                <w:rFonts w:ascii="BRH Malayalam Extra" w:hAnsi="BRH Malayalam Extra" w:cs="BRH Malayalam Extra"/>
+                <w:color w:val="000000"/>
+                <w:sz w:val="32"/>
+                <w:szCs w:val="32"/>
+              </w:rPr>
+              <w:t>MÞ§) ¥së</w:t>
             </w:r>
             <w:r>
               <w:rPr>
@@ -33916,7 +34052,27 @@
                 <w:sz w:val="32"/>
                 <w:szCs w:val="32"/>
               </w:rPr>
-              <w:t xml:space="preserve"> td¢˜hõx(MÞ§) ¥së</w:t>
+              <w:t xml:space="preserve"> td¢˜</w:t>
+            </w:r>
+            <w:proofErr w:type="gramStart"/>
+            <w:r>
+              <w:rPr>
+                <w:rFonts w:ascii="BRH Malayalam Extra" w:hAnsi="BRH Malayalam Extra" w:cs="BRH Malayalam Extra"/>
+                <w:color w:val="000000"/>
+                <w:sz w:val="32"/>
+                <w:szCs w:val="32"/>
+              </w:rPr>
+              <w:t>hõx(</w:t>
+            </w:r>
+            <w:proofErr w:type="gramEnd"/>
+            <w:r>
+              <w:rPr>
+                <w:rFonts w:ascii="BRH Malayalam Extra" w:hAnsi="BRH Malayalam Extra" w:cs="BRH Malayalam Extra"/>
+                <w:color w:val="000000"/>
+                <w:sz w:val="32"/>
+                <w:szCs w:val="32"/>
+              </w:rPr>
+              <w:t>MÞ§) ¥së</w:t>
             </w:r>
             <w:r>
               <w:rPr>
@@ -34066,7 +34222,27 @@
                 <w:sz w:val="32"/>
                 <w:szCs w:val="32"/>
               </w:rPr>
-              <w:t xml:space="preserve"> td¢˜hõx(MÞ§) ¥së</w:t>
+              <w:t xml:space="preserve"> td¢˜</w:t>
+            </w:r>
+            <w:proofErr w:type="gramStart"/>
+            <w:r>
+              <w:rPr>
+                <w:rFonts w:ascii="BRH Malayalam Extra" w:hAnsi="BRH Malayalam Extra" w:cs="BRH Malayalam Extra"/>
+                <w:color w:val="000000"/>
+                <w:sz w:val="32"/>
+                <w:szCs w:val="32"/>
+              </w:rPr>
+              <w:t>hõx(</w:t>
+            </w:r>
+            <w:proofErr w:type="gramEnd"/>
+            <w:r>
+              <w:rPr>
+                <w:rFonts w:ascii="BRH Malayalam Extra" w:hAnsi="BRH Malayalam Extra" w:cs="BRH Malayalam Extra"/>
+                <w:color w:val="000000"/>
+                <w:sz w:val="32"/>
+                <w:szCs w:val="32"/>
+              </w:rPr>
+              <w:t>MÞ§) ¥së</w:t>
             </w:r>
             <w:r>
               <w:rPr>
@@ -34508,7 +34684,27 @@
                 <w:sz w:val="32"/>
                 <w:szCs w:val="32"/>
               </w:rPr>
-              <w:t>— sëx(MÞ§) sëx© h—</w:t>
+              <w:t xml:space="preserve">— </w:t>
+            </w:r>
+            <w:proofErr w:type="gramStart"/>
+            <w:r>
+              <w:rPr>
+                <w:rFonts w:ascii="BRH Malayalam Extra" w:hAnsi="BRH Malayalam Extra" w:cs="BRH Malayalam Extra"/>
+                <w:color w:val="000000"/>
+                <w:sz w:val="32"/>
+                <w:szCs w:val="32"/>
+              </w:rPr>
+              <w:t>sëx(</w:t>
+            </w:r>
+            <w:proofErr w:type="gramEnd"/>
+            <w:r>
+              <w:rPr>
+                <w:rFonts w:ascii="BRH Malayalam Extra" w:hAnsi="BRH Malayalam Extra" w:cs="BRH Malayalam Extra"/>
+                <w:color w:val="000000"/>
+                <w:sz w:val="32"/>
+                <w:szCs w:val="32"/>
+              </w:rPr>
+              <w:t>MÞ§) sëx© h—</w:t>
             </w:r>
             <w:r>
               <w:rPr>
@@ -34864,7 +35060,27 @@
                 <w:sz w:val="32"/>
                 <w:szCs w:val="32"/>
               </w:rPr>
-              <w:t xml:space="preserve"> sëx(MÞ§) sëx© h</w:t>
+              <w:t xml:space="preserve"> </w:t>
+            </w:r>
+            <w:proofErr w:type="gramStart"/>
+            <w:r>
+              <w:rPr>
+                <w:rFonts w:ascii="BRH Malayalam Extra" w:hAnsi="BRH Malayalam Extra" w:cs="BRH Malayalam Extra"/>
+                <w:color w:val="000000"/>
+                <w:sz w:val="32"/>
+                <w:szCs w:val="32"/>
+              </w:rPr>
+              <w:t>sëx(</w:t>
+            </w:r>
+            <w:proofErr w:type="gramEnd"/>
+            <w:r>
+              <w:rPr>
+                <w:rFonts w:ascii="BRH Malayalam Extra" w:hAnsi="BRH Malayalam Extra" w:cs="BRH Malayalam Extra"/>
+                <w:color w:val="000000"/>
+                <w:sz w:val="32"/>
+                <w:szCs w:val="32"/>
+              </w:rPr>
+              <w:t>MÞ§) sëx© h</w:t>
             </w:r>
             <w:r>
               <w:rPr>
@@ -34942,7 +35158,27 @@
                 <w:sz w:val="32"/>
                 <w:szCs w:val="32"/>
               </w:rPr>
-              <w:t>— sëx(MÞ§) sëûI ZûI Zx© h—</w:t>
+              <w:t xml:space="preserve">— </w:t>
+            </w:r>
+            <w:proofErr w:type="gramStart"/>
+            <w:r>
+              <w:rPr>
+                <w:rFonts w:ascii="BRH Malayalam Extra" w:hAnsi="BRH Malayalam Extra" w:cs="BRH Malayalam Extra"/>
+                <w:color w:val="000000"/>
+                <w:sz w:val="32"/>
+                <w:szCs w:val="32"/>
+              </w:rPr>
+              <w:t>sëx(</w:t>
+            </w:r>
+            <w:proofErr w:type="gramEnd"/>
+            <w:r>
+              <w:rPr>
+                <w:rFonts w:ascii="BRH Malayalam Extra" w:hAnsi="BRH Malayalam Extra" w:cs="BRH Malayalam Extra"/>
+                <w:color w:val="000000"/>
+                <w:sz w:val="32"/>
+                <w:szCs w:val="32"/>
+              </w:rPr>
+              <w:t>MÞ§) sëûI ZûI Zx© h—</w:t>
             </w:r>
             <w:r>
               <w:rPr>
@@ -35020,7 +35256,27 @@
                 <w:sz w:val="32"/>
                 <w:szCs w:val="32"/>
               </w:rPr>
-              <w:t xml:space="preserve">— sëx(MÞ§) sëûI | </w:t>
+              <w:t xml:space="preserve">— </w:t>
+            </w:r>
+            <w:proofErr w:type="gramStart"/>
+            <w:r>
+              <w:rPr>
+                <w:rFonts w:ascii="BRH Malayalam Extra" w:hAnsi="BRH Malayalam Extra" w:cs="BRH Malayalam Extra"/>
+                <w:color w:val="000000"/>
+                <w:sz w:val="32"/>
+                <w:szCs w:val="32"/>
+              </w:rPr>
+              <w:t>sëx(</w:t>
+            </w:r>
+            <w:proofErr w:type="gramEnd"/>
+            <w:r>
+              <w:rPr>
+                <w:rFonts w:ascii="BRH Malayalam Extra" w:hAnsi="BRH Malayalam Extra" w:cs="BRH Malayalam Extra"/>
+                <w:color w:val="000000"/>
+                <w:sz w:val="32"/>
+                <w:szCs w:val="32"/>
+              </w:rPr>
+              <w:t xml:space="preserve">MÞ§) sëûI | </w:t>
             </w:r>
           </w:p>
           <w:p>
@@ -35532,7 +35788,27 @@
                 <w:sz w:val="32"/>
                 <w:szCs w:val="32"/>
               </w:rPr>
-              <w:t>td¢˜hõx(MÞ§) ¥së</w:t>
+              <w:t>td¢˜</w:t>
+            </w:r>
+            <w:proofErr w:type="gramStart"/>
+            <w:r>
+              <w:rPr>
+                <w:rFonts w:ascii="BRH Malayalam Extra" w:hAnsi="BRH Malayalam Extra" w:cs="BRH Malayalam Extra"/>
+                <w:color w:val="000000"/>
+                <w:sz w:val="32"/>
+                <w:szCs w:val="32"/>
+              </w:rPr>
+              <w:t>hõx(</w:t>
+            </w:r>
+            <w:proofErr w:type="gramEnd"/>
+            <w:r>
+              <w:rPr>
+                <w:rFonts w:ascii="BRH Malayalam Extra" w:hAnsi="BRH Malayalam Extra" w:cs="BRH Malayalam Extra"/>
+                <w:color w:val="000000"/>
+                <w:sz w:val="32"/>
+                <w:szCs w:val="32"/>
+              </w:rPr>
+              <w:t>MÞ§) ¥së</w:t>
             </w:r>
             <w:r>
               <w:rPr>
@@ -35604,7 +35880,27 @@
                 <w:sz w:val="32"/>
                 <w:szCs w:val="32"/>
               </w:rPr>
-              <w:t xml:space="preserve"> td¢˜hõx(MÞ§) ¥së</w:t>
+              <w:t xml:space="preserve"> td¢˜</w:t>
+            </w:r>
+            <w:proofErr w:type="gramStart"/>
+            <w:r>
+              <w:rPr>
+                <w:rFonts w:ascii="BRH Malayalam Extra" w:hAnsi="BRH Malayalam Extra" w:cs="BRH Malayalam Extra"/>
+                <w:color w:val="000000"/>
+                <w:sz w:val="32"/>
+                <w:szCs w:val="32"/>
+              </w:rPr>
+              <w:t>hõx(</w:t>
+            </w:r>
+            <w:proofErr w:type="gramEnd"/>
+            <w:r>
+              <w:rPr>
+                <w:rFonts w:ascii="BRH Malayalam Extra" w:hAnsi="BRH Malayalam Extra" w:cs="BRH Malayalam Extra"/>
+                <w:color w:val="000000"/>
+                <w:sz w:val="32"/>
+                <w:szCs w:val="32"/>
+              </w:rPr>
+              <w:t>MÞ§) ¥së</w:t>
             </w:r>
             <w:r>
               <w:rPr>
@@ -35714,7 +36010,27 @@
                 <w:sz w:val="32"/>
                 <w:szCs w:val="32"/>
               </w:rPr>
-              <w:t xml:space="preserve"> td¢˜hõx(MÞ§) ¥së</w:t>
+              <w:t xml:space="preserve"> td¢˜</w:t>
+            </w:r>
+            <w:proofErr w:type="gramStart"/>
+            <w:r>
+              <w:rPr>
+                <w:rFonts w:ascii="BRH Malayalam Extra" w:hAnsi="BRH Malayalam Extra" w:cs="BRH Malayalam Extra"/>
+                <w:color w:val="000000"/>
+                <w:sz w:val="32"/>
+                <w:szCs w:val="32"/>
+              </w:rPr>
+              <w:t>hõx(</w:t>
+            </w:r>
+            <w:proofErr w:type="gramEnd"/>
+            <w:r>
+              <w:rPr>
+                <w:rFonts w:ascii="BRH Malayalam Extra" w:hAnsi="BRH Malayalam Extra" w:cs="BRH Malayalam Extra"/>
+                <w:color w:val="000000"/>
+                <w:sz w:val="32"/>
+                <w:szCs w:val="32"/>
+              </w:rPr>
+              <w:t>MÞ§) ¥së</w:t>
             </w:r>
             <w:r>
               <w:rPr>
@@ -36105,7 +36421,27 @@
                 <w:sz w:val="32"/>
                 <w:szCs w:val="32"/>
               </w:rPr>
-              <w:t xml:space="preserve"> sëx(MÞ§) sëx© h—</w:t>
+              <w:t xml:space="preserve"> </w:t>
+            </w:r>
+            <w:proofErr w:type="gramStart"/>
+            <w:r>
+              <w:rPr>
+                <w:rFonts w:ascii="BRH Malayalam Extra" w:hAnsi="BRH Malayalam Extra" w:cs="BRH Malayalam Extra"/>
+                <w:color w:val="000000"/>
+                <w:sz w:val="32"/>
+                <w:szCs w:val="32"/>
+              </w:rPr>
+              <w:t>sëx(</w:t>
+            </w:r>
+            <w:proofErr w:type="gramEnd"/>
+            <w:r>
+              <w:rPr>
+                <w:rFonts w:ascii="BRH Malayalam Extra" w:hAnsi="BRH Malayalam Extra" w:cs="BRH Malayalam Extra"/>
+                <w:color w:val="000000"/>
+                <w:sz w:val="32"/>
+                <w:szCs w:val="32"/>
+              </w:rPr>
+              <w:t>MÞ§) sëx© h—</w:t>
             </w:r>
             <w:r>
               <w:rPr>
@@ -36463,7 +36799,27 @@
                 <w:sz w:val="32"/>
                 <w:szCs w:val="32"/>
               </w:rPr>
-              <w:t xml:space="preserve"> sëx(MÞ§) sëx© h</w:t>
+              <w:t xml:space="preserve"> </w:t>
+            </w:r>
+            <w:proofErr w:type="gramStart"/>
+            <w:r>
+              <w:rPr>
+                <w:rFonts w:ascii="BRH Malayalam Extra" w:hAnsi="BRH Malayalam Extra" w:cs="BRH Malayalam Extra"/>
+                <w:color w:val="000000"/>
+                <w:sz w:val="32"/>
+                <w:szCs w:val="32"/>
+              </w:rPr>
+              <w:t>sëx(</w:t>
+            </w:r>
+            <w:proofErr w:type="gramEnd"/>
+            <w:r>
+              <w:rPr>
+                <w:rFonts w:ascii="BRH Malayalam Extra" w:hAnsi="BRH Malayalam Extra" w:cs="BRH Malayalam Extra"/>
+                <w:color w:val="000000"/>
+                <w:sz w:val="32"/>
+                <w:szCs w:val="32"/>
+              </w:rPr>
+              <w:t>MÞ§) sëx© h</w:t>
             </w:r>
             <w:r>
               <w:rPr>
@@ -36520,7 +36876,27 @@
                 <w:sz w:val="32"/>
                 <w:szCs w:val="32"/>
               </w:rPr>
-              <w:t xml:space="preserve"> sëx(MÞ§) sëûI </w:t>
+              <w:t xml:space="preserve"> </w:t>
+            </w:r>
+            <w:proofErr w:type="gramStart"/>
+            <w:r>
+              <w:rPr>
+                <w:rFonts w:ascii="BRH Malayalam Extra" w:hAnsi="BRH Malayalam Extra" w:cs="BRH Malayalam Extra"/>
+                <w:color w:val="000000"/>
+                <w:sz w:val="32"/>
+                <w:szCs w:val="32"/>
+              </w:rPr>
+              <w:t>sëx(</w:t>
+            </w:r>
+            <w:proofErr w:type="gramEnd"/>
+            <w:r>
+              <w:rPr>
+                <w:rFonts w:ascii="BRH Malayalam Extra" w:hAnsi="BRH Malayalam Extra" w:cs="BRH Malayalam Extra"/>
+                <w:color w:val="000000"/>
+                <w:sz w:val="32"/>
+                <w:szCs w:val="32"/>
+              </w:rPr>
+              <w:t xml:space="preserve">MÞ§) sëûI </w:t>
             </w:r>
           </w:p>
           <w:p>
@@ -36591,7 +36967,27 @@
                 <w:sz w:val="32"/>
                 <w:szCs w:val="32"/>
               </w:rPr>
-              <w:t xml:space="preserve"> sëx(MÞ§) sëûI | </w:t>
+              <w:t xml:space="preserve"> </w:t>
+            </w:r>
+            <w:proofErr w:type="gramStart"/>
+            <w:r>
+              <w:rPr>
+                <w:rFonts w:ascii="BRH Malayalam Extra" w:hAnsi="BRH Malayalam Extra" w:cs="BRH Malayalam Extra"/>
+                <w:color w:val="000000"/>
+                <w:sz w:val="32"/>
+                <w:szCs w:val="32"/>
+              </w:rPr>
+              <w:t>sëx(</w:t>
+            </w:r>
+            <w:proofErr w:type="gramEnd"/>
+            <w:r>
+              <w:rPr>
+                <w:rFonts w:ascii="BRH Malayalam Extra" w:hAnsi="BRH Malayalam Extra" w:cs="BRH Malayalam Extra"/>
+                <w:color w:val="000000"/>
+                <w:sz w:val="32"/>
+                <w:szCs w:val="32"/>
+              </w:rPr>
+              <w:t xml:space="preserve">MÞ§) sëûI | </w:t>
             </w:r>
           </w:p>
           <w:p>
@@ -38219,6 +38615,7 @@
         </w:rPr>
         <w:t xml:space="preserve">TS </w:t>
       </w:r>
+      <w:proofErr w:type="gramStart"/>
       <w:r>
         <w:rPr>
           <w:b/>
@@ -38257,7 +38654,18 @@
           <w:szCs w:val="32"/>
           <w:u w:val="single"/>
         </w:rPr>
-        <w:t xml:space="preserve">– TS </w:t>
+        <w:t>–</w:t>
+      </w:r>
+      <w:proofErr w:type="gramEnd"/>
+      <w:r>
+        <w:rPr>
+          <w:b/>
+          <w:bCs/>
+          <w:sz w:val="32"/>
+          <w:szCs w:val="32"/>
+          <w:u w:val="single"/>
+        </w:rPr>
+        <w:t xml:space="preserve"> TS </w:t>
       </w:r>
       <w:r>
         <w:rPr>

</xml_diff>